<commit_message>
Atulização da aula dia 14/09/2026
</commit_message>
<xml_diff>
--- a/apostila/Projeto Space For Men.docx
+++ b/apostila/Projeto Space For Men.docx
@@ -9551,8 +9551,6 @@
     <w:p/>
     <w:p/>
     <w:p>
-      <w:bookmarkStart w:id="0" w:name="_GoBack"/>
-      <w:bookmarkEnd w:id="0"/>
       <w:r>
         <w:rPr>
           <w:noProof/>
@@ -10035,6 +10033,9 @@
         </w:rPr>
       </w:pPr>
       <w:r>
+        <w:rPr>
+          <w:noProof/>
+        </w:rPr>
         <w:lastRenderedPageBreak/>
         <w:drawing>
           <wp:anchor distT="0" distB="0" distL="114300" distR="114300" simplePos="0" relativeHeight="251747328" behindDoc="1" locked="0" layoutInCell="1" allowOverlap="1" wp14:anchorId="2DE3381E">
@@ -10107,43 +10108,30 @@
         </w:rPr>
       </w:pPr>
       <w:r>
-        <w:t>57-</w:t>
-      </w:r>
-      <w:r>
-        <w:t xml:space="preserve"> Criamos a página contatos.html e contatos.css copiamos o cabeçalho(header) da página produtos e colocamos na página contato e repetimos o mesmo processo do </w:t>
-      </w:r>
-      <w:proofErr w:type="spellStart"/>
-      <w:r>
-        <w:t>css</w:t>
-      </w:r>
-      <w:proofErr w:type="spellEnd"/>
-      <w:r>
-        <w:t xml:space="preserve"> com isso finalizando o menu que já estava pronto.</w:t>
-      </w:r>
-    </w:p>
-    <w:p>
-      <w:r>
+        <w:rPr>
+          <w:noProof/>
+        </w:rPr>
         <w:drawing>
-          <wp:anchor distT="0" distB="0" distL="114300" distR="114300" simplePos="0" relativeHeight="251749376" behindDoc="1" locked="0" layoutInCell="1" allowOverlap="1" wp14:anchorId="5CCFA757">
+          <wp:anchor distT="0" distB="0" distL="114300" distR="114300" simplePos="0" relativeHeight="251748352" behindDoc="1" locked="0" layoutInCell="1" allowOverlap="1" wp14:anchorId="63267BEE">
             <wp:simplePos x="0" y="0"/>
             <wp:positionH relativeFrom="page">
-              <wp:posOffset>381783</wp:posOffset>
+              <wp:posOffset>2123218</wp:posOffset>
             </wp:positionH>
             <wp:positionV relativeFrom="paragraph">
-              <wp:posOffset>14605</wp:posOffset>
+              <wp:posOffset>748414</wp:posOffset>
             </wp:positionV>
-            <wp:extent cx="1714739" cy="4324954"/>
-            <wp:effectExtent l="0" t="0" r="0" b="0"/>
+            <wp:extent cx="4495800" cy="2295525"/>
+            <wp:effectExtent l="0" t="0" r="0" b="9525"/>
             <wp:wrapTight wrapText="bothSides">
               <wp:wrapPolygon edited="0">
                 <wp:start x="0" y="0"/>
-                <wp:lineTo x="0" y="21505"/>
-                <wp:lineTo x="21360" y="21505"/>
-                <wp:lineTo x="21360" y="0"/>
+                <wp:lineTo x="0" y="21510"/>
+                <wp:lineTo x="21508" y="21510"/>
+                <wp:lineTo x="21508" y="0"/>
                 <wp:lineTo x="0" y="0"/>
               </wp:wrapPolygon>
             </wp:wrapTight>
-            <wp:docPr id="94" name="Imagem 94"/>
+            <wp:docPr id="92" name="Imagem 92"/>
             <wp:cNvGraphicFramePr>
               <a:graphicFrameLocks xmlns:a="http://schemas.openxmlformats.org/drawingml/2006/main" noChangeAspect="1"/>
             </wp:cNvGraphicFramePr>
@@ -10169,7 +10157,7 @@
                   <pic:spPr>
                     <a:xfrm>
                       <a:off x="0" y="0"/>
-                      <a:ext cx="1714739" cy="4324954"/>
+                      <a:ext cx="4495800" cy="2295525"/>
                     </a:xfrm>
                     <a:prstGeom prst="rect">
                       <a:avLst/>
@@ -10182,27 +10170,30 @@
         </w:drawing>
       </w:r>
       <w:r>
+        <w:rPr>
+          <w:noProof/>
+        </w:rPr>
         <w:drawing>
-          <wp:anchor distT="0" distB="0" distL="114300" distR="114300" simplePos="0" relativeHeight="251748352" behindDoc="1" locked="0" layoutInCell="1" allowOverlap="1" wp14:anchorId="63267BEE">
+          <wp:anchor distT="0" distB="0" distL="114300" distR="114300" simplePos="0" relativeHeight="251749376" behindDoc="1" locked="0" layoutInCell="1" allowOverlap="1" wp14:anchorId="5CCFA757">
             <wp:simplePos x="0" y="0"/>
             <wp:positionH relativeFrom="page">
-              <wp:posOffset>2056927</wp:posOffset>
+              <wp:posOffset>402900</wp:posOffset>
             </wp:positionH>
             <wp:positionV relativeFrom="paragraph">
-              <wp:posOffset>286858</wp:posOffset>
+              <wp:posOffset>561694</wp:posOffset>
             </wp:positionV>
-            <wp:extent cx="4495800" cy="2295525"/>
-            <wp:effectExtent l="0" t="0" r="0" b="9525"/>
+            <wp:extent cx="1714739" cy="4324954"/>
+            <wp:effectExtent l="0" t="0" r="0" b="0"/>
             <wp:wrapTight wrapText="bothSides">
               <wp:wrapPolygon edited="0">
                 <wp:start x="0" y="0"/>
-                <wp:lineTo x="0" y="21510"/>
-                <wp:lineTo x="21508" y="21510"/>
-                <wp:lineTo x="21508" y="0"/>
+                <wp:lineTo x="0" y="21505"/>
+                <wp:lineTo x="21360" y="21505"/>
+                <wp:lineTo x="21360" y="0"/>
                 <wp:lineTo x="0" y="0"/>
               </wp:wrapPolygon>
             </wp:wrapTight>
-            <wp:docPr id="92" name="Imagem 92"/>
+            <wp:docPr id="94" name="Imagem 94"/>
             <wp:cNvGraphicFramePr>
               <a:graphicFrameLocks xmlns:a="http://schemas.openxmlformats.org/drawingml/2006/main" noChangeAspect="1"/>
             </wp:cNvGraphicFramePr>
@@ -10228,7 +10219,7 @@
                   <pic:spPr>
                     <a:xfrm>
                       <a:off x="0" y="0"/>
-                      <a:ext cx="4495800" cy="2295525"/>
+                      <a:ext cx="1714739" cy="4324954"/>
                     </a:xfrm>
                     <a:prstGeom prst="rect">
                       <a:avLst/>
@@ -10240,6 +10231,20 @@
           </wp:anchor>
         </w:drawing>
       </w:r>
+      <w:r>
+        <w:t>57-</w:t>
+      </w:r>
+      <w:r>
+        <w:t xml:space="preserve"> Criamos a página contatos.html e contatos.css copiamos o cabeçalho(header) da página produtos e colocamos na página contato e repetimos o mesmo processo do </w:t>
+      </w:r>
+      <w:proofErr w:type="spellStart"/>
+      <w:r>
+        <w:t>css</w:t>
+      </w:r>
+      <w:proofErr w:type="spellEnd"/>
+      <w:r>
+        <w:t xml:space="preserve"> com isso finalizando o menu que já estava pronto.</w:t>
+      </w:r>
     </w:p>
     <w:p/>
     <w:p/>
@@ -10248,13 +10253,634 @@
     <w:p/>
     <w:p/>
     <w:p/>
-    <w:p>
-      <w:r>
-        <w:t xml:space="preserve">58- </w:t>
-      </w:r>
+    <w:p/>
+    <w:p>
+      <w:pPr>
+        <w:rPr>
+          <w:noProof/>
+        </w:rPr>
+      </w:pPr>
+      <w:r>
+        <w:drawing>
+          <wp:anchor distT="0" distB="0" distL="114300" distR="114300" simplePos="0" relativeHeight="251750400" behindDoc="1" locked="0" layoutInCell="1" allowOverlap="1" wp14:anchorId="03CFC6E3">
+            <wp:simplePos x="0" y="0"/>
+            <wp:positionH relativeFrom="margin">
+              <wp:posOffset>-223284</wp:posOffset>
+            </wp:positionH>
+            <wp:positionV relativeFrom="paragraph">
+              <wp:posOffset>400271</wp:posOffset>
+            </wp:positionV>
+            <wp:extent cx="3581400" cy="1443990"/>
+            <wp:effectExtent l="0" t="0" r="0" b="3810"/>
+            <wp:wrapTight wrapText="bothSides">
+              <wp:wrapPolygon edited="0">
+                <wp:start x="0" y="0"/>
+                <wp:lineTo x="0" y="21372"/>
+                <wp:lineTo x="21485" y="21372"/>
+                <wp:lineTo x="21485" y="0"/>
+                <wp:lineTo x="0" y="0"/>
+              </wp:wrapPolygon>
+            </wp:wrapTight>
+            <wp:docPr id="90" name="Imagem 90"/>
+            <wp:cNvGraphicFramePr>
+              <a:graphicFrameLocks xmlns:a="http://schemas.openxmlformats.org/drawingml/2006/main" noChangeAspect="1"/>
+            </wp:cNvGraphicFramePr>
+            <a:graphic xmlns:a="http://schemas.openxmlformats.org/drawingml/2006/main">
+              <a:graphicData uri="http://schemas.openxmlformats.org/drawingml/2006/picture">
+                <pic:pic xmlns:pic="http://schemas.openxmlformats.org/drawingml/2006/picture">
+                  <pic:nvPicPr>
+                    <pic:cNvPr id="1" name=""/>
+                    <pic:cNvPicPr/>
+                  </pic:nvPicPr>
+                  <pic:blipFill>
+                    <a:blip r:embed="rId103">
+                      <a:extLst>
+                        <a:ext uri="{28A0092B-C50C-407E-A947-70E740481C1C}">
+                          <a14:useLocalDpi xmlns:a14="http://schemas.microsoft.com/office/drawing/2010/main" val="0"/>
+                        </a:ext>
+                      </a:extLst>
+                    </a:blip>
+                    <a:stretch>
+                      <a:fillRect/>
+                    </a:stretch>
+                  </pic:blipFill>
+                  <pic:spPr>
+                    <a:xfrm>
+                      <a:off x="0" y="0"/>
+                      <a:ext cx="3581400" cy="1443990"/>
+                    </a:xfrm>
+                    <a:prstGeom prst="rect">
+                      <a:avLst/>
+                    </a:prstGeom>
+                  </pic:spPr>
+                </pic:pic>
+              </a:graphicData>
+            </a:graphic>
+            <wp14:sizeRelV relativeFrom="margin">
+              <wp14:pctHeight>0</wp14:pctHeight>
+            </wp14:sizeRelV>
+          </wp:anchor>
+        </w:drawing>
+      </w:r>
+      <w:r>
+        <w:t>58-</w:t>
+      </w:r>
+      <w:r>
+        <w:t xml:space="preserve"> Na página contato.html inserimos o </w:t>
+      </w:r>
+      <w:proofErr w:type="spellStart"/>
+      <w:r>
+        <w:t>main</w:t>
+      </w:r>
+      <w:proofErr w:type="spellEnd"/>
+      <w:r>
+        <w:t xml:space="preserve"> dentro dele adicionamos o </w:t>
+      </w:r>
+      <w:proofErr w:type="spellStart"/>
+      <w:r>
+        <w:t>form</w:t>
+      </w:r>
+      <w:proofErr w:type="spellEnd"/>
+      <w:r>
+        <w:t xml:space="preserve"> e começamos a trabalhar com </w:t>
+      </w:r>
+      <w:proofErr w:type="spellStart"/>
+      <w:r>
+        <w:t>label</w:t>
+      </w:r>
+      <w:proofErr w:type="spellEnd"/>
+      <w:r>
+        <w:t>(etiqueta) e input de texto.</w:t>
+      </w:r>
+      <w:r>
+        <w:rPr>
+          <w:noProof/>
+        </w:rPr>
+        <w:t xml:space="preserve"> </w:t>
+      </w:r>
+    </w:p>
+    <w:p/>
+    <w:p/>
+    <w:p/>
+    <w:p/>
+    <w:p/>
+    <w:p/>
+    <w:p>
+      <w:r>
+        <w:drawing>
+          <wp:anchor distT="0" distB="0" distL="114300" distR="114300" simplePos="0" relativeHeight="251751424" behindDoc="1" locked="0" layoutInCell="1" allowOverlap="1" wp14:anchorId="0AEBB1C2">
+            <wp:simplePos x="0" y="0"/>
+            <wp:positionH relativeFrom="column">
+              <wp:posOffset>-80010</wp:posOffset>
+            </wp:positionH>
+            <wp:positionV relativeFrom="paragraph">
+              <wp:posOffset>387394</wp:posOffset>
+            </wp:positionV>
+            <wp:extent cx="4095750" cy="1009650"/>
+            <wp:effectExtent l="0" t="0" r="0" b="0"/>
+            <wp:wrapTight wrapText="bothSides">
+              <wp:wrapPolygon edited="0">
+                <wp:start x="0" y="0"/>
+                <wp:lineTo x="0" y="21192"/>
+                <wp:lineTo x="21500" y="21192"/>
+                <wp:lineTo x="21500" y="0"/>
+                <wp:lineTo x="0" y="0"/>
+              </wp:wrapPolygon>
+            </wp:wrapTight>
+            <wp:docPr id="93" name="Imagem 93"/>
+            <wp:cNvGraphicFramePr>
+              <a:graphicFrameLocks xmlns:a="http://schemas.openxmlformats.org/drawingml/2006/main" noChangeAspect="1"/>
+            </wp:cNvGraphicFramePr>
+            <a:graphic xmlns:a="http://schemas.openxmlformats.org/drawingml/2006/main">
+              <a:graphicData uri="http://schemas.openxmlformats.org/drawingml/2006/picture">
+                <pic:pic xmlns:pic="http://schemas.openxmlformats.org/drawingml/2006/picture">
+                  <pic:nvPicPr>
+                    <pic:cNvPr id="1" name=""/>
+                    <pic:cNvPicPr/>
+                  </pic:nvPicPr>
+                  <pic:blipFill>
+                    <a:blip r:embed="rId104">
+                      <a:extLst>
+                        <a:ext uri="{28A0092B-C50C-407E-A947-70E740481C1C}">
+                          <a14:useLocalDpi xmlns:a14="http://schemas.microsoft.com/office/drawing/2010/main" val="0"/>
+                        </a:ext>
+                      </a:extLst>
+                    </a:blip>
+                    <a:stretch>
+                      <a:fillRect/>
+                    </a:stretch>
+                  </pic:blipFill>
+                  <pic:spPr>
+                    <a:xfrm>
+                      <a:off x="0" y="0"/>
+                      <a:ext cx="4095750" cy="1009650"/>
+                    </a:xfrm>
+                    <a:prstGeom prst="rect">
+                      <a:avLst/>
+                    </a:prstGeom>
+                  </pic:spPr>
+                </pic:pic>
+              </a:graphicData>
+            </a:graphic>
+          </wp:anchor>
+        </w:drawing>
+      </w:r>
+      <w:r>
+        <w:t xml:space="preserve">59- Para unir o </w:t>
+      </w:r>
+      <w:proofErr w:type="spellStart"/>
+      <w:r>
+        <w:t>label</w:t>
+      </w:r>
+      <w:proofErr w:type="spellEnd"/>
+      <w:r>
+        <w:t xml:space="preserve"> com input adicionamos o mesmo nome tanto no for da </w:t>
+      </w:r>
+      <w:proofErr w:type="spellStart"/>
+      <w:r>
+        <w:t>label</w:t>
+      </w:r>
+      <w:proofErr w:type="spellEnd"/>
+      <w:r>
+        <w:t xml:space="preserve"> com no id do </w:t>
+      </w:r>
+      <w:r>
+        <w:t>input.</w:t>
+      </w:r>
+    </w:p>
+    <w:p/>
+    <w:p/>
+    <w:p/>
+    <w:p/>
+    <w:p>
+      <w:pPr>
+        <w:rPr>
+          <w:noProof/>
+        </w:rPr>
+      </w:pPr>
+      <w:r>
+        <w:drawing>
+          <wp:anchor distT="0" distB="0" distL="114300" distR="114300" simplePos="0" relativeHeight="251752448" behindDoc="1" locked="0" layoutInCell="1" allowOverlap="1" wp14:anchorId="15B22B3F">
+            <wp:simplePos x="0" y="0"/>
+            <wp:positionH relativeFrom="column">
+              <wp:posOffset>-59498</wp:posOffset>
+            </wp:positionH>
+            <wp:positionV relativeFrom="paragraph">
+              <wp:posOffset>433617</wp:posOffset>
+            </wp:positionV>
+            <wp:extent cx="1809750" cy="952500"/>
+            <wp:effectExtent l="0" t="0" r="0" b="0"/>
+            <wp:wrapTight wrapText="bothSides">
+              <wp:wrapPolygon edited="0">
+                <wp:start x="0" y="0"/>
+                <wp:lineTo x="0" y="21168"/>
+                <wp:lineTo x="21373" y="21168"/>
+                <wp:lineTo x="21373" y="0"/>
+                <wp:lineTo x="0" y="0"/>
+              </wp:wrapPolygon>
+            </wp:wrapTight>
+            <wp:docPr id="95" name="Imagem 95"/>
+            <wp:cNvGraphicFramePr>
+              <a:graphicFrameLocks xmlns:a="http://schemas.openxmlformats.org/drawingml/2006/main" noChangeAspect="1"/>
+            </wp:cNvGraphicFramePr>
+            <a:graphic xmlns:a="http://schemas.openxmlformats.org/drawingml/2006/main">
+              <a:graphicData uri="http://schemas.openxmlformats.org/drawingml/2006/picture">
+                <pic:pic xmlns:pic="http://schemas.openxmlformats.org/drawingml/2006/picture">
+                  <pic:nvPicPr>
+                    <pic:cNvPr id="1" name=""/>
+                    <pic:cNvPicPr/>
+                  </pic:nvPicPr>
+                  <pic:blipFill>
+                    <a:blip r:embed="rId105">
+                      <a:extLst>
+                        <a:ext uri="{28A0092B-C50C-407E-A947-70E740481C1C}">
+                          <a14:useLocalDpi xmlns:a14="http://schemas.microsoft.com/office/drawing/2010/main" val="0"/>
+                        </a:ext>
+                      </a:extLst>
+                    </a:blip>
+                    <a:stretch>
+                      <a:fillRect/>
+                    </a:stretch>
+                  </pic:blipFill>
+                  <pic:spPr>
+                    <a:xfrm>
+                      <a:off x="0" y="0"/>
+                      <a:ext cx="1809750" cy="952500"/>
+                    </a:xfrm>
+                    <a:prstGeom prst="rect">
+                      <a:avLst/>
+                    </a:prstGeom>
+                  </pic:spPr>
+                </pic:pic>
+              </a:graphicData>
+            </a:graphic>
+          </wp:anchor>
+        </w:drawing>
+      </w:r>
+      <w:r>
+        <w:t>60-</w:t>
+      </w:r>
+      <w:r>
+        <w:t xml:space="preserve"> Para centralizar o conteúdo dentro do </w:t>
+      </w:r>
+      <w:proofErr w:type="spellStart"/>
+      <w:r>
+        <w:t>main</w:t>
+      </w:r>
+      <w:proofErr w:type="spellEnd"/>
+      <w:r>
+        <w:t xml:space="preserve"> demos uma largura e utilizamos o </w:t>
+      </w:r>
+      <w:proofErr w:type="spellStart"/>
+      <w:r>
+        <w:t>margin</w:t>
+      </w:r>
+      <w:proofErr w:type="spellEnd"/>
+      <w:r>
+        <w:t>: 0 auto conforme imagem:</w:t>
+      </w:r>
+      <w:r>
+        <w:rPr>
+          <w:noProof/>
+        </w:rPr>
+        <w:t xml:space="preserve"> </w:t>
+      </w:r>
+    </w:p>
+    <w:p/>
+    <w:p/>
+    <w:p/>
+    <w:p/>
+    <w:p>
+      <w:pPr>
+        <w:rPr>
+          <w:noProof/>
+        </w:rPr>
+      </w:pPr>
+      <w:r>
+        <w:drawing>
+          <wp:anchor distT="0" distB="0" distL="114300" distR="114300" simplePos="0" relativeHeight="251754496" behindDoc="1" locked="0" layoutInCell="1" allowOverlap="1" wp14:anchorId="74584A16">
+            <wp:simplePos x="0" y="0"/>
+            <wp:positionH relativeFrom="page">
+              <wp:posOffset>1711813</wp:posOffset>
+            </wp:positionH>
+            <wp:positionV relativeFrom="paragraph">
+              <wp:posOffset>448280</wp:posOffset>
+            </wp:positionV>
+            <wp:extent cx="5400040" cy="1647190"/>
+            <wp:effectExtent l="0" t="0" r="0" b="0"/>
+            <wp:wrapTight wrapText="bothSides">
+              <wp:wrapPolygon edited="0">
+                <wp:start x="0" y="0"/>
+                <wp:lineTo x="0" y="21234"/>
+                <wp:lineTo x="21488" y="21234"/>
+                <wp:lineTo x="21488" y="0"/>
+                <wp:lineTo x="0" y="0"/>
+              </wp:wrapPolygon>
+            </wp:wrapTight>
+            <wp:docPr id="98" name="Imagem 98"/>
+            <wp:cNvGraphicFramePr>
+              <a:graphicFrameLocks xmlns:a="http://schemas.openxmlformats.org/drawingml/2006/main" noChangeAspect="1"/>
+            </wp:cNvGraphicFramePr>
+            <a:graphic xmlns:a="http://schemas.openxmlformats.org/drawingml/2006/main">
+              <a:graphicData uri="http://schemas.openxmlformats.org/drawingml/2006/picture">
+                <pic:pic xmlns:pic="http://schemas.openxmlformats.org/drawingml/2006/picture">
+                  <pic:nvPicPr>
+                    <pic:cNvPr id="1" name=""/>
+                    <pic:cNvPicPr/>
+                  </pic:nvPicPr>
+                  <pic:blipFill>
+                    <a:blip r:embed="rId106">
+                      <a:extLst>
+                        <a:ext uri="{28A0092B-C50C-407E-A947-70E740481C1C}">
+                          <a14:useLocalDpi xmlns:a14="http://schemas.microsoft.com/office/drawing/2010/main" val="0"/>
+                        </a:ext>
+                      </a:extLst>
+                    </a:blip>
+                    <a:stretch>
+                      <a:fillRect/>
+                    </a:stretch>
+                  </pic:blipFill>
+                  <pic:spPr>
+                    <a:xfrm>
+                      <a:off x="0" y="0"/>
+                      <a:ext cx="5400040" cy="1647190"/>
+                    </a:xfrm>
+                    <a:prstGeom prst="rect">
+                      <a:avLst/>
+                    </a:prstGeom>
+                  </pic:spPr>
+                </pic:pic>
+              </a:graphicData>
+            </a:graphic>
+            <wp14:sizeRelV relativeFrom="margin">
+              <wp14:pctHeight>0</wp14:pctHeight>
+            </wp14:sizeRelV>
+          </wp:anchor>
+        </w:drawing>
+      </w:r>
+      <w:r>
+        <w:t>61- Observamos que o nosso formulário estava apertado entre o cabeçalho e o rodapé inserimos uma altura tanto para cima com para baixo.</w:t>
+      </w:r>
+      <w:r>
+        <w:rPr>
+          <w:noProof/>
+        </w:rPr>
+        <w:t xml:space="preserve"> </w:t>
+      </w:r>
+    </w:p>
+    <w:p>
+      <w:r>
+        <w:drawing>
+          <wp:anchor distT="0" distB="0" distL="114300" distR="114300" simplePos="0" relativeHeight="251753472" behindDoc="1" locked="0" layoutInCell="1" allowOverlap="1" wp14:anchorId="44397204">
+            <wp:simplePos x="0" y="0"/>
+            <wp:positionH relativeFrom="margin">
+              <wp:posOffset>-858549</wp:posOffset>
+            </wp:positionH>
+            <wp:positionV relativeFrom="paragraph">
+              <wp:posOffset>424992</wp:posOffset>
+            </wp:positionV>
+            <wp:extent cx="1485900" cy="657225"/>
+            <wp:effectExtent l="0" t="0" r="0" b="9525"/>
+            <wp:wrapTight wrapText="bothSides">
+              <wp:wrapPolygon edited="0">
+                <wp:start x="0" y="0"/>
+                <wp:lineTo x="0" y="21287"/>
+                <wp:lineTo x="21323" y="21287"/>
+                <wp:lineTo x="21323" y="0"/>
+                <wp:lineTo x="0" y="0"/>
+              </wp:wrapPolygon>
+            </wp:wrapTight>
+            <wp:docPr id="96" name="Imagem 96"/>
+            <wp:cNvGraphicFramePr>
+              <a:graphicFrameLocks xmlns:a="http://schemas.openxmlformats.org/drawingml/2006/main" noChangeAspect="1"/>
+            </wp:cNvGraphicFramePr>
+            <a:graphic xmlns:a="http://schemas.openxmlformats.org/drawingml/2006/main">
+              <a:graphicData uri="http://schemas.openxmlformats.org/drawingml/2006/picture">
+                <pic:pic xmlns:pic="http://schemas.openxmlformats.org/drawingml/2006/picture">
+                  <pic:nvPicPr>
+                    <pic:cNvPr id="1" name=""/>
+                    <pic:cNvPicPr/>
+                  </pic:nvPicPr>
+                  <pic:blipFill>
+                    <a:blip r:embed="rId107">
+                      <a:extLst>
+                        <a:ext uri="{28A0092B-C50C-407E-A947-70E740481C1C}">
+                          <a14:useLocalDpi xmlns:a14="http://schemas.microsoft.com/office/drawing/2010/main" val="0"/>
+                        </a:ext>
+                      </a:extLst>
+                    </a:blip>
+                    <a:stretch>
+                      <a:fillRect/>
+                    </a:stretch>
+                  </pic:blipFill>
+                  <pic:spPr>
+                    <a:xfrm>
+                      <a:off x="0" y="0"/>
+                      <a:ext cx="1485900" cy="657225"/>
+                    </a:xfrm>
+                    <a:prstGeom prst="rect">
+                      <a:avLst/>
+                    </a:prstGeom>
+                  </pic:spPr>
+                </pic:pic>
+              </a:graphicData>
+            </a:graphic>
+          </wp:anchor>
+        </w:drawing>
+      </w:r>
+    </w:p>
+    <w:p/>
+    <w:p/>
+    <w:p>
+      <w:pPr>
+        <w:rPr>
+          <w:noProof/>
+        </w:rPr>
+      </w:pPr>
+      <w:r>
+        <w:drawing>
+          <wp:anchor distT="0" distB="0" distL="114300" distR="114300" simplePos="0" relativeHeight="251756544" behindDoc="1" locked="0" layoutInCell="1" allowOverlap="1" wp14:anchorId="1AA28DE4">
+            <wp:simplePos x="0" y="0"/>
+            <wp:positionH relativeFrom="column">
+              <wp:posOffset>1067435</wp:posOffset>
+            </wp:positionH>
+            <wp:positionV relativeFrom="paragraph">
+              <wp:posOffset>874395</wp:posOffset>
+            </wp:positionV>
+            <wp:extent cx="4410710" cy="2155825"/>
+            <wp:effectExtent l="0" t="0" r="8890" b="0"/>
+            <wp:wrapTight wrapText="bothSides">
+              <wp:wrapPolygon edited="0">
+                <wp:start x="0" y="0"/>
+                <wp:lineTo x="0" y="21377"/>
+                <wp:lineTo x="21550" y="21377"/>
+                <wp:lineTo x="21550" y="0"/>
+                <wp:lineTo x="0" y="0"/>
+              </wp:wrapPolygon>
+            </wp:wrapTight>
+            <wp:docPr id="100" name="Imagem 100"/>
+            <wp:cNvGraphicFramePr>
+              <a:graphicFrameLocks xmlns:a="http://schemas.openxmlformats.org/drawingml/2006/main" noChangeAspect="1"/>
+            </wp:cNvGraphicFramePr>
+            <a:graphic xmlns:a="http://schemas.openxmlformats.org/drawingml/2006/main">
+              <a:graphicData uri="http://schemas.openxmlformats.org/drawingml/2006/picture">
+                <pic:pic xmlns:pic="http://schemas.openxmlformats.org/drawingml/2006/picture">
+                  <pic:nvPicPr>
+                    <pic:cNvPr id="1" name=""/>
+                    <pic:cNvPicPr/>
+                  </pic:nvPicPr>
+                  <pic:blipFill>
+                    <a:blip r:embed="rId108">
+                      <a:extLst>
+                        <a:ext uri="{28A0092B-C50C-407E-A947-70E740481C1C}">
+                          <a14:useLocalDpi xmlns:a14="http://schemas.microsoft.com/office/drawing/2010/main" val="0"/>
+                        </a:ext>
+                      </a:extLst>
+                    </a:blip>
+                    <a:stretch>
+                      <a:fillRect/>
+                    </a:stretch>
+                  </pic:blipFill>
+                  <pic:spPr>
+                    <a:xfrm>
+                      <a:off x="0" y="0"/>
+                      <a:ext cx="4410710" cy="2155825"/>
+                    </a:xfrm>
+                    <a:prstGeom prst="rect">
+                      <a:avLst/>
+                    </a:prstGeom>
+                  </pic:spPr>
+                </pic:pic>
+              </a:graphicData>
+            </a:graphic>
+            <wp14:sizeRelH relativeFrom="margin">
+              <wp14:pctWidth>0</wp14:pctWidth>
+            </wp14:sizeRelH>
+            <wp14:sizeRelV relativeFrom="margin">
+              <wp14:pctHeight>0</wp14:pctHeight>
+            </wp14:sizeRelV>
+          </wp:anchor>
+        </w:drawing>
+      </w:r>
+      <w:r>
+        <w:drawing>
+          <wp:anchor distT="0" distB="0" distL="114300" distR="114300" simplePos="0" relativeHeight="251755520" behindDoc="1" locked="0" layoutInCell="1" allowOverlap="1" wp14:anchorId="36F2F6A3">
+            <wp:simplePos x="0" y="0"/>
+            <wp:positionH relativeFrom="column">
+              <wp:posOffset>-995414</wp:posOffset>
+            </wp:positionH>
+            <wp:positionV relativeFrom="paragraph">
+              <wp:posOffset>874056</wp:posOffset>
+            </wp:positionV>
+            <wp:extent cx="2038350" cy="1295400"/>
+            <wp:effectExtent l="0" t="0" r="0" b="0"/>
+            <wp:wrapTight wrapText="bothSides">
+              <wp:wrapPolygon edited="0">
+                <wp:start x="0" y="0"/>
+                <wp:lineTo x="0" y="21282"/>
+                <wp:lineTo x="21398" y="21282"/>
+                <wp:lineTo x="21398" y="0"/>
+                <wp:lineTo x="0" y="0"/>
+              </wp:wrapPolygon>
+            </wp:wrapTight>
+            <wp:docPr id="99" name="Imagem 99"/>
+            <wp:cNvGraphicFramePr>
+              <a:graphicFrameLocks xmlns:a="http://schemas.openxmlformats.org/drawingml/2006/main" noChangeAspect="1"/>
+            </wp:cNvGraphicFramePr>
+            <a:graphic xmlns:a="http://schemas.openxmlformats.org/drawingml/2006/main">
+              <a:graphicData uri="http://schemas.openxmlformats.org/drawingml/2006/picture">
+                <pic:pic xmlns:pic="http://schemas.openxmlformats.org/drawingml/2006/picture">
+                  <pic:nvPicPr>
+                    <pic:cNvPr id="1" name=""/>
+                    <pic:cNvPicPr/>
+                  </pic:nvPicPr>
+                  <pic:blipFill>
+                    <a:blip r:embed="rId109">
+                      <a:extLst>
+                        <a:ext uri="{28A0092B-C50C-407E-A947-70E740481C1C}">
+                          <a14:useLocalDpi xmlns:a14="http://schemas.microsoft.com/office/drawing/2010/main" val="0"/>
+                        </a:ext>
+                      </a:extLst>
+                    </a:blip>
+                    <a:stretch>
+                      <a:fillRect/>
+                    </a:stretch>
+                  </pic:blipFill>
+                  <pic:spPr>
+                    <a:xfrm>
+                      <a:off x="0" y="0"/>
+                      <a:ext cx="2038350" cy="1295400"/>
+                    </a:xfrm>
+                    <a:prstGeom prst="rect">
+                      <a:avLst/>
+                    </a:prstGeom>
+                  </pic:spPr>
+                </pic:pic>
+              </a:graphicData>
+            </a:graphic>
+          </wp:anchor>
+        </w:drawing>
+      </w:r>
+      <w:r>
+        <w:t>62</w:t>
+      </w:r>
+      <w:r>
+        <w:t>-</w:t>
+      </w:r>
+      <w:r>
+        <w:t xml:space="preserve"> </w:t>
+      </w:r>
+      <w:r>
+        <w:t xml:space="preserve">Podemos avaliar que o nosso formulário tem um tipo de comportamento mesmo colocando um elemento em baixo do outro no </w:t>
+      </w:r>
+      <w:proofErr w:type="spellStart"/>
+      <w:r>
+        <w:t>html</w:t>
+      </w:r>
+      <w:proofErr w:type="spellEnd"/>
+      <w:r>
+        <w:t xml:space="preserve"> ao </w:t>
+      </w:r>
+      <w:proofErr w:type="spellStart"/>
+      <w:r>
+        <w:t>rendelizar</w:t>
+      </w:r>
+      <w:proofErr w:type="spellEnd"/>
+      <w:r>
+        <w:t xml:space="preserve"> a página os elementos (</w:t>
+      </w:r>
+      <w:proofErr w:type="spellStart"/>
+      <w:r>
+        <w:t>label</w:t>
+      </w:r>
+      <w:proofErr w:type="spellEnd"/>
+      <w:r>
+        <w:t xml:space="preserve"> e input) ficam um ao lado do outro. Para mudar essa situação mudamos a natureza do </w:t>
+      </w:r>
+      <w:proofErr w:type="spellStart"/>
+      <w:r>
+        <w:t>label</w:t>
+      </w:r>
+      <w:proofErr w:type="spellEnd"/>
+      <w:r>
+        <w:t xml:space="preserve"> e input conforme código abaixo.</w:t>
+      </w:r>
+      <w:r>
+        <w:rPr>
+          <w:noProof/>
+        </w:rPr>
+        <w:t xml:space="preserve"> </w:t>
+      </w:r>
+    </w:p>
+    <w:p/>
+    <w:p/>
+    <w:p/>
+    <w:p>
+      <w:bookmarkStart w:id="0" w:name="_GoBack"/>
+      <w:bookmarkEnd w:id="0"/>
     </w:p>
     <w:sectPr>
-      <w:footerReference w:type="default" r:id="rId103"/>
+      <w:footerReference w:type="default" r:id="rId110"/>
       <w:pgSz w:w="11906" w:h="16838"/>
       <w:pgMar w:top="1418" w:right="1701" w:bottom="1418" w:left="1701" w:header="709" w:footer="709" w:gutter="0"/>
       <w:cols w:space="708"/>
@@ -11836,7 +12462,7 @@
 </file>
 
 <file path=customXml/itemProps1.xml><?xml version="1.0" encoding="utf-8"?>
-<ds:datastoreItem xmlns:ds="http://schemas.openxmlformats.org/officeDocument/2006/customXml" ds:itemID="{27DF0690-EED9-463A-A235-01DCEB1F4DC7}">
+<ds:datastoreItem xmlns:ds="http://schemas.openxmlformats.org/officeDocument/2006/customXml" ds:itemID="{18673631-659E-4CAB-96D6-DAD107C6413C}">
   <ds:schemaRefs>
     <ds:schemaRef ds:uri="http://schemas.openxmlformats.org/officeDocument/2006/bibliography"/>
   </ds:schemaRefs>

</xml_diff>

<commit_message>
atualição da aula dia 17/09/2026
</commit_message>
<xml_diff>
--- a/apostila/Projeto Space For Men.docx
+++ b/apostila/Projeto Space For Men.docx
@@ -1478,19 +1478,8 @@
           </wp:anchor>
         </w:drawing>
       </w:r>
-      <w:proofErr w:type="gramStart"/>
-      <w:r>
-        <w:t xml:space="preserve">E </w:t>
-      </w:r>
-      <w:r>
-        <w:t xml:space="preserve"> </w:t>
-      </w:r>
-      <w:r>
-        <w:t>adicionamos</w:t>
-      </w:r>
-      <w:proofErr w:type="gramEnd"/>
-      <w:r>
-        <w:t xml:space="preserve"> a cor de fundo cinza claro.</w:t>
+      <w:r>
+        <w:t>E adicionamos a cor de fundo cinza claro.</w:t>
       </w:r>
       <w:r>
         <w:rPr>
@@ -1822,13 +1811,14 @@
         <w:t xml:space="preserve">14-Para alinhar a lista ao topo </w:t>
       </w:r>
       <w:r>
-        <w:t xml:space="preserve">de imagem utilizamos </w:t>
-      </w:r>
-      <w:proofErr w:type="gramStart"/>
-      <w:r>
-        <w:t>os seguinte comando</w:t>
-      </w:r>
-      <w:proofErr w:type="gramEnd"/>
+        <w:t>de imagem utilizamos os seguinte</w:t>
+      </w:r>
+      <w:r>
+        <w:t xml:space="preserve"> </w:t>
+      </w:r>
+      <w:r>
+        <w:t>comando</w:t>
+      </w:r>
       <w:r>
         <w:t>:</w:t>
       </w:r>
@@ -2048,15 +2038,7 @@
         </w:drawing>
       </w:r>
       <w:r>
-        <w:t xml:space="preserve">15-Ainda trabalhando </w:t>
-      </w:r>
-      <w:proofErr w:type="gramStart"/>
-      <w:r>
-        <w:t>com  a</w:t>
-      </w:r>
-      <w:proofErr w:type="gramEnd"/>
-      <w:r>
-        <w:t xml:space="preserve"> lista definimos um tamanho para que ele ocupe 20% de largura e colocamos um espaço externo do lado direito de 15% obtendo os segui</w:t>
+        <w:t>15-Ainda trabalhando com a lista definimos um tamanho para que ele ocupe 20% de largura e colocamos um espaço externo do lado direito de 15% obtendo os segui</w:t>
       </w:r>
       <w:r>
         <w:t>ntes resultados:</w:t>
@@ -2296,19 +2278,11 @@
         <w:t xml:space="preserve"> principal inserimos um espaço interno tanto para </w:t>
       </w:r>
       <w:proofErr w:type="spellStart"/>
-      <w:proofErr w:type="gramStart"/>
-      <w:r>
-        <w:rPr>
-          <w:sz w:val="20"/>
-        </w:rPr>
-        <w:t>cima,direita</w:t>
-      </w:r>
-      <w:proofErr w:type="gramEnd"/>
-      <w:r>
-        <w:rPr>
-          <w:sz w:val="20"/>
-        </w:rPr>
-        <w:t>,baixo</w:t>
+      <w:r>
+        <w:rPr>
+          <w:sz w:val="20"/>
+        </w:rPr>
+        <w:t>cima,direita,baixo</w:t>
       </w:r>
       <w:proofErr w:type="spellEnd"/>
       <w:r>
@@ -2785,21 +2759,7 @@
         <w:rPr>
           <w:sz w:val="20"/>
         </w:rPr>
-        <w:t xml:space="preserve">vos no projetos produtos.html e o </w:t>
-      </w:r>
-      <w:proofErr w:type="gramStart"/>
-      <w:r>
-        <w:rPr>
-          <w:sz w:val="20"/>
-        </w:rPr>
-        <w:t>produtos.css  e</w:t>
-      </w:r>
-      <w:proofErr w:type="gramEnd"/>
-      <w:r>
-        <w:rPr>
-          <w:sz w:val="20"/>
-        </w:rPr>
-        <w:t xml:space="preserve"> ligamos o </w:t>
+        <w:t xml:space="preserve">vos no projetos produtos.html e o produtos.css  e ligamos o </w:t>
       </w:r>
       <w:proofErr w:type="spellStart"/>
       <w:r>
@@ -3040,21 +3000,7 @@
         <w:rPr>
           <w:sz w:val="20"/>
         </w:rPr>
-        <w:t xml:space="preserve"> dentro do header inserimos uma imagem que será o logo do </w:t>
-      </w:r>
-      <w:proofErr w:type="gramStart"/>
-      <w:r>
-        <w:rPr>
-          <w:sz w:val="20"/>
-        </w:rPr>
-        <w:t>site  e</w:t>
-      </w:r>
-      <w:proofErr w:type="gramEnd"/>
-      <w:r>
-        <w:rPr>
-          <w:sz w:val="20"/>
-        </w:rPr>
-        <w:t xml:space="preserve"> criamos uma lista não ordenada para que mais tarde ela será o menu do nosso site.</w:t>
+        <w:t xml:space="preserve"> dentro do header inserimos uma imagem que será o logo do site e criamos uma lista não ordenada para que mais tarde ela será o menu do nosso site.</w:t>
       </w:r>
       <w:r>
         <w:rPr>
@@ -4936,27 +4882,13 @@
         <w:rPr>
           <w:sz w:val="20"/>
         </w:rPr>
-        <w:t xml:space="preserve"> para saber a </w:t>
-      </w:r>
-      <w:proofErr w:type="gramStart"/>
-      <w:r>
-        <w:rPr>
-          <w:sz w:val="20"/>
-        </w:rPr>
-        <w:t xml:space="preserve">altura </w:t>
-      </w:r>
-      <w:r>
-        <w:rPr>
-          <w:sz w:val="20"/>
-        </w:rPr>
-        <w:t xml:space="preserve"> do</w:t>
-      </w:r>
-      <w:proofErr w:type="gramEnd"/>
-      <w:r>
-        <w:rPr>
-          <w:sz w:val="20"/>
-        </w:rPr>
-        <w:t xml:space="preserve"> elemento dentro do header apertando f12</w:t>
+        <w:t xml:space="preserve"> para saber a altura </w:t>
+      </w:r>
+      <w:r>
+        <w:rPr>
+          <w:sz w:val="20"/>
+        </w:rPr>
+        <w:t xml:space="preserve"> do elemento dentro do header apertando f12</w:t>
       </w:r>
     </w:p>
     <w:p>
@@ -5271,21 +5203,7 @@
         <w:rPr>
           <w:sz w:val="20"/>
         </w:rPr>
-        <w:t xml:space="preserve">Para centralizar o logo e nossa lista(menu) envolvemos </w:t>
-      </w:r>
-      <w:proofErr w:type="gramStart"/>
-      <w:r>
-        <w:rPr>
-          <w:sz w:val="20"/>
-        </w:rPr>
-        <w:t>eles  dentro</w:t>
-      </w:r>
-      <w:proofErr w:type="gramEnd"/>
-      <w:r>
-        <w:rPr>
-          <w:sz w:val="20"/>
-        </w:rPr>
-        <w:t xml:space="preserve"> de uma </w:t>
+        <w:t xml:space="preserve">Para centralizar o logo e nossa lista(menu) envolvemos eles dentro de uma </w:t>
       </w:r>
       <w:proofErr w:type="spellStart"/>
       <w:r>
@@ -6681,33 +6599,19 @@
         <w:rPr>
           <w:sz w:val="20"/>
         </w:rPr>
-        <w:t xml:space="preserve">Para </w:t>
-      </w:r>
-      <w:proofErr w:type="gramStart"/>
-      <w:r>
-        <w:rPr>
-          <w:sz w:val="20"/>
-        </w:rPr>
-        <w:t>centraliza</w:t>
-      </w:r>
-      <w:r>
-        <w:rPr>
-          <w:sz w:val="20"/>
-        </w:rPr>
-        <w:t>r</w:t>
-      </w:r>
-      <w:r>
-        <w:rPr>
-          <w:sz w:val="20"/>
-        </w:rPr>
-        <w:t xml:space="preserve">  a</w:t>
-      </w:r>
-      <w:proofErr w:type="gramEnd"/>
-      <w:r>
-        <w:rPr>
-          <w:sz w:val="20"/>
-        </w:rPr>
-        <w:t xml:space="preserve"> nosso lista de produtos na </w:t>
+        <w:t>Para centraliza</w:t>
+      </w:r>
+      <w:r>
+        <w:rPr>
+          <w:sz w:val="20"/>
+        </w:rPr>
+        <w:t xml:space="preserve">r a </w:t>
+      </w:r>
+      <w:r>
+        <w:rPr>
+          <w:sz w:val="20"/>
+        </w:rPr>
+        <w:t xml:space="preserve">nosso lista de produtos na </w:t>
       </w:r>
       <w:proofErr w:type="spellStart"/>
       <w:r>
@@ -6938,21 +6842,25 @@
         <w:rPr>
           <w:sz w:val="20"/>
         </w:rPr>
+        <w:t xml:space="preserve"> no</w:t>
+      </w:r>
+      <w:r>
+        <w:rPr>
+          <w:sz w:val="20"/>
+        </w:rPr>
+        <w:t>s</w:t>
+      </w:r>
+      <w:r>
+        <w:rPr>
+          <w:sz w:val="20"/>
+        </w:rPr>
+        <w:t xml:space="preserve"> produtos li;</w:t>
+      </w:r>
+      <w:r>
+        <w:rPr>
+          <w:noProof/>
+        </w:rPr>
         <w:t xml:space="preserve"> </w:t>
-      </w:r>
-      <w:proofErr w:type="gramStart"/>
-      <w:r>
-        <w:rPr>
-          <w:sz w:val="20"/>
-        </w:rPr>
-        <w:t>no produtos</w:t>
-      </w:r>
-      <w:proofErr w:type="gramEnd"/>
-      <w:r>
-        <w:rPr>
-          <w:sz w:val="20"/>
-        </w:rPr>
-        <w:t xml:space="preserve"> li;</w:t>
       </w:r>
       <w:r>
         <w:rPr>
@@ -7178,14 +7086,18 @@
         </w:rPr>
         <w:t xml:space="preserve"> através de </w:t>
       </w:r>
-      <w:proofErr w:type="spellStart"/>
       <w:r>
         <w:rPr>
           <w:sz w:val="20"/>
         </w:rPr>
         <w:t>referencia</w:t>
       </w:r>
-      <w:proofErr w:type="spellEnd"/>
+      <w:r>
+        <w:rPr>
+          <w:sz w:val="20"/>
+        </w:rPr>
+        <w:t>s</w:t>
+      </w:r>
       <w:r>
         <w:rPr>
           <w:sz w:val="20"/>
@@ -7637,19 +7549,11 @@
         </w:rPr>
         <w:t xml:space="preserve"> </w:t>
       </w:r>
-      <w:proofErr w:type="gramStart"/>
-      <w:r>
-        <w:rPr>
-          <w:sz w:val="20"/>
-        </w:rPr>
-        <w:t>No produtos</w:t>
-      </w:r>
-      <w:proofErr w:type="gramEnd"/>
-      <w:r>
-        <w:rPr>
-          <w:sz w:val="20"/>
-        </w:rPr>
-        <w:t xml:space="preserve"> </w:t>
+      <w:r>
+        <w:rPr>
+          <w:sz w:val="20"/>
+        </w:rPr>
+        <w:t xml:space="preserve">No produtos </w:t>
       </w:r>
       <w:r>
         <w:rPr>
@@ -8039,27 +7943,13 @@
         <w:rPr>
           <w:sz w:val="20"/>
         </w:rPr>
-        <w:t xml:space="preserve"> </w:t>
-      </w:r>
-      <w:proofErr w:type="gramStart"/>
-      <w:r>
-        <w:rPr>
-          <w:sz w:val="20"/>
-        </w:rPr>
-        <w:t xml:space="preserve">NO </w:t>
-      </w:r>
-      <w:r>
-        <w:rPr>
-          <w:sz w:val="20"/>
-        </w:rPr>
-        <w:t>produtos</w:t>
-      </w:r>
-      <w:proofErr w:type="gramEnd"/>
-      <w:r>
-        <w:rPr>
-          <w:sz w:val="20"/>
-        </w:rPr>
-        <w:t xml:space="preserve"> li adicionamos um espaço interno cima com para baixo e para direita e esquerda</w:t>
+        <w:t xml:space="preserve"> NO </w:t>
+      </w:r>
+      <w:r>
+        <w:rPr>
+          <w:sz w:val="20"/>
+        </w:rPr>
+        <w:t>produtos li adicionamos um espaço interno cima com para baixo e para direita e esquerda</w:t>
       </w:r>
       <w:r>
         <w:rPr>
@@ -8907,21 +8797,19 @@
         <w:rPr>
           <w:sz w:val="20"/>
         </w:rPr>
-        <w:t xml:space="preserve"> Arredondamos os cantos da </w:t>
-      </w:r>
-      <w:proofErr w:type="gramStart"/>
-      <w:r>
-        <w:rPr>
-          <w:sz w:val="20"/>
-        </w:rPr>
-        <w:t>nosso borda</w:t>
-      </w:r>
-      <w:proofErr w:type="gramEnd"/>
-      <w:r>
-        <w:rPr>
-          <w:sz w:val="20"/>
-        </w:rPr>
-        <w:t xml:space="preserve"> utilizando o border-radius:10px.</w:t>
+        <w:t xml:space="preserve"> Arredondamos os cantos da nos</w:t>
+      </w:r>
+      <w:r>
+        <w:rPr>
+          <w:sz w:val="20"/>
+        </w:rPr>
+        <w:t>sa</w:t>
+      </w:r>
+      <w:r>
+        <w:rPr>
+          <w:sz w:val="20"/>
+        </w:rPr>
+        <w:t xml:space="preserve"> borda utilizando o border-radius:10px.</w:t>
       </w:r>
       <w:r>
         <w:rPr>
@@ -10007,15 +9895,13 @@
       </w:r>
       <w:proofErr w:type="spellEnd"/>
       <w:r>
-        <w:t xml:space="preserve"> após colocamos uma imagem de fundo preta se fez necessário mudar a cor da letra do </w:t>
-      </w:r>
-      <w:proofErr w:type="gramStart"/>
-      <w:r>
-        <w:t>parágrafo(</w:t>
-      </w:r>
-      <w:proofErr w:type="gramEnd"/>
-      <w:r>
-        <w:t>White</w:t>
+        <w:t xml:space="preserve"> após colocamos uma imagem de fundo preta se fez necessário mudar a cor da letra do parágrafo</w:t>
+      </w:r>
+      <w:r>
+        <w:t xml:space="preserve"> </w:t>
+      </w:r>
+      <w:r>
+        <w:t>(White</w:t>
       </w:r>
       <w:r>
         <w:t>).</w:t>
@@ -10261,6 +10147,9 @@
         </w:rPr>
       </w:pPr>
       <w:r>
+        <w:rPr>
+          <w:noProof/>
+        </w:rPr>
         <w:drawing>
           <wp:anchor distT="0" distB="0" distL="114300" distR="114300" simplePos="0" relativeHeight="251750400" behindDoc="1" locked="0" layoutInCell="1" allowOverlap="1" wp14:anchorId="03CFC6E3">
             <wp:simplePos x="0" y="0"/>
@@ -10367,6 +10256,9 @@
     <w:p/>
     <w:p>
       <w:r>
+        <w:rPr>
+          <w:noProof/>
+        </w:rPr>
         <w:drawing>
           <wp:anchor distT="0" distB="0" distL="114300" distR="114300" simplePos="0" relativeHeight="251751424" behindDoc="1" locked="0" layoutInCell="1" allowOverlap="1" wp14:anchorId="0AEBB1C2">
             <wp:simplePos x="0" y="0"/>
@@ -10459,6 +10351,9 @@
         </w:rPr>
       </w:pPr>
       <w:r>
+        <w:rPr>
+          <w:noProof/>
+        </w:rPr>
         <w:drawing>
           <wp:anchor distT="0" distB="0" distL="114300" distR="114300" simplePos="0" relativeHeight="251752448" behindDoc="1" locked="0" layoutInCell="1" allowOverlap="1" wp14:anchorId="15B22B3F">
             <wp:simplePos x="0" y="0"/>
@@ -10557,6 +10452,9 @@
         </w:rPr>
       </w:pPr>
       <w:r>
+        <w:rPr>
+          <w:noProof/>
+        </w:rPr>
         <w:drawing>
           <wp:anchor distT="0" distB="0" distL="114300" distR="114300" simplePos="0" relativeHeight="251754496" behindDoc="1" locked="0" layoutInCell="1" allowOverlap="1" wp14:anchorId="74584A16">
             <wp:simplePos x="0" y="0"/>
@@ -10630,6 +10528,9 @@
     </w:p>
     <w:p>
       <w:r>
+        <w:rPr>
+          <w:noProof/>
+        </w:rPr>
         <w:drawing>
           <wp:anchor distT="0" distB="0" distL="114300" distR="114300" simplePos="0" relativeHeight="251753472" behindDoc="1" locked="0" layoutInCell="1" allowOverlap="1" wp14:anchorId="44397204">
             <wp:simplePos x="0" y="0"/>
@@ -10698,6 +10599,9 @@
         </w:rPr>
       </w:pPr>
       <w:r>
+        <w:rPr>
+          <w:noProof/>
+        </w:rPr>
         <w:drawing>
           <wp:anchor distT="0" distB="0" distL="114300" distR="114300" simplePos="0" relativeHeight="251756544" behindDoc="1" locked="0" layoutInCell="1" allowOverlap="1" wp14:anchorId="1AA28DE4">
             <wp:simplePos x="0" y="0"/>
@@ -10763,6 +10667,9 @@
         </w:drawing>
       </w:r>
       <w:r>
+        <w:rPr>
+          <w:noProof/>
+        </w:rPr>
         <w:drawing>
           <wp:anchor distT="0" distB="0" distL="114300" distR="114300" simplePos="0" relativeHeight="251755520" behindDoc="1" locked="0" layoutInCell="1" allowOverlap="1" wp14:anchorId="36F2F6A3">
             <wp:simplePos x="0" y="0"/>
@@ -10865,6 +10772,375 @@
       <w:r>
         <w:t xml:space="preserve"> e input conforme código abaixo.</w:t>
       </w:r>
+    </w:p>
+    <w:p>
+      <w:pPr>
+        <w:rPr>
+          <w:noProof/>
+        </w:rPr>
+      </w:pPr>
+    </w:p>
+    <w:p>
+      <w:pPr>
+        <w:rPr>
+          <w:noProof/>
+        </w:rPr>
+      </w:pPr>
+    </w:p>
+    <w:p>
+      <w:pPr>
+        <w:rPr>
+          <w:noProof/>
+        </w:rPr>
+      </w:pPr>
+    </w:p>
+    <w:p>
+      <w:r>
+        <w:lastRenderedPageBreak/>
+        <w:t>63</w:t>
+      </w:r>
+      <w:r>
+        <w:t>-</w:t>
+      </w:r>
+      <w:r>
+        <w:t xml:space="preserve"> Demos um espaço para lado de baixo da </w:t>
+      </w:r>
+      <w:proofErr w:type="spellStart"/>
+      <w:r>
+        <w:t>label</w:t>
+      </w:r>
+      <w:proofErr w:type="spellEnd"/>
+      <w:r>
+        <w:t xml:space="preserve"> de margin:20px e aumentamos o tamanho da fonte, o input também acrescentamos um espaço do lado de baixo e aumentos o espaço interno tanto na parte cima, baixo, direita e esquerda.</w:t>
+      </w:r>
+    </w:p>
+    <w:p>
+      <w:r>
+        <w:rPr>
+          <w:noProof/>
+        </w:rPr>
+        <w:drawing>
+          <wp:anchor distT="0" distB="0" distL="114300" distR="114300" simplePos="0" relativeHeight="251758592" behindDoc="1" locked="0" layoutInCell="1" allowOverlap="1" wp14:anchorId="04C698B0">
+            <wp:simplePos x="0" y="0"/>
+            <wp:positionH relativeFrom="column">
+              <wp:posOffset>1907540</wp:posOffset>
+            </wp:positionH>
+            <wp:positionV relativeFrom="paragraph">
+              <wp:posOffset>8890</wp:posOffset>
+            </wp:positionV>
+            <wp:extent cx="2244090" cy="2274570"/>
+            <wp:effectExtent l="0" t="0" r="3810" b="0"/>
+            <wp:wrapTight wrapText="bothSides">
+              <wp:wrapPolygon edited="0">
+                <wp:start x="0" y="0"/>
+                <wp:lineTo x="0" y="21347"/>
+                <wp:lineTo x="21453" y="21347"/>
+                <wp:lineTo x="21453" y="0"/>
+                <wp:lineTo x="0" y="0"/>
+              </wp:wrapPolygon>
+            </wp:wrapTight>
+            <wp:docPr id="101" name="Imagem 101"/>
+            <wp:cNvGraphicFramePr>
+              <a:graphicFrameLocks xmlns:a="http://schemas.openxmlformats.org/drawingml/2006/main" noChangeAspect="1"/>
+            </wp:cNvGraphicFramePr>
+            <a:graphic xmlns:a="http://schemas.openxmlformats.org/drawingml/2006/main">
+              <a:graphicData uri="http://schemas.openxmlformats.org/drawingml/2006/picture">
+                <pic:pic xmlns:pic="http://schemas.openxmlformats.org/drawingml/2006/picture">
+                  <pic:nvPicPr>
+                    <pic:cNvPr id="1" name=""/>
+                    <pic:cNvPicPr/>
+                  </pic:nvPicPr>
+                  <pic:blipFill>
+                    <a:blip r:embed="rId110">
+                      <a:extLst>
+                        <a:ext uri="{28A0092B-C50C-407E-A947-70E740481C1C}">
+                          <a14:useLocalDpi xmlns:a14="http://schemas.microsoft.com/office/drawing/2010/main" val="0"/>
+                        </a:ext>
+                      </a:extLst>
+                    </a:blip>
+                    <a:stretch>
+                      <a:fillRect/>
+                    </a:stretch>
+                  </pic:blipFill>
+                  <pic:spPr>
+                    <a:xfrm>
+                      <a:off x="0" y="0"/>
+                      <a:ext cx="2244090" cy="2274570"/>
+                    </a:xfrm>
+                    <a:prstGeom prst="rect">
+                      <a:avLst/>
+                    </a:prstGeom>
+                  </pic:spPr>
+                </pic:pic>
+              </a:graphicData>
+            </a:graphic>
+            <wp14:sizeRelH relativeFrom="margin">
+              <wp14:pctWidth>0</wp14:pctWidth>
+            </wp14:sizeRelH>
+            <wp14:sizeRelV relativeFrom="margin">
+              <wp14:pctHeight>0</wp14:pctHeight>
+            </wp14:sizeRelV>
+          </wp:anchor>
+        </w:drawing>
+      </w:r>
+      <w:r>
+        <w:rPr>
+          <w:noProof/>
+        </w:rPr>
+        <w:drawing>
+          <wp:anchor distT="0" distB="0" distL="114300" distR="114300" simplePos="0" relativeHeight="251757568" behindDoc="1" locked="0" layoutInCell="1" allowOverlap="1" wp14:anchorId="63225F98">
+            <wp:simplePos x="0" y="0"/>
+            <wp:positionH relativeFrom="column">
+              <wp:posOffset>-49161</wp:posOffset>
+            </wp:positionH>
+            <wp:positionV relativeFrom="paragraph">
+              <wp:posOffset>19050</wp:posOffset>
+            </wp:positionV>
+            <wp:extent cx="1933575" cy="2066925"/>
+            <wp:effectExtent l="0" t="0" r="9525" b="9525"/>
+            <wp:wrapTight wrapText="bothSides">
+              <wp:wrapPolygon edited="0">
+                <wp:start x="0" y="0"/>
+                <wp:lineTo x="0" y="21500"/>
+                <wp:lineTo x="21494" y="21500"/>
+                <wp:lineTo x="21494" y="0"/>
+                <wp:lineTo x="0" y="0"/>
+              </wp:wrapPolygon>
+            </wp:wrapTight>
+            <wp:docPr id="97" name="Imagem 97"/>
+            <wp:cNvGraphicFramePr>
+              <a:graphicFrameLocks xmlns:a="http://schemas.openxmlformats.org/drawingml/2006/main" noChangeAspect="1"/>
+            </wp:cNvGraphicFramePr>
+            <a:graphic xmlns:a="http://schemas.openxmlformats.org/drawingml/2006/main">
+              <a:graphicData uri="http://schemas.openxmlformats.org/drawingml/2006/picture">
+                <pic:pic xmlns:pic="http://schemas.openxmlformats.org/drawingml/2006/picture">
+                  <pic:nvPicPr>
+                    <pic:cNvPr id="1" name=""/>
+                    <pic:cNvPicPr/>
+                  </pic:nvPicPr>
+                  <pic:blipFill>
+                    <a:blip r:embed="rId111">
+                      <a:extLst>
+                        <a:ext uri="{28A0092B-C50C-407E-A947-70E740481C1C}">
+                          <a14:useLocalDpi xmlns:a14="http://schemas.microsoft.com/office/drawing/2010/main" val="0"/>
+                        </a:ext>
+                      </a:extLst>
+                    </a:blip>
+                    <a:stretch>
+                      <a:fillRect/>
+                    </a:stretch>
+                  </pic:blipFill>
+                  <pic:spPr>
+                    <a:xfrm>
+                      <a:off x="0" y="0"/>
+                      <a:ext cx="1933575" cy="2066925"/>
+                    </a:xfrm>
+                    <a:prstGeom prst="rect">
+                      <a:avLst/>
+                    </a:prstGeom>
+                  </pic:spPr>
+                </pic:pic>
+              </a:graphicData>
+            </a:graphic>
+          </wp:anchor>
+        </w:drawing>
+      </w:r>
+    </w:p>
+    <w:p/>
+    <w:p/>
+    <w:p/>
+    <w:p/>
+    <w:p/>
+    <w:p/>
+    <w:p/>
+    <w:p>
+      <w:r>
+        <w:rPr>
+          <w:noProof/>
+        </w:rPr>
+        <w:drawing>
+          <wp:anchor distT="0" distB="0" distL="114300" distR="114300" simplePos="0" relativeHeight="251760640" behindDoc="1" locked="0" layoutInCell="1" allowOverlap="1" wp14:anchorId="1E9AD702">
+            <wp:simplePos x="0" y="0"/>
+            <wp:positionH relativeFrom="column">
+              <wp:posOffset>1056640</wp:posOffset>
+            </wp:positionH>
+            <wp:positionV relativeFrom="paragraph">
+              <wp:posOffset>285750</wp:posOffset>
+            </wp:positionV>
+            <wp:extent cx="4523740" cy="2264410"/>
+            <wp:effectExtent l="0" t="0" r="0" b="2540"/>
+            <wp:wrapTight wrapText="bothSides">
+              <wp:wrapPolygon edited="0">
+                <wp:start x="0" y="0"/>
+                <wp:lineTo x="0" y="21443"/>
+                <wp:lineTo x="21467" y="21443"/>
+                <wp:lineTo x="21467" y="0"/>
+                <wp:lineTo x="0" y="0"/>
+              </wp:wrapPolygon>
+            </wp:wrapTight>
+            <wp:docPr id="104" name="Imagem 104"/>
+            <wp:cNvGraphicFramePr>
+              <a:graphicFrameLocks xmlns:a="http://schemas.openxmlformats.org/drawingml/2006/main" noChangeAspect="1"/>
+            </wp:cNvGraphicFramePr>
+            <a:graphic xmlns:a="http://schemas.openxmlformats.org/drawingml/2006/main">
+              <a:graphicData uri="http://schemas.openxmlformats.org/drawingml/2006/picture">
+                <pic:pic xmlns:pic="http://schemas.openxmlformats.org/drawingml/2006/picture">
+                  <pic:nvPicPr>
+                    <pic:cNvPr id="1" name=""/>
+                    <pic:cNvPicPr/>
+                  </pic:nvPicPr>
+                  <pic:blipFill>
+                    <a:blip r:embed="rId112">
+                      <a:extLst>
+                        <a:ext uri="{28A0092B-C50C-407E-A947-70E740481C1C}">
+                          <a14:useLocalDpi xmlns:a14="http://schemas.microsoft.com/office/drawing/2010/main" val="0"/>
+                        </a:ext>
+                      </a:extLst>
+                    </a:blip>
+                    <a:stretch>
+                      <a:fillRect/>
+                    </a:stretch>
+                  </pic:blipFill>
+                  <pic:spPr>
+                    <a:xfrm>
+                      <a:off x="0" y="0"/>
+                      <a:ext cx="4523740" cy="2264410"/>
+                    </a:xfrm>
+                    <a:prstGeom prst="rect">
+                      <a:avLst/>
+                    </a:prstGeom>
+                  </pic:spPr>
+                </pic:pic>
+              </a:graphicData>
+            </a:graphic>
+            <wp14:sizeRelV relativeFrom="margin">
+              <wp14:pctHeight>0</wp14:pctHeight>
+            </wp14:sizeRelV>
+          </wp:anchor>
+        </w:drawing>
+      </w:r>
+      <w:r>
+        <w:rPr>
+          <w:noProof/>
+        </w:rPr>
+        <w:drawing>
+          <wp:anchor distT="0" distB="0" distL="114300" distR="114300" simplePos="0" relativeHeight="251759616" behindDoc="1" locked="0" layoutInCell="1" allowOverlap="1" wp14:anchorId="67547A68">
+            <wp:simplePos x="0" y="0"/>
+            <wp:positionH relativeFrom="column">
+              <wp:posOffset>-655409</wp:posOffset>
+            </wp:positionH>
+            <wp:positionV relativeFrom="paragraph">
+              <wp:posOffset>297933</wp:posOffset>
+            </wp:positionV>
+            <wp:extent cx="1714500" cy="1152525"/>
+            <wp:effectExtent l="0" t="0" r="0" b="9525"/>
+            <wp:wrapTight wrapText="bothSides">
+              <wp:wrapPolygon edited="0">
+                <wp:start x="0" y="0"/>
+                <wp:lineTo x="0" y="21421"/>
+                <wp:lineTo x="21360" y="21421"/>
+                <wp:lineTo x="21360" y="0"/>
+                <wp:lineTo x="0" y="0"/>
+              </wp:wrapPolygon>
+            </wp:wrapTight>
+            <wp:docPr id="102" name="Imagem 102"/>
+            <wp:cNvGraphicFramePr>
+              <a:graphicFrameLocks xmlns:a="http://schemas.openxmlformats.org/drawingml/2006/main" noChangeAspect="1"/>
+            </wp:cNvGraphicFramePr>
+            <a:graphic xmlns:a="http://schemas.openxmlformats.org/drawingml/2006/main">
+              <a:graphicData uri="http://schemas.openxmlformats.org/drawingml/2006/picture">
+                <pic:pic xmlns:pic="http://schemas.openxmlformats.org/drawingml/2006/picture">
+                  <pic:nvPicPr>
+                    <pic:cNvPr id="1" name=""/>
+                    <pic:cNvPicPr/>
+                  </pic:nvPicPr>
+                  <pic:blipFill>
+                    <a:blip r:embed="rId113">
+                      <a:extLst>
+                        <a:ext uri="{28A0092B-C50C-407E-A947-70E740481C1C}">
+                          <a14:useLocalDpi xmlns:a14="http://schemas.microsoft.com/office/drawing/2010/main" val="0"/>
+                        </a:ext>
+                      </a:extLst>
+                    </a:blip>
+                    <a:stretch>
+                      <a:fillRect/>
+                    </a:stretch>
+                  </pic:blipFill>
+                  <pic:spPr>
+                    <a:xfrm>
+                      <a:off x="0" y="0"/>
+                      <a:ext cx="1714500" cy="1152525"/>
+                    </a:xfrm>
+                    <a:prstGeom prst="rect">
+                      <a:avLst/>
+                    </a:prstGeom>
+                  </pic:spPr>
+                </pic:pic>
+              </a:graphicData>
+            </a:graphic>
+          </wp:anchor>
+        </w:drawing>
+      </w:r>
+      <w:r>
+        <w:t>64-</w:t>
+      </w:r>
+      <w:r>
+        <w:t xml:space="preserve"> Incluímos uma porcentagem de 50% para cada inputs do nosso formulário.</w:t>
+      </w:r>
+    </w:p>
+    <w:p>
+      <w:pPr>
+        <w:rPr>
+          <w:noProof/>
+        </w:rPr>
+      </w:pPr>
+    </w:p>
+    <w:p>
+      <w:pPr>
+        <w:rPr>
+          <w:noProof/>
+        </w:rPr>
+      </w:pPr>
+    </w:p>
+    <w:p>
+      <w:pPr>
+        <w:rPr>
+          <w:noProof/>
+        </w:rPr>
+      </w:pPr>
+    </w:p>
+    <w:p>
+      <w:pPr>
+        <w:rPr>
+          <w:noProof/>
+        </w:rPr>
+      </w:pPr>
+    </w:p>
+    <w:p>
+      <w:pPr>
+        <w:rPr>
+          <w:noProof/>
+        </w:rPr>
+      </w:pPr>
+    </w:p>
+    <w:p>
+      <w:pPr>
+        <w:rPr>
+          <w:noProof/>
+        </w:rPr>
+      </w:pPr>
+      <w:r>
+        <w:rPr>
+          <w:noProof/>
+        </w:rPr>
+        <w:t>65- Inserimos um textarea(Input</w:t>
+      </w:r>
+      <w:r>
+        <w:rPr>
+          <w:noProof/>
+        </w:rPr>
+        <w:t>s de mensagem)em baixo do input telefone e aumentamos o tamanho da coluna para ficar alinahdo com outros inputs.</w:t>
+      </w:r>
       <w:r>
         <w:rPr>
           <w:noProof/>
@@ -10872,15 +11148,1157 @@
         <w:t xml:space="preserve"> </w:t>
       </w:r>
     </w:p>
-    <w:p/>
-    <w:p/>
-    <w:p/>
-    <w:p>
+    <w:p>
+      <w:pPr>
+        <w:rPr>
+          <w:noProof/>
+        </w:rPr>
+      </w:pPr>
+      <w:r>
+        <w:rPr>
+          <w:noProof/>
+        </w:rPr>
+        <w:drawing>
+          <wp:anchor distT="0" distB="0" distL="114300" distR="114300" simplePos="0" relativeHeight="251761664" behindDoc="1" locked="0" layoutInCell="1" allowOverlap="1" wp14:anchorId="095A1200">
+            <wp:simplePos x="0" y="0"/>
+            <wp:positionH relativeFrom="column">
+              <wp:posOffset>-410815</wp:posOffset>
+            </wp:positionH>
+            <wp:positionV relativeFrom="paragraph">
+              <wp:posOffset>130810</wp:posOffset>
+            </wp:positionV>
+            <wp:extent cx="4362450" cy="2413000"/>
+            <wp:effectExtent l="0" t="0" r="0" b="6350"/>
+            <wp:wrapTight wrapText="bothSides">
+              <wp:wrapPolygon edited="0">
+                <wp:start x="0" y="0"/>
+                <wp:lineTo x="0" y="21486"/>
+                <wp:lineTo x="21506" y="21486"/>
+                <wp:lineTo x="21506" y="0"/>
+                <wp:lineTo x="0" y="0"/>
+              </wp:wrapPolygon>
+            </wp:wrapTight>
+            <wp:docPr id="105" name="Imagem 105"/>
+            <wp:cNvGraphicFramePr>
+              <a:graphicFrameLocks xmlns:a="http://schemas.openxmlformats.org/drawingml/2006/main" noChangeAspect="1"/>
+            </wp:cNvGraphicFramePr>
+            <a:graphic xmlns:a="http://schemas.openxmlformats.org/drawingml/2006/main">
+              <a:graphicData uri="http://schemas.openxmlformats.org/drawingml/2006/picture">
+                <pic:pic xmlns:pic="http://schemas.openxmlformats.org/drawingml/2006/picture">
+                  <pic:nvPicPr>
+                    <pic:cNvPr id="1" name=""/>
+                    <pic:cNvPicPr/>
+                  </pic:nvPicPr>
+                  <pic:blipFill>
+                    <a:blip r:embed="rId114">
+                      <a:extLst>
+                        <a:ext uri="{28A0092B-C50C-407E-A947-70E740481C1C}">
+                          <a14:useLocalDpi xmlns:a14="http://schemas.microsoft.com/office/drawing/2010/main" val="0"/>
+                        </a:ext>
+                      </a:extLst>
+                    </a:blip>
+                    <a:stretch>
+                      <a:fillRect/>
+                    </a:stretch>
+                  </pic:blipFill>
+                  <pic:spPr>
+                    <a:xfrm>
+                      <a:off x="0" y="0"/>
+                      <a:ext cx="4362450" cy="2413000"/>
+                    </a:xfrm>
+                    <a:prstGeom prst="rect">
+                      <a:avLst/>
+                    </a:prstGeom>
+                  </pic:spPr>
+                </pic:pic>
+              </a:graphicData>
+            </a:graphic>
+            <wp14:sizeRelV relativeFrom="margin">
+              <wp14:pctHeight>0</wp14:pctHeight>
+            </wp14:sizeRelV>
+          </wp:anchor>
+        </w:drawing>
+      </w:r>
+    </w:p>
+    <w:p>
+      <w:pPr>
+        <w:rPr>
+          <w:noProof/>
+        </w:rPr>
+      </w:pPr>
+    </w:p>
+    <w:p>
+      <w:pPr>
+        <w:rPr>
+          <w:noProof/>
+        </w:rPr>
+      </w:pPr>
+    </w:p>
+    <w:p>
+      <w:pPr>
+        <w:rPr>
+          <w:noProof/>
+        </w:rPr>
+      </w:pPr>
+    </w:p>
+    <w:p>
+      <w:pPr>
+        <w:rPr>
+          <w:noProof/>
+        </w:rPr>
+      </w:pPr>
+    </w:p>
+    <w:p>
+      <w:pPr>
+        <w:rPr>
+          <w:noProof/>
+        </w:rPr>
+      </w:pPr>
+    </w:p>
+    <w:p>
+      <w:pPr>
+        <w:rPr>
+          <w:noProof/>
+        </w:rPr>
+      </w:pPr>
+    </w:p>
+    <w:p>
+      <w:pPr>
+        <w:rPr>
+          <w:noProof/>
+        </w:rPr>
+      </w:pPr>
+    </w:p>
+    <w:p>
+      <w:pPr>
+        <w:rPr>
+          <w:noProof/>
+        </w:rPr>
+      </w:pPr>
+    </w:p>
+    <w:p>
+      <w:pPr>
+        <w:rPr>
+          <w:noProof/>
+        </w:rPr>
+      </w:pPr>
+      <w:r>
+        <w:rPr>
+          <w:noProof/>
+        </w:rPr>
+        <w:lastRenderedPageBreak/>
+        <w:drawing>
+          <wp:anchor distT="0" distB="0" distL="114300" distR="114300" simplePos="0" relativeHeight="251762688" behindDoc="1" locked="0" layoutInCell="1" allowOverlap="1" wp14:anchorId="560499AC">
+            <wp:simplePos x="0" y="0"/>
+            <wp:positionH relativeFrom="column">
+              <wp:posOffset>-453390</wp:posOffset>
+            </wp:positionH>
+            <wp:positionV relativeFrom="paragraph">
+              <wp:posOffset>13970</wp:posOffset>
+            </wp:positionV>
+            <wp:extent cx="4704715" cy="3189605"/>
+            <wp:effectExtent l="0" t="0" r="635" b="0"/>
+            <wp:wrapTight wrapText="bothSides">
+              <wp:wrapPolygon edited="0">
+                <wp:start x="0" y="0"/>
+                <wp:lineTo x="0" y="21415"/>
+                <wp:lineTo x="21515" y="21415"/>
+                <wp:lineTo x="21515" y="0"/>
+                <wp:lineTo x="0" y="0"/>
+              </wp:wrapPolygon>
+            </wp:wrapTight>
+            <wp:docPr id="106" name="Imagem 106"/>
+            <wp:cNvGraphicFramePr>
+              <a:graphicFrameLocks xmlns:a="http://schemas.openxmlformats.org/drawingml/2006/main" noChangeAspect="1"/>
+            </wp:cNvGraphicFramePr>
+            <a:graphic xmlns:a="http://schemas.openxmlformats.org/drawingml/2006/main">
+              <a:graphicData uri="http://schemas.openxmlformats.org/drawingml/2006/picture">
+                <pic:pic xmlns:pic="http://schemas.openxmlformats.org/drawingml/2006/picture">
+                  <pic:nvPicPr>
+                    <pic:cNvPr id="1" name=""/>
+                    <pic:cNvPicPr/>
+                  </pic:nvPicPr>
+                  <pic:blipFill>
+                    <a:blip r:embed="rId115">
+                      <a:extLst>
+                        <a:ext uri="{28A0092B-C50C-407E-A947-70E740481C1C}">
+                          <a14:useLocalDpi xmlns:a14="http://schemas.microsoft.com/office/drawing/2010/main" val="0"/>
+                        </a:ext>
+                      </a:extLst>
+                    </a:blip>
+                    <a:stretch>
+                      <a:fillRect/>
+                    </a:stretch>
+                  </pic:blipFill>
+                  <pic:spPr>
+                    <a:xfrm>
+                      <a:off x="0" y="0"/>
+                      <a:ext cx="4704715" cy="3189605"/>
+                    </a:xfrm>
+                    <a:prstGeom prst="rect">
+                      <a:avLst/>
+                    </a:prstGeom>
+                  </pic:spPr>
+                </pic:pic>
+              </a:graphicData>
+            </a:graphic>
+            <wp14:sizeRelV relativeFrom="margin">
+              <wp14:pctHeight>0</wp14:pctHeight>
+            </wp14:sizeRelV>
+          </wp:anchor>
+        </w:drawing>
+      </w:r>
+      <w:r>
+        <w:rPr>
+          <w:noProof/>
+        </w:rPr>
+        <w:t xml:space="preserve"> </w:t>
+      </w:r>
+    </w:p>
+    <w:p/>
+    <w:p/>
+    <w:p/>
+    <w:p/>
+    <w:p/>
+    <w:p/>
+    <w:p/>
+    <w:p/>
+    <w:p/>
+    <w:p/>
+    <w:p/>
+    <w:p>
+      <w:r>
+        <w:rPr>
+          <w:noProof/>
+        </w:rPr>
+        <w:drawing>
+          <wp:anchor distT="0" distB="0" distL="114300" distR="114300" simplePos="0" relativeHeight="251764736" behindDoc="1" locked="0" layoutInCell="1" allowOverlap="1" wp14:anchorId="2A3FB19D">
+            <wp:simplePos x="0" y="0"/>
+            <wp:positionH relativeFrom="margin">
+              <wp:posOffset>2640448</wp:posOffset>
+            </wp:positionH>
+            <wp:positionV relativeFrom="paragraph">
+              <wp:posOffset>646607</wp:posOffset>
+            </wp:positionV>
+            <wp:extent cx="2867425" cy="1543265"/>
+            <wp:effectExtent l="0" t="0" r="9525" b="0"/>
+            <wp:wrapTight wrapText="bothSides">
+              <wp:wrapPolygon edited="0">
+                <wp:start x="0" y="0"/>
+                <wp:lineTo x="0" y="21333"/>
+                <wp:lineTo x="21528" y="21333"/>
+                <wp:lineTo x="21528" y="0"/>
+                <wp:lineTo x="0" y="0"/>
+              </wp:wrapPolygon>
+            </wp:wrapTight>
+            <wp:docPr id="109" name="Imagem 109"/>
+            <wp:cNvGraphicFramePr>
+              <a:graphicFrameLocks xmlns:a="http://schemas.openxmlformats.org/drawingml/2006/main" noChangeAspect="1"/>
+            </wp:cNvGraphicFramePr>
+            <a:graphic xmlns:a="http://schemas.openxmlformats.org/drawingml/2006/main">
+              <a:graphicData uri="http://schemas.openxmlformats.org/drawingml/2006/picture">
+                <pic:pic xmlns:pic="http://schemas.openxmlformats.org/drawingml/2006/picture">
+                  <pic:nvPicPr>
+                    <pic:cNvPr id="1" name=""/>
+                    <pic:cNvPicPr/>
+                  </pic:nvPicPr>
+                  <pic:blipFill>
+                    <a:blip r:embed="rId116">
+                      <a:extLst>
+                        <a:ext uri="{28A0092B-C50C-407E-A947-70E740481C1C}">
+                          <a14:useLocalDpi xmlns:a14="http://schemas.microsoft.com/office/drawing/2010/main" val="0"/>
+                        </a:ext>
+                      </a:extLst>
+                    </a:blip>
+                    <a:stretch>
+                      <a:fillRect/>
+                    </a:stretch>
+                  </pic:blipFill>
+                  <pic:spPr>
+                    <a:xfrm>
+                      <a:off x="0" y="0"/>
+                      <a:ext cx="2867425" cy="1543265"/>
+                    </a:xfrm>
+                    <a:prstGeom prst="rect">
+                      <a:avLst/>
+                    </a:prstGeom>
+                  </pic:spPr>
+                </pic:pic>
+              </a:graphicData>
+            </a:graphic>
+          </wp:anchor>
+        </w:drawing>
+      </w:r>
+      <w:r>
+        <w:rPr>
+          <w:noProof/>
+        </w:rPr>
+        <w:drawing>
+          <wp:anchor distT="0" distB="0" distL="114300" distR="114300" simplePos="0" relativeHeight="251763712" behindDoc="1" locked="0" layoutInCell="1" allowOverlap="1" wp14:anchorId="7089CF06">
+            <wp:simplePos x="0" y="0"/>
+            <wp:positionH relativeFrom="column">
+              <wp:posOffset>-920322</wp:posOffset>
+            </wp:positionH>
+            <wp:positionV relativeFrom="paragraph">
+              <wp:posOffset>572785</wp:posOffset>
+            </wp:positionV>
+            <wp:extent cx="3524250" cy="3324225"/>
+            <wp:effectExtent l="0" t="0" r="0" b="9525"/>
+            <wp:wrapTight wrapText="bothSides">
+              <wp:wrapPolygon edited="0">
+                <wp:start x="0" y="0"/>
+                <wp:lineTo x="0" y="21538"/>
+                <wp:lineTo x="21483" y="21538"/>
+                <wp:lineTo x="21483" y="0"/>
+                <wp:lineTo x="0" y="0"/>
+              </wp:wrapPolygon>
+            </wp:wrapTight>
+            <wp:docPr id="107" name="Imagem 107"/>
+            <wp:cNvGraphicFramePr>
+              <a:graphicFrameLocks xmlns:a="http://schemas.openxmlformats.org/drawingml/2006/main" noChangeAspect="1"/>
+            </wp:cNvGraphicFramePr>
+            <a:graphic xmlns:a="http://schemas.openxmlformats.org/drawingml/2006/main">
+              <a:graphicData uri="http://schemas.openxmlformats.org/drawingml/2006/picture">
+                <pic:pic xmlns:pic="http://schemas.openxmlformats.org/drawingml/2006/picture">
+                  <pic:nvPicPr>
+                    <pic:cNvPr id="1" name=""/>
+                    <pic:cNvPicPr/>
+                  </pic:nvPicPr>
+                  <pic:blipFill>
+                    <a:blip r:embed="rId117">
+                      <a:extLst>
+                        <a:ext uri="{28A0092B-C50C-407E-A947-70E740481C1C}">
+                          <a14:useLocalDpi xmlns:a14="http://schemas.microsoft.com/office/drawing/2010/main" val="0"/>
+                        </a:ext>
+                      </a:extLst>
+                    </a:blip>
+                    <a:stretch>
+                      <a:fillRect/>
+                    </a:stretch>
+                  </pic:blipFill>
+                  <pic:spPr>
+                    <a:xfrm>
+                      <a:off x="0" y="0"/>
+                      <a:ext cx="3524250" cy="3324225"/>
+                    </a:xfrm>
+                    <a:prstGeom prst="rect">
+                      <a:avLst/>
+                    </a:prstGeom>
+                  </pic:spPr>
+                </pic:pic>
+              </a:graphicData>
+            </a:graphic>
+          </wp:anchor>
+        </w:drawing>
+      </w:r>
+      <w:r>
+        <w:t>66-</w:t>
+      </w:r>
+      <w:r>
+        <w:t xml:space="preserve"> </w:t>
+      </w:r>
+      <w:r>
+        <w:t xml:space="preserve">Trabalhando como o input </w:t>
+      </w:r>
+      <w:proofErr w:type="spellStart"/>
+      <w:r>
+        <w:t>r</w:t>
+      </w:r>
+      <w:r>
+        <w:t>a</w:t>
+      </w:r>
+      <w:r>
+        <w:t>dio</w:t>
+      </w:r>
+      <w:proofErr w:type="spellEnd"/>
+      <w:r>
+        <w:t xml:space="preserve"> em nosso formulário inserimos o </w:t>
+      </w:r>
+      <w:proofErr w:type="spellStart"/>
+      <w:r>
+        <w:t>label</w:t>
+      </w:r>
+      <w:proofErr w:type="spellEnd"/>
+      <w:r>
+        <w:t xml:space="preserve"> e os inputs radio conforme código a baixo e transformamos que somente uma opção poder ser escolhida utilizando o mesmo nome na palavra </w:t>
+      </w:r>
+      <w:proofErr w:type="spellStart"/>
+      <w:r>
+        <w:t>name</w:t>
+      </w:r>
+      <w:proofErr w:type="spellEnd"/>
+      <w:r>
+        <w:t xml:space="preserve"> do código.</w:t>
+      </w:r>
+    </w:p>
+    <w:p/>
+    <w:p/>
+    <w:p/>
+    <w:p/>
+    <w:p/>
+    <w:p/>
+    <w:p/>
+    <w:p>
+      <w:pPr>
+        <w:rPr>
+          <w:noProof/>
+        </w:rPr>
+      </w:pPr>
+      <w:r>
+        <w:rPr>
+          <w:noProof/>
+        </w:rPr>
+        <w:drawing>
+          <wp:anchor distT="0" distB="0" distL="114300" distR="114300" simplePos="0" relativeHeight="251765760" behindDoc="1" locked="0" layoutInCell="1" allowOverlap="1" wp14:anchorId="59C3C6CE">
+            <wp:simplePos x="0" y="0"/>
+            <wp:positionH relativeFrom="column">
+              <wp:posOffset>-527818</wp:posOffset>
+            </wp:positionH>
+            <wp:positionV relativeFrom="paragraph">
+              <wp:posOffset>285396</wp:posOffset>
+            </wp:positionV>
+            <wp:extent cx="3924300" cy="666750"/>
+            <wp:effectExtent l="0" t="0" r="0" b="0"/>
+            <wp:wrapTight wrapText="bothSides">
+              <wp:wrapPolygon edited="0">
+                <wp:start x="0" y="0"/>
+                <wp:lineTo x="0" y="20983"/>
+                <wp:lineTo x="21495" y="20983"/>
+                <wp:lineTo x="21495" y="0"/>
+                <wp:lineTo x="0" y="0"/>
+              </wp:wrapPolygon>
+            </wp:wrapTight>
+            <wp:docPr id="110" name="Imagem 110"/>
+            <wp:cNvGraphicFramePr>
+              <a:graphicFrameLocks xmlns:a="http://schemas.openxmlformats.org/drawingml/2006/main" noChangeAspect="1"/>
+            </wp:cNvGraphicFramePr>
+            <a:graphic xmlns:a="http://schemas.openxmlformats.org/drawingml/2006/main">
+              <a:graphicData uri="http://schemas.openxmlformats.org/drawingml/2006/picture">
+                <pic:pic xmlns:pic="http://schemas.openxmlformats.org/drawingml/2006/picture">
+                  <pic:nvPicPr>
+                    <pic:cNvPr id="1" name=""/>
+                    <pic:cNvPicPr/>
+                  </pic:nvPicPr>
+                  <pic:blipFill>
+                    <a:blip r:embed="rId118">
+                      <a:extLst>
+                        <a:ext uri="{28A0092B-C50C-407E-A947-70E740481C1C}">
+                          <a14:useLocalDpi xmlns:a14="http://schemas.microsoft.com/office/drawing/2010/main" val="0"/>
+                        </a:ext>
+                      </a:extLst>
+                    </a:blip>
+                    <a:stretch>
+                      <a:fillRect/>
+                    </a:stretch>
+                  </pic:blipFill>
+                  <pic:spPr>
+                    <a:xfrm>
+                      <a:off x="0" y="0"/>
+                      <a:ext cx="3924300" cy="666750"/>
+                    </a:xfrm>
+                    <a:prstGeom prst="rect">
+                      <a:avLst/>
+                    </a:prstGeom>
+                  </pic:spPr>
+                </pic:pic>
+              </a:graphicData>
+            </a:graphic>
+          </wp:anchor>
+        </w:drawing>
+      </w:r>
+      <w:r>
+        <w:t>67-</w:t>
+      </w:r>
+      <w:r>
+        <w:t xml:space="preserve"> </w:t>
+      </w:r>
+      <w:r>
+        <w:t xml:space="preserve">Inserimos um parágrafo em cima da </w:t>
+      </w:r>
+      <w:proofErr w:type="spellStart"/>
+      <w:r>
+        <w:t>label</w:t>
+      </w:r>
+      <w:proofErr w:type="spellEnd"/>
+      <w:r>
+        <w:t xml:space="preserve"> radio-box telefone</w:t>
+      </w:r>
+      <w:r>
+        <w:t>.</w:t>
+      </w:r>
+      <w:r>
+        <w:rPr>
+          <w:noProof/>
+        </w:rPr>
+        <w:t xml:space="preserve"> </w:t>
+      </w:r>
+    </w:p>
+    <w:p/>
+    <w:p/>
+    <w:p/>
+    <w:p>
+      <w:pPr>
+        <w:rPr>
+          <w:noProof/>
+        </w:rPr>
+      </w:pPr>
+      <w:r>
+        <w:rPr>
+          <w:noProof/>
+        </w:rPr>
+        <w:lastRenderedPageBreak/>
+        <w:drawing>
+          <wp:anchor distT="0" distB="0" distL="114300" distR="114300" simplePos="0" relativeHeight="251766784" behindDoc="1" locked="0" layoutInCell="1" allowOverlap="1" wp14:anchorId="1A2C1574">
+            <wp:simplePos x="0" y="0"/>
+            <wp:positionH relativeFrom="column">
+              <wp:posOffset>-622935</wp:posOffset>
+            </wp:positionH>
+            <wp:positionV relativeFrom="paragraph">
+              <wp:posOffset>385312</wp:posOffset>
+            </wp:positionV>
+            <wp:extent cx="4362450" cy="2009775"/>
+            <wp:effectExtent l="0" t="0" r="0" b="9525"/>
+            <wp:wrapTight wrapText="bothSides">
+              <wp:wrapPolygon edited="0">
+                <wp:start x="0" y="0"/>
+                <wp:lineTo x="0" y="21498"/>
+                <wp:lineTo x="21506" y="21498"/>
+                <wp:lineTo x="21506" y="0"/>
+                <wp:lineTo x="0" y="0"/>
+              </wp:wrapPolygon>
+            </wp:wrapTight>
+            <wp:docPr id="111" name="Imagem 111"/>
+            <wp:cNvGraphicFramePr>
+              <a:graphicFrameLocks xmlns:a="http://schemas.openxmlformats.org/drawingml/2006/main" noChangeAspect="1"/>
+            </wp:cNvGraphicFramePr>
+            <a:graphic xmlns:a="http://schemas.openxmlformats.org/drawingml/2006/main">
+              <a:graphicData uri="http://schemas.openxmlformats.org/drawingml/2006/picture">
+                <pic:pic xmlns:pic="http://schemas.openxmlformats.org/drawingml/2006/picture">
+                  <pic:nvPicPr>
+                    <pic:cNvPr id="1" name=""/>
+                    <pic:cNvPicPr/>
+                  </pic:nvPicPr>
+                  <pic:blipFill>
+                    <a:blip r:embed="rId119">
+                      <a:extLst>
+                        <a:ext uri="{28A0092B-C50C-407E-A947-70E740481C1C}">
+                          <a14:useLocalDpi xmlns:a14="http://schemas.microsoft.com/office/drawing/2010/main" val="0"/>
+                        </a:ext>
+                      </a:extLst>
+                    </a:blip>
+                    <a:stretch>
+                      <a:fillRect/>
+                    </a:stretch>
+                  </pic:blipFill>
+                  <pic:spPr>
+                    <a:xfrm>
+                      <a:off x="0" y="0"/>
+                      <a:ext cx="4362450" cy="2009775"/>
+                    </a:xfrm>
+                    <a:prstGeom prst="rect">
+                      <a:avLst/>
+                    </a:prstGeom>
+                  </pic:spPr>
+                </pic:pic>
+              </a:graphicData>
+            </a:graphic>
+          </wp:anchor>
+        </w:drawing>
+      </w:r>
+      <w:r>
+        <w:t>68-</w:t>
+      </w:r>
+      <w:r>
+        <w:t xml:space="preserve"> Adicionamos uma </w:t>
+      </w:r>
+      <w:proofErr w:type="spellStart"/>
+      <w:r>
+        <w:t>div</w:t>
+      </w:r>
+      <w:proofErr w:type="spellEnd"/>
+      <w:r>
+        <w:t xml:space="preserve"> </w:t>
+      </w:r>
+      <w:r>
+        <w:t xml:space="preserve">envolvendo o parágrafo como prefere o nosso contato e as </w:t>
+      </w:r>
+      <w:proofErr w:type="spellStart"/>
+      <w:r>
+        <w:t>label</w:t>
+      </w:r>
+      <w:proofErr w:type="spellEnd"/>
+      <w:r>
+        <w:t xml:space="preserve"> e inputs r</w:t>
+      </w:r>
+      <w:r>
+        <w:t>á</w:t>
+      </w:r>
+      <w:r>
+        <w:t>dio.</w:t>
+      </w:r>
+    </w:p>
+    <w:p/>
+    <w:p/>
+    <w:p/>
+    <w:p/>
+    <w:p/>
+    <w:p/>
+    <w:p/>
+    <w:p>
+      <w:pPr>
+        <w:rPr>
+          <w:noProof/>
+        </w:rPr>
+      </w:pPr>
+      <w:r>
+        <w:rPr>
+          <w:noProof/>
+        </w:rPr>
+        <w:drawing>
+          <wp:anchor distT="0" distB="0" distL="114300" distR="114300" simplePos="0" relativeHeight="251768832" behindDoc="1" locked="0" layoutInCell="1" allowOverlap="1" wp14:anchorId="68D4A619">
+            <wp:simplePos x="0" y="0"/>
+            <wp:positionH relativeFrom="column">
+              <wp:posOffset>-825529</wp:posOffset>
+            </wp:positionH>
+            <wp:positionV relativeFrom="paragraph">
+              <wp:posOffset>771864</wp:posOffset>
+            </wp:positionV>
+            <wp:extent cx="3743325" cy="533400"/>
+            <wp:effectExtent l="0" t="0" r="9525" b="0"/>
+            <wp:wrapTight wrapText="bothSides">
+              <wp:wrapPolygon edited="0">
+                <wp:start x="0" y="0"/>
+                <wp:lineTo x="0" y="20829"/>
+                <wp:lineTo x="21545" y="20829"/>
+                <wp:lineTo x="21545" y="0"/>
+                <wp:lineTo x="0" y="0"/>
+              </wp:wrapPolygon>
+            </wp:wrapTight>
+            <wp:docPr id="113" name="Imagem 113"/>
+            <wp:cNvGraphicFramePr>
+              <a:graphicFrameLocks xmlns:a="http://schemas.openxmlformats.org/drawingml/2006/main" noChangeAspect="1"/>
+            </wp:cNvGraphicFramePr>
+            <a:graphic xmlns:a="http://schemas.openxmlformats.org/drawingml/2006/main">
+              <a:graphicData uri="http://schemas.openxmlformats.org/drawingml/2006/picture">
+                <pic:pic xmlns:pic="http://schemas.openxmlformats.org/drawingml/2006/picture">
+                  <pic:nvPicPr>
+                    <pic:cNvPr id="1" name=""/>
+                    <pic:cNvPicPr/>
+                  </pic:nvPicPr>
+                  <pic:blipFill>
+                    <a:blip r:embed="rId120">
+                      <a:extLst>
+                        <a:ext uri="{28A0092B-C50C-407E-A947-70E740481C1C}">
+                          <a14:useLocalDpi xmlns:a14="http://schemas.microsoft.com/office/drawing/2010/main" val="0"/>
+                        </a:ext>
+                      </a:extLst>
+                    </a:blip>
+                    <a:stretch>
+                      <a:fillRect/>
+                    </a:stretch>
+                  </pic:blipFill>
+                  <pic:spPr>
+                    <a:xfrm>
+                      <a:off x="0" y="0"/>
+                      <a:ext cx="3743325" cy="533400"/>
+                    </a:xfrm>
+                    <a:prstGeom prst="rect">
+                      <a:avLst/>
+                    </a:prstGeom>
+                  </pic:spPr>
+                </pic:pic>
+              </a:graphicData>
+            </a:graphic>
+          </wp:anchor>
+        </w:drawing>
+      </w:r>
+      <w:r>
+        <w:rPr>
+          <w:noProof/>
+        </w:rPr>
+        <w:drawing>
+          <wp:anchor distT="0" distB="0" distL="114300" distR="114300" simplePos="0" relativeHeight="251767808" behindDoc="1" locked="0" layoutInCell="1" allowOverlap="1" wp14:anchorId="4AEBE469">
+            <wp:simplePos x="0" y="0"/>
+            <wp:positionH relativeFrom="column">
+              <wp:posOffset>-867513</wp:posOffset>
+            </wp:positionH>
+            <wp:positionV relativeFrom="paragraph">
+              <wp:posOffset>275649</wp:posOffset>
+            </wp:positionV>
+            <wp:extent cx="5400040" cy="494665"/>
+            <wp:effectExtent l="0" t="0" r="0" b="635"/>
+            <wp:wrapTight wrapText="bothSides">
+              <wp:wrapPolygon edited="0">
+                <wp:start x="0" y="0"/>
+                <wp:lineTo x="0" y="20796"/>
+                <wp:lineTo x="21488" y="20796"/>
+                <wp:lineTo x="21488" y="0"/>
+                <wp:lineTo x="0" y="0"/>
+              </wp:wrapPolygon>
+            </wp:wrapTight>
+            <wp:docPr id="112" name="Imagem 112"/>
+            <wp:cNvGraphicFramePr>
+              <a:graphicFrameLocks xmlns:a="http://schemas.openxmlformats.org/drawingml/2006/main" noChangeAspect="1"/>
+            </wp:cNvGraphicFramePr>
+            <a:graphic xmlns:a="http://schemas.openxmlformats.org/drawingml/2006/main">
+              <a:graphicData uri="http://schemas.openxmlformats.org/drawingml/2006/picture">
+                <pic:pic xmlns:pic="http://schemas.openxmlformats.org/drawingml/2006/picture">
+                  <pic:nvPicPr>
+                    <pic:cNvPr id="1" name=""/>
+                    <pic:cNvPicPr/>
+                  </pic:nvPicPr>
+                  <pic:blipFill>
+                    <a:blip r:embed="rId121">
+                      <a:extLst>
+                        <a:ext uri="{28A0092B-C50C-407E-A947-70E740481C1C}">
+                          <a14:useLocalDpi xmlns:a14="http://schemas.microsoft.com/office/drawing/2010/main" val="0"/>
+                        </a:ext>
+                      </a:extLst>
+                    </a:blip>
+                    <a:stretch>
+                      <a:fillRect/>
+                    </a:stretch>
+                  </pic:blipFill>
+                  <pic:spPr>
+                    <a:xfrm>
+                      <a:off x="0" y="0"/>
+                      <a:ext cx="5400040" cy="494665"/>
+                    </a:xfrm>
+                    <a:prstGeom prst="rect">
+                      <a:avLst/>
+                    </a:prstGeom>
+                  </pic:spPr>
+                </pic:pic>
+              </a:graphicData>
+            </a:graphic>
+          </wp:anchor>
+        </w:drawing>
+      </w:r>
+      <w:r>
+        <w:t>69-</w:t>
+      </w:r>
+      <w:r>
+        <w:t xml:space="preserve"> Posterior adicionamos um </w:t>
+      </w:r>
+      <w:proofErr w:type="spellStart"/>
+      <w:r>
+        <w:t>label</w:t>
+      </w:r>
+      <w:proofErr w:type="spellEnd"/>
+      <w:r>
+        <w:t xml:space="preserve"> com</w:t>
+      </w:r>
+      <w:r>
+        <w:t xml:space="preserve"> </w:t>
+      </w:r>
+      <w:proofErr w:type="gramStart"/>
+      <w:r>
+        <w:t xml:space="preserve">o </w:t>
+      </w:r>
+      <w:r>
+        <w:t>inputs</w:t>
+      </w:r>
+      <w:proofErr w:type="gramEnd"/>
+      <w:r>
+        <w:t xml:space="preserve"> </w:t>
+      </w:r>
+      <w:proofErr w:type="spellStart"/>
+      <w:r>
+        <w:t>checkbox</w:t>
+      </w:r>
+      <w:proofErr w:type="spellEnd"/>
+      <w:r>
+        <w:t>.</w:t>
+      </w:r>
+      <w:r>
+        <w:rPr>
+          <w:noProof/>
+        </w:rPr>
+        <w:t xml:space="preserve"> </w:t>
+      </w:r>
+    </w:p>
+    <w:p/>
+    <w:p/>
+    <w:p/>
+    <w:p/>
+    <w:p>
+      <w:pPr>
+        <w:rPr>
+          <w:noProof/>
+        </w:rPr>
+      </w:pPr>
+      <w:r>
+        <w:rPr>
+          <w:noProof/>
+        </w:rPr>
+        <w:drawing>
+          <wp:anchor distT="0" distB="0" distL="114300" distR="114300" simplePos="0" relativeHeight="251770880" behindDoc="1" locked="0" layoutInCell="1" allowOverlap="1" wp14:anchorId="1A33461B">
+            <wp:simplePos x="0" y="0"/>
+            <wp:positionH relativeFrom="column">
+              <wp:posOffset>-995650</wp:posOffset>
+            </wp:positionH>
+            <wp:positionV relativeFrom="paragraph">
+              <wp:posOffset>1892654</wp:posOffset>
+            </wp:positionV>
+            <wp:extent cx="2991267" cy="1200318"/>
+            <wp:effectExtent l="0" t="0" r="0" b="0"/>
+            <wp:wrapTight wrapText="bothSides">
+              <wp:wrapPolygon edited="0">
+                <wp:start x="0" y="0"/>
+                <wp:lineTo x="0" y="21257"/>
+                <wp:lineTo x="21462" y="21257"/>
+                <wp:lineTo x="21462" y="0"/>
+                <wp:lineTo x="0" y="0"/>
+              </wp:wrapPolygon>
+            </wp:wrapTight>
+            <wp:docPr id="116" name="Imagem 116"/>
+            <wp:cNvGraphicFramePr>
+              <a:graphicFrameLocks xmlns:a="http://schemas.openxmlformats.org/drawingml/2006/main" noChangeAspect="1"/>
+            </wp:cNvGraphicFramePr>
+            <a:graphic xmlns:a="http://schemas.openxmlformats.org/drawingml/2006/main">
+              <a:graphicData uri="http://schemas.openxmlformats.org/drawingml/2006/picture">
+                <pic:pic xmlns:pic="http://schemas.openxmlformats.org/drawingml/2006/picture">
+                  <pic:nvPicPr>
+                    <pic:cNvPr id="1" name=""/>
+                    <pic:cNvPicPr/>
+                  </pic:nvPicPr>
+                  <pic:blipFill>
+                    <a:blip r:embed="rId122">
+                      <a:extLst>
+                        <a:ext uri="{28A0092B-C50C-407E-A947-70E740481C1C}">
+                          <a14:useLocalDpi xmlns:a14="http://schemas.microsoft.com/office/drawing/2010/main" val="0"/>
+                        </a:ext>
+                      </a:extLst>
+                    </a:blip>
+                    <a:stretch>
+                      <a:fillRect/>
+                    </a:stretch>
+                  </pic:blipFill>
+                  <pic:spPr>
+                    <a:xfrm>
+                      <a:off x="0" y="0"/>
+                      <a:ext cx="2991267" cy="1200318"/>
+                    </a:xfrm>
+                    <a:prstGeom prst="rect">
+                      <a:avLst/>
+                    </a:prstGeom>
+                  </pic:spPr>
+                </pic:pic>
+              </a:graphicData>
+            </a:graphic>
+          </wp:anchor>
+        </w:drawing>
+      </w:r>
+      <w:r>
+        <w:rPr>
+          <w:noProof/>
+        </w:rPr>
+        <w:drawing>
+          <wp:anchor distT="0" distB="0" distL="114300" distR="114300" simplePos="0" relativeHeight="251769856" behindDoc="1" locked="0" layoutInCell="1" allowOverlap="1" wp14:anchorId="6268339C">
+            <wp:simplePos x="0" y="0"/>
+            <wp:positionH relativeFrom="column">
+              <wp:posOffset>-1048385</wp:posOffset>
+            </wp:positionH>
+            <wp:positionV relativeFrom="paragraph">
+              <wp:posOffset>465455</wp:posOffset>
+            </wp:positionV>
+            <wp:extent cx="5464810" cy="1427480"/>
+            <wp:effectExtent l="0" t="0" r="2540" b="1270"/>
+            <wp:wrapTight wrapText="bothSides">
+              <wp:wrapPolygon edited="0">
+                <wp:start x="0" y="0"/>
+                <wp:lineTo x="0" y="21331"/>
+                <wp:lineTo x="21535" y="21331"/>
+                <wp:lineTo x="21535" y="0"/>
+                <wp:lineTo x="0" y="0"/>
+              </wp:wrapPolygon>
+            </wp:wrapTight>
+            <wp:docPr id="115" name="Imagem 115"/>
+            <wp:cNvGraphicFramePr>
+              <a:graphicFrameLocks xmlns:a="http://schemas.openxmlformats.org/drawingml/2006/main" noChangeAspect="1"/>
+            </wp:cNvGraphicFramePr>
+            <a:graphic xmlns:a="http://schemas.openxmlformats.org/drawingml/2006/main">
+              <a:graphicData uri="http://schemas.openxmlformats.org/drawingml/2006/picture">
+                <pic:pic xmlns:pic="http://schemas.openxmlformats.org/drawingml/2006/picture">
+                  <pic:nvPicPr>
+                    <pic:cNvPr id="1" name=""/>
+                    <pic:cNvPicPr/>
+                  </pic:nvPicPr>
+                  <pic:blipFill>
+                    <a:blip r:embed="rId123">
+                      <a:extLst>
+                        <a:ext uri="{28A0092B-C50C-407E-A947-70E740481C1C}">
+                          <a14:useLocalDpi xmlns:a14="http://schemas.microsoft.com/office/drawing/2010/main" val="0"/>
+                        </a:ext>
+                      </a:extLst>
+                    </a:blip>
+                    <a:stretch>
+                      <a:fillRect/>
+                    </a:stretch>
+                  </pic:blipFill>
+                  <pic:spPr>
+                    <a:xfrm>
+                      <a:off x="0" y="0"/>
+                      <a:ext cx="5464810" cy="1427480"/>
+                    </a:xfrm>
+                    <a:prstGeom prst="rect">
+                      <a:avLst/>
+                    </a:prstGeom>
+                  </pic:spPr>
+                </pic:pic>
+              </a:graphicData>
+            </a:graphic>
+            <wp14:sizeRelH relativeFrom="margin">
+              <wp14:pctWidth>0</wp14:pctWidth>
+            </wp14:sizeRelH>
+          </wp:anchor>
+        </w:drawing>
+      </w:r>
+      <w:r>
+        <w:t>70-</w:t>
+      </w:r>
+      <w:r>
+        <w:t xml:space="preserve"> </w:t>
+      </w:r>
+      <w:r>
+        <w:t xml:space="preserve">Para colocar os inputs radio-box e </w:t>
+      </w:r>
+      <w:proofErr w:type="spellStart"/>
+      <w:r>
+        <w:t>checkbox</w:t>
+      </w:r>
+      <w:proofErr w:type="spellEnd"/>
+      <w:r>
+        <w:t xml:space="preserve"> ao lado da </w:t>
+      </w:r>
+      <w:proofErr w:type="spellStart"/>
+      <w:r>
+        <w:t>label</w:t>
+      </w:r>
+      <w:proofErr w:type="spellEnd"/>
+      <w:r>
+        <w:t xml:space="preserve"> precisamos adicionar </w:t>
+      </w:r>
+      <w:proofErr w:type="gramStart"/>
+      <w:r>
+        <w:t>o inputs</w:t>
+      </w:r>
+      <w:proofErr w:type="gramEnd"/>
+      <w:r>
+        <w:t xml:space="preserve"> dentro</w:t>
+      </w:r>
+      <w:r>
+        <w:t xml:space="preserve"> da </w:t>
+      </w:r>
+      <w:proofErr w:type="spellStart"/>
+      <w:r>
+        <w:t>label</w:t>
+      </w:r>
+      <w:proofErr w:type="spellEnd"/>
+      <w:r>
+        <w:t xml:space="preserve"> conforme imagem abaixo.</w:t>
+      </w:r>
+    </w:p>
+    <w:p/>
+    <w:p/>
+    <w:p/>
+    <w:p/>
+    <w:p/>
+    <w:p/>
+    <w:p/>
+    <w:p/>
+    <w:p/>
+    <w:p/>
+    <w:p>
+      <w:pPr>
+        <w:rPr>
+          <w:noProof/>
+        </w:rPr>
+      </w:pPr>
       <w:bookmarkStart w:id="0" w:name="_GoBack"/>
       <w:bookmarkEnd w:id="0"/>
+      <w:r>
+        <w:t>71-</w:t>
+      </w:r>
+      <w:r>
+        <w:t xml:space="preserve"> Notamos que em nosso caso o </w:t>
+      </w:r>
+      <w:proofErr w:type="spellStart"/>
+      <w:r>
+        <w:t>form</w:t>
+      </w:r>
+      <w:proofErr w:type="spellEnd"/>
+      <w:r>
+        <w:t xml:space="preserve"> inputs estava configurando como display: </w:t>
+      </w:r>
+      <w:proofErr w:type="spellStart"/>
+      <w:r>
+        <w:t>block</w:t>
+      </w:r>
+      <w:proofErr w:type="spellEnd"/>
+      <w:r>
+        <w:t xml:space="preserve"> impedido que as </w:t>
+      </w:r>
+      <w:proofErr w:type="spellStart"/>
+      <w:r>
+        <w:t>label</w:t>
+      </w:r>
+      <w:proofErr w:type="spellEnd"/>
+      <w:r>
+        <w:t xml:space="preserve"> </w:t>
+      </w:r>
+      <w:r>
+        <w:t xml:space="preserve">e os inputs de ficarem um ao lado do outro. Para resolver essa situação mudamos onde antigamente era </w:t>
+      </w:r>
+      <w:proofErr w:type="spellStart"/>
+      <w:r>
+        <w:t>form</w:t>
+      </w:r>
+      <w:proofErr w:type="spellEnd"/>
+      <w:r>
+        <w:t xml:space="preserve"> inputs trocamos para uma </w:t>
+      </w:r>
+      <w:proofErr w:type="spellStart"/>
+      <w:r>
+        <w:t>class</w:t>
+      </w:r>
+      <w:proofErr w:type="spellEnd"/>
+      <w:r>
+        <w:t xml:space="preserve"> inputs-padrão e adicionamos</w:t>
+      </w:r>
+      <w:r>
+        <w:t xml:space="preserve"> nos inputs os quais queríamos que ficassem um abaixo do outro.</w:t>
+      </w:r>
+    </w:p>
+    <w:p>
+      <w:r>
+        <w:rPr>
+          <w:noProof/>
+        </w:rPr>
+        <w:lastRenderedPageBreak/>
+        <w:drawing>
+          <wp:anchor distT="0" distB="0" distL="114300" distR="114300" simplePos="0" relativeHeight="251771904" behindDoc="1" locked="0" layoutInCell="1" allowOverlap="1" wp14:anchorId="5E7B0D5A">
+            <wp:simplePos x="0" y="0"/>
+            <wp:positionH relativeFrom="column">
+              <wp:posOffset>3108591</wp:posOffset>
+            </wp:positionH>
+            <wp:positionV relativeFrom="paragraph">
+              <wp:posOffset>15</wp:posOffset>
+            </wp:positionV>
+            <wp:extent cx="1533525" cy="971550"/>
+            <wp:effectExtent l="0" t="0" r="9525" b="0"/>
+            <wp:wrapTight wrapText="bothSides">
+              <wp:wrapPolygon edited="0">
+                <wp:start x="0" y="0"/>
+                <wp:lineTo x="0" y="21176"/>
+                <wp:lineTo x="21466" y="21176"/>
+                <wp:lineTo x="21466" y="0"/>
+                <wp:lineTo x="0" y="0"/>
+              </wp:wrapPolygon>
+            </wp:wrapTight>
+            <wp:docPr id="117" name="Imagem 117"/>
+            <wp:cNvGraphicFramePr>
+              <a:graphicFrameLocks xmlns:a="http://schemas.openxmlformats.org/drawingml/2006/main" noChangeAspect="1"/>
+            </wp:cNvGraphicFramePr>
+            <a:graphic xmlns:a="http://schemas.openxmlformats.org/drawingml/2006/main">
+              <a:graphicData uri="http://schemas.openxmlformats.org/drawingml/2006/picture">
+                <pic:pic xmlns:pic="http://schemas.openxmlformats.org/drawingml/2006/picture">
+                  <pic:nvPicPr>
+                    <pic:cNvPr id="1" name=""/>
+                    <pic:cNvPicPr/>
+                  </pic:nvPicPr>
+                  <pic:blipFill>
+                    <a:blip r:embed="rId124">
+                      <a:extLst>
+                        <a:ext uri="{28A0092B-C50C-407E-A947-70E740481C1C}">
+                          <a14:useLocalDpi xmlns:a14="http://schemas.microsoft.com/office/drawing/2010/main" val="0"/>
+                        </a:ext>
+                      </a:extLst>
+                    </a:blip>
+                    <a:stretch>
+                      <a:fillRect/>
+                    </a:stretch>
+                  </pic:blipFill>
+                  <pic:spPr>
+                    <a:xfrm>
+                      <a:off x="0" y="0"/>
+                      <a:ext cx="1533525" cy="971550"/>
+                    </a:xfrm>
+                    <a:prstGeom prst="rect">
+                      <a:avLst/>
+                    </a:prstGeom>
+                  </pic:spPr>
+                </pic:pic>
+              </a:graphicData>
+            </a:graphic>
+          </wp:anchor>
+        </w:drawing>
+      </w:r>
+      <w:r>
+        <w:rPr>
+          <w:noProof/>
+        </w:rPr>
+        <w:drawing>
+          <wp:anchor distT="0" distB="0" distL="114300" distR="114300" simplePos="0" relativeHeight="251772928" behindDoc="1" locked="0" layoutInCell="1" allowOverlap="1" wp14:anchorId="560E2CF5">
+            <wp:simplePos x="0" y="0"/>
+            <wp:positionH relativeFrom="margin">
+              <wp:posOffset>-595423</wp:posOffset>
+            </wp:positionH>
+            <wp:positionV relativeFrom="paragraph">
+              <wp:posOffset>251</wp:posOffset>
+            </wp:positionV>
+            <wp:extent cx="3695700" cy="1257300"/>
+            <wp:effectExtent l="0" t="0" r="0" b="0"/>
+            <wp:wrapTight wrapText="bothSides">
+              <wp:wrapPolygon edited="0">
+                <wp:start x="0" y="0"/>
+                <wp:lineTo x="0" y="21273"/>
+                <wp:lineTo x="21489" y="21273"/>
+                <wp:lineTo x="21489" y="0"/>
+                <wp:lineTo x="0" y="0"/>
+              </wp:wrapPolygon>
+            </wp:wrapTight>
+            <wp:docPr id="118" name="Imagem 118"/>
+            <wp:cNvGraphicFramePr>
+              <a:graphicFrameLocks xmlns:a="http://schemas.openxmlformats.org/drawingml/2006/main" noChangeAspect="1"/>
+            </wp:cNvGraphicFramePr>
+            <a:graphic xmlns:a="http://schemas.openxmlformats.org/drawingml/2006/main">
+              <a:graphicData uri="http://schemas.openxmlformats.org/drawingml/2006/picture">
+                <pic:pic xmlns:pic="http://schemas.openxmlformats.org/drawingml/2006/picture">
+                  <pic:nvPicPr>
+                    <pic:cNvPr id="1" name=""/>
+                    <pic:cNvPicPr/>
+                  </pic:nvPicPr>
+                  <pic:blipFill>
+                    <a:blip r:embed="rId125">
+                      <a:extLst>
+                        <a:ext uri="{28A0092B-C50C-407E-A947-70E740481C1C}">
+                          <a14:useLocalDpi xmlns:a14="http://schemas.microsoft.com/office/drawing/2010/main" val="0"/>
+                        </a:ext>
+                      </a:extLst>
+                    </a:blip>
+                    <a:stretch>
+                      <a:fillRect/>
+                    </a:stretch>
+                  </pic:blipFill>
+                  <pic:spPr>
+                    <a:xfrm>
+                      <a:off x="0" y="0"/>
+                      <a:ext cx="3695700" cy="1257300"/>
+                    </a:xfrm>
+                    <a:prstGeom prst="rect">
+                      <a:avLst/>
+                    </a:prstGeom>
+                  </pic:spPr>
+                </pic:pic>
+              </a:graphicData>
+            </a:graphic>
+          </wp:anchor>
+        </w:drawing>
+      </w:r>
     </w:p>
     <w:sectPr>
-      <w:footerReference w:type="default" r:id="rId110"/>
+      <w:footerReference w:type="default" r:id="rId126"/>
       <w:pgSz w:w="11906" w:h="16838"/>
       <w:pgMar w:top="1418" w:right="1701" w:bottom="1418" w:left="1701" w:header="709" w:footer="709" w:gutter="0"/>
       <w:cols w:space="708"/>
@@ -12462,7 +13880,7 @@
 </file>
 
 <file path=customXml/itemProps1.xml><?xml version="1.0" encoding="utf-8"?>
-<ds:datastoreItem xmlns:ds="http://schemas.openxmlformats.org/officeDocument/2006/customXml" ds:itemID="{18673631-659E-4CAB-96D6-DAD107C6413C}">
+<ds:datastoreItem xmlns:ds="http://schemas.openxmlformats.org/officeDocument/2006/customXml" ds:itemID="{5D7066C4-7E0E-4B69-825E-8D34F1CC3C7F}">
   <ds:schemaRefs>
     <ds:schemaRef ds:uri="http://schemas.openxmlformats.org/officeDocument/2006/bibliography"/>
   </ds:schemaRefs>

</xml_diff>

<commit_message>
atualização da aula do dia 21/09/2026
</commit_message>
<xml_diff>
--- a/apostila/Projeto Space For Men.docx
+++ b/apostila/Projeto Space For Men.docx
@@ -62,10 +62,10 @@
           <wp:anchor distT="0" distB="0" distL="114300" distR="114300" simplePos="0" relativeHeight="251658240" behindDoc="1" locked="0" layoutInCell="1" allowOverlap="1" wp14:anchorId="6E048764">
             <wp:simplePos x="0" y="0"/>
             <wp:positionH relativeFrom="margin">
-              <wp:posOffset>-299085</wp:posOffset>
+              <wp:align>center</wp:align>
             </wp:positionH>
             <wp:positionV relativeFrom="paragraph">
-              <wp:posOffset>358140</wp:posOffset>
+              <wp:posOffset>274690</wp:posOffset>
             </wp:positionV>
             <wp:extent cx="6162675" cy="3676650"/>
             <wp:effectExtent l="0" t="0" r="9525" b="0"/>
@@ -193,11 +193,6 @@
       <w:pPr>
         <w:pStyle w:val="PargrafodaLista"/>
       </w:pPr>
-    </w:p>
-    <w:p>
-      <w:pPr>
-        <w:pStyle w:val="PargrafodaLista"/>
-      </w:pPr>
       <w:r>
         <w:rPr>
           <w:noProof/>
@@ -206,10 +201,10 @@
           <wp:anchor distT="0" distB="0" distL="114300" distR="114300" simplePos="0" relativeHeight="251659264" behindDoc="1" locked="0" layoutInCell="1" allowOverlap="1" wp14:anchorId="5B397181">
             <wp:simplePos x="0" y="0"/>
             <wp:positionH relativeFrom="column">
-              <wp:posOffset>748665</wp:posOffset>
+              <wp:posOffset>-324485</wp:posOffset>
             </wp:positionH>
             <wp:positionV relativeFrom="paragraph">
-              <wp:posOffset>6985</wp:posOffset>
+              <wp:posOffset>204470</wp:posOffset>
             </wp:positionV>
             <wp:extent cx="2971800" cy="1924050"/>
             <wp:effectExtent l="0" t="0" r="0" b="0"/>
@@ -266,6 +261,11 @@
           </wp:anchor>
         </w:drawing>
       </w:r>
+    </w:p>
+    <w:p>
+      <w:pPr>
+        <w:pStyle w:val="PargrafodaLista"/>
+      </w:pPr>
     </w:p>
     <w:p>
       <w:pPr>
@@ -1811,7 +1811,11 @@
         <w:t xml:space="preserve">14-Para alinhar a lista ao topo </w:t>
       </w:r>
       <w:r>
-        <w:t>de imagem utilizamos os seguinte</w:t>
+        <w:t xml:space="preserve">de imagem utilizamos </w:t>
+      </w:r>
+      <w:proofErr w:type="gramStart"/>
+      <w:r>
+        <w:t>os seguinte</w:t>
       </w:r>
       <w:r>
         <w:t xml:space="preserve"> </w:t>
@@ -1819,6 +1823,7 @@
       <w:r>
         <w:t>comando</w:t>
       </w:r>
+      <w:proofErr w:type="gramEnd"/>
       <w:r>
         <w:t>:</w:t>
       </w:r>
@@ -2278,11 +2283,19 @@
         <w:t xml:space="preserve"> principal inserimos um espaço interno tanto para </w:t>
       </w:r>
       <w:proofErr w:type="spellStart"/>
-      <w:r>
-        <w:rPr>
-          <w:sz w:val="20"/>
-        </w:rPr>
-        <w:t>cima,direita,baixo</w:t>
+      <w:proofErr w:type="gramStart"/>
+      <w:r>
+        <w:rPr>
+          <w:sz w:val="20"/>
+        </w:rPr>
+        <w:t>cima,direita</w:t>
+      </w:r>
+      <w:proofErr w:type="gramEnd"/>
+      <w:r>
+        <w:rPr>
+          <w:sz w:val="20"/>
+        </w:rPr>
+        <w:t>,baixo</w:t>
       </w:r>
       <w:proofErr w:type="spellEnd"/>
       <w:r>
@@ -2759,7 +2772,21 @@
         <w:rPr>
           <w:sz w:val="20"/>
         </w:rPr>
-        <w:t xml:space="preserve">vos no projetos produtos.html e o produtos.css  e ligamos o </w:t>
+        <w:t xml:space="preserve">vos no projetos produtos.html e o </w:t>
+      </w:r>
+      <w:proofErr w:type="gramStart"/>
+      <w:r>
+        <w:rPr>
+          <w:sz w:val="20"/>
+        </w:rPr>
+        <w:t>produtos.css  e</w:t>
+      </w:r>
+      <w:proofErr w:type="gramEnd"/>
+      <w:r>
+        <w:rPr>
+          <w:sz w:val="20"/>
+        </w:rPr>
+        <w:t xml:space="preserve"> ligamos o </w:t>
       </w:r>
       <w:proofErr w:type="spellStart"/>
       <w:r>
@@ -4882,13 +4909,27 @@
         <w:rPr>
           <w:sz w:val="20"/>
         </w:rPr>
-        <w:t xml:space="preserve"> para saber a altura </w:t>
-      </w:r>
-      <w:r>
-        <w:rPr>
-          <w:sz w:val="20"/>
-        </w:rPr>
-        <w:t xml:space="preserve"> do elemento dentro do header apertando f12</w:t>
+        <w:t xml:space="preserve"> para saber a </w:t>
+      </w:r>
+      <w:proofErr w:type="gramStart"/>
+      <w:r>
+        <w:rPr>
+          <w:sz w:val="20"/>
+        </w:rPr>
+        <w:t xml:space="preserve">altura </w:t>
+      </w:r>
+      <w:r>
+        <w:rPr>
+          <w:sz w:val="20"/>
+        </w:rPr>
+        <w:t xml:space="preserve"> do</w:t>
+      </w:r>
+      <w:proofErr w:type="gramEnd"/>
+      <w:r>
+        <w:rPr>
+          <w:sz w:val="20"/>
+        </w:rPr>
+        <w:t xml:space="preserve"> elemento dentro do header apertando f12</w:t>
       </w:r>
     </w:p>
     <w:p>
@@ -6607,11 +6648,19 @@
         </w:rPr>
         <w:t xml:space="preserve">r a </w:t>
       </w:r>
-      <w:r>
-        <w:rPr>
-          <w:sz w:val="20"/>
-        </w:rPr>
-        <w:t xml:space="preserve">nosso lista de produtos na </w:t>
+      <w:proofErr w:type="gramStart"/>
+      <w:r>
+        <w:rPr>
+          <w:sz w:val="20"/>
+        </w:rPr>
+        <w:t>nosso lista</w:t>
+      </w:r>
+      <w:proofErr w:type="gramEnd"/>
+      <w:r>
+        <w:rPr>
+          <w:sz w:val="20"/>
+        </w:rPr>
+        <w:t xml:space="preserve"> de produtos na </w:t>
       </w:r>
       <w:proofErr w:type="spellStart"/>
       <w:r>
@@ -7549,11 +7598,19 @@
         </w:rPr>
         <w:t xml:space="preserve"> </w:t>
       </w:r>
-      <w:r>
-        <w:rPr>
-          <w:sz w:val="20"/>
-        </w:rPr>
-        <w:t xml:space="preserve">No produtos </w:t>
+      <w:proofErr w:type="gramStart"/>
+      <w:r>
+        <w:rPr>
+          <w:sz w:val="20"/>
+        </w:rPr>
+        <w:t>No produtos</w:t>
+      </w:r>
+      <w:proofErr w:type="gramEnd"/>
+      <w:r>
+        <w:rPr>
+          <w:sz w:val="20"/>
+        </w:rPr>
+        <w:t xml:space="preserve"> </w:t>
       </w:r>
       <w:r>
         <w:rPr>
@@ -7943,13 +8000,27 @@
         <w:rPr>
           <w:sz w:val="20"/>
         </w:rPr>
-        <w:t xml:space="preserve"> NO </w:t>
-      </w:r>
-      <w:r>
-        <w:rPr>
-          <w:sz w:val="20"/>
-        </w:rPr>
-        <w:t>produtos li adicionamos um espaço interno cima com para baixo e para direita e esquerda</w:t>
+        <w:t xml:space="preserve"> </w:t>
+      </w:r>
+      <w:proofErr w:type="gramStart"/>
+      <w:r>
+        <w:rPr>
+          <w:sz w:val="20"/>
+        </w:rPr>
+        <w:t xml:space="preserve">NO </w:t>
+      </w:r>
+      <w:r>
+        <w:rPr>
+          <w:sz w:val="20"/>
+        </w:rPr>
+        <w:t>produtos</w:t>
+      </w:r>
+      <w:proofErr w:type="gramEnd"/>
+      <w:r>
+        <w:rPr>
+          <w:sz w:val="20"/>
+        </w:rPr>
+        <w:t xml:space="preserve"> li adicionamos um espaço interno cima com para baixo e para direita e esquerda</w:t>
       </w:r>
       <w:r>
         <w:rPr>
@@ -12110,13 +12181,6 @@
     <w:p/>
     <w:p/>
     <w:p>
-      <w:pPr>
-        <w:rPr>
-          <w:noProof/>
-        </w:rPr>
-      </w:pPr>
-      <w:bookmarkStart w:id="0" w:name="_GoBack"/>
-      <w:bookmarkEnd w:id="0"/>
       <w:r>
         <w:t>71-</w:t>
       </w:r>
@@ -12169,6 +12233,27 @@
       <w:r>
         <w:t xml:space="preserve"> nos inputs os quais queríamos que ficassem um abaixo do outro.</w:t>
       </w:r>
+    </w:p>
+    <w:p>
+      <w:pPr>
+        <w:rPr>
+          <w:noProof/>
+        </w:rPr>
+      </w:pPr>
+    </w:p>
+    <w:p>
+      <w:pPr>
+        <w:rPr>
+          <w:noProof/>
+        </w:rPr>
+      </w:pPr>
+    </w:p>
+    <w:p>
+      <w:pPr>
+        <w:rPr>
+          <w:noProof/>
+        </w:rPr>
+      </w:pPr>
     </w:p>
     <w:p>
       <w:r>
@@ -12177,26 +12262,26 @@
         </w:rPr>
         <w:lastRenderedPageBreak/>
         <w:drawing>
-          <wp:anchor distT="0" distB="0" distL="114300" distR="114300" simplePos="0" relativeHeight="251771904" behindDoc="1" locked="0" layoutInCell="1" allowOverlap="1" wp14:anchorId="5E7B0D5A">
+          <wp:anchor distT="0" distB="0" distL="114300" distR="114300" simplePos="0" relativeHeight="251772928" behindDoc="1" locked="0" layoutInCell="1" allowOverlap="1" wp14:anchorId="560E2CF5">
             <wp:simplePos x="0" y="0"/>
-            <wp:positionH relativeFrom="column">
-              <wp:posOffset>3108591</wp:posOffset>
+            <wp:positionH relativeFrom="margin">
+              <wp:posOffset>-775749</wp:posOffset>
             </wp:positionH>
             <wp:positionV relativeFrom="paragraph">
-              <wp:posOffset>15</wp:posOffset>
+              <wp:posOffset>606</wp:posOffset>
             </wp:positionV>
-            <wp:extent cx="1533525" cy="971550"/>
-            <wp:effectExtent l="0" t="0" r="9525" b="0"/>
+            <wp:extent cx="3695700" cy="1257300"/>
+            <wp:effectExtent l="0" t="0" r="0" b="0"/>
             <wp:wrapTight wrapText="bothSides">
               <wp:wrapPolygon edited="0">
                 <wp:start x="0" y="0"/>
-                <wp:lineTo x="0" y="21176"/>
-                <wp:lineTo x="21466" y="21176"/>
-                <wp:lineTo x="21466" y="0"/>
+                <wp:lineTo x="0" y="21273"/>
+                <wp:lineTo x="21489" y="21273"/>
+                <wp:lineTo x="21489" y="0"/>
                 <wp:lineTo x="0" y="0"/>
               </wp:wrapPolygon>
             </wp:wrapTight>
-            <wp:docPr id="117" name="Imagem 117"/>
+            <wp:docPr id="118" name="Imagem 118"/>
             <wp:cNvGraphicFramePr>
               <a:graphicFrameLocks xmlns:a="http://schemas.openxmlformats.org/drawingml/2006/main" noChangeAspect="1"/>
             </wp:cNvGraphicFramePr>
@@ -12222,7 +12307,7 @@
                   <pic:spPr>
                     <a:xfrm>
                       <a:off x="0" y="0"/>
-                      <a:ext cx="1533525" cy="971550"/>
+                      <a:ext cx="3695700" cy="1257300"/>
                     </a:xfrm>
                     <a:prstGeom prst="rect">
                       <a:avLst/>
@@ -12234,31 +12319,33 @@
           </wp:anchor>
         </w:drawing>
       </w:r>
+    </w:p>
+    <w:p>
       <w:r>
         <w:rPr>
           <w:noProof/>
         </w:rPr>
         <w:drawing>
-          <wp:anchor distT="0" distB="0" distL="114300" distR="114300" simplePos="0" relativeHeight="251772928" behindDoc="1" locked="0" layoutInCell="1" allowOverlap="1" wp14:anchorId="560E2CF5">
+          <wp:anchor distT="0" distB="0" distL="114300" distR="114300" simplePos="0" relativeHeight="251771904" behindDoc="1" locked="0" layoutInCell="1" allowOverlap="1" wp14:anchorId="5E7B0D5A">
             <wp:simplePos x="0" y="0"/>
-            <wp:positionH relativeFrom="margin">
-              <wp:posOffset>-595423</wp:posOffset>
+            <wp:positionH relativeFrom="column">
+              <wp:posOffset>2938204</wp:posOffset>
             </wp:positionH>
             <wp:positionV relativeFrom="paragraph">
-              <wp:posOffset>251</wp:posOffset>
+              <wp:posOffset>19936</wp:posOffset>
             </wp:positionV>
-            <wp:extent cx="3695700" cy="1257300"/>
-            <wp:effectExtent l="0" t="0" r="0" b="0"/>
+            <wp:extent cx="1533525" cy="971550"/>
+            <wp:effectExtent l="0" t="0" r="9525" b="0"/>
             <wp:wrapTight wrapText="bothSides">
               <wp:wrapPolygon edited="0">
                 <wp:start x="0" y="0"/>
-                <wp:lineTo x="0" y="21273"/>
-                <wp:lineTo x="21489" y="21273"/>
-                <wp:lineTo x="21489" y="0"/>
+                <wp:lineTo x="0" y="21176"/>
+                <wp:lineTo x="21466" y="21176"/>
+                <wp:lineTo x="21466" y="0"/>
                 <wp:lineTo x="0" y="0"/>
               </wp:wrapPolygon>
             </wp:wrapTight>
-            <wp:docPr id="118" name="Imagem 118"/>
+            <wp:docPr id="117" name="Imagem 117"/>
             <wp:cNvGraphicFramePr>
               <a:graphicFrameLocks xmlns:a="http://schemas.openxmlformats.org/drawingml/2006/main" noChangeAspect="1"/>
             </wp:cNvGraphicFramePr>
@@ -12284,7 +12371,7 @@
                   <pic:spPr>
                     <a:xfrm>
                       <a:off x="0" y="0"/>
-                      <a:ext cx="3695700" cy="1257300"/>
+                      <a:ext cx="1533525" cy="971550"/>
                     </a:xfrm>
                     <a:prstGeom prst="rect">
                       <a:avLst/>
@@ -12297,8 +12384,1679 @@
         </w:drawing>
       </w:r>
     </w:p>
+    <w:p/>
+    <w:p/>
+    <w:p/>
+    <w:p>
+      <w:pPr>
+        <w:tabs>
+          <w:tab w:val="left" w:pos="3181"/>
+        </w:tabs>
+        <w:rPr>
+          <w:noProof/>
+        </w:rPr>
+      </w:pPr>
+      <w:r>
+        <w:rPr>
+          <w:noProof/>
+        </w:rPr>
+        <w:drawing>
+          <wp:anchor distT="0" distB="0" distL="114300" distR="114300" simplePos="0" relativeHeight="251774976" behindDoc="1" locked="0" layoutInCell="1" allowOverlap="1" wp14:anchorId="29FB4E47">
+            <wp:simplePos x="0" y="0"/>
+            <wp:positionH relativeFrom="column">
+              <wp:posOffset>-602039</wp:posOffset>
+            </wp:positionH>
+            <wp:positionV relativeFrom="paragraph">
+              <wp:posOffset>1615484</wp:posOffset>
+            </wp:positionV>
+            <wp:extent cx="1667108" cy="647790"/>
+            <wp:effectExtent l="0" t="0" r="9525" b="0"/>
+            <wp:wrapTight wrapText="bothSides">
+              <wp:wrapPolygon edited="0">
+                <wp:start x="0" y="0"/>
+                <wp:lineTo x="0" y="20965"/>
+                <wp:lineTo x="21477" y="20965"/>
+                <wp:lineTo x="21477" y="0"/>
+                <wp:lineTo x="0" y="0"/>
+              </wp:wrapPolygon>
+            </wp:wrapTight>
+            <wp:docPr id="114" name="Imagem 114"/>
+            <wp:cNvGraphicFramePr>
+              <a:graphicFrameLocks xmlns:a="http://schemas.openxmlformats.org/drawingml/2006/main" noChangeAspect="1"/>
+            </wp:cNvGraphicFramePr>
+            <a:graphic xmlns:a="http://schemas.openxmlformats.org/drawingml/2006/main">
+              <a:graphicData uri="http://schemas.openxmlformats.org/drawingml/2006/picture">
+                <pic:pic xmlns:pic="http://schemas.openxmlformats.org/drawingml/2006/picture">
+                  <pic:nvPicPr>
+                    <pic:cNvPr id="1" name=""/>
+                    <pic:cNvPicPr/>
+                  </pic:nvPicPr>
+                  <pic:blipFill>
+                    <a:blip r:embed="rId126">
+                      <a:extLst>
+                        <a:ext uri="{28A0092B-C50C-407E-A947-70E740481C1C}">
+                          <a14:useLocalDpi xmlns:a14="http://schemas.microsoft.com/office/drawing/2010/main" val="0"/>
+                        </a:ext>
+                      </a:extLst>
+                    </a:blip>
+                    <a:stretch>
+                      <a:fillRect/>
+                    </a:stretch>
+                  </pic:blipFill>
+                  <pic:spPr>
+                    <a:xfrm>
+                      <a:off x="0" y="0"/>
+                      <a:ext cx="1667108" cy="647790"/>
+                    </a:xfrm>
+                    <a:prstGeom prst="rect">
+                      <a:avLst/>
+                    </a:prstGeom>
+                  </pic:spPr>
+                </pic:pic>
+              </a:graphicData>
+            </a:graphic>
+          </wp:anchor>
+        </w:drawing>
+      </w:r>
+      <w:r>
+        <w:rPr>
+          <w:noProof/>
+        </w:rPr>
+        <w:drawing>
+          <wp:anchor distT="0" distB="0" distL="114300" distR="114300" simplePos="0" relativeHeight="251776000" behindDoc="1" locked="0" layoutInCell="1" allowOverlap="1" wp14:anchorId="6BC7748B">
+            <wp:simplePos x="0" y="0"/>
+            <wp:positionH relativeFrom="margin">
+              <wp:align>center</wp:align>
+            </wp:positionH>
+            <wp:positionV relativeFrom="paragraph">
+              <wp:posOffset>818589</wp:posOffset>
+            </wp:positionV>
+            <wp:extent cx="3343742" cy="1486107"/>
+            <wp:effectExtent l="0" t="0" r="9525" b="0"/>
+            <wp:wrapTight wrapText="bothSides">
+              <wp:wrapPolygon edited="0">
+                <wp:start x="0" y="0"/>
+                <wp:lineTo x="0" y="21323"/>
+                <wp:lineTo x="21538" y="21323"/>
+                <wp:lineTo x="21538" y="0"/>
+                <wp:lineTo x="0" y="0"/>
+              </wp:wrapPolygon>
+            </wp:wrapTight>
+            <wp:docPr id="119" name="Imagem 119"/>
+            <wp:cNvGraphicFramePr>
+              <a:graphicFrameLocks xmlns:a="http://schemas.openxmlformats.org/drawingml/2006/main" noChangeAspect="1"/>
+            </wp:cNvGraphicFramePr>
+            <a:graphic xmlns:a="http://schemas.openxmlformats.org/drawingml/2006/main">
+              <a:graphicData uri="http://schemas.openxmlformats.org/drawingml/2006/picture">
+                <pic:pic xmlns:pic="http://schemas.openxmlformats.org/drawingml/2006/picture">
+                  <pic:nvPicPr>
+                    <pic:cNvPr id="1" name=""/>
+                    <pic:cNvPicPr/>
+                  </pic:nvPicPr>
+                  <pic:blipFill>
+                    <a:blip r:embed="rId127">
+                      <a:extLst>
+                        <a:ext uri="{28A0092B-C50C-407E-A947-70E740481C1C}">
+                          <a14:useLocalDpi xmlns:a14="http://schemas.microsoft.com/office/drawing/2010/main" val="0"/>
+                        </a:ext>
+                      </a:extLst>
+                    </a:blip>
+                    <a:stretch>
+                      <a:fillRect/>
+                    </a:stretch>
+                  </pic:blipFill>
+                  <pic:spPr>
+                    <a:xfrm>
+                      <a:off x="0" y="0"/>
+                      <a:ext cx="3343742" cy="1486107"/>
+                    </a:xfrm>
+                    <a:prstGeom prst="rect">
+                      <a:avLst/>
+                    </a:prstGeom>
+                  </pic:spPr>
+                </pic:pic>
+              </a:graphicData>
+            </a:graphic>
+          </wp:anchor>
+        </w:drawing>
+      </w:r>
+      <w:r>
+        <w:rPr>
+          <w:noProof/>
+        </w:rPr>
+        <w:drawing>
+          <wp:anchor distT="0" distB="0" distL="114300" distR="114300" simplePos="0" relativeHeight="251773952" behindDoc="1" locked="0" layoutInCell="1" allowOverlap="1" wp14:anchorId="67263991">
+            <wp:simplePos x="0" y="0"/>
+            <wp:positionH relativeFrom="column">
+              <wp:posOffset>-570349</wp:posOffset>
+            </wp:positionH>
+            <wp:positionV relativeFrom="paragraph">
+              <wp:posOffset>446538</wp:posOffset>
+            </wp:positionV>
+            <wp:extent cx="5400040" cy="361315"/>
+            <wp:effectExtent l="0" t="0" r="0" b="635"/>
+            <wp:wrapTight wrapText="bothSides">
+              <wp:wrapPolygon edited="0">
+                <wp:start x="0" y="0"/>
+                <wp:lineTo x="0" y="20499"/>
+                <wp:lineTo x="21488" y="20499"/>
+                <wp:lineTo x="21488" y="0"/>
+                <wp:lineTo x="0" y="0"/>
+              </wp:wrapPolygon>
+            </wp:wrapTight>
+            <wp:docPr id="108" name="Imagem 108"/>
+            <wp:cNvGraphicFramePr>
+              <a:graphicFrameLocks xmlns:a="http://schemas.openxmlformats.org/drawingml/2006/main" noChangeAspect="1"/>
+            </wp:cNvGraphicFramePr>
+            <a:graphic xmlns:a="http://schemas.openxmlformats.org/drawingml/2006/main">
+              <a:graphicData uri="http://schemas.openxmlformats.org/drawingml/2006/picture">
+                <pic:pic xmlns:pic="http://schemas.openxmlformats.org/drawingml/2006/picture">
+                  <pic:nvPicPr>
+                    <pic:cNvPr id="1" name=""/>
+                    <pic:cNvPicPr/>
+                  </pic:nvPicPr>
+                  <pic:blipFill>
+                    <a:blip r:embed="rId128">
+                      <a:extLst>
+                        <a:ext uri="{28A0092B-C50C-407E-A947-70E740481C1C}">
+                          <a14:useLocalDpi xmlns:a14="http://schemas.microsoft.com/office/drawing/2010/main" val="0"/>
+                        </a:ext>
+                      </a:extLst>
+                    </a:blip>
+                    <a:stretch>
+                      <a:fillRect/>
+                    </a:stretch>
+                  </pic:blipFill>
+                  <pic:spPr>
+                    <a:xfrm>
+                      <a:off x="0" y="0"/>
+                      <a:ext cx="5400040" cy="361315"/>
+                    </a:xfrm>
+                    <a:prstGeom prst="rect">
+                      <a:avLst/>
+                    </a:prstGeom>
+                  </pic:spPr>
+                </pic:pic>
+              </a:graphicData>
+            </a:graphic>
+          </wp:anchor>
+        </w:drawing>
+      </w:r>
+      <w:r>
+        <w:t xml:space="preserve">72- Adicionamos uma </w:t>
+      </w:r>
+      <w:proofErr w:type="spellStart"/>
+      <w:r>
+        <w:t>class</w:t>
+      </w:r>
+      <w:proofErr w:type="spellEnd"/>
+      <w:r>
+        <w:t xml:space="preserve"> na </w:t>
+      </w:r>
+      <w:proofErr w:type="spellStart"/>
+      <w:r>
+        <w:t>label</w:t>
+      </w:r>
+      <w:proofErr w:type="spellEnd"/>
+      <w:r>
+        <w:t xml:space="preserve"> </w:t>
+      </w:r>
+      <w:proofErr w:type="spellStart"/>
+      <w:r>
+        <w:t>checkbox</w:t>
+      </w:r>
+      <w:proofErr w:type="spellEnd"/>
+      <w:r>
+        <w:t xml:space="preserve"> para dar um espaço tanto para cima como para baixo.</w:t>
+      </w:r>
+      <w:r>
+        <w:rPr>
+          <w:noProof/>
+        </w:rPr>
+        <w:t xml:space="preserve"> </w:t>
+      </w:r>
+    </w:p>
+    <w:p>
+      <w:pPr>
+        <w:tabs>
+          <w:tab w:val="left" w:pos="3181"/>
+        </w:tabs>
+      </w:pPr>
+    </w:p>
+    <w:p>
+      <w:pPr>
+        <w:tabs>
+          <w:tab w:val="left" w:pos="3181"/>
+        </w:tabs>
+      </w:pPr>
+    </w:p>
+    <w:p>
+      <w:pPr>
+        <w:tabs>
+          <w:tab w:val="left" w:pos="3181"/>
+        </w:tabs>
+      </w:pPr>
+    </w:p>
+    <w:p>
+      <w:pPr>
+        <w:tabs>
+          <w:tab w:val="left" w:pos="3181"/>
+        </w:tabs>
+      </w:pPr>
+    </w:p>
+    <w:p>
+      <w:pPr>
+        <w:tabs>
+          <w:tab w:val="left" w:pos="3181"/>
+        </w:tabs>
+      </w:pPr>
+    </w:p>
+    <w:p>
+      <w:pPr>
+        <w:tabs>
+          <w:tab w:val="left" w:pos="3181"/>
+        </w:tabs>
+      </w:pPr>
+    </w:p>
+    <w:p>
+      <w:pPr>
+        <w:tabs>
+          <w:tab w:val="left" w:pos="3181"/>
+        </w:tabs>
+      </w:pPr>
+    </w:p>
+    <w:p>
+      <w:pPr>
+        <w:tabs>
+          <w:tab w:val="left" w:pos="3181"/>
+        </w:tabs>
+      </w:pPr>
+      <w:r>
+        <w:drawing>
+          <wp:anchor distT="0" distB="0" distL="114300" distR="114300" simplePos="0" relativeHeight="251777024" behindDoc="1" locked="0" layoutInCell="1" allowOverlap="1" wp14:anchorId="299B4692">
+            <wp:simplePos x="0" y="0"/>
+            <wp:positionH relativeFrom="column">
+              <wp:posOffset>-623038</wp:posOffset>
+            </wp:positionH>
+            <wp:positionV relativeFrom="paragraph">
+              <wp:posOffset>443880</wp:posOffset>
+            </wp:positionV>
+            <wp:extent cx="3209925" cy="1495425"/>
+            <wp:effectExtent l="0" t="0" r="9525" b="9525"/>
+            <wp:wrapTight wrapText="bothSides">
+              <wp:wrapPolygon edited="0">
+                <wp:start x="0" y="0"/>
+                <wp:lineTo x="0" y="21462"/>
+                <wp:lineTo x="21536" y="21462"/>
+                <wp:lineTo x="21536" y="0"/>
+                <wp:lineTo x="0" y="0"/>
+              </wp:wrapPolygon>
+            </wp:wrapTight>
+            <wp:docPr id="120" name="Imagem 120"/>
+            <wp:cNvGraphicFramePr>
+              <a:graphicFrameLocks xmlns:a="http://schemas.openxmlformats.org/drawingml/2006/main" noChangeAspect="1"/>
+            </wp:cNvGraphicFramePr>
+            <a:graphic xmlns:a="http://schemas.openxmlformats.org/drawingml/2006/main">
+              <a:graphicData uri="http://schemas.openxmlformats.org/drawingml/2006/picture">
+                <pic:pic xmlns:pic="http://schemas.openxmlformats.org/drawingml/2006/picture">
+                  <pic:nvPicPr>
+                    <pic:cNvPr id="1" name=""/>
+                    <pic:cNvPicPr/>
+                  </pic:nvPicPr>
+                  <pic:blipFill>
+                    <a:blip r:embed="rId129">
+                      <a:extLst>
+                        <a:ext uri="{28A0092B-C50C-407E-A947-70E740481C1C}">
+                          <a14:useLocalDpi xmlns:a14="http://schemas.microsoft.com/office/drawing/2010/main" val="0"/>
+                        </a:ext>
+                      </a:extLst>
+                    </a:blip>
+                    <a:stretch>
+                      <a:fillRect/>
+                    </a:stretch>
+                  </pic:blipFill>
+                  <pic:spPr>
+                    <a:xfrm>
+                      <a:off x="0" y="0"/>
+                      <a:ext cx="3209925" cy="1495425"/>
+                    </a:xfrm>
+                    <a:prstGeom prst="rect">
+                      <a:avLst/>
+                    </a:prstGeom>
+                  </pic:spPr>
+                </pic:pic>
+              </a:graphicData>
+            </a:graphic>
+          </wp:anchor>
+        </w:drawing>
+      </w:r>
+      <w:r>
+        <w:t xml:space="preserve">73- </w:t>
+      </w:r>
+      <w:r>
+        <w:t xml:space="preserve">Inserimos um parágrafo fazendo uma pergunta qual a preferencia de horário e adicionamos </w:t>
+      </w:r>
+      <w:proofErr w:type="spellStart"/>
+      <w:r>
+        <w:t>select</w:t>
+      </w:r>
+      <w:proofErr w:type="spellEnd"/>
+      <w:r>
+        <w:t xml:space="preserve"> com </w:t>
+      </w:r>
+      <w:proofErr w:type="spellStart"/>
+      <w:r>
+        <w:t>option</w:t>
+      </w:r>
+      <w:proofErr w:type="spellEnd"/>
+      <w:r>
+        <w:t xml:space="preserve"> no </w:t>
+      </w:r>
+      <w:proofErr w:type="spellStart"/>
+      <w:r>
+        <w:t>html</w:t>
+      </w:r>
+      <w:proofErr w:type="spellEnd"/>
+      <w:r>
+        <w:t xml:space="preserve"> conforme código.</w:t>
+      </w:r>
+    </w:p>
+    <w:p>
+      <w:pPr>
+        <w:tabs>
+          <w:tab w:val="left" w:pos="3181"/>
+        </w:tabs>
+      </w:pPr>
+    </w:p>
+    <w:p>
+      <w:pPr>
+        <w:tabs>
+          <w:tab w:val="left" w:pos="3181"/>
+        </w:tabs>
+      </w:pPr>
+    </w:p>
+    <w:p>
+      <w:pPr>
+        <w:tabs>
+          <w:tab w:val="left" w:pos="3181"/>
+        </w:tabs>
+      </w:pPr>
+    </w:p>
+    <w:p>
+      <w:pPr>
+        <w:tabs>
+          <w:tab w:val="left" w:pos="3181"/>
+        </w:tabs>
+      </w:pPr>
+    </w:p>
+    <w:p>
+      <w:pPr>
+        <w:tabs>
+          <w:tab w:val="left" w:pos="3181"/>
+        </w:tabs>
+      </w:pPr>
+    </w:p>
+    <w:p>
+      <w:pPr>
+        <w:tabs>
+          <w:tab w:val="left" w:pos="3181"/>
+        </w:tabs>
+      </w:pPr>
+    </w:p>
+    <w:p>
+      <w:pPr>
+        <w:tabs>
+          <w:tab w:val="left" w:pos="3181"/>
+        </w:tabs>
+      </w:pPr>
+      <w:r>
+        <w:drawing>
+          <wp:anchor distT="0" distB="0" distL="114300" distR="114300" simplePos="0" relativeHeight="251778048" behindDoc="1" locked="0" layoutInCell="1" allowOverlap="1" wp14:anchorId="5D3463F9">
+            <wp:simplePos x="0" y="0"/>
+            <wp:positionH relativeFrom="page">
+              <wp:posOffset>510141</wp:posOffset>
+            </wp:positionH>
+            <wp:positionV relativeFrom="paragraph">
+              <wp:posOffset>588128</wp:posOffset>
+            </wp:positionV>
+            <wp:extent cx="4801235" cy="1895475"/>
+            <wp:effectExtent l="0" t="0" r="0" b="9525"/>
+            <wp:wrapTight wrapText="bothSides">
+              <wp:wrapPolygon edited="0">
+                <wp:start x="0" y="0"/>
+                <wp:lineTo x="0" y="21491"/>
+                <wp:lineTo x="21511" y="21491"/>
+                <wp:lineTo x="21511" y="0"/>
+                <wp:lineTo x="0" y="0"/>
+              </wp:wrapPolygon>
+            </wp:wrapTight>
+            <wp:docPr id="121" name="Imagem 121"/>
+            <wp:cNvGraphicFramePr>
+              <a:graphicFrameLocks xmlns:a="http://schemas.openxmlformats.org/drawingml/2006/main" noChangeAspect="1"/>
+            </wp:cNvGraphicFramePr>
+            <a:graphic xmlns:a="http://schemas.openxmlformats.org/drawingml/2006/main">
+              <a:graphicData uri="http://schemas.openxmlformats.org/drawingml/2006/picture">
+                <pic:pic xmlns:pic="http://schemas.openxmlformats.org/drawingml/2006/picture">
+                  <pic:nvPicPr>
+                    <pic:cNvPr id="1" name=""/>
+                    <pic:cNvPicPr/>
+                  </pic:nvPicPr>
+                  <pic:blipFill>
+                    <a:blip r:embed="rId130">
+                      <a:extLst>
+                        <a:ext uri="{28A0092B-C50C-407E-A947-70E740481C1C}">
+                          <a14:useLocalDpi xmlns:a14="http://schemas.microsoft.com/office/drawing/2010/main" val="0"/>
+                        </a:ext>
+                      </a:extLst>
+                    </a:blip>
+                    <a:stretch>
+                      <a:fillRect/>
+                    </a:stretch>
+                  </pic:blipFill>
+                  <pic:spPr>
+                    <a:xfrm>
+                      <a:off x="0" y="0"/>
+                      <a:ext cx="4801235" cy="1895475"/>
+                    </a:xfrm>
+                    <a:prstGeom prst="rect">
+                      <a:avLst/>
+                    </a:prstGeom>
+                  </pic:spPr>
+                </pic:pic>
+              </a:graphicData>
+            </a:graphic>
+          </wp:anchor>
+        </w:drawing>
+      </w:r>
+      <w:r>
+        <w:t>74-</w:t>
+      </w:r>
+      <w:r>
+        <w:t xml:space="preserve"> Entramos no site (mobile inputs </w:t>
+      </w:r>
+      <w:proofErr w:type="spellStart"/>
+      <w:r>
+        <w:t>types</w:t>
+      </w:r>
+      <w:proofErr w:type="spellEnd"/>
+      <w:r>
+        <w:t>) para verificar os tipos de inputs para dispositivos mobile e alteramos em nosso formulário</w:t>
+      </w:r>
+      <w:r>
+        <w:t xml:space="preserve"> alguns tipos para ficar compatível com os dispositivos de celulares.</w:t>
+      </w:r>
+    </w:p>
+    <w:p>
+      <w:pPr>
+        <w:tabs>
+          <w:tab w:val="left" w:pos="3181"/>
+        </w:tabs>
+      </w:pPr>
+    </w:p>
+    <w:p>
+      <w:pPr>
+        <w:tabs>
+          <w:tab w:val="left" w:pos="3181"/>
+        </w:tabs>
+      </w:pPr>
+    </w:p>
+    <w:p>
+      <w:pPr>
+        <w:tabs>
+          <w:tab w:val="left" w:pos="3181"/>
+        </w:tabs>
+      </w:pPr>
+    </w:p>
+    <w:p>
+      <w:pPr>
+        <w:tabs>
+          <w:tab w:val="left" w:pos="3181"/>
+        </w:tabs>
+      </w:pPr>
+    </w:p>
+    <w:p>
+      <w:pPr>
+        <w:tabs>
+          <w:tab w:val="left" w:pos="3181"/>
+        </w:tabs>
+      </w:pPr>
+    </w:p>
+    <w:p>
+      <w:pPr>
+        <w:tabs>
+          <w:tab w:val="left" w:pos="3181"/>
+        </w:tabs>
+      </w:pPr>
+    </w:p>
+    <w:p>
+      <w:pPr>
+        <w:tabs>
+          <w:tab w:val="left" w:pos="3181"/>
+        </w:tabs>
+      </w:pPr>
+    </w:p>
+    <w:p>
+      <w:pPr>
+        <w:tabs>
+          <w:tab w:val="left" w:pos="3181"/>
+        </w:tabs>
+      </w:pPr>
+      <w:r>
+        <w:lastRenderedPageBreak/>
+        <w:t xml:space="preserve">75- </w:t>
+      </w:r>
+      <w:r>
+        <w:t xml:space="preserve">Quando queremos que algun campos seja obrigatório no formulário usamos o </w:t>
+      </w:r>
+      <w:proofErr w:type="spellStart"/>
+      <w:r>
+        <w:t>required</w:t>
+      </w:r>
+      <w:proofErr w:type="spellEnd"/>
+      <w:r>
+        <w:t xml:space="preserve"> no input</w:t>
+      </w:r>
+      <w:r>
+        <w:t xml:space="preserve"> </w:t>
+      </w:r>
+      <w:r>
+        <w:t>(</w:t>
+      </w:r>
+      <w:proofErr w:type="spellStart"/>
+      <w:r>
+        <w:t>obs</w:t>
+      </w:r>
+      <w:proofErr w:type="spellEnd"/>
+      <w:r>
+        <w:t xml:space="preserve"> se usamos o tipo de input correto com por exemplo </w:t>
+      </w:r>
+      <w:proofErr w:type="spellStart"/>
+      <w:r>
+        <w:t>email</w:t>
+      </w:r>
+      <w:proofErr w:type="spellEnd"/>
+      <w:r>
+        <w:t xml:space="preserve"> se não tiver correto a grafia ele também não envia).</w:t>
+      </w:r>
+    </w:p>
+    <w:p>
+      <w:pPr>
+        <w:tabs>
+          <w:tab w:val="left" w:pos="3181"/>
+        </w:tabs>
+        <w:rPr>
+          <w:noProof/>
+        </w:rPr>
+      </w:pPr>
+      <w:r>
+        <w:drawing>
+          <wp:anchor distT="0" distB="0" distL="114300" distR="114300" simplePos="0" relativeHeight="251779072" behindDoc="1" locked="0" layoutInCell="1" allowOverlap="1" wp14:anchorId="38EEE5B2">
+            <wp:simplePos x="0" y="0"/>
+            <wp:positionH relativeFrom="column">
+              <wp:posOffset>-431800</wp:posOffset>
+            </wp:positionH>
+            <wp:positionV relativeFrom="paragraph">
+              <wp:posOffset>221615</wp:posOffset>
+            </wp:positionV>
+            <wp:extent cx="5400040" cy="2051685"/>
+            <wp:effectExtent l="0" t="0" r="0" b="5715"/>
+            <wp:wrapTight wrapText="bothSides">
+              <wp:wrapPolygon edited="0">
+                <wp:start x="0" y="0"/>
+                <wp:lineTo x="0" y="21460"/>
+                <wp:lineTo x="21488" y="21460"/>
+                <wp:lineTo x="21488" y="0"/>
+                <wp:lineTo x="0" y="0"/>
+              </wp:wrapPolygon>
+            </wp:wrapTight>
+            <wp:docPr id="122" name="Imagem 122"/>
+            <wp:cNvGraphicFramePr>
+              <a:graphicFrameLocks xmlns:a="http://schemas.openxmlformats.org/drawingml/2006/main" noChangeAspect="1"/>
+            </wp:cNvGraphicFramePr>
+            <a:graphic xmlns:a="http://schemas.openxmlformats.org/drawingml/2006/main">
+              <a:graphicData uri="http://schemas.openxmlformats.org/drawingml/2006/picture">
+                <pic:pic xmlns:pic="http://schemas.openxmlformats.org/drawingml/2006/picture">
+                  <pic:nvPicPr>
+                    <pic:cNvPr id="1" name=""/>
+                    <pic:cNvPicPr/>
+                  </pic:nvPicPr>
+                  <pic:blipFill>
+                    <a:blip r:embed="rId131">
+                      <a:extLst>
+                        <a:ext uri="{28A0092B-C50C-407E-A947-70E740481C1C}">
+                          <a14:useLocalDpi xmlns:a14="http://schemas.microsoft.com/office/drawing/2010/main" val="0"/>
+                        </a:ext>
+                      </a:extLst>
+                    </a:blip>
+                    <a:stretch>
+                      <a:fillRect/>
+                    </a:stretch>
+                  </pic:blipFill>
+                  <pic:spPr>
+                    <a:xfrm>
+                      <a:off x="0" y="0"/>
+                      <a:ext cx="5400040" cy="2051685"/>
+                    </a:xfrm>
+                    <a:prstGeom prst="rect">
+                      <a:avLst/>
+                    </a:prstGeom>
+                  </pic:spPr>
+                </pic:pic>
+              </a:graphicData>
+            </a:graphic>
+            <wp14:sizeRelV relativeFrom="margin">
+              <wp14:pctHeight>0</wp14:pctHeight>
+            </wp14:sizeRelV>
+          </wp:anchor>
+        </w:drawing>
+      </w:r>
+    </w:p>
+    <w:p>
+      <w:pPr>
+        <w:tabs>
+          <w:tab w:val="left" w:pos="3181"/>
+        </w:tabs>
+        <w:rPr>
+          <w:noProof/>
+        </w:rPr>
+      </w:pPr>
+    </w:p>
+    <w:p>
+      <w:pPr>
+        <w:tabs>
+          <w:tab w:val="left" w:pos="3181"/>
+        </w:tabs>
+        <w:rPr>
+          <w:noProof/>
+        </w:rPr>
+      </w:pPr>
+    </w:p>
+    <w:p>
+      <w:pPr>
+        <w:tabs>
+          <w:tab w:val="left" w:pos="3181"/>
+        </w:tabs>
+        <w:rPr>
+          <w:noProof/>
+        </w:rPr>
+      </w:pPr>
+    </w:p>
+    <w:p>
+      <w:pPr>
+        <w:tabs>
+          <w:tab w:val="left" w:pos="3181"/>
+        </w:tabs>
+        <w:rPr>
+          <w:noProof/>
+        </w:rPr>
+      </w:pPr>
+    </w:p>
+    <w:p>
+      <w:pPr>
+        <w:tabs>
+          <w:tab w:val="left" w:pos="3181"/>
+        </w:tabs>
+        <w:rPr>
+          <w:noProof/>
+        </w:rPr>
+      </w:pPr>
+    </w:p>
+    <w:p>
+      <w:pPr>
+        <w:tabs>
+          <w:tab w:val="left" w:pos="3181"/>
+        </w:tabs>
+        <w:rPr>
+          <w:noProof/>
+        </w:rPr>
+      </w:pPr>
+    </w:p>
+    <w:p>
+      <w:pPr>
+        <w:tabs>
+          <w:tab w:val="left" w:pos="3181"/>
+        </w:tabs>
+        <w:rPr>
+          <w:noProof/>
+        </w:rPr>
+      </w:pPr>
+    </w:p>
+    <w:p>
+      <w:pPr>
+        <w:tabs>
+          <w:tab w:val="left" w:pos="3181"/>
+        </w:tabs>
+        <w:rPr>
+          <w:noProof/>
+        </w:rPr>
+      </w:pPr>
+    </w:p>
+    <w:p>
+      <w:pPr>
+        <w:tabs>
+          <w:tab w:val="left" w:pos="3181"/>
+        </w:tabs>
+        <w:rPr>
+          <w:noProof/>
+        </w:rPr>
+      </w:pPr>
+      <w:r>
+        <w:rPr>
+          <w:noProof/>
+        </w:rPr>
+        <w:t>76-</w:t>
+      </w:r>
+      <w:r>
+        <w:rPr>
+          <w:noProof/>
+        </w:rPr>
+        <w:t xml:space="preserve"> </w:t>
+      </w:r>
+      <w:r>
+        <w:rPr>
+          <w:noProof/>
+        </w:rPr>
+        <w:t xml:space="preserve"> Utilizamos o placeholder para deixar exemplo dentro dos inputs como deve ser preenchido.</w:t>
+      </w:r>
+      <w:r>
+        <w:rPr>
+          <w:noProof/>
+        </w:rPr>
+        <w:t xml:space="preserve"> </w:t>
+      </w:r>
+    </w:p>
+    <w:p>
+      <w:pPr>
+        <w:tabs>
+          <w:tab w:val="left" w:pos="3181"/>
+        </w:tabs>
+      </w:pPr>
+      <w:r>
+        <w:rPr>
+          <w:noProof/>
+        </w:rPr>
+        <w:drawing>
+          <wp:anchor distT="0" distB="0" distL="114300" distR="114300" simplePos="0" relativeHeight="251780096" behindDoc="1" locked="0" layoutInCell="1" allowOverlap="1" wp14:anchorId="5C781BF7">
+            <wp:simplePos x="0" y="0"/>
+            <wp:positionH relativeFrom="column">
+              <wp:posOffset>-431800</wp:posOffset>
+            </wp:positionH>
+            <wp:positionV relativeFrom="paragraph">
+              <wp:posOffset>104775</wp:posOffset>
+            </wp:positionV>
+            <wp:extent cx="5400040" cy="1509395"/>
+            <wp:effectExtent l="0" t="0" r="0" b="0"/>
+            <wp:wrapTight wrapText="bothSides">
+              <wp:wrapPolygon edited="0">
+                <wp:start x="0" y="0"/>
+                <wp:lineTo x="0" y="21264"/>
+                <wp:lineTo x="21488" y="21264"/>
+                <wp:lineTo x="21488" y="0"/>
+                <wp:lineTo x="0" y="0"/>
+              </wp:wrapPolygon>
+            </wp:wrapTight>
+            <wp:docPr id="123" name="Imagem 123"/>
+            <wp:cNvGraphicFramePr>
+              <a:graphicFrameLocks xmlns:a="http://schemas.openxmlformats.org/drawingml/2006/main" noChangeAspect="1"/>
+            </wp:cNvGraphicFramePr>
+            <a:graphic xmlns:a="http://schemas.openxmlformats.org/drawingml/2006/main">
+              <a:graphicData uri="http://schemas.openxmlformats.org/drawingml/2006/picture">
+                <pic:pic xmlns:pic="http://schemas.openxmlformats.org/drawingml/2006/picture">
+                  <pic:nvPicPr>
+                    <pic:cNvPr id="1" name=""/>
+                    <pic:cNvPicPr/>
+                  </pic:nvPicPr>
+                  <pic:blipFill>
+                    <a:blip r:embed="rId132">
+                      <a:extLst>
+                        <a:ext uri="{28A0092B-C50C-407E-A947-70E740481C1C}">
+                          <a14:useLocalDpi xmlns:a14="http://schemas.microsoft.com/office/drawing/2010/main" val="0"/>
+                        </a:ext>
+                      </a:extLst>
+                    </a:blip>
+                    <a:stretch>
+                      <a:fillRect/>
+                    </a:stretch>
+                  </pic:blipFill>
+                  <pic:spPr>
+                    <a:xfrm>
+                      <a:off x="0" y="0"/>
+                      <a:ext cx="5400040" cy="1509395"/>
+                    </a:xfrm>
+                    <a:prstGeom prst="rect">
+                      <a:avLst/>
+                    </a:prstGeom>
+                  </pic:spPr>
+                </pic:pic>
+              </a:graphicData>
+            </a:graphic>
+            <wp14:sizeRelV relativeFrom="margin">
+              <wp14:pctHeight>0</wp14:pctHeight>
+            </wp14:sizeRelV>
+          </wp:anchor>
+        </w:drawing>
+      </w:r>
+    </w:p>
+    <w:p>
+      <w:pPr>
+        <w:tabs>
+          <w:tab w:val="left" w:pos="3181"/>
+        </w:tabs>
+      </w:pPr>
+    </w:p>
+    <w:p>
+      <w:pPr>
+        <w:tabs>
+          <w:tab w:val="left" w:pos="3181"/>
+        </w:tabs>
+      </w:pPr>
+    </w:p>
+    <w:p>
+      <w:pPr>
+        <w:tabs>
+          <w:tab w:val="left" w:pos="3181"/>
+        </w:tabs>
+      </w:pPr>
+    </w:p>
+    <w:p>
+      <w:pPr>
+        <w:tabs>
+          <w:tab w:val="left" w:pos="3181"/>
+        </w:tabs>
+      </w:pPr>
+    </w:p>
+    <w:p>
+      <w:pPr>
+        <w:tabs>
+          <w:tab w:val="left" w:pos="3181"/>
+        </w:tabs>
+      </w:pPr>
+    </w:p>
+    <w:p>
+      <w:pPr>
+        <w:tabs>
+          <w:tab w:val="left" w:pos="3181"/>
+        </w:tabs>
+      </w:pPr>
+      <w:r>
+        <w:rPr>
+          <w:noProof/>
+        </w:rPr>
+        <w:drawing>
+          <wp:anchor distT="0" distB="0" distL="114300" distR="114300" simplePos="0" relativeHeight="251781120" behindDoc="1" locked="0" layoutInCell="1" allowOverlap="1" wp14:anchorId="572DFCB8">
+            <wp:simplePos x="0" y="0"/>
+            <wp:positionH relativeFrom="margin">
+              <wp:posOffset>-339430</wp:posOffset>
+            </wp:positionH>
+            <wp:positionV relativeFrom="paragraph">
+              <wp:posOffset>98307</wp:posOffset>
+            </wp:positionV>
+            <wp:extent cx="3876675" cy="1952625"/>
+            <wp:effectExtent l="0" t="0" r="9525" b="9525"/>
+            <wp:wrapTight wrapText="bothSides">
+              <wp:wrapPolygon edited="0">
+                <wp:start x="0" y="0"/>
+                <wp:lineTo x="0" y="21495"/>
+                <wp:lineTo x="21547" y="21495"/>
+                <wp:lineTo x="21547" y="0"/>
+                <wp:lineTo x="0" y="0"/>
+              </wp:wrapPolygon>
+            </wp:wrapTight>
+            <wp:docPr id="124" name="Imagem 124"/>
+            <wp:cNvGraphicFramePr>
+              <a:graphicFrameLocks xmlns:a="http://schemas.openxmlformats.org/drawingml/2006/main" noChangeAspect="1"/>
+            </wp:cNvGraphicFramePr>
+            <a:graphic xmlns:a="http://schemas.openxmlformats.org/drawingml/2006/main">
+              <a:graphicData uri="http://schemas.openxmlformats.org/drawingml/2006/picture">
+                <pic:pic xmlns:pic="http://schemas.openxmlformats.org/drawingml/2006/picture">
+                  <pic:nvPicPr>
+                    <pic:cNvPr id="1" name=""/>
+                    <pic:cNvPicPr/>
+                  </pic:nvPicPr>
+                  <pic:blipFill>
+                    <a:blip r:embed="rId133">
+                      <a:extLst>
+                        <a:ext uri="{28A0092B-C50C-407E-A947-70E740481C1C}">
+                          <a14:useLocalDpi xmlns:a14="http://schemas.microsoft.com/office/drawing/2010/main" val="0"/>
+                        </a:ext>
+                      </a:extLst>
+                    </a:blip>
+                    <a:stretch>
+                      <a:fillRect/>
+                    </a:stretch>
+                  </pic:blipFill>
+                  <pic:spPr>
+                    <a:xfrm>
+                      <a:off x="0" y="0"/>
+                      <a:ext cx="3876675" cy="1952625"/>
+                    </a:xfrm>
+                    <a:prstGeom prst="rect">
+                      <a:avLst/>
+                    </a:prstGeom>
+                  </pic:spPr>
+                </pic:pic>
+              </a:graphicData>
+            </a:graphic>
+          </wp:anchor>
+        </w:drawing>
+      </w:r>
+    </w:p>
+    <w:p>
+      <w:pPr>
+        <w:tabs>
+          <w:tab w:val="left" w:pos="3181"/>
+        </w:tabs>
+      </w:pPr>
+    </w:p>
+    <w:p>
+      <w:pPr>
+        <w:tabs>
+          <w:tab w:val="left" w:pos="3181"/>
+        </w:tabs>
+      </w:pPr>
+    </w:p>
+    <w:p/>
+    <w:p/>
+    <w:p>
+      <w:pPr>
+        <w:tabs>
+          <w:tab w:val="left" w:pos="3181"/>
+        </w:tabs>
+      </w:pPr>
+    </w:p>
+    <w:p>
+      <w:pPr>
+        <w:tabs>
+          <w:tab w:val="left" w:pos="3181"/>
+        </w:tabs>
+        <w:rPr>
+          <w:noProof/>
+        </w:rPr>
+      </w:pPr>
+      <w:r>
+        <w:rPr>
+          <w:noProof/>
+        </w:rPr>
+        <w:lastRenderedPageBreak/>
+        <w:drawing>
+          <wp:anchor distT="0" distB="0" distL="114300" distR="114300" simplePos="0" relativeHeight="251784192" behindDoc="1" locked="0" layoutInCell="1" allowOverlap="1" wp14:anchorId="10550296">
+            <wp:simplePos x="0" y="0"/>
+            <wp:positionH relativeFrom="column">
+              <wp:posOffset>4342130</wp:posOffset>
+            </wp:positionH>
+            <wp:positionV relativeFrom="paragraph">
+              <wp:posOffset>2437765</wp:posOffset>
+            </wp:positionV>
+            <wp:extent cx="1945005" cy="1009650"/>
+            <wp:effectExtent l="0" t="0" r="0" b="0"/>
+            <wp:wrapTight wrapText="bothSides">
+              <wp:wrapPolygon edited="0">
+                <wp:start x="0" y="0"/>
+                <wp:lineTo x="0" y="21192"/>
+                <wp:lineTo x="21367" y="21192"/>
+                <wp:lineTo x="21367" y="0"/>
+                <wp:lineTo x="0" y="0"/>
+              </wp:wrapPolygon>
+            </wp:wrapTight>
+            <wp:docPr id="126" name="Imagem 126"/>
+            <wp:cNvGraphicFramePr>
+              <a:graphicFrameLocks xmlns:a="http://schemas.openxmlformats.org/drawingml/2006/main" noChangeAspect="1"/>
+            </wp:cNvGraphicFramePr>
+            <a:graphic xmlns:a="http://schemas.openxmlformats.org/drawingml/2006/main">
+              <a:graphicData uri="http://schemas.openxmlformats.org/drawingml/2006/picture">
+                <pic:pic xmlns:pic="http://schemas.openxmlformats.org/drawingml/2006/picture">
+                  <pic:nvPicPr>
+                    <pic:cNvPr id="1" name=""/>
+                    <pic:cNvPicPr/>
+                  </pic:nvPicPr>
+                  <pic:blipFill>
+                    <a:blip r:embed="rId134">
+                      <a:extLst>
+                        <a:ext uri="{28A0092B-C50C-407E-A947-70E740481C1C}">
+                          <a14:useLocalDpi xmlns:a14="http://schemas.microsoft.com/office/drawing/2010/main" val="0"/>
+                        </a:ext>
+                      </a:extLst>
+                    </a:blip>
+                    <a:stretch>
+                      <a:fillRect/>
+                    </a:stretch>
+                  </pic:blipFill>
+                  <pic:spPr>
+                    <a:xfrm>
+                      <a:off x="0" y="0"/>
+                      <a:ext cx="1945005" cy="1009650"/>
+                    </a:xfrm>
+                    <a:prstGeom prst="rect">
+                      <a:avLst/>
+                    </a:prstGeom>
+                  </pic:spPr>
+                </pic:pic>
+              </a:graphicData>
+            </a:graphic>
+            <wp14:sizeRelH relativeFrom="margin">
+              <wp14:pctWidth>0</wp14:pctWidth>
+            </wp14:sizeRelH>
+          </wp:anchor>
+        </w:drawing>
+      </w:r>
+      <w:r>
+        <w:drawing>
+          <wp:anchor distT="0" distB="0" distL="114300" distR="114300" simplePos="0" relativeHeight="251783168" behindDoc="1" locked="0" layoutInCell="1" allowOverlap="1" wp14:anchorId="4B1168AE" wp14:editId="75E9B32C">
+            <wp:simplePos x="0" y="0"/>
+            <wp:positionH relativeFrom="page">
+              <wp:align>left</wp:align>
+            </wp:positionH>
+            <wp:positionV relativeFrom="paragraph">
+              <wp:posOffset>664993</wp:posOffset>
+            </wp:positionV>
+            <wp:extent cx="5400040" cy="2835275"/>
+            <wp:effectExtent l="0" t="0" r="0" b="3175"/>
+            <wp:wrapTight wrapText="bothSides">
+              <wp:wrapPolygon edited="0">
+                <wp:start x="0" y="0"/>
+                <wp:lineTo x="0" y="21479"/>
+                <wp:lineTo x="21488" y="21479"/>
+                <wp:lineTo x="21488" y="0"/>
+                <wp:lineTo x="0" y="0"/>
+              </wp:wrapPolygon>
+            </wp:wrapTight>
+            <wp:docPr id="125" name="Imagem 125"/>
+            <wp:cNvGraphicFramePr>
+              <a:graphicFrameLocks xmlns:a="http://schemas.openxmlformats.org/drawingml/2006/main" noChangeAspect="1"/>
+            </wp:cNvGraphicFramePr>
+            <a:graphic xmlns:a="http://schemas.openxmlformats.org/drawingml/2006/main">
+              <a:graphicData uri="http://schemas.openxmlformats.org/drawingml/2006/picture">
+                <pic:pic xmlns:pic="http://schemas.openxmlformats.org/drawingml/2006/picture">
+                  <pic:nvPicPr>
+                    <pic:cNvPr id="1" name=""/>
+                    <pic:cNvPicPr/>
+                  </pic:nvPicPr>
+                  <pic:blipFill>
+                    <a:blip r:embed="rId135">
+                      <a:extLst>
+                        <a:ext uri="{28A0092B-C50C-407E-A947-70E740481C1C}">
+                          <a14:useLocalDpi xmlns:a14="http://schemas.microsoft.com/office/drawing/2010/main" val="0"/>
+                        </a:ext>
+                      </a:extLst>
+                    </a:blip>
+                    <a:stretch>
+                      <a:fillRect/>
+                    </a:stretch>
+                  </pic:blipFill>
+                  <pic:spPr>
+                    <a:xfrm>
+                      <a:off x="0" y="0"/>
+                      <a:ext cx="5400040" cy="2835275"/>
+                    </a:xfrm>
+                    <a:prstGeom prst="rect">
+                      <a:avLst/>
+                    </a:prstGeom>
+                  </pic:spPr>
+                </pic:pic>
+              </a:graphicData>
+            </a:graphic>
+          </wp:anchor>
+        </w:drawing>
+      </w:r>
+      <w:r>
+        <w:t>77-</w:t>
+      </w:r>
+      <w:r>
+        <w:t xml:space="preserve"> </w:t>
+      </w:r>
+      <w:r>
+        <w:t xml:space="preserve">Trocamos as </w:t>
+      </w:r>
+      <w:proofErr w:type="spellStart"/>
+      <w:r>
+        <w:t>div</w:t>
+      </w:r>
+      <w:proofErr w:type="spellEnd"/>
+      <w:r>
+        <w:t xml:space="preserve"> do formulário por </w:t>
+      </w:r>
+      <w:proofErr w:type="spellStart"/>
+      <w:r>
+        <w:t>fieldset</w:t>
+      </w:r>
+      <w:proofErr w:type="spellEnd"/>
+      <w:r>
+        <w:t xml:space="preserve"> (conjuntos de campos) e as parágrafos por </w:t>
+      </w:r>
+      <w:proofErr w:type="spellStart"/>
+      <w:r>
+        <w:t>legend</w:t>
+      </w:r>
+      <w:proofErr w:type="spellEnd"/>
+      <w:r>
+        <w:t xml:space="preserve"> sendo uma melhor forma de trabalhar quando estamos tratando de formulário e no </w:t>
+      </w:r>
+      <w:proofErr w:type="spellStart"/>
+      <w:r>
+        <w:t>css</w:t>
+      </w:r>
+      <w:proofErr w:type="spellEnd"/>
+      <w:r>
+        <w:t xml:space="preserve"> as </w:t>
+      </w:r>
+      <w:proofErr w:type="spellStart"/>
+      <w:r>
+        <w:t>legend</w:t>
+      </w:r>
+      <w:proofErr w:type="spellEnd"/>
+      <w:r>
+        <w:t xml:space="preserve"> ficaram com as mesmas configurações dos </w:t>
+      </w:r>
+      <w:proofErr w:type="spellStart"/>
+      <w:r>
+        <w:t>label</w:t>
+      </w:r>
+      <w:proofErr w:type="spellEnd"/>
+      <w:r>
+        <w:t>.</w:t>
+      </w:r>
+      <w:r>
+        <w:rPr>
+          <w:noProof/>
+        </w:rPr>
+        <w:t xml:space="preserve"> </w:t>
+      </w:r>
+    </w:p>
+    <w:p>
+      <w:pPr>
+        <w:tabs>
+          <w:tab w:val="left" w:pos="3181"/>
+        </w:tabs>
+      </w:pPr>
+    </w:p>
+    <w:p>
+      <w:pPr>
+        <w:tabs>
+          <w:tab w:val="left" w:pos="3181"/>
+        </w:tabs>
+      </w:pPr>
+    </w:p>
+    <w:p>
+      <w:pPr>
+        <w:tabs>
+          <w:tab w:val="left" w:pos="3181"/>
+        </w:tabs>
+      </w:pPr>
+    </w:p>
+    <w:p>
+      <w:pPr>
+        <w:tabs>
+          <w:tab w:val="left" w:pos="3181"/>
+        </w:tabs>
+      </w:pPr>
+    </w:p>
+    <w:p>
+      <w:pPr>
+        <w:tabs>
+          <w:tab w:val="left" w:pos="3181"/>
+        </w:tabs>
+      </w:pPr>
+    </w:p>
+    <w:p>
+      <w:pPr>
+        <w:tabs>
+          <w:tab w:val="left" w:pos="3181"/>
+        </w:tabs>
+      </w:pPr>
+    </w:p>
+    <w:p>
+      <w:pPr>
+        <w:tabs>
+          <w:tab w:val="left" w:pos="3181"/>
+        </w:tabs>
+      </w:pPr>
+    </w:p>
+    <w:p>
+      <w:pPr>
+        <w:tabs>
+          <w:tab w:val="left" w:pos="3181"/>
+        </w:tabs>
+      </w:pPr>
+      <w:r>
+        <w:drawing>
+          <wp:anchor distT="0" distB="0" distL="114300" distR="114300" simplePos="0" relativeHeight="251786240" behindDoc="1" locked="0" layoutInCell="1" allowOverlap="1" wp14:anchorId="3BE302EE">
+            <wp:simplePos x="0" y="0"/>
+            <wp:positionH relativeFrom="column">
+              <wp:posOffset>2927838</wp:posOffset>
+            </wp:positionH>
+            <wp:positionV relativeFrom="paragraph">
+              <wp:posOffset>377382</wp:posOffset>
+            </wp:positionV>
+            <wp:extent cx="1991003" cy="762106"/>
+            <wp:effectExtent l="0" t="0" r="9525" b="0"/>
+            <wp:wrapTight wrapText="bothSides">
+              <wp:wrapPolygon edited="0">
+                <wp:start x="0" y="0"/>
+                <wp:lineTo x="0" y="21060"/>
+                <wp:lineTo x="21497" y="21060"/>
+                <wp:lineTo x="21497" y="0"/>
+                <wp:lineTo x="0" y="0"/>
+              </wp:wrapPolygon>
+            </wp:wrapTight>
+            <wp:docPr id="128" name="Imagem 128"/>
+            <wp:cNvGraphicFramePr>
+              <a:graphicFrameLocks xmlns:a="http://schemas.openxmlformats.org/drawingml/2006/main" noChangeAspect="1"/>
+            </wp:cNvGraphicFramePr>
+            <a:graphic xmlns:a="http://schemas.openxmlformats.org/drawingml/2006/main">
+              <a:graphicData uri="http://schemas.openxmlformats.org/drawingml/2006/picture">
+                <pic:pic xmlns:pic="http://schemas.openxmlformats.org/drawingml/2006/picture">
+                  <pic:nvPicPr>
+                    <pic:cNvPr id="1" name=""/>
+                    <pic:cNvPicPr/>
+                  </pic:nvPicPr>
+                  <pic:blipFill>
+                    <a:blip r:embed="rId136">
+                      <a:extLst>
+                        <a:ext uri="{28A0092B-C50C-407E-A947-70E740481C1C}">
+                          <a14:useLocalDpi xmlns:a14="http://schemas.microsoft.com/office/drawing/2010/main" val="0"/>
+                        </a:ext>
+                      </a:extLst>
+                    </a:blip>
+                    <a:stretch>
+                      <a:fillRect/>
+                    </a:stretch>
+                  </pic:blipFill>
+                  <pic:spPr>
+                    <a:xfrm>
+                      <a:off x="0" y="0"/>
+                      <a:ext cx="1991003" cy="762106"/>
+                    </a:xfrm>
+                    <a:prstGeom prst="rect">
+                      <a:avLst/>
+                    </a:prstGeom>
+                  </pic:spPr>
+                </pic:pic>
+              </a:graphicData>
+            </a:graphic>
+          </wp:anchor>
+        </w:drawing>
+      </w:r>
+      <w:r>
+        <w:drawing>
+          <wp:anchor distT="0" distB="0" distL="114300" distR="114300" simplePos="0" relativeHeight="251785216" behindDoc="1" locked="0" layoutInCell="1" allowOverlap="1" wp14:anchorId="55C3549D">
+            <wp:simplePos x="0" y="0"/>
+            <wp:positionH relativeFrom="page">
+              <wp:posOffset>31897</wp:posOffset>
+            </wp:positionH>
+            <wp:positionV relativeFrom="paragraph">
+              <wp:posOffset>557796</wp:posOffset>
+            </wp:positionV>
+            <wp:extent cx="3933825" cy="314325"/>
+            <wp:effectExtent l="0" t="0" r="9525" b="9525"/>
+            <wp:wrapTight wrapText="bothSides">
+              <wp:wrapPolygon edited="0">
+                <wp:start x="0" y="0"/>
+                <wp:lineTo x="0" y="20945"/>
+                <wp:lineTo x="21548" y="20945"/>
+                <wp:lineTo x="21548" y="0"/>
+                <wp:lineTo x="0" y="0"/>
+              </wp:wrapPolygon>
+            </wp:wrapTight>
+            <wp:docPr id="127" name="Imagem 127"/>
+            <wp:cNvGraphicFramePr>
+              <a:graphicFrameLocks xmlns:a="http://schemas.openxmlformats.org/drawingml/2006/main" noChangeAspect="1"/>
+            </wp:cNvGraphicFramePr>
+            <a:graphic xmlns:a="http://schemas.openxmlformats.org/drawingml/2006/main">
+              <a:graphicData uri="http://schemas.openxmlformats.org/drawingml/2006/picture">
+                <pic:pic xmlns:pic="http://schemas.openxmlformats.org/drawingml/2006/picture">
+                  <pic:nvPicPr>
+                    <pic:cNvPr id="1" name=""/>
+                    <pic:cNvPicPr/>
+                  </pic:nvPicPr>
+                  <pic:blipFill>
+                    <a:blip r:embed="rId137">
+                      <a:extLst>
+                        <a:ext uri="{28A0092B-C50C-407E-A947-70E740481C1C}">
+                          <a14:useLocalDpi xmlns:a14="http://schemas.microsoft.com/office/drawing/2010/main" val="0"/>
+                        </a:ext>
+                      </a:extLst>
+                    </a:blip>
+                    <a:stretch>
+                      <a:fillRect/>
+                    </a:stretch>
+                  </pic:blipFill>
+                  <pic:spPr>
+                    <a:xfrm>
+                      <a:off x="0" y="0"/>
+                      <a:ext cx="3933825" cy="314325"/>
+                    </a:xfrm>
+                    <a:prstGeom prst="rect">
+                      <a:avLst/>
+                    </a:prstGeom>
+                  </pic:spPr>
+                </pic:pic>
+              </a:graphicData>
+            </a:graphic>
+          </wp:anchor>
+        </w:drawing>
+      </w:r>
+      <w:r>
+        <w:t>78-</w:t>
+      </w:r>
+      <w:r>
+        <w:t xml:space="preserve"> </w:t>
+      </w:r>
+      <w:r>
+        <w:t xml:space="preserve">No </w:t>
+      </w:r>
+      <w:proofErr w:type="spellStart"/>
+      <w:r>
+        <w:t>html</w:t>
+      </w:r>
+      <w:proofErr w:type="spellEnd"/>
+      <w:r>
+        <w:t xml:space="preserve"> inserimos um</w:t>
+      </w:r>
+      <w:r>
+        <w:t>a</w:t>
+      </w:r>
+      <w:r>
+        <w:t xml:space="preserve"> </w:t>
+      </w:r>
+      <w:proofErr w:type="spellStart"/>
+      <w:r>
+        <w:t>class</w:t>
+      </w:r>
+      <w:proofErr w:type="spellEnd"/>
+      <w:r>
+        <w:t xml:space="preserve"> enviar no botão e no </w:t>
+      </w:r>
+      <w:proofErr w:type="spellStart"/>
+      <w:r>
+        <w:t>css</w:t>
+      </w:r>
+      <w:proofErr w:type="spellEnd"/>
+      <w:r>
+        <w:t xml:space="preserve"> aumentamos a largura e o espaço interno tanto para cima com para baixo.</w:t>
+      </w:r>
+    </w:p>
+    <w:p>
+      <w:pPr>
+        <w:tabs>
+          <w:tab w:val="left" w:pos="3181"/>
+        </w:tabs>
+      </w:pPr>
+    </w:p>
+    <w:p>
+      <w:pPr>
+        <w:tabs>
+          <w:tab w:val="left" w:pos="3181"/>
+        </w:tabs>
+      </w:pPr>
+    </w:p>
+    <w:p>
+      <w:pPr>
+        <w:tabs>
+          <w:tab w:val="left" w:pos="3181"/>
+        </w:tabs>
+      </w:pPr>
+    </w:p>
+    <w:p>
+      <w:pPr>
+        <w:tabs>
+          <w:tab w:val="left" w:pos="3181"/>
+        </w:tabs>
+        <w:jc w:val="both"/>
+      </w:pPr>
+      <w:r>
+        <w:t>79-</w:t>
+      </w:r>
+      <w:r>
+        <w:t xml:space="preserve"> Ainda tra</w:t>
+      </w:r>
+      <w:r>
+        <w:t>balhando com o botão enviar fizemos:</w:t>
+      </w:r>
+    </w:p>
+    <w:p>
+      <w:pPr>
+        <w:pStyle w:val="PargrafodaLista"/>
+        <w:numPr>
+          <w:ilvl w:val="0"/>
+          <w:numId w:val="10"/>
+        </w:numPr>
+        <w:tabs>
+          <w:tab w:val="left" w:pos="3181"/>
+        </w:tabs>
+        <w:jc w:val="both"/>
+      </w:pPr>
+      <w:r>
+        <w:t>Colocamos um</w:t>
+      </w:r>
+      <w:r>
+        <w:t xml:space="preserve">a </w:t>
+      </w:r>
+      <w:r>
+        <w:t xml:space="preserve">cor de fundo </w:t>
+      </w:r>
+    </w:p>
+    <w:p>
+      <w:pPr>
+        <w:pStyle w:val="PargrafodaLista"/>
+        <w:numPr>
+          <w:ilvl w:val="0"/>
+          <w:numId w:val="10"/>
+        </w:numPr>
+        <w:tabs>
+          <w:tab w:val="left" w:pos="3181"/>
+        </w:tabs>
+        <w:jc w:val="both"/>
+      </w:pPr>
+      <w:r>
+        <w:t xml:space="preserve">Mudamos a cor da letra para branco </w:t>
+      </w:r>
+    </w:p>
+    <w:p>
+      <w:pPr>
+        <w:pStyle w:val="PargrafodaLista"/>
+        <w:numPr>
+          <w:ilvl w:val="0"/>
+          <w:numId w:val="10"/>
+        </w:numPr>
+        <w:tabs>
+          <w:tab w:val="left" w:pos="3181"/>
+        </w:tabs>
+        <w:jc w:val="both"/>
+      </w:pPr>
+      <w:r>
+        <w:t>Deixamos o texto mais encorpado e negrito</w:t>
+      </w:r>
+    </w:p>
+    <w:p>
+      <w:pPr>
+        <w:pStyle w:val="PargrafodaLista"/>
+        <w:numPr>
+          <w:ilvl w:val="0"/>
+          <w:numId w:val="10"/>
+        </w:numPr>
+        <w:tabs>
+          <w:tab w:val="left" w:pos="3181"/>
+        </w:tabs>
+        <w:jc w:val="both"/>
+      </w:pPr>
+      <w:r>
+        <w:t>Aumentamos o tamanho da fonte</w:t>
+      </w:r>
+    </w:p>
+    <w:p>
+      <w:pPr>
+        <w:pStyle w:val="PargrafodaLista"/>
+        <w:numPr>
+          <w:ilvl w:val="0"/>
+          <w:numId w:val="10"/>
+        </w:numPr>
+        <w:tabs>
+          <w:tab w:val="left" w:pos="3181"/>
+        </w:tabs>
+        <w:jc w:val="both"/>
+      </w:pPr>
+      <w:r>
+        <w:t xml:space="preserve">Tiramos a borda do botão </w:t>
+      </w:r>
+    </w:p>
+    <w:p>
+      <w:pPr>
+        <w:pStyle w:val="PargrafodaLista"/>
+        <w:numPr>
+          <w:ilvl w:val="0"/>
+          <w:numId w:val="10"/>
+        </w:numPr>
+        <w:tabs>
+          <w:tab w:val="left" w:pos="3181"/>
+        </w:tabs>
+        <w:jc w:val="both"/>
+      </w:pPr>
+      <w:r>
+        <w:drawing>
+          <wp:anchor distT="0" distB="0" distL="114300" distR="114300" simplePos="0" relativeHeight="251787264" behindDoc="1" locked="0" layoutInCell="1" allowOverlap="1" wp14:anchorId="54BE7533">
+            <wp:simplePos x="0" y="0"/>
+            <wp:positionH relativeFrom="column">
+              <wp:posOffset>-836118</wp:posOffset>
+            </wp:positionH>
+            <wp:positionV relativeFrom="paragraph">
+              <wp:posOffset>242644</wp:posOffset>
+            </wp:positionV>
+            <wp:extent cx="2476500" cy="1857375"/>
+            <wp:effectExtent l="0" t="0" r="0" b="9525"/>
+            <wp:wrapTight wrapText="bothSides">
+              <wp:wrapPolygon edited="0">
+                <wp:start x="0" y="0"/>
+                <wp:lineTo x="0" y="21489"/>
+                <wp:lineTo x="21434" y="21489"/>
+                <wp:lineTo x="21434" y="0"/>
+                <wp:lineTo x="0" y="0"/>
+              </wp:wrapPolygon>
+            </wp:wrapTight>
+            <wp:docPr id="129" name="Imagem 129"/>
+            <wp:cNvGraphicFramePr>
+              <a:graphicFrameLocks xmlns:a="http://schemas.openxmlformats.org/drawingml/2006/main" noChangeAspect="1"/>
+            </wp:cNvGraphicFramePr>
+            <a:graphic xmlns:a="http://schemas.openxmlformats.org/drawingml/2006/main">
+              <a:graphicData uri="http://schemas.openxmlformats.org/drawingml/2006/picture">
+                <pic:pic xmlns:pic="http://schemas.openxmlformats.org/drawingml/2006/picture">
+                  <pic:nvPicPr>
+                    <pic:cNvPr id="1" name=""/>
+                    <pic:cNvPicPr/>
+                  </pic:nvPicPr>
+                  <pic:blipFill>
+                    <a:blip r:embed="rId138">
+                      <a:extLst>
+                        <a:ext uri="{28A0092B-C50C-407E-A947-70E740481C1C}">
+                          <a14:useLocalDpi xmlns:a14="http://schemas.microsoft.com/office/drawing/2010/main" val="0"/>
+                        </a:ext>
+                      </a:extLst>
+                    </a:blip>
+                    <a:stretch>
+                      <a:fillRect/>
+                    </a:stretch>
+                  </pic:blipFill>
+                  <pic:spPr>
+                    <a:xfrm>
+                      <a:off x="0" y="0"/>
+                      <a:ext cx="2476500" cy="1857375"/>
+                    </a:xfrm>
+                    <a:prstGeom prst="rect">
+                      <a:avLst/>
+                    </a:prstGeom>
+                  </pic:spPr>
+                </pic:pic>
+              </a:graphicData>
+            </a:graphic>
+          </wp:anchor>
+        </w:drawing>
+      </w:r>
+      <w:r>
+        <w:t>E arredondamos os c</w:t>
+      </w:r>
+      <w:r>
+        <w:t>a</w:t>
+      </w:r>
+      <w:r>
+        <w:t>nt</w:t>
+      </w:r>
+      <w:r>
+        <w:t>o</w:t>
+      </w:r>
+      <w:r>
+        <w:t>s</w:t>
+      </w:r>
+    </w:p>
+    <w:p>
+      <w:pPr>
+        <w:tabs>
+          <w:tab w:val="left" w:pos="3181"/>
+        </w:tabs>
+        <w:jc w:val="both"/>
+      </w:pPr>
+    </w:p>
+    <w:p>
+      <w:pPr>
+        <w:tabs>
+          <w:tab w:val="left" w:pos="3181"/>
+        </w:tabs>
+        <w:jc w:val="both"/>
+      </w:pPr>
+    </w:p>
+    <w:p>
+      <w:pPr>
+        <w:tabs>
+          <w:tab w:val="left" w:pos="3181"/>
+        </w:tabs>
+        <w:jc w:val="both"/>
+      </w:pPr>
+    </w:p>
+    <w:p>
+      <w:pPr>
+        <w:tabs>
+          <w:tab w:val="left" w:pos="3181"/>
+        </w:tabs>
+        <w:jc w:val="both"/>
+      </w:pPr>
+    </w:p>
+    <w:p>
+      <w:pPr>
+        <w:tabs>
+          <w:tab w:val="left" w:pos="3181"/>
+        </w:tabs>
+        <w:jc w:val="both"/>
+      </w:pPr>
+    </w:p>
+    <w:p>
+      <w:pPr>
+        <w:tabs>
+          <w:tab w:val="left" w:pos="3181"/>
+        </w:tabs>
+        <w:jc w:val="both"/>
+      </w:pPr>
+    </w:p>
+    <w:p>
+      <w:pPr>
+        <w:tabs>
+          <w:tab w:val="left" w:pos="3181"/>
+        </w:tabs>
+        <w:jc w:val="both"/>
+      </w:pPr>
+    </w:p>
+    <w:p>
+      <w:pPr>
+        <w:tabs>
+          <w:tab w:val="left" w:pos="3181"/>
+        </w:tabs>
+        <w:jc w:val="both"/>
+      </w:pPr>
+      <w:r>
+        <w:t>79-</w:t>
+      </w:r>
+      <w:bookmarkStart w:id="0" w:name="_GoBack"/>
+      <w:bookmarkEnd w:id="0"/>
+    </w:p>
     <w:sectPr>
-      <w:footerReference w:type="default" r:id="rId126"/>
+      <w:footerReference w:type="default" r:id="rId139"/>
       <w:pgSz w:w="11906" w:h="16838"/>
       <w:pgMar w:top="1418" w:right="1701" w:bottom="1418" w:left="1701" w:header="709" w:footer="709" w:gutter="0"/>
       <w:cols w:space="708"/>
@@ -12489,9 +14247,9 @@
     </w:lvl>
   </w:abstractNum>
   <w:abstractNum w:abstractNumId="1" w15:restartNumberingAfterBreak="0">
-    <w:nsid w:val="31FB2E6C"/>
+    <w:nsid w:val="17066399"/>
     <w:multiLevelType w:val="hybridMultilevel"/>
-    <w:tmpl w:val="1D0E047C"/>
+    <w:tmpl w:val="5D46B7AA"/>
     <w:lvl w:ilvl="0" w:tplc="04160001">
       <w:start w:val="1"/>
       <w:numFmt w:val="bullet"/>
@@ -12602,9 +14360,9 @@
     </w:lvl>
   </w:abstractNum>
   <w:abstractNum w:abstractNumId="2" w15:restartNumberingAfterBreak="0">
-    <w:nsid w:val="471817DB"/>
+    <w:nsid w:val="271B712E"/>
     <w:multiLevelType w:val="hybridMultilevel"/>
-    <w:tmpl w:val="E0CCA988"/>
+    <w:tmpl w:val="76A0506E"/>
     <w:lvl w:ilvl="0" w:tplc="04160001">
       <w:start w:val="1"/>
       <w:numFmt w:val="bullet"/>
@@ -12715,9 +14473,9 @@
     </w:lvl>
   </w:abstractNum>
   <w:abstractNum w:abstractNumId="3" w15:restartNumberingAfterBreak="0">
-    <w:nsid w:val="5B807CDB"/>
+    <w:nsid w:val="31FB2E6C"/>
     <w:multiLevelType w:val="hybridMultilevel"/>
-    <w:tmpl w:val="5BD0D580"/>
+    <w:tmpl w:val="1D0E047C"/>
     <w:lvl w:ilvl="0" w:tplc="04160001">
       <w:start w:val="1"/>
       <w:numFmt w:val="bullet"/>
@@ -12828,9 +14586,9 @@
     </w:lvl>
   </w:abstractNum>
   <w:abstractNum w:abstractNumId="4" w15:restartNumberingAfterBreak="0">
-    <w:nsid w:val="6B0F7CA7"/>
+    <w:nsid w:val="463821FD"/>
     <w:multiLevelType w:val="hybridMultilevel"/>
-    <w:tmpl w:val="3FF40976"/>
+    <w:tmpl w:val="1D662410"/>
     <w:lvl w:ilvl="0" w:tplc="04160001">
       <w:start w:val="1"/>
       <w:numFmt w:val="bullet"/>
@@ -12941,9 +14699,9 @@
     </w:lvl>
   </w:abstractNum>
   <w:abstractNum w:abstractNumId="5" w15:restartNumberingAfterBreak="0">
-    <w:nsid w:val="7E3921C8"/>
+    <w:nsid w:val="471817DB"/>
     <w:multiLevelType w:val="hybridMultilevel"/>
-    <w:tmpl w:val="68D678A0"/>
+    <w:tmpl w:val="E0CCA988"/>
     <w:lvl w:ilvl="0" w:tplc="04160001">
       <w:start w:val="1"/>
       <w:numFmt w:val="bullet"/>
@@ -13053,23 +14811,487 @@
       </w:rPr>
     </w:lvl>
   </w:abstractNum>
+  <w:abstractNum w:abstractNumId="6" w15:restartNumberingAfterBreak="0">
+    <w:nsid w:val="5B807CDB"/>
+    <w:multiLevelType w:val="hybridMultilevel"/>
+    <w:tmpl w:val="5BD0D580"/>
+    <w:lvl w:ilvl="0" w:tplc="04160001">
+      <w:start w:val="1"/>
+      <w:numFmt w:val="bullet"/>
+      <w:lvlText w:val=""/>
+      <w:lvlJc w:val="left"/>
+      <w:pPr>
+        <w:ind w:left="720" w:hanging="360"/>
+      </w:pPr>
+      <w:rPr>
+        <w:rFonts w:ascii="Symbol" w:hAnsi="Symbol" w:hint="default"/>
+      </w:rPr>
+    </w:lvl>
+    <w:lvl w:ilvl="1" w:tplc="04160003" w:tentative="1">
+      <w:start w:val="1"/>
+      <w:numFmt w:val="bullet"/>
+      <w:lvlText w:val="o"/>
+      <w:lvlJc w:val="left"/>
+      <w:pPr>
+        <w:ind w:left="1440" w:hanging="360"/>
+      </w:pPr>
+      <w:rPr>
+        <w:rFonts w:ascii="Courier New" w:hAnsi="Courier New" w:cs="Courier New" w:hint="default"/>
+      </w:rPr>
+    </w:lvl>
+    <w:lvl w:ilvl="2" w:tplc="04160005" w:tentative="1">
+      <w:start w:val="1"/>
+      <w:numFmt w:val="bullet"/>
+      <w:lvlText w:val=""/>
+      <w:lvlJc w:val="left"/>
+      <w:pPr>
+        <w:ind w:left="2160" w:hanging="360"/>
+      </w:pPr>
+      <w:rPr>
+        <w:rFonts w:ascii="Wingdings" w:hAnsi="Wingdings" w:hint="default"/>
+      </w:rPr>
+    </w:lvl>
+    <w:lvl w:ilvl="3" w:tplc="04160001" w:tentative="1">
+      <w:start w:val="1"/>
+      <w:numFmt w:val="bullet"/>
+      <w:lvlText w:val=""/>
+      <w:lvlJc w:val="left"/>
+      <w:pPr>
+        <w:ind w:left="2880" w:hanging="360"/>
+      </w:pPr>
+      <w:rPr>
+        <w:rFonts w:ascii="Symbol" w:hAnsi="Symbol" w:hint="default"/>
+      </w:rPr>
+    </w:lvl>
+    <w:lvl w:ilvl="4" w:tplc="04160003" w:tentative="1">
+      <w:start w:val="1"/>
+      <w:numFmt w:val="bullet"/>
+      <w:lvlText w:val="o"/>
+      <w:lvlJc w:val="left"/>
+      <w:pPr>
+        <w:ind w:left="3600" w:hanging="360"/>
+      </w:pPr>
+      <w:rPr>
+        <w:rFonts w:ascii="Courier New" w:hAnsi="Courier New" w:cs="Courier New" w:hint="default"/>
+      </w:rPr>
+    </w:lvl>
+    <w:lvl w:ilvl="5" w:tplc="04160005" w:tentative="1">
+      <w:start w:val="1"/>
+      <w:numFmt w:val="bullet"/>
+      <w:lvlText w:val=""/>
+      <w:lvlJc w:val="left"/>
+      <w:pPr>
+        <w:ind w:left="4320" w:hanging="360"/>
+      </w:pPr>
+      <w:rPr>
+        <w:rFonts w:ascii="Wingdings" w:hAnsi="Wingdings" w:hint="default"/>
+      </w:rPr>
+    </w:lvl>
+    <w:lvl w:ilvl="6" w:tplc="04160001" w:tentative="1">
+      <w:start w:val="1"/>
+      <w:numFmt w:val="bullet"/>
+      <w:lvlText w:val=""/>
+      <w:lvlJc w:val="left"/>
+      <w:pPr>
+        <w:ind w:left="5040" w:hanging="360"/>
+      </w:pPr>
+      <w:rPr>
+        <w:rFonts w:ascii="Symbol" w:hAnsi="Symbol" w:hint="default"/>
+      </w:rPr>
+    </w:lvl>
+    <w:lvl w:ilvl="7" w:tplc="04160003" w:tentative="1">
+      <w:start w:val="1"/>
+      <w:numFmt w:val="bullet"/>
+      <w:lvlText w:val="o"/>
+      <w:lvlJc w:val="left"/>
+      <w:pPr>
+        <w:ind w:left="5760" w:hanging="360"/>
+      </w:pPr>
+      <w:rPr>
+        <w:rFonts w:ascii="Courier New" w:hAnsi="Courier New" w:cs="Courier New" w:hint="default"/>
+      </w:rPr>
+    </w:lvl>
+    <w:lvl w:ilvl="8" w:tplc="04160005" w:tentative="1">
+      <w:start w:val="1"/>
+      <w:numFmt w:val="bullet"/>
+      <w:lvlText w:val=""/>
+      <w:lvlJc w:val="left"/>
+      <w:pPr>
+        <w:ind w:left="6480" w:hanging="360"/>
+      </w:pPr>
+      <w:rPr>
+        <w:rFonts w:ascii="Wingdings" w:hAnsi="Wingdings" w:hint="default"/>
+      </w:rPr>
+    </w:lvl>
+  </w:abstractNum>
+  <w:abstractNum w:abstractNumId="7" w15:restartNumberingAfterBreak="0">
+    <w:nsid w:val="6B0F7CA7"/>
+    <w:multiLevelType w:val="hybridMultilevel"/>
+    <w:tmpl w:val="3FF40976"/>
+    <w:lvl w:ilvl="0" w:tplc="04160001">
+      <w:start w:val="1"/>
+      <w:numFmt w:val="bullet"/>
+      <w:lvlText w:val=""/>
+      <w:lvlJc w:val="left"/>
+      <w:pPr>
+        <w:ind w:left="720" w:hanging="360"/>
+      </w:pPr>
+      <w:rPr>
+        <w:rFonts w:ascii="Symbol" w:hAnsi="Symbol" w:hint="default"/>
+      </w:rPr>
+    </w:lvl>
+    <w:lvl w:ilvl="1" w:tplc="04160003" w:tentative="1">
+      <w:start w:val="1"/>
+      <w:numFmt w:val="bullet"/>
+      <w:lvlText w:val="o"/>
+      <w:lvlJc w:val="left"/>
+      <w:pPr>
+        <w:ind w:left="1440" w:hanging="360"/>
+      </w:pPr>
+      <w:rPr>
+        <w:rFonts w:ascii="Courier New" w:hAnsi="Courier New" w:cs="Courier New" w:hint="default"/>
+      </w:rPr>
+    </w:lvl>
+    <w:lvl w:ilvl="2" w:tplc="04160005" w:tentative="1">
+      <w:start w:val="1"/>
+      <w:numFmt w:val="bullet"/>
+      <w:lvlText w:val=""/>
+      <w:lvlJc w:val="left"/>
+      <w:pPr>
+        <w:ind w:left="2160" w:hanging="360"/>
+      </w:pPr>
+      <w:rPr>
+        <w:rFonts w:ascii="Wingdings" w:hAnsi="Wingdings" w:hint="default"/>
+      </w:rPr>
+    </w:lvl>
+    <w:lvl w:ilvl="3" w:tplc="04160001" w:tentative="1">
+      <w:start w:val="1"/>
+      <w:numFmt w:val="bullet"/>
+      <w:lvlText w:val=""/>
+      <w:lvlJc w:val="left"/>
+      <w:pPr>
+        <w:ind w:left="2880" w:hanging="360"/>
+      </w:pPr>
+      <w:rPr>
+        <w:rFonts w:ascii="Symbol" w:hAnsi="Symbol" w:hint="default"/>
+      </w:rPr>
+    </w:lvl>
+    <w:lvl w:ilvl="4" w:tplc="04160003" w:tentative="1">
+      <w:start w:val="1"/>
+      <w:numFmt w:val="bullet"/>
+      <w:lvlText w:val="o"/>
+      <w:lvlJc w:val="left"/>
+      <w:pPr>
+        <w:ind w:left="3600" w:hanging="360"/>
+      </w:pPr>
+      <w:rPr>
+        <w:rFonts w:ascii="Courier New" w:hAnsi="Courier New" w:cs="Courier New" w:hint="default"/>
+      </w:rPr>
+    </w:lvl>
+    <w:lvl w:ilvl="5" w:tplc="04160005" w:tentative="1">
+      <w:start w:val="1"/>
+      <w:numFmt w:val="bullet"/>
+      <w:lvlText w:val=""/>
+      <w:lvlJc w:val="left"/>
+      <w:pPr>
+        <w:ind w:left="4320" w:hanging="360"/>
+      </w:pPr>
+      <w:rPr>
+        <w:rFonts w:ascii="Wingdings" w:hAnsi="Wingdings" w:hint="default"/>
+      </w:rPr>
+    </w:lvl>
+    <w:lvl w:ilvl="6" w:tplc="04160001" w:tentative="1">
+      <w:start w:val="1"/>
+      <w:numFmt w:val="bullet"/>
+      <w:lvlText w:val=""/>
+      <w:lvlJc w:val="left"/>
+      <w:pPr>
+        <w:ind w:left="5040" w:hanging="360"/>
+      </w:pPr>
+      <w:rPr>
+        <w:rFonts w:ascii="Symbol" w:hAnsi="Symbol" w:hint="default"/>
+      </w:rPr>
+    </w:lvl>
+    <w:lvl w:ilvl="7" w:tplc="04160003" w:tentative="1">
+      <w:start w:val="1"/>
+      <w:numFmt w:val="bullet"/>
+      <w:lvlText w:val="o"/>
+      <w:lvlJc w:val="left"/>
+      <w:pPr>
+        <w:ind w:left="5760" w:hanging="360"/>
+      </w:pPr>
+      <w:rPr>
+        <w:rFonts w:ascii="Courier New" w:hAnsi="Courier New" w:cs="Courier New" w:hint="default"/>
+      </w:rPr>
+    </w:lvl>
+    <w:lvl w:ilvl="8" w:tplc="04160005" w:tentative="1">
+      <w:start w:val="1"/>
+      <w:numFmt w:val="bullet"/>
+      <w:lvlText w:val=""/>
+      <w:lvlJc w:val="left"/>
+      <w:pPr>
+        <w:ind w:left="6480" w:hanging="360"/>
+      </w:pPr>
+      <w:rPr>
+        <w:rFonts w:ascii="Wingdings" w:hAnsi="Wingdings" w:hint="default"/>
+      </w:rPr>
+    </w:lvl>
+  </w:abstractNum>
+  <w:abstractNum w:abstractNumId="8" w15:restartNumberingAfterBreak="0">
+    <w:nsid w:val="7E3921C8"/>
+    <w:multiLevelType w:val="hybridMultilevel"/>
+    <w:tmpl w:val="68D678A0"/>
+    <w:lvl w:ilvl="0" w:tplc="04160001">
+      <w:start w:val="1"/>
+      <w:numFmt w:val="bullet"/>
+      <w:lvlText w:val=""/>
+      <w:lvlJc w:val="left"/>
+      <w:pPr>
+        <w:ind w:left="720" w:hanging="360"/>
+      </w:pPr>
+      <w:rPr>
+        <w:rFonts w:ascii="Symbol" w:hAnsi="Symbol" w:hint="default"/>
+      </w:rPr>
+    </w:lvl>
+    <w:lvl w:ilvl="1" w:tplc="04160003" w:tentative="1">
+      <w:start w:val="1"/>
+      <w:numFmt w:val="bullet"/>
+      <w:lvlText w:val="o"/>
+      <w:lvlJc w:val="left"/>
+      <w:pPr>
+        <w:ind w:left="1440" w:hanging="360"/>
+      </w:pPr>
+      <w:rPr>
+        <w:rFonts w:ascii="Courier New" w:hAnsi="Courier New" w:cs="Courier New" w:hint="default"/>
+      </w:rPr>
+    </w:lvl>
+    <w:lvl w:ilvl="2" w:tplc="04160005" w:tentative="1">
+      <w:start w:val="1"/>
+      <w:numFmt w:val="bullet"/>
+      <w:lvlText w:val=""/>
+      <w:lvlJc w:val="left"/>
+      <w:pPr>
+        <w:ind w:left="2160" w:hanging="360"/>
+      </w:pPr>
+      <w:rPr>
+        <w:rFonts w:ascii="Wingdings" w:hAnsi="Wingdings" w:hint="default"/>
+      </w:rPr>
+    </w:lvl>
+    <w:lvl w:ilvl="3" w:tplc="04160001" w:tentative="1">
+      <w:start w:val="1"/>
+      <w:numFmt w:val="bullet"/>
+      <w:lvlText w:val=""/>
+      <w:lvlJc w:val="left"/>
+      <w:pPr>
+        <w:ind w:left="2880" w:hanging="360"/>
+      </w:pPr>
+      <w:rPr>
+        <w:rFonts w:ascii="Symbol" w:hAnsi="Symbol" w:hint="default"/>
+      </w:rPr>
+    </w:lvl>
+    <w:lvl w:ilvl="4" w:tplc="04160003" w:tentative="1">
+      <w:start w:val="1"/>
+      <w:numFmt w:val="bullet"/>
+      <w:lvlText w:val="o"/>
+      <w:lvlJc w:val="left"/>
+      <w:pPr>
+        <w:ind w:left="3600" w:hanging="360"/>
+      </w:pPr>
+      <w:rPr>
+        <w:rFonts w:ascii="Courier New" w:hAnsi="Courier New" w:cs="Courier New" w:hint="default"/>
+      </w:rPr>
+    </w:lvl>
+    <w:lvl w:ilvl="5" w:tplc="04160005" w:tentative="1">
+      <w:start w:val="1"/>
+      <w:numFmt w:val="bullet"/>
+      <w:lvlText w:val=""/>
+      <w:lvlJc w:val="left"/>
+      <w:pPr>
+        <w:ind w:left="4320" w:hanging="360"/>
+      </w:pPr>
+      <w:rPr>
+        <w:rFonts w:ascii="Wingdings" w:hAnsi="Wingdings" w:hint="default"/>
+      </w:rPr>
+    </w:lvl>
+    <w:lvl w:ilvl="6" w:tplc="04160001" w:tentative="1">
+      <w:start w:val="1"/>
+      <w:numFmt w:val="bullet"/>
+      <w:lvlText w:val=""/>
+      <w:lvlJc w:val="left"/>
+      <w:pPr>
+        <w:ind w:left="5040" w:hanging="360"/>
+      </w:pPr>
+      <w:rPr>
+        <w:rFonts w:ascii="Symbol" w:hAnsi="Symbol" w:hint="default"/>
+      </w:rPr>
+    </w:lvl>
+    <w:lvl w:ilvl="7" w:tplc="04160003" w:tentative="1">
+      <w:start w:val="1"/>
+      <w:numFmt w:val="bullet"/>
+      <w:lvlText w:val="o"/>
+      <w:lvlJc w:val="left"/>
+      <w:pPr>
+        <w:ind w:left="5760" w:hanging="360"/>
+      </w:pPr>
+      <w:rPr>
+        <w:rFonts w:ascii="Courier New" w:hAnsi="Courier New" w:cs="Courier New" w:hint="default"/>
+      </w:rPr>
+    </w:lvl>
+    <w:lvl w:ilvl="8" w:tplc="04160005" w:tentative="1">
+      <w:start w:val="1"/>
+      <w:numFmt w:val="bullet"/>
+      <w:lvlText w:val=""/>
+      <w:lvlJc w:val="left"/>
+      <w:pPr>
+        <w:ind w:left="6480" w:hanging="360"/>
+      </w:pPr>
+      <w:rPr>
+        <w:rFonts w:ascii="Wingdings" w:hAnsi="Wingdings" w:hint="default"/>
+      </w:rPr>
+    </w:lvl>
+  </w:abstractNum>
+  <w:abstractNum w:abstractNumId="9" w15:restartNumberingAfterBreak="0">
+    <w:nsid w:val="7EDD3EB0"/>
+    <w:multiLevelType w:val="hybridMultilevel"/>
+    <w:tmpl w:val="2ACE7D7E"/>
+    <w:lvl w:ilvl="0" w:tplc="04160001">
+      <w:start w:val="1"/>
+      <w:numFmt w:val="bullet"/>
+      <w:lvlText w:val=""/>
+      <w:lvlJc w:val="left"/>
+      <w:pPr>
+        <w:ind w:left="720" w:hanging="360"/>
+      </w:pPr>
+      <w:rPr>
+        <w:rFonts w:ascii="Symbol" w:hAnsi="Symbol" w:hint="default"/>
+      </w:rPr>
+    </w:lvl>
+    <w:lvl w:ilvl="1" w:tplc="04160003" w:tentative="1">
+      <w:start w:val="1"/>
+      <w:numFmt w:val="bullet"/>
+      <w:lvlText w:val="o"/>
+      <w:lvlJc w:val="left"/>
+      <w:pPr>
+        <w:ind w:left="1440" w:hanging="360"/>
+      </w:pPr>
+      <w:rPr>
+        <w:rFonts w:ascii="Courier New" w:hAnsi="Courier New" w:cs="Courier New" w:hint="default"/>
+      </w:rPr>
+    </w:lvl>
+    <w:lvl w:ilvl="2" w:tplc="04160005" w:tentative="1">
+      <w:start w:val="1"/>
+      <w:numFmt w:val="bullet"/>
+      <w:lvlText w:val=""/>
+      <w:lvlJc w:val="left"/>
+      <w:pPr>
+        <w:ind w:left="2160" w:hanging="360"/>
+      </w:pPr>
+      <w:rPr>
+        <w:rFonts w:ascii="Wingdings" w:hAnsi="Wingdings" w:hint="default"/>
+      </w:rPr>
+    </w:lvl>
+    <w:lvl w:ilvl="3" w:tplc="04160001" w:tentative="1">
+      <w:start w:val="1"/>
+      <w:numFmt w:val="bullet"/>
+      <w:lvlText w:val=""/>
+      <w:lvlJc w:val="left"/>
+      <w:pPr>
+        <w:ind w:left="2880" w:hanging="360"/>
+      </w:pPr>
+      <w:rPr>
+        <w:rFonts w:ascii="Symbol" w:hAnsi="Symbol" w:hint="default"/>
+      </w:rPr>
+    </w:lvl>
+    <w:lvl w:ilvl="4" w:tplc="04160003" w:tentative="1">
+      <w:start w:val="1"/>
+      <w:numFmt w:val="bullet"/>
+      <w:lvlText w:val="o"/>
+      <w:lvlJc w:val="left"/>
+      <w:pPr>
+        <w:ind w:left="3600" w:hanging="360"/>
+      </w:pPr>
+      <w:rPr>
+        <w:rFonts w:ascii="Courier New" w:hAnsi="Courier New" w:cs="Courier New" w:hint="default"/>
+      </w:rPr>
+    </w:lvl>
+    <w:lvl w:ilvl="5" w:tplc="04160005" w:tentative="1">
+      <w:start w:val="1"/>
+      <w:numFmt w:val="bullet"/>
+      <w:lvlText w:val=""/>
+      <w:lvlJc w:val="left"/>
+      <w:pPr>
+        <w:ind w:left="4320" w:hanging="360"/>
+      </w:pPr>
+      <w:rPr>
+        <w:rFonts w:ascii="Wingdings" w:hAnsi="Wingdings" w:hint="default"/>
+      </w:rPr>
+    </w:lvl>
+    <w:lvl w:ilvl="6" w:tplc="04160001" w:tentative="1">
+      <w:start w:val="1"/>
+      <w:numFmt w:val="bullet"/>
+      <w:lvlText w:val=""/>
+      <w:lvlJc w:val="left"/>
+      <w:pPr>
+        <w:ind w:left="5040" w:hanging="360"/>
+      </w:pPr>
+      <w:rPr>
+        <w:rFonts w:ascii="Symbol" w:hAnsi="Symbol" w:hint="default"/>
+      </w:rPr>
+    </w:lvl>
+    <w:lvl w:ilvl="7" w:tplc="04160003" w:tentative="1">
+      <w:start w:val="1"/>
+      <w:numFmt w:val="bullet"/>
+      <w:lvlText w:val="o"/>
+      <w:lvlJc w:val="left"/>
+      <w:pPr>
+        <w:ind w:left="5760" w:hanging="360"/>
+      </w:pPr>
+      <w:rPr>
+        <w:rFonts w:ascii="Courier New" w:hAnsi="Courier New" w:cs="Courier New" w:hint="default"/>
+      </w:rPr>
+    </w:lvl>
+    <w:lvl w:ilvl="8" w:tplc="04160005" w:tentative="1">
+      <w:start w:val="1"/>
+      <w:numFmt w:val="bullet"/>
+      <w:lvlText w:val=""/>
+      <w:lvlJc w:val="left"/>
+      <w:pPr>
+        <w:ind w:left="6480" w:hanging="360"/>
+      </w:pPr>
+      <w:rPr>
+        <w:rFonts w:ascii="Wingdings" w:hAnsi="Wingdings" w:hint="default"/>
+      </w:rPr>
+    </w:lvl>
+  </w:abstractNum>
   <w:num w:numId="1">
-    <w:abstractNumId w:val="2"/>
+    <w:abstractNumId w:val="5"/>
   </w:num>
   <w:num w:numId="2">
-    <w:abstractNumId w:val="5"/>
+    <w:abstractNumId w:val="8"/>
   </w:num>
   <w:num w:numId="3">
-    <w:abstractNumId w:val="1"/>
+    <w:abstractNumId w:val="3"/>
   </w:num>
   <w:num w:numId="4">
     <w:abstractNumId w:val="0"/>
   </w:num>
   <w:num w:numId="5">
-    <w:abstractNumId w:val="3"/>
+    <w:abstractNumId w:val="6"/>
   </w:num>
   <w:num w:numId="6">
+    <w:abstractNumId w:val="7"/>
+  </w:num>
+  <w:num w:numId="7">
     <w:abstractNumId w:val="4"/>
+  </w:num>
+  <w:num w:numId="8">
+    <w:abstractNumId w:val="1"/>
+  </w:num>
+  <w:num w:numId="9">
+    <w:abstractNumId w:val="9"/>
+  </w:num>
+  <w:num w:numId="10">
+    <w:abstractNumId w:val="2"/>
   </w:num>
 </w:numbering>
 </file>
@@ -13880,7 +16102,7 @@
 </file>
 
 <file path=customXml/itemProps1.xml><?xml version="1.0" encoding="utf-8"?>
-<ds:datastoreItem xmlns:ds="http://schemas.openxmlformats.org/officeDocument/2006/customXml" ds:itemID="{5D7066C4-7E0E-4B69-825E-8D34F1CC3C7F}">
+<ds:datastoreItem xmlns:ds="http://schemas.openxmlformats.org/officeDocument/2006/customXml" ds:itemID="{7E5D7488-D3DF-4BC4-A138-748196D4FBD7}">
   <ds:schemaRefs>
     <ds:schemaRef ds:uri="http://schemas.openxmlformats.org/officeDocument/2006/bibliography"/>
   </ds:schemaRefs>

</xml_diff>

<commit_message>
atulização da aula dia 29/09/2026
</commit_message>
<xml_diff>
--- a/apostila/Projeto Space For Men.docx
+++ b/apostila/Projeto Space For Men.docx
@@ -16379,6 +16379,9 @@
         </w:tabs>
       </w:pPr>
       <w:r>
+        <w:rPr>
+          <w:noProof/>
+        </w:rPr>
         <w:lastRenderedPageBreak/>
         <w:drawing>
           <wp:anchor distT="0" distB="0" distL="114300" distR="114300" simplePos="0" relativeHeight="251807744" behindDoc="1" locked="0" layoutInCell="1" allowOverlap="1" wp14:anchorId="5597ED09">
@@ -16469,6 +16472,9 @@
         </w:tabs>
       </w:pPr>
       <w:r>
+        <w:rPr>
+          <w:noProof/>
+        </w:rPr>
         <w:drawing>
           <wp:anchor distT="0" distB="0" distL="114300" distR="114300" simplePos="0" relativeHeight="251806720" behindDoc="1" locked="0" layoutInCell="1" allowOverlap="1" wp14:anchorId="56D15FAC">
             <wp:simplePos x="0" y="0"/>
@@ -16545,6 +16551,9 @@
         </w:rPr>
       </w:pPr>
       <w:r>
+        <w:rPr>
+          <w:noProof/>
+        </w:rPr>
         <w:drawing>
           <wp:anchor distT="0" distB="0" distL="114300" distR="114300" simplePos="0" relativeHeight="251808768" behindDoc="1" locked="0" layoutInCell="1" allowOverlap="1" wp14:anchorId="724BEEA9">
             <wp:simplePos x="0" y="0"/>
@@ -16674,6 +16683,9 @@
         </w:rPr>
       </w:pPr>
       <w:r>
+        <w:rPr>
+          <w:noProof/>
+        </w:rPr>
         <w:drawing>
           <wp:anchor distT="0" distB="0" distL="114300" distR="114300" simplePos="0" relativeHeight="251810816" behindDoc="1" locked="0" layoutInCell="1" allowOverlap="1" wp14:anchorId="1DD7CAEA">
             <wp:simplePos x="0" y="0"/>
@@ -16733,6 +16745,9 @@
         </w:drawing>
       </w:r>
       <w:r>
+        <w:rPr>
+          <w:noProof/>
+        </w:rPr>
         <w:drawing>
           <wp:anchor distT="0" distB="0" distL="114300" distR="114300" simplePos="0" relativeHeight="251809792" behindDoc="1" locked="0" layoutInCell="1" allowOverlap="1" wp14:anchorId="6444199A">
             <wp:simplePos x="0" y="0"/>
@@ -16928,9 +16943,12 @@
       </w:r>
       <w:proofErr w:type="spellStart"/>
       <w:r>
-        <w:t>css.</w:t>
+        <w:t>css</w:t>
       </w:r>
       <w:proofErr w:type="spellEnd"/>
+      <w:r>
+        <w:t>.</w:t>
+      </w:r>
     </w:p>
     <w:p>
       <w:pPr>
@@ -16979,6 +16997,9 @@
         </w:tabs>
       </w:pPr>
       <w:r>
+        <w:rPr>
+          <w:noProof/>
+        </w:rPr>
         <w:lastRenderedPageBreak/>
         <w:drawing>
           <wp:anchor distT="0" distB="0" distL="114300" distR="114300" simplePos="0" relativeHeight="251811840" behindDoc="1" locked="0" layoutInCell="1" allowOverlap="1" wp14:anchorId="6BC9A9D5">
@@ -17039,6 +17060,9 @@
         </w:drawing>
       </w:r>
       <w:r>
+        <w:rPr>
+          <w:noProof/>
+        </w:rPr>
         <w:drawing>
           <wp:anchor distT="0" distB="0" distL="114300" distR="114300" simplePos="0" relativeHeight="251812864" behindDoc="1" locked="0" layoutInCell="1" allowOverlap="1" wp14:anchorId="03361B74">
             <wp:simplePos x="0" y="0"/>
@@ -17231,11 +17255,11 @@
         <w:tabs>
           <w:tab w:val="left" w:pos="1624"/>
         </w:tabs>
-        <w:rPr>
-          <w:noProof/>
-        </w:rPr>
-      </w:pPr>
-      <w:r>
+      </w:pPr>
+      <w:r>
+        <w:rPr>
+          <w:noProof/>
+        </w:rPr>
         <w:drawing>
           <wp:anchor distT="0" distB="0" distL="114300" distR="114300" simplePos="0" relativeHeight="251814912" behindDoc="1" locked="0" layoutInCell="1" allowOverlap="1" wp14:anchorId="0CA95D0E">
             <wp:simplePos x="0" y="0"/>
@@ -17325,13 +17349,1175 @@
       </w:r>
       <w:proofErr w:type="spellEnd"/>
       <w:r>
-        <w:t>, no campo parecido 3 pontinha ou três linha clica vai aparecer a seguinte tela com o campo compartilha ou incorporar acessamos esse campo copiamos o link que gera para colocar no html.</w:t>
+        <w:t xml:space="preserve">, no campo parecido </w:t>
+      </w:r>
+      <w:proofErr w:type="gramStart"/>
+      <w:r>
+        <w:t>3 pontinha</w:t>
+      </w:r>
+      <w:proofErr w:type="gramEnd"/>
+      <w:r>
+        <w:t xml:space="preserve"> ou três linha clica vai aparecer a seguinte tela com o campo compartilha ou incorporar acessamos esse campo copiamos o link que gera para colocar no </w:t>
+      </w:r>
+      <w:proofErr w:type="spellStart"/>
+      <w:r>
+        <w:t>html</w:t>
+      </w:r>
+      <w:proofErr w:type="spellEnd"/>
+      <w:r>
+        <w:t>.</w:t>
+      </w:r>
+    </w:p>
+    <w:p>
+      <w:pPr>
+        <w:tabs>
+          <w:tab w:val="left" w:pos="1624"/>
+        </w:tabs>
+        <w:rPr>
+          <w:noProof/>
+        </w:rPr>
+      </w:pPr>
+    </w:p>
+    <w:p>
+      <w:pPr>
+        <w:tabs>
+          <w:tab w:val="left" w:pos="1624"/>
+        </w:tabs>
+        <w:rPr>
+          <w:noProof/>
+        </w:rPr>
+      </w:pPr>
+    </w:p>
+    <w:p>
+      <w:pPr>
+        <w:tabs>
+          <w:tab w:val="left" w:pos="1624"/>
+        </w:tabs>
+        <w:rPr>
+          <w:noProof/>
+        </w:rPr>
+      </w:pPr>
+    </w:p>
+    <w:p>
+      <w:pPr>
+        <w:tabs>
+          <w:tab w:val="left" w:pos="1624"/>
+        </w:tabs>
+        <w:rPr>
+          <w:noProof/>
+        </w:rPr>
+      </w:pPr>
+    </w:p>
+    <w:p>
+      <w:pPr>
+        <w:tabs>
+          <w:tab w:val="left" w:pos="1624"/>
+        </w:tabs>
+        <w:rPr>
+          <w:noProof/>
+        </w:rPr>
+      </w:pPr>
+    </w:p>
+    <w:p>
+      <w:pPr>
+        <w:tabs>
+          <w:tab w:val="left" w:pos="1624"/>
+        </w:tabs>
+        <w:rPr>
+          <w:noProof/>
+        </w:rPr>
+      </w:pPr>
+    </w:p>
+    <w:p>
+      <w:pPr>
+        <w:tabs>
+          <w:tab w:val="left" w:pos="1624"/>
+        </w:tabs>
+        <w:rPr>
+          <w:noProof/>
+        </w:rPr>
+      </w:pPr>
+    </w:p>
+    <w:p>
+      <w:pPr>
+        <w:tabs>
+          <w:tab w:val="left" w:pos="1624"/>
+        </w:tabs>
+        <w:rPr>
+          <w:noProof/>
+        </w:rPr>
+      </w:pPr>
+    </w:p>
+    <w:p>
+      <w:pPr>
+        <w:tabs>
+          <w:tab w:val="left" w:pos="1624"/>
+        </w:tabs>
+        <w:rPr>
+          <w:noProof/>
+        </w:rPr>
+      </w:pPr>
+    </w:p>
+    <w:p>
+      <w:pPr>
+        <w:tabs>
+          <w:tab w:val="left" w:pos="1624"/>
+        </w:tabs>
+        <w:rPr>
+          <w:noProof/>
+        </w:rPr>
+      </w:pPr>
+    </w:p>
+    <w:p>
+      <w:pPr>
+        <w:tabs>
+          <w:tab w:val="left" w:pos="1624"/>
+        </w:tabs>
+        <w:rPr>
+          <w:noProof/>
+        </w:rPr>
+      </w:pPr>
+    </w:p>
+    <w:p>
+      <w:pPr>
+        <w:tabs>
+          <w:tab w:val="left" w:pos="1624"/>
+        </w:tabs>
+        <w:rPr>
+          <w:noProof/>
+        </w:rPr>
+      </w:pPr>
+    </w:p>
+    <w:p>
+      <w:pPr>
+        <w:tabs>
+          <w:tab w:val="left" w:pos="1624"/>
+        </w:tabs>
+        <w:rPr>
+          <w:noProof/>
+        </w:rPr>
+      </w:pPr>
+    </w:p>
+    <w:p>
+      <w:pPr>
+        <w:tabs>
+          <w:tab w:val="left" w:pos="1624"/>
+        </w:tabs>
+        <w:rPr>
+          <w:noProof/>
+        </w:rPr>
+      </w:pPr>
+    </w:p>
+    <w:p>
+      <w:pPr>
+        <w:tabs>
+          <w:tab w:val="left" w:pos="1624"/>
+        </w:tabs>
+        <w:rPr>
+          <w:noProof/>
+        </w:rPr>
+      </w:pPr>
+      <w:r>
+        <w:rPr>
+          <w:noProof/>
+        </w:rPr>
+        <w:lastRenderedPageBreak/>
+        <w:drawing>
+          <wp:anchor distT="0" distB="0" distL="114300" distR="114300" simplePos="0" relativeHeight="251815936" behindDoc="1" locked="0" layoutInCell="1" allowOverlap="1" wp14:anchorId="3B5C8F57">
+            <wp:simplePos x="0" y="0"/>
+            <wp:positionH relativeFrom="column">
+              <wp:posOffset>-368330</wp:posOffset>
+            </wp:positionH>
+            <wp:positionV relativeFrom="paragraph">
+              <wp:posOffset>438918</wp:posOffset>
+            </wp:positionV>
+            <wp:extent cx="5400040" cy="699770"/>
+            <wp:effectExtent l="0" t="0" r="0" b="5080"/>
+            <wp:wrapTight wrapText="bothSides">
+              <wp:wrapPolygon edited="0">
+                <wp:start x="0" y="0"/>
+                <wp:lineTo x="0" y="21169"/>
+                <wp:lineTo x="21488" y="21169"/>
+                <wp:lineTo x="21488" y="0"/>
+                <wp:lineTo x="0" y="0"/>
+              </wp:wrapPolygon>
+            </wp:wrapTight>
+            <wp:docPr id="155" name="Imagem 155"/>
+            <wp:cNvGraphicFramePr>
+              <a:graphicFrameLocks xmlns:a="http://schemas.openxmlformats.org/drawingml/2006/main" noChangeAspect="1"/>
+            </wp:cNvGraphicFramePr>
+            <a:graphic xmlns:a="http://schemas.openxmlformats.org/drawingml/2006/main">
+              <a:graphicData uri="http://schemas.openxmlformats.org/drawingml/2006/picture">
+                <pic:pic xmlns:pic="http://schemas.openxmlformats.org/drawingml/2006/picture">
+                  <pic:nvPicPr>
+                    <pic:cNvPr id="1" name=""/>
+                    <pic:cNvPicPr/>
+                  </pic:nvPicPr>
+                  <pic:blipFill>
+                    <a:blip r:embed="rId166">
+                      <a:extLst>
+                        <a:ext uri="{28A0092B-C50C-407E-A947-70E740481C1C}">
+                          <a14:useLocalDpi xmlns:a14="http://schemas.microsoft.com/office/drawing/2010/main" val="0"/>
+                        </a:ext>
+                      </a:extLst>
+                    </a:blip>
+                    <a:stretch>
+                      <a:fillRect/>
+                    </a:stretch>
+                  </pic:blipFill>
+                  <pic:spPr>
+                    <a:xfrm>
+                      <a:off x="0" y="0"/>
+                      <a:ext cx="5400040" cy="699770"/>
+                    </a:xfrm>
+                    <a:prstGeom prst="rect">
+                      <a:avLst/>
+                    </a:prstGeom>
+                  </pic:spPr>
+                </pic:pic>
+              </a:graphicData>
+            </a:graphic>
+          </wp:anchor>
+        </w:drawing>
+      </w:r>
+      <w:r>
+        <w:rPr>
+          <w:noProof/>
+        </w:rPr>
+        <w:t>97-</w:t>
+      </w:r>
+      <w:r>
+        <w:rPr>
+          <w:noProof/>
+        </w:rPr>
+        <w:t xml:space="preserve"> Para </w:t>
+      </w:r>
+      <w:r>
+        <w:rPr>
+          <w:noProof/>
+        </w:rPr>
+        <w:t>melhorar a visualização do nosso mapa no site colocamos para que ele ocupe 100% de largura e 300px de altura no iframe</w:t>
+      </w:r>
+      <w:r>
+        <w:rPr>
+          <w:noProof/>
+        </w:rPr>
+        <w:t>.</w:t>
+      </w:r>
+    </w:p>
+    <w:p>
+      <w:pPr>
+        <w:tabs>
+          <w:tab w:val="left" w:pos="1624"/>
+        </w:tabs>
+        <w:rPr>
+          <w:noProof/>
+        </w:rPr>
+      </w:pPr>
+    </w:p>
+    <w:p>
+      <w:pPr>
+        <w:tabs>
+          <w:tab w:val="left" w:pos="1624"/>
+        </w:tabs>
+        <w:rPr>
+          <w:noProof/>
+        </w:rPr>
+      </w:pPr>
+    </w:p>
+    <w:p>
+      <w:pPr>
+        <w:tabs>
+          <w:tab w:val="left" w:pos="1624"/>
+        </w:tabs>
+        <w:rPr>
+          <w:noProof/>
+        </w:rPr>
+      </w:pPr>
+    </w:p>
+    <w:p>
+      <w:pPr>
+        <w:tabs>
+          <w:tab w:val="left" w:pos="1624"/>
+        </w:tabs>
+        <w:rPr>
+          <w:noProof/>
+        </w:rPr>
+      </w:pPr>
+      <w:r>
+        <w:rPr>
+          <w:noProof/>
+        </w:rPr>
+        <w:drawing>
+          <wp:anchor distT="0" distB="0" distL="114300" distR="114300" simplePos="0" relativeHeight="251816960" behindDoc="1" locked="0" layoutInCell="1" allowOverlap="1" wp14:anchorId="3100E408">
+            <wp:simplePos x="0" y="0"/>
+            <wp:positionH relativeFrom="column">
+              <wp:posOffset>-27394</wp:posOffset>
+            </wp:positionH>
+            <wp:positionV relativeFrom="paragraph">
+              <wp:posOffset>526060</wp:posOffset>
+            </wp:positionV>
+            <wp:extent cx="2009775" cy="676275"/>
+            <wp:effectExtent l="0" t="0" r="9525" b="9525"/>
+            <wp:wrapTight wrapText="bothSides">
+              <wp:wrapPolygon edited="0">
+                <wp:start x="0" y="0"/>
+                <wp:lineTo x="0" y="21296"/>
+                <wp:lineTo x="21498" y="21296"/>
+                <wp:lineTo x="21498" y="0"/>
+                <wp:lineTo x="0" y="0"/>
+              </wp:wrapPolygon>
+            </wp:wrapTight>
+            <wp:docPr id="156" name="Imagem 156"/>
+            <wp:cNvGraphicFramePr>
+              <a:graphicFrameLocks xmlns:a="http://schemas.openxmlformats.org/drawingml/2006/main" noChangeAspect="1"/>
+            </wp:cNvGraphicFramePr>
+            <a:graphic xmlns:a="http://schemas.openxmlformats.org/drawingml/2006/main">
+              <a:graphicData uri="http://schemas.openxmlformats.org/drawingml/2006/picture">
+                <pic:pic xmlns:pic="http://schemas.openxmlformats.org/drawingml/2006/picture">
+                  <pic:nvPicPr>
+                    <pic:cNvPr id="1" name=""/>
+                    <pic:cNvPicPr/>
+                  </pic:nvPicPr>
+                  <pic:blipFill>
+                    <a:blip r:embed="rId167">
+                      <a:extLst>
+                        <a:ext uri="{28A0092B-C50C-407E-A947-70E740481C1C}">
+                          <a14:useLocalDpi xmlns:a14="http://schemas.microsoft.com/office/drawing/2010/main" val="0"/>
+                        </a:ext>
+                      </a:extLst>
+                    </a:blip>
+                    <a:stretch>
+                      <a:fillRect/>
+                    </a:stretch>
+                  </pic:blipFill>
+                  <pic:spPr>
+                    <a:xfrm>
+                      <a:off x="0" y="0"/>
+                      <a:ext cx="2009775" cy="676275"/>
+                    </a:xfrm>
+                    <a:prstGeom prst="rect">
+                      <a:avLst/>
+                    </a:prstGeom>
+                  </pic:spPr>
+                </pic:pic>
+              </a:graphicData>
+            </a:graphic>
+          </wp:anchor>
+        </w:drawing>
+      </w:r>
+      <w:r>
+        <w:rPr>
+          <w:noProof/>
+        </w:rPr>
+        <w:t>98- Para deixa a nossa seção mapa de uma forma mais estilizada vamos dar um espaço interno para cima e para baixo de 3em e 0 dos lados.</w:t>
+      </w:r>
+      <w:r>
+        <w:rPr>
+          <w:noProof/>
+        </w:rPr>
+        <w:t xml:space="preserve"> </w:t>
+      </w:r>
+    </w:p>
+    <w:p>
+      <w:pPr>
+        <w:tabs>
+          <w:tab w:val="left" w:pos="1624"/>
+        </w:tabs>
+        <w:rPr>
+          <w:noProof/>
+        </w:rPr>
+      </w:pPr>
+    </w:p>
+    <w:p>
+      <w:pPr>
+        <w:tabs>
+          <w:tab w:val="left" w:pos="1624"/>
+        </w:tabs>
+        <w:rPr>
+          <w:noProof/>
+        </w:rPr>
+      </w:pPr>
+    </w:p>
+    <w:p>
+      <w:pPr>
+        <w:tabs>
+          <w:tab w:val="left" w:pos="1624"/>
+        </w:tabs>
+        <w:rPr>
+          <w:noProof/>
+        </w:rPr>
+      </w:pPr>
+    </w:p>
+    <w:p>
+      <w:pPr>
+        <w:tabs>
+          <w:tab w:val="left" w:pos="1624"/>
+        </w:tabs>
+        <w:rPr>
+          <w:noProof/>
+        </w:rPr>
+      </w:pPr>
+      <w:r>
+        <w:rPr>
+          <w:noProof/>
+        </w:rPr>
+        <w:t>99- Demos um espaço para baixo no paragrafo</w:t>
+      </w:r>
+      <w:r>
+        <w:rPr>
+          <w:noProof/>
+        </w:rPr>
+        <w:t xml:space="preserve"> da seção mapa e centralizamos o texto.</w:t>
+      </w:r>
+    </w:p>
+    <w:p>
+      <w:pPr>
+        <w:tabs>
+          <w:tab w:val="left" w:pos="1624"/>
+        </w:tabs>
+        <w:rPr>
+          <w:noProof/>
+        </w:rPr>
+      </w:pPr>
+      <w:r>
+        <w:rPr>
+          <w:noProof/>
+        </w:rPr>
+        <w:drawing>
+          <wp:anchor distT="0" distB="0" distL="114300" distR="114300" simplePos="0" relativeHeight="251817984" behindDoc="1" locked="0" layoutInCell="1" allowOverlap="1" wp14:anchorId="020C5B9A">
+            <wp:simplePos x="0" y="0"/>
+            <wp:positionH relativeFrom="column">
+              <wp:posOffset>-70485</wp:posOffset>
+            </wp:positionH>
+            <wp:positionV relativeFrom="paragraph">
+              <wp:posOffset>147113</wp:posOffset>
+            </wp:positionV>
+            <wp:extent cx="2209800" cy="781050"/>
+            <wp:effectExtent l="0" t="0" r="0" b="0"/>
+            <wp:wrapTight wrapText="bothSides">
+              <wp:wrapPolygon edited="0">
+                <wp:start x="0" y="0"/>
+                <wp:lineTo x="0" y="21073"/>
+                <wp:lineTo x="21414" y="21073"/>
+                <wp:lineTo x="21414" y="0"/>
+                <wp:lineTo x="0" y="0"/>
+              </wp:wrapPolygon>
+            </wp:wrapTight>
+            <wp:docPr id="157" name="Imagem 157"/>
+            <wp:cNvGraphicFramePr>
+              <a:graphicFrameLocks xmlns:a="http://schemas.openxmlformats.org/drawingml/2006/main" noChangeAspect="1"/>
+            </wp:cNvGraphicFramePr>
+            <a:graphic xmlns:a="http://schemas.openxmlformats.org/drawingml/2006/main">
+              <a:graphicData uri="http://schemas.openxmlformats.org/drawingml/2006/picture">
+                <pic:pic xmlns:pic="http://schemas.openxmlformats.org/drawingml/2006/picture">
+                  <pic:nvPicPr>
+                    <pic:cNvPr id="1" name=""/>
+                    <pic:cNvPicPr/>
+                  </pic:nvPicPr>
+                  <pic:blipFill>
+                    <a:blip r:embed="rId168">
+                      <a:extLst>
+                        <a:ext uri="{28A0092B-C50C-407E-A947-70E740481C1C}">
+                          <a14:useLocalDpi xmlns:a14="http://schemas.microsoft.com/office/drawing/2010/main" val="0"/>
+                        </a:ext>
+                      </a:extLst>
+                    </a:blip>
+                    <a:stretch>
+                      <a:fillRect/>
+                    </a:stretch>
+                  </pic:blipFill>
+                  <pic:spPr>
+                    <a:xfrm>
+                      <a:off x="0" y="0"/>
+                      <a:ext cx="2209800" cy="781050"/>
+                    </a:xfrm>
+                    <a:prstGeom prst="rect">
+                      <a:avLst/>
+                    </a:prstGeom>
+                  </pic:spPr>
+                </pic:pic>
+              </a:graphicData>
+            </a:graphic>
+          </wp:anchor>
+        </w:drawing>
+      </w:r>
+    </w:p>
+    <w:p>
+      <w:pPr>
+        <w:tabs>
+          <w:tab w:val="left" w:pos="1624"/>
+        </w:tabs>
+        <w:rPr>
+          <w:noProof/>
+        </w:rPr>
+      </w:pPr>
+    </w:p>
+    <w:p>
+      <w:pPr>
+        <w:tabs>
+          <w:tab w:val="left" w:pos="1624"/>
+        </w:tabs>
+        <w:rPr>
+          <w:noProof/>
+        </w:rPr>
+      </w:pPr>
+    </w:p>
+    <w:p>
+      <w:pPr>
+        <w:tabs>
+          <w:tab w:val="left" w:pos="1624"/>
+        </w:tabs>
+        <w:rPr>
+          <w:noProof/>
+        </w:rPr>
+      </w:pPr>
+    </w:p>
+    <w:p>
+      <w:pPr>
+        <w:tabs>
+          <w:tab w:val="left" w:pos="1624"/>
+        </w:tabs>
+        <w:rPr>
+          <w:noProof/>
+        </w:rPr>
+      </w:pPr>
+      <w:r>
+        <w:rPr>
+          <w:noProof/>
+        </w:rPr>
+        <w:t>100- Já que estamos mexendo com iframe vamos apreder a incorporar um vídeo do youtube.</w:t>
+      </w:r>
+    </w:p>
+    <w:p>
+      <w:pPr>
+        <w:tabs>
+          <w:tab w:val="left" w:pos="1624"/>
+        </w:tabs>
+      </w:pPr>
+      <w:r>
+        <w:rPr>
+          <w:noProof/>
+        </w:rPr>
+        <w:t>Vamos entrar no youtube no seguinte endereço:</w:t>
+      </w:r>
+      <w:r>
+        <w:t xml:space="preserve"> </w:t>
+      </w:r>
+      <w:hyperlink r:id="rId169" w:history="1">
+        <w:r>
+          <w:rPr>
+            <w:rStyle w:val="Hyperlink"/>
+          </w:rPr>
+          <w:t>https://www.youtu.com/results?search_query=scissor+cut+short+back</w:t>
+        </w:r>
+      </w:hyperlink>
+      <w:r>
+        <w:t xml:space="preserve"> </w:t>
+      </w:r>
+    </w:p>
+    <w:p>
+      <w:pPr>
+        <w:tabs>
+          <w:tab w:val="left" w:pos="1624"/>
+        </w:tabs>
+        <w:rPr>
+          <w:noProof/>
+        </w:rPr>
+      </w:pPr>
+      <w:r>
+        <w:t xml:space="preserve">Na página do </w:t>
+      </w:r>
+      <w:proofErr w:type="spellStart"/>
+      <w:r>
+        <w:t>youtube</w:t>
+      </w:r>
+      <w:proofErr w:type="spellEnd"/>
+      <w:r>
+        <w:t xml:space="preserve"> vai </w:t>
+      </w:r>
+      <w:proofErr w:type="spellStart"/>
+      <w:r>
+        <w:t>aparecerum</w:t>
+      </w:r>
+      <w:proofErr w:type="spellEnd"/>
+      <w:r>
+        <w:t xml:space="preserve"> campo chamado compartilhar ao clicar nesse campo vai aparecer ícone de </w:t>
+      </w:r>
+      <w:proofErr w:type="spellStart"/>
+      <w:r>
+        <w:t>tag</w:t>
+      </w:r>
+      <w:proofErr w:type="spellEnd"/>
+      <w:r>
+        <w:t xml:space="preserve"> &lt;&gt;(incorporar)para copiar para link e colar na página.</w:t>
+      </w:r>
+      <w:r>
+        <w:rPr>
+          <w:noProof/>
+        </w:rPr>
+        <w:t xml:space="preserve"> </w:t>
+      </w:r>
+    </w:p>
+    <w:p>
+      <w:pPr>
+        <w:tabs>
+          <w:tab w:val="left" w:pos="1624"/>
+        </w:tabs>
+      </w:pPr>
+    </w:p>
+    <w:p>
+      <w:pPr>
+        <w:tabs>
+          <w:tab w:val="left" w:pos="1624"/>
+        </w:tabs>
+      </w:pPr>
+      <w:r>
+        <w:drawing>
+          <wp:anchor distT="0" distB="0" distL="114300" distR="114300" simplePos="0" relativeHeight="251819008" behindDoc="1" locked="0" layoutInCell="1" allowOverlap="1" wp14:anchorId="1973C349">
+            <wp:simplePos x="0" y="0"/>
+            <wp:positionH relativeFrom="column">
+              <wp:posOffset>-442270</wp:posOffset>
+            </wp:positionH>
+            <wp:positionV relativeFrom="paragraph">
+              <wp:posOffset>173222</wp:posOffset>
+            </wp:positionV>
+            <wp:extent cx="4267200" cy="2409825"/>
+            <wp:effectExtent l="0" t="0" r="0" b="9525"/>
+            <wp:wrapTight wrapText="bothSides">
+              <wp:wrapPolygon edited="0">
+                <wp:start x="0" y="0"/>
+                <wp:lineTo x="0" y="21515"/>
+                <wp:lineTo x="21504" y="21515"/>
+                <wp:lineTo x="21504" y="0"/>
+                <wp:lineTo x="0" y="0"/>
+              </wp:wrapPolygon>
+            </wp:wrapTight>
+            <wp:docPr id="158" name="Imagem 158"/>
+            <wp:cNvGraphicFramePr>
+              <a:graphicFrameLocks xmlns:a="http://schemas.openxmlformats.org/drawingml/2006/main" noChangeAspect="1"/>
+            </wp:cNvGraphicFramePr>
+            <a:graphic xmlns:a="http://schemas.openxmlformats.org/drawingml/2006/main">
+              <a:graphicData uri="http://schemas.openxmlformats.org/drawingml/2006/picture">
+                <pic:pic xmlns:pic="http://schemas.openxmlformats.org/drawingml/2006/picture">
+                  <pic:nvPicPr>
+                    <pic:cNvPr id="1" name=""/>
+                    <pic:cNvPicPr/>
+                  </pic:nvPicPr>
+                  <pic:blipFill>
+                    <a:blip r:embed="rId170">
+                      <a:extLst>
+                        <a:ext uri="{28A0092B-C50C-407E-A947-70E740481C1C}">
+                          <a14:useLocalDpi xmlns:a14="http://schemas.microsoft.com/office/drawing/2010/main" val="0"/>
+                        </a:ext>
+                      </a:extLst>
+                    </a:blip>
+                    <a:stretch>
+                      <a:fillRect/>
+                    </a:stretch>
+                  </pic:blipFill>
+                  <pic:spPr>
+                    <a:xfrm>
+                      <a:off x="0" y="0"/>
+                      <a:ext cx="4267200" cy="2409825"/>
+                    </a:xfrm>
+                    <a:prstGeom prst="rect">
+                      <a:avLst/>
+                    </a:prstGeom>
+                  </pic:spPr>
+                </pic:pic>
+              </a:graphicData>
+            </a:graphic>
+          </wp:anchor>
+        </w:drawing>
+      </w:r>
+    </w:p>
+    <w:p>
+      <w:pPr>
+        <w:tabs>
+          <w:tab w:val="left" w:pos="1624"/>
+        </w:tabs>
+      </w:pPr>
+    </w:p>
+    <w:p>
+      <w:pPr>
+        <w:tabs>
+          <w:tab w:val="left" w:pos="1624"/>
+        </w:tabs>
+      </w:pPr>
+    </w:p>
+    <w:p>
+      <w:pPr>
+        <w:tabs>
+          <w:tab w:val="left" w:pos="1624"/>
+        </w:tabs>
+      </w:pPr>
+    </w:p>
+    <w:p>
+      <w:pPr>
+        <w:tabs>
+          <w:tab w:val="left" w:pos="1624"/>
+        </w:tabs>
+      </w:pPr>
+    </w:p>
+    <w:p>
+      <w:pPr>
+        <w:tabs>
+          <w:tab w:val="left" w:pos="1624"/>
+        </w:tabs>
+      </w:pPr>
+    </w:p>
+    <w:p>
+      <w:pPr>
+        <w:tabs>
+          <w:tab w:val="left" w:pos="1624"/>
+        </w:tabs>
+      </w:pPr>
+    </w:p>
+    <w:p>
+      <w:pPr>
+        <w:tabs>
+          <w:tab w:val="left" w:pos="1624"/>
+        </w:tabs>
+      </w:pPr>
+    </w:p>
+    <w:p>
+      <w:pPr>
+        <w:tabs>
+          <w:tab w:val="left" w:pos="1624"/>
+        </w:tabs>
+      </w:pPr>
+    </w:p>
+    <w:p>
+      <w:pPr>
+        <w:tabs>
+          <w:tab w:val="left" w:pos="1624"/>
+        </w:tabs>
+      </w:pPr>
+    </w:p>
+    <w:p>
+      <w:pPr>
+        <w:tabs>
+          <w:tab w:val="left" w:pos="1624"/>
+        </w:tabs>
+      </w:pPr>
+      <w:r>
+        <w:lastRenderedPageBreak/>
+        <w:drawing>
+          <wp:anchor distT="0" distB="0" distL="114300" distR="114300" simplePos="0" relativeHeight="251820032" behindDoc="1" locked="0" layoutInCell="1" allowOverlap="1" wp14:anchorId="6E00830E">
+            <wp:simplePos x="0" y="0"/>
+            <wp:positionH relativeFrom="column">
+              <wp:posOffset>-485007</wp:posOffset>
+            </wp:positionH>
+            <wp:positionV relativeFrom="paragraph">
+              <wp:posOffset>363530</wp:posOffset>
+            </wp:positionV>
+            <wp:extent cx="5400040" cy="1030605"/>
+            <wp:effectExtent l="0" t="0" r="0" b="0"/>
+            <wp:wrapTight wrapText="bothSides">
+              <wp:wrapPolygon edited="0">
+                <wp:start x="0" y="0"/>
+                <wp:lineTo x="0" y="21161"/>
+                <wp:lineTo x="21488" y="21161"/>
+                <wp:lineTo x="21488" y="0"/>
+                <wp:lineTo x="0" y="0"/>
+              </wp:wrapPolygon>
+            </wp:wrapTight>
+            <wp:docPr id="159" name="Imagem 159"/>
+            <wp:cNvGraphicFramePr>
+              <a:graphicFrameLocks xmlns:a="http://schemas.openxmlformats.org/drawingml/2006/main" noChangeAspect="1"/>
+            </wp:cNvGraphicFramePr>
+            <a:graphic xmlns:a="http://schemas.openxmlformats.org/drawingml/2006/main">
+              <a:graphicData uri="http://schemas.openxmlformats.org/drawingml/2006/picture">
+                <pic:pic xmlns:pic="http://schemas.openxmlformats.org/drawingml/2006/picture">
+                  <pic:nvPicPr>
+                    <pic:cNvPr id="1" name=""/>
+                    <pic:cNvPicPr/>
+                  </pic:nvPicPr>
+                  <pic:blipFill>
+                    <a:blip r:embed="rId171">
+                      <a:extLst>
+                        <a:ext uri="{28A0092B-C50C-407E-A947-70E740481C1C}">
+                          <a14:useLocalDpi xmlns:a14="http://schemas.microsoft.com/office/drawing/2010/main" val="0"/>
+                        </a:ext>
+                      </a:extLst>
+                    </a:blip>
+                    <a:stretch>
+                      <a:fillRect/>
+                    </a:stretch>
+                  </pic:blipFill>
+                  <pic:spPr>
+                    <a:xfrm>
+                      <a:off x="0" y="0"/>
+                      <a:ext cx="5400040" cy="1030605"/>
+                    </a:xfrm>
+                    <a:prstGeom prst="rect">
+                      <a:avLst/>
+                    </a:prstGeom>
+                  </pic:spPr>
+                </pic:pic>
+              </a:graphicData>
+            </a:graphic>
+          </wp:anchor>
+        </w:drawing>
+      </w:r>
+      <w:r>
+        <w:t xml:space="preserve">101- Para trabalhar com o vídeo no </w:t>
+      </w:r>
+      <w:proofErr w:type="spellStart"/>
+      <w:r>
+        <w:t>css</w:t>
+      </w:r>
+      <w:proofErr w:type="spellEnd"/>
+      <w:r>
+        <w:t xml:space="preserve"> adicionamos uma </w:t>
+      </w:r>
+      <w:proofErr w:type="spellStart"/>
+      <w:r>
+        <w:t>div</w:t>
+      </w:r>
+      <w:proofErr w:type="spellEnd"/>
+      <w:r>
+        <w:t xml:space="preserve"> com a </w:t>
+      </w:r>
+      <w:proofErr w:type="spellStart"/>
+      <w:r>
+        <w:t>class</w:t>
+      </w:r>
+      <w:proofErr w:type="spellEnd"/>
+      <w:r>
+        <w:t xml:space="preserve"> vídeo entorno do link.</w:t>
+      </w:r>
+    </w:p>
+    <w:p>
+      <w:pPr>
+        <w:tabs>
+          <w:tab w:val="left" w:pos="1624"/>
+        </w:tabs>
+      </w:pPr>
+    </w:p>
+    <w:p>
+      <w:pPr>
+        <w:tabs>
+          <w:tab w:val="left" w:pos="1624"/>
+        </w:tabs>
+      </w:pPr>
+    </w:p>
+    <w:p>
+      <w:pPr>
+        <w:tabs>
+          <w:tab w:val="left" w:pos="1624"/>
+        </w:tabs>
+      </w:pPr>
+    </w:p>
+    <w:p>
+      <w:pPr>
+        <w:tabs>
+          <w:tab w:val="left" w:pos="1624"/>
+        </w:tabs>
+      </w:pPr>
+    </w:p>
+    <w:p>
+      <w:pPr>
+        <w:tabs>
+          <w:tab w:val="left" w:pos="1624"/>
+        </w:tabs>
+      </w:pPr>
+    </w:p>
+    <w:p>
+      <w:pPr>
+        <w:tabs>
+          <w:tab w:val="left" w:pos="1624"/>
+        </w:tabs>
+        <w:rPr>
+          <w:noProof/>
+        </w:rPr>
+      </w:pPr>
+      <w:r>
+        <w:t xml:space="preserve">102- No </w:t>
+      </w:r>
+      <w:proofErr w:type="spellStart"/>
+      <w:r>
+        <w:t>css</w:t>
+      </w:r>
+      <w:proofErr w:type="spellEnd"/>
+      <w:r>
+        <w:t xml:space="preserve"> na </w:t>
+      </w:r>
+      <w:proofErr w:type="spellStart"/>
+      <w:r>
+        <w:t>class</w:t>
+      </w:r>
+      <w:proofErr w:type="spellEnd"/>
+      <w:r>
+        <w:t xml:space="preserve"> vídeo vamos colocar uma largura para vídeo 560px e vamos dar um espaço externo para cima e para baixo de 1em auto.</w:t>
+      </w:r>
+    </w:p>
+    <w:p>
+      <w:pPr>
+        <w:tabs>
+          <w:tab w:val="left" w:pos="1624"/>
+        </w:tabs>
+        <w:rPr>
+          <w:noProof/>
+        </w:rPr>
+      </w:pPr>
+      <w:r>
+        <w:drawing>
+          <wp:anchor distT="0" distB="0" distL="114300" distR="114300" simplePos="0" relativeHeight="251821056" behindDoc="1" locked="0" layoutInCell="1" allowOverlap="1" wp14:anchorId="190A9916">
+            <wp:simplePos x="0" y="0"/>
+            <wp:positionH relativeFrom="column">
+              <wp:posOffset>-347064</wp:posOffset>
+            </wp:positionH>
+            <wp:positionV relativeFrom="paragraph">
+              <wp:posOffset>9643</wp:posOffset>
+            </wp:positionV>
+            <wp:extent cx="2962275" cy="962025"/>
+            <wp:effectExtent l="0" t="0" r="9525" b="9525"/>
+            <wp:wrapTight wrapText="bothSides">
+              <wp:wrapPolygon edited="0">
+                <wp:start x="0" y="0"/>
+                <wp:lineTo x="0" y="21386"/>
+                <wp:lineTo x="21531" y="21386"/>
+                <wp:lineTo x="21531" y="0"/>
+                <wp:lineTo x="0" y="0"/>
+              </wp:wrapPolygon>
+            </wp:wrapTight>
+            <wp:docPr id="160" name="Imagem 160"/>
+            <wp:cNvGraphicFramePr>
+              <a:graphicFrameLocks xmlns:a="http://schemas.openxmlformats.org/drawingml/2006/main" noChangeAspect="1"/>
+            </wp:cNvGraphicFramePr>
+            <a:graphic xmlns:a="http://schemas.openxmlformats.org/drawingml/2006/main">
+              <a:graphicData uri="http://schemas.openxmlformats.org/drawingml/2006/picture">
+                <pic:pic xmlns:pic="http://schemas.openxmlformats.org/drawingml/2006/picture">
+                  <pic:nvPicPr>
+                    <pic:cNvPr id="1" name=""/>
+                    <pic:cNvPicPr/>
+                  </pic:nvPicPr>
+                  <pic:blipFill>
+                    <a:blip r:embed="rId172">
+                      <a:extLst>
+                        <a:ext uri="{28A0092B-C50C-407E-A947-70E740481C1C}">
+                          <a14:useLocalDpi xmlns:a14="http://schemas.microsoft.com/office/drawing/2010/main" val="0"/>
+                        </a:ext>
+                      </a:extLst>
+                    </a:blip>
+                    <a:stretch>
+                      <a:fillRect/>
+                    </a:stretch>
+                  </pic:blipFill>
+                  <pic:spPr>
+                    <a:xfrm>
+                      <a:off x="0" y="0"/>
+                      <a:ext cx="2962275" cy="962025"/>
+                    </a:xfrm>
+                    <a:prstGeom prst="rect">
+                      <a:avLst/>
+                    </a:prstGeom>
+                  </pic:spPr>
+                </pic:pic>
+              </a:graphicData>
+            </a:graphic>
+          </wp:anchor>
+        </w:drawing>
+      </w:r>
+    </w:p>
+    <w:p>
+      <w:pPr>
+        <w:tabs>
+          <w:tab w:val="left" w:pos="1624"/>
+        </w:tabs>
+        <w:rPr>
+          <w:noProof/>
+        </w:rPr>
+      </w:pPr>
+    </w:p>
+    <w:p>
+      <w:pPr>
+        <w:tabs>
+          <w:tab w:val="left" w:pos="1624"/>
+        </w:tabs>
+        <w:rPr>
+          <w:noProof/>
+        </w:rPr>
+      </w:pPr>
+    </w:p>
+    <w:p>
+      <w:pPr>
+        <w:tabs>
+          <w:tab w:val="left" w:pos="1624"/>
+        </w:tabs>
+        <w:rPr>
+          <w:noProof/>
+        </w:rPr>
+      </w:pPr>
+    </w:p>
+    <w:p>
+      <w:pPr>
+        <w:tabs>
+          <w:tab w:val="left" w:pos="1624"/>
+        </w:tabs>
+        <w:rPr>
+          <w:noProof/>
+        </w:rPr>
+      </w:pPr>
+      <w:r>
+        <w:rPr>
+          <w:noProof/>
+        </w:rPr>
+        <w:t>103- Criamos um div com a class chamada conteudo-beneficios que envolve a lista e a imagem benefícios para trabalhar com o espaço entre elas.</w:t>
+      </w:r>
+    </w:p>
+    <w:p>
+      <w:pPr>
+        <w:tabs>
+          <w:tab w:val="left" w:pos="1624"/>
+        </w:tabs>
+        <w:rPr>
+          <w:noProof/>
+        </w:rPr>
+      </w:pPr>
+      <w:r>
+        <w:rPr>
+          <w:noProof/>
+        </w:rPr>
+        <w:drawing>
+          <wp:anchor distT="0" distB="0" distL="114300" distR="114300" simplePos="0" relativeHeight="251822080" behindDoc="1" locked="0" layoutInCell="1" allowOverlap="1" wp14:anchorId="78D8F3B7">
+            <wp:simplePos x="0" y="0"/>
+            <wp:positionH relativeFrom="page">
+              <wp:posOffset>488950</wp:posOffset>
+            </wp:positionH>
+            <wp:positionV relativeFrom="paragraph">
+              <wp:posOffset>13970</wp:posOffset>
+            </wp:positionV>
+            <wp:extent cx="5102860" cy="2193925"/>
+            <wp:effectExtent l="0" t="0" r="2540" b="0"/>
+            <wp:wrapTight wrapText="bothSides">
+              <wp:wrapPolygon edited="0">
+                <wp:start x="0" y="0"/>
+                <wp:lineTo x="0" y="21381"/>
+                <wp:lineTo x="21530" y="21381"/>
+                <wp:lineTo x="21530" y="0"/>
+                <wp:lineTo x="0" y="0"/>
+              </wp:wrapPolygon>
+            </wp:wrapTight>
+            <wp:docPr id="161" name="Imagem 161"/>
+            <wp:cNvGraphicFramePr>
+              <a:graphicFrameLocks xmlns:a="http://schemas.openxmlformats.org/drawingml/2006/main" noChangeAspect="1"/>
+            </wp:cNvGraphicFramePr>
+            <a:graphic xmlns:a="http://schemas.openxmlformats.org/drawingml/2006/main">
+              <a:graphicData uri="http://schemas.openxmlformats.org/drawingml/2006/picture">
+                <pic:pic xmlns:pic="http://schemas.openxmlformats.org/drawingml/2006/picture">
+                  <pic:nvPicPr>
+                    <pic:cNvPr id="1" name=""/>
+                    <pic:cNvPicPr/>
+                  </pic:nvPicPr>
+                  <pic:blipFill>
+                    <a:blip r:embed="rId173">
+                      <a:extLst>
+                        <a:ext uri="{28A0092B-C50C-407E-A947-70E740481C1C}">
+                          <a14:useLocalDpi xmlns:a14="http://schemas.microsoft.com/office/drawing/2010/main" val="0"/>
+                        </a:ext>
+                      </a:extLst>
+                    </a:blip>
+                    <a:stretch>
+                      <a:fillRect/>
+                    </a:stretch>
+                  </pic:blipFill>
+                  <pic:spPr>
+                    <a:xfrm>
+                      <a:off x="0" y="0"/>
+                      <a:ext cx="5102860" cy="2193925"/>
+                    </a:xfrm>
+                    <a:prstGeom prst="rect">
+                      <a:avLst/>
+                    </a:prstGeom>
+                  </pic:spPr>
+                </pic:pic>
+              </a:graphicData>
+            </a:graphic>
+            <wp14:sizeRelH relativeFrom="margin">
+              <wp14:pctWidth>0</wp14:pctWidth>
+            </wp14:sizeRelH>
+            <wp14:sizeRelV relativeFrom="margin">
+              <wp14:pctHeight>0</wp14:pctHeight>
+            </wp14:sizeRelV>
+          </wp:anchor>
+        </w:drawing>
+      </w:r>
+    </w:p>
+    <w:p>
+      <w:pPr>
+        <w:tabs>
+          <w:tab w:val="left" w:pos="1624"/>
+        </w:tabs>
+        <w:rPr>
+          <w:noProof/>
+        </w:rPr>
+      </w:pPr>
+      <w:r>
+        <w:rPr>
+          <w:noProof/>
+        </w:rPr>
+        <w:t xml:space="preserve"> </w:t>
+      </w:r>
+    </w:p>
+    <w:p>
+      <w:pPr>
+        <w:tabs>
+          <w:tab w:val="left" w:pos="1624"/>
+        </w:tabs>
+      </w:pPr>
+    </w:p>
+    <w:p>
+      <w:pPr>
+        <w:tabs>
+          <w:tab w:val="left" w:pos="1624"/>
+        </w:tabs>
+      </w:pPr>
+    </w:p>
+    <w:p>
+      <w:pPr>
+        <w:tabs>
+          <w:tab w:val="left" w:pos="1624"/>
+        </w:tabs>
+      </w:pPr>
+    </w:p>
+    <w:p>
+      <w:pPr>
+        <w:tabs>
+          <w:tab w:val="left" w:pos="1624"/>
+        </w:tabs>
+      </w:pPr>
+    </w:p>
+    <w:p>
+      <w:pPr>
+        <w:tabs>
+          <w:tab w:val="left" w:pos="1624"/>
+        </w:tabs>
+      </w:pPr>
+    </w:p>
+    <w:p>
+      <w:pPr>
+        <w:tabs>
+          <w:tab w:val="left" w:pos="1624"/>
+        </w:tabs>
+      </w:pPr>
+    </w:p>
+    <w:p>
+      <w:pPr>
+        <w:tabs>
+          <w:tab w:val="left" w:pos="1624"/>
+        </w:tabs>
+      </w:pPr>
+      <w:r>
+        <w:t>104-</w:t>
       </w:r>
       <w:bookmarkStart w:id="0" w:name="_GoBack"/>
       <w:bookmarkEnd w:id="0"/>
     </w:p>
     <w:sectPr>
-      <w:footerReference w:type="default" r:id="rId166"/>
+      <w:footerReference w:type="default" r:id="rId174"/>
       <w:pgSz w:w="11906" w:h="16838"/>
       <w:pgMar w:top="1418" w:right="1701" w:bottom="1418" w:left="1701" w:header="709" w:footer="709" w:gutter="0"/>
       <w:cols w:space="708"/>
@@ -19320,7 +20506,6 @@
   <w:style w:type="character" w:default="1" w:styleId="Fontepargpadro">
     <w:name w:val="Default Paragraph Font"/>
     <w:uiPriority w:val="1"/>
-    <w:semiHidden/>
     <w:unhideWhenUsed/>
   </w:style>
   <w:style w:type="table" w:default="1" w:styleId="Tabelanormal">
@@ -19725,7 +20910,7 @@
 </file>
 
 <file path=customXml/itemProps1.xml><?xml version="1.0" encoding="utf-8"?>
-<ds:datastoreItem xmlns:ds="http://schemas.openxmlformats.org/officeDocument/2006/customXml" ds:itemID="{8447D5EE-34C3-494E-B733-6CE891DC1DBA}">
+<ds:datastoreItem xmlns:ds="http://schemas.openxmlformats.org/officeDocument/2006/customXml" ds:itemID="{2B437E4C-0508-4602-A86F-4A262A539409}">
   <ds:schemaRefs>
     <ds:schemaRef ds:uri="http://schemas.openxmlformats.org/officeDocument/2006/bibliography"/>
   </ds:schemaRefs>

</xml_diff>

<commit_message>
atulização da aula dia 01/10/2026
</commit_message>
<xml_diff>
--- a/apostila/Projeto Space For Men.docx
+++ b/apostila/Projeto Space For Men.docx
@@ -22,7 +22,10 @@
     </w:p>
     <w:p>
       <w:r>
-        <w:t>1-</w:t>
+        <w:t>1</w:t>
+      </w:r>
+      <w:r>
+        <w:t>-</w:t>
       </w:r>
       <w:r>
         <w:t>C</w:t>
@@ -172,7 +175,13 @@
         <w:pStyle w:val="PargrafodaLista"/>
       </w:pPr>
       <w:r>
-        <w:t>2-</w:t>
+        <w:t>2</w:t>
+      </w:r>
+      <w:r>
+        <w:t>-</w:t>
+      </w:r>
+      <w:r>
+        <w:t xml:space="preserve"> </w:t>
       </w:r>
       <w:r>
         <w:t>A</w:t>
@@ -307,7 +316,13 @@
       </w:pPr>
       <w:r>
         <w:lastRenderedPageBreak/>
-        <w:t>3-</w:t>
+        <w:t>3</w:t>
+      </w:r>
+      <w:r>
+        <w:t>-</w:t>
+      </w:r>
+      <w:r>
+        <w:t xml:space="preserve"> </w:t>
       </w:r>
       <w:r>
         <w:t xml:space="preserve">No texto do index.html utilizamos </w:t>
@@ -318,7 +333,15 @@
       </w:r>
       <w:proofErr w:type="spellEnd"/>
       <w:r>
-        <w:t xml:space="preserve"> alinhadas tendo a regras a primeira que abre e a ultima que fecha conforme imagem.</w:t>
+        <w:t xml:space="preserve"> alinhadas tendo a regras a primeira que abre e a </w:t>
+      </w:r>
+      <w:proofErr w:type="spellStart"/>
+      <w:r>
+        <w:t>ultima</w:t>
+      </w:r>
+      <w:proofErr w:type="spellEnd"/>
+      <w:r>
+        <w:t xml:space="preserve"> que fecha conforme imagem.</w:t>
       </w:r>
     </w:p>
     <w:p>
@@ -382,7 +405,13 @@
         </w:tabs>
       </w:pPr>
       <w:r>
-        <w:t>4-</w:t>
+        <w:t>4</w:t>
+      </w:r>
+      <w:r>
+        <w:t>-</w:t>
+      </w:r>
+      <w:r>
+        <w:t xml:space="preserve"> </w:t>
       </w:r>
       <w:r>
         <w:t>C</w:t>
@@ -895,6 +924,9 @@
         <w:softHyphen/>
       </w:r>
       <w:r>
+        <w:t xml:space="preserve"> </w:t>
+      </w:r>
+      <w:r>
         <w:t xml:space="preserve">No </w:t>
       </w:r>
       <w:proofErr w:type="spellStart"/>
@@ -17886,7 +17918,13 @@
         <w:rPr>
           <w:noProof/>
         </w:rPr>
-        <w:t>100- Já que estamos mexendo com iframe vamos apreder a incorporar um vídeo do youtube.</w:t>
+        <w:t>100</w:t>
+      </w:r>
+      <w:r>
+        <w:rPr>
+          <w:noProof/>
+        </w:rPr>
+        <w:t>- Já que estamos mexendo com iframe vamos apreder a incorporar um vídeo do youtube.</w:t>
       </w:r>
     </w:p>
     <w:p>
@@ -17973,6 +18011,9 @@
         </w:tabs>
       </w:pPr>
       <w:r>
+        <w:rPr>
+          <w:noProof/>
+        </w:rPr>
         <w:drawing>
           <wp:anchor distT="0" distB="0" distL="114300" distR="114300" simplePos="0" relativeHeight="251819008" behindDoc="1" locked="0" layoutInCell="1" allowOverlap="1" wp14:anchorId="1973C349">
             <wp:simplePos x="0" y="0"/>
@@ -18102,6 +18143,9 @@
         </w:tabs>
       </w:pPr>
       <w:r>
+        <w:rPr>
+          <w:noProof/>
+        </w:rPr>
         <w:lastRenderedPageBreak/>
         <w:drawing>
           <wp:anchor distT="0" distB="0" distL="114300" distR="114300" simplePos="0" relativeHeight="251820032" behindDoc="1" locked="0" layoutInCell="1" allowOverlap="1" wp14:anchorId="6E00830E">
@@ -18162,7 +18206,13 @@
         </w:drawing>
       </w:r>
       <w:r>
-        <w:t xml:space="preserve">101- Para trabalhar com o vídeo no </w:t>
+        <w:t>10</w:t>
+      </w:r>
+      <w:r>
+        <w:t>1</w:t>
+      </w:r>
+      <w:r>
+        <w:t xml:space="preserve">- Para trabalhar com o vídeo no </w:t>
       </w:r>
       <w:proofErr w:type="spellStart"/>
       <w:r>
@@ -18263,6 +18313,9 @@
         </w:rPr>
       </w:pPr>
       <w:r>
+        <w:rPr>
+          <w:noProof/>
+        </w:rPr>
         <w:drawing>
           <wp:anchor distT="0" distB="0" distL="114300" distR="114300" simplePos="0" relativeHeight="251821056" behindDoc="1" locked="0" layoutInCell="1" allowOverlap="1" wp14:anchorId="190A9916">
             <wp:simplePos x="0" y="0"/>
@@ -18511,13 +18564,1306 @@
         </w:tabs>
       </w:pPr>
       <w:r>
+        <w:drawing>
+          <wp:anchor distT="0" distB="0" distL="114300" distR="114300" simplePos="0" relativeHeight="251823104" behindDoc="1" locked="0" layoutInCell="1" allowOverlap="1" wp14:anchorId="43159523">
+            <wp:simplePos x="0" y="0"/>
+            <wp:positionH relativeFrom="column">
+              <wp:posOffset>-591613</wp:posOffset>
+            </wp:positionH>
+            <wp:positionV relativeFrom="paragraph">
+              <wp:posOffset>301743</wp:posOffset>
+            </wp:positionV>
+            <wp:extent cx="4610735" cy="2028825"/>
+            <wp:effectExtent l="0" t="0" r="0" b="9525"/>
+            <wp:wrapTight wrapText="bothSides">
+              <wp:wrapPolygon edited="0">
+                <wp:start x="0" y="0"/>
+                <wp:lineTo x="0" y="21499"/>
+                <wp:lineTo x="21508" y="21499"/>
+                <wp:lineTo x="21508" y="0"/>
+                <wp:lineTo x="0" y="0"/>
+              </wp:wrapPolygon>
+            </wp:wrapTight>
+            <wp:docPr id="162" name="Imagem 162"/>
+            <wp:cNvGraphicFramePr>
+              <a:graphicFrameLocks xmlns:a="http://schemas.openxmlformats.org/drawingml/2006/main" noChangeAspect="1"/>
+            </wp:cNvGraphicFramePr>
+            <a:graphic xmlns:a="http://schemas.openxmlformats.org/drawingml/2006/main">
+              <a:graphicData uri="http://schemas.openxmlformats.org/drawingml/2006/picture">
+                <pic:pic xmlns:pic="http://schemas.openxmlformats.org/drawingml/2006/picture">
+                  <pic:nvPicPr>
+                    <pic:cNvPr id="1" name=""/>
+                    <pic:cNvPicPr/>
+                  </pic:nvPicPr>
+                  <pic:blipFill>
+                    <a:blip r:embed="rId174">
+                      <a:extLst>
+                        <a:ext uri="{28A0092B-C50C-407E-A947-70E740481C1C}">
+                          <a14:useLocalDpi xmlns:a14="http://schemas.microsoft.com/office/drawing/2010/main" val="0"/>
+                        </a:ext>
+                      </a:extLst>
+                    </a:blip>
+                    <a:stretch>
+                      <a:fillRect/>
+                    </a:stretch>
+                  </pic:blipFill>
+                  <pic:spPr>
+                    <a:xfrm>
+                      <a:off x="0" y="0"/>
+                      <a:ext cx="4610735" cy="2028825"/>
+                    </a:xfrm>
+                    <a:prstGeom prst="rect">
+                      <a:avLst/>
+                    </a:prstGeom>
+                  </pic:spPr>
+                </pic:pic>
+              </a:graphicData>
+            </a:graphic>
+          </wp:anchor>
+        </w:drawing>
+      </w:r>
+      <w:r>
         <w:t>104-</w:t>
       </w:r>
+      <w:r>
+        <w:softHyphen/>
+      </w:r>
+      <w:r>
+        <w:softHyphen/>
+      </w:r>
+      <w:r>
+        <w:t xml:space="preserve"> Adicionamos um </w:t>
+      </w:r>
+      <w:proofErr w:type="spellStart"/>
+      <w:r>
+        <w:t>class</w:t>
+      </w:r>
+      <w:proofErr w:type="spellEnd"/>
+      <w:r>
+        <w:t xml:space="preserve"> para lista que está dentro da seção benefícios.</w:t>
+      </w:r>
+    </w:p>
+    <w:p>
+      <w:pPr>
+        <w:tabs>
+          <w:tab w:val="left" w:pos="1624"/>
+        </w:tabs>
+        <w:rPr>
+          <w:noProof/>
+        </w:rPr>
+      </w:pPr>
+    </w:p>
+    <w:p>
+      <w:pPr>
+        <w:tabs>
+          <w:tab w:val="left" w:pos="1624"/>
+        </w:tabs>
+        <w:rPr>
+          <w:noProof/>
+        </w:rPr>
+      </w:pPr>
+    </w:p>
+    <w:p>
+      <w:pPr>
+        <w:tabs>
+          <w:tab w:val="left" w:pos="1624"/>
+        </w:tabs>
+        <w:rPr>
+          <w:noProof/>
+        </w:rPr>
+      </w:pPr>
+    </w:p>
+    <w:p>
+      <w:pPr>
+        <w:tabs>
+          <w:tab w:val="left" w:pos="1624"/>
+        </w:tabs>
+        <w:rPr>
+          <w:noProof/>
+        </w:rPr>
+      </w:pPr>
+    </w:p>
+    <w:p>
+      <w:pPr>
+        <w:tabs>
+          <w:tab w:val="left" w:pos="1624"/>
+        </w:tabs>
+        <w:rPr>
+          <w:noProof/>
+        </w:rPr>
+      </w:pPr>
+    </w:p>
+    <w:p>
+      <w:pPr>
+        <w:tabs>
+          <w:tab w:val="left" w:pos="1624"/>
+        </w:tabs>
+        <w:rPr>
+          <w:noProof/>
+        </w:rPr>
+      </w:pPr>
+    </w:p>
+    <w:p>
+      <w:pPr>
+        <w:tabs>
+          <w:tab w:val="left" w:pos="1624"/>
+        </w:tabs>
+        <w:rPr>
+          <w:noProof/>
+        </w:rPr>
+      </w:pPr>
+    </w:p>
+    <w:p>
+      <w:pPr>
+        <w:tabs>
+          <w:tab w:val="left" w:pos="1624"/>
+        </w:tabs>
+        <w:rPr>
+          <w:noProof/>
+        </w:rPr>
+      </w:pPr>
+    </w:p>
+    <w:p>
+      <w:pPr>
+        <w:tabs>
+          <w:tab w:val="left" w:pos="1624"/>
+        </w:tabs>
+        <w:rPr>
+          <w:noProof/>
+        </w:rPr>
+      </w:pPr>
+      <w:r>
+        <w:rPr>
+          <w:noProof/>
+        </w:rPr>
+        <w:lastRenderedPageBreak/>
+        <w:t>105</w:t>
+      </w:r>
+      <w:r>
+        <w:rPr>
+          <w:noProof/>
+        </w:rPr>
+        <w:t>- Após colocar a uma class na lista definimos a largura para 40% com intuito de colocar ao lista ao lado da imagem beneficios depois mudamos a natureza da lista para ficar inline-block, notamos que quanto estamos trabalhando com 100%de espaço:</w:t>
+      </w:r>
+      <w:r>
+        <w:rPr>
+          <w:noProof/>
+        </w:rPr>
+        <w:t xml:space="preserve"> </w:t>
+      </w:r>
+    </w:p>
+    <w:p>
+      <w:pPr>
+        <w:pStyle w:val="PargrafodaLista"/>
+        <w:numPr>
+          <w:ilvl w:val="0"/>
+          <w:numId w:val="16"/>
+        </w:numPr>
+        <w:tabs>
+          <w:tab w:val="left" w:pos="1624"/>
+        </w:tabs>
+        <w:rPr>
+          <w:noProof/>
+        </w:rPr>
+      </w:pPr>
+      <w:r>
+        <w:rPr>
+          <w:noProof/>
+        </w:rPr>
+        <w:t>Lista com 40% de largura</w:t>
+      </w:r>
+    </w:p>
+    <w:p>
+      <w:pPr>
+        <w:pStyle w:val="PargrafodaLista"/>
+        <w:numPr>
+          <w:ilvl w:val="0"/>
+          <w:numId w:val="16"/>
+        </w:numPr>
+        <w:tabs>
+          <w:tab w:val="left" w:pos="1624"/>
+        </w:tabs>
+        <w:rPr>
+          <w:noProof/>
+        </w:rPr>
+      </w:pPr>
+      <w:r>
+        <w:rPr>
+          <w:noProof/>
+        </w:rPr>
+        <w:t>A imagem com 60% de largura.</w:t>
+      </w:r>
+    </w:p>
+    <w:p>
+      <w:pPr>
+        <w:pStyle w:val="PargrafodaLista"/>
+        <w:numPr>
+          <w:ilvl w:val="0"/>
+          <w:numId w:val="16"/>
+        </w:numPr>
+        <w:tabs>
+          <w:tab w:val="left" w:pos="1624"/>
+        </w:tabs>
+        <w:rPr>
+          <w:noProof/>
+        </w:rPr>
+      </w:pPr>
+      <w:r>
+        <w:rPr>
+          <w:noProof/>
+        </w:rPr>
+        <w:t>Se faz ne</w:t>
+      </w:r>
+      <w:r>
+        <w:rPr>
+          <w:noProof/>
+        </w:rPr>
+        <w:t>cessário não deixar espaço no html entre lista e a imag</w:t>
+      </w:r>
+      <w:r>
+        <w:rPr>
+          <w:noProof/>
+        </w:rPr>
+        <w:t>em.</w:t>
+      </w:r>
+    </w:p>
+    <w:p>
+      <w:pPr>
+        <w:tabs>
+          <w:tab w:val="left" w:pos="1624"/>
+        </w:tabs>
+        <w:rPr>
+          <w:noProof/>
+        </w:rPr>
+      </w:pPr>
+      <w:r>
+        <w:rPr>
+          <w:noProof/>
+        </w:rPr>
+        <w:drawing>
+          <wp:anchor distT="0" distB="0" distL="114300" distR="114300" simplePos="0" relativeHeight="251824128" behindDoc="1" locked="0" layoutInCell="1" allowOverlap="1" wp14:anchorId="1C0106E2">
+            <wp:simplePos x="0" y="0"/>
+            <wp:positionH relativeFrom="margin">
+              <wp:align>left</wp:align>
+            </wp:positionH>
+            <wp:positionV relativeFrom="paragraph">
+              <wp:posOffset>15816</wp:posOffset>
+            </wp:positionV>
+            <wp:extent cx="2505075" cy="1657350"/>
+            <wp:effectExtent l="0" t="0" r="9525" b="0"/>
+            <wp:wrapTight wrapText="bothSides">
+              <wp:wrapPolygon edited="0">
+                <wp:start x="0" y="0"/>
+                <wp:lineTo x="0" y="21352"/>
+                <wp:lineTo x="21518" y="21352"/>
+                <wp:lineTo x="21518" y="0"/>
+                <wp:lineTo x="0" y="0"/>
+              </wp:wrapPolygon>
+            </wp:wrapTight>
+            <wp:docPr id="163" name="Imagem 163"/>
+            <wp:cNvGraphicFramePr>
+              <a:graphicFrameLocks xmlns:a="http://schemas.openxmlformats.org/drawingml/2006/main" noChangeAspect="1"/>
+            </wp:cNvGraphicFramePr>
+            <a:graphic xmlns:a="http://schemas.openxmlformats.org/drawingml/2006/main">
+              <a:graphicData uri="http://schemas.openxmlformats.org/drawingml/2006/picture">
+                <pic:pic xmlns:pic="http://schemas.openxmlformats.org/drawingml/2006/picture">
+                  <pic:nvPicPr>
+                    <pic:cNvPr id="1" name=""/>
+                    <pic:cNvPicPr/>
+                  </pic:nvPicPr>
+                  <pic:blipFill>
+                    <a:blip r:embed="rId175">
+                      <a:extLst>
+                        <a:ext uri="{28A0092B-C50C-407E-A947-70E740481C1C}">
+                          <a14:useLocalDpi xmlns:a14="http://schemas.microsoft.com/office/drawing/2010/main" val="0"/>
+                        </a:ext>
+                      </a:extLst>
+                    </a:blip>
+                    <a:stretch>
+                      <a:fillRect/>
+                    </a:stretch>
+                  </pic:blipFill>
+                  <pic:spPr>
+                    <a:xfrm>
+                      <a:off x="0" y="0"/>
+                      <a:ext cx="2505075" cy="1657350"/>
+                    </a:xfrm>
+                    <a:prstGeom prst="rect">
+                      <a:avLst/>
+                    </a:prstGeom>
+                  </pic:spPr>
+                </pic:pic>
+              </a:graphicData>
+            </a:graphic>
+          </wp:anchor>
+        </w:drawing>
+      </w:r>
+    </w:p>
+    <w:p>
+      <w:pPr>
+        <w:tabs>
+          <w:tab w:val="left" w:pos="1624"/>
+        </w:tabs>
+        <w:ind w:left="360"/>
+        <w:jc w:val="both"/>
+        <w:rPr>
+          <w:noProof/>
+        </w:rPr>
+      </w:pPr>
+    </w:p>
+    <w:p/>
+    <w:p/>
+    <w:p>
+      <w:pPr>
+        <w:tabs>
+          <w:tab w:val="left" w:pos="4839"/>
+        </w:tabs>
+      </w:pPr>
+    </w:p>
+    <w:p>
+      <w:pPr>
+        <w:tabs>
+          <w:tab w:val="left" w:pos="4839"/>
+        </w:tabs>
+      </w:pPr>
+      <w:r>
+        <w:rPr>
+          <w:noProof/>
+        </w:rPr>
+        <w:drawing>
+          <wp:anchor distT="0" distB="0" distL="114300" distR="114300" simplePos="0" relativeHeight="251825152" behindDoc="1" locked="0" layoutInCell="1" allowOverlap="1" wp14:anchorId="410D64E2">
+            <wp:simplePos x="0" y="0"/>
+            <wp:positionH relativeFrom="column">
+              <wp:posOffset>-315093</wp:posOffset>
+            </wp:positionH>
+            <wp:positionV relativeFrom="paragraph">
+              <wp:posOffset>220773</wp:posOffset>
+            </wp:positionV>
+            <wp:extent cx="5400040" cy="2287905"/>
+            <wp:effectExtent l="0" t="0" r="0" b="0"/>
+            <wp:wrapTight wrapText="bothSides">
+              <wp:wrapPolygon edited="0">
+                <wp:start x="0" y="0"/>
+                <wp:lineTo x="0" y="21402"/>
+                <wp:lineTo x="21488" y="21402"/>
+                <wp:lineTo x="21488" y="0"/>
+                <wp:lineTo x="0" y="0"/>
+              </wp:wrapPolygon>
+            </wp:wrapTight>
+            <wp:docPr id="164" name="Imagem 164"/>
+            <wp:cNvGraphicFramePr>
+              <a:graphicFrameLocks xmlns:a="http://schemas.openxmlformats.org/drawingml/2006/main" noChangeAspect="1"/>
+            </wp:cNvGraphicFramePr>
+            <a:graphic xmlns:a="http://schemas.openxmlformats.org/drawingml/2006/main">
+              <a:graphicData uri="http://schemas.openxmlformats.org/drawingml/2006/picture">
+                <pic:pic xmlns:pic="http://schemas.openxmlformats.org/drawingml/2006/picture">
+                  <pic:nvPicPr>
+                    <pic:cNvPr id="1" name=""/>
+                    <pic:cNvPicPr/>
+                  </pic:nvPicPr>
+                  <pic:blipFill>
+                    <a:blip r:embed="rId176">
+                      <a:extLst>
+                        <a:ext uri="{28A0092B-C50C-407E-A947-70E740481C1C}">
+                          <a14:useLocalDpi xmlns:a14="http://schemas.microsoft.com/office/drawing/2010/main" val="0"/>
+                        </a:ext>
+                      </a:extLst>
+                    </a:blip>
+                    <a:stretch>
+                      <a:fillRect/>
+                    </a:stretch>
+                  </pic:blipFill>
+                  <pic:spPr>
+                    <a:xfrm>
+                      <a:off x="0" y="0"/>
+                      <a:ext cx="5400040" cy="2287905"/>
+                    </a:xfrm>
+                    <a:prstGeom prst="rect">
+                      <a:avLst/>
+                    </a:prstGeom>
+                  </pic:spPr>
+                </pic:pic>
+              </a:graphicData>
+            </a:graphic>
+          </wp:anchor>
+        </w:drawing>
+      </w:r>
+    </w:p>
+    <w:p>
+      <w:pPr>
+        <w:tabs>
+          <w:tab w:val="left" w:pos="4839"/>
+        </w:tabs>
+      </w:pPr>
+    </w:p>
+    <w:p>
+      <w:pPr>
+        <w:tabs>
+          <w:tab w:val="left" w:pos="4839"/>
+        </w:tabs>
+      </w:pPr>
+    </w:p>
+    <w:p>
+      <w:pPr>
+        <w:tabs>
+          <w:tab w:val="left" w:pos="4839"/>
+        </w:tabs>
+      </w:pPr>
+    </w:p>
+    <w:p>
+      <w:pPr>
+        <w:tabs>
+          <w:tab w:val="left" w:pos="4839"/>
+        </w:tabs>
+      </w:pPr>
+    </w:p>
+    <w:p>
+      <w:pPr>
+        <w:tabs>
+          <w:tab w:val="left" w:pos="4839"/>
+        </w:tabs>
+      </w:pPr>
+    </w:p>
+    <w:p>
+      <w:pPr>
+        <w:tabs>
+          <w:tab w:val="left" w:pos="4839"/>
+        </w:tabs>
+      </w:pPr>
+    </w:p>
+    <w:p>
+      <w:pPr>
+        <w:tabs>
+          <w:tab w:val="left" w:pos="4839"/>
+        </w:tabs>
+      </w:pPr>
+    </w:p>
+    <w:p>
+      <w:pPr>
+        <w:tabs>
+          <w:tab w:val="left" w:pos="4839"/>
+        </w:tabs>
+        <w:rPr>
+          <w:noProof/>
+        </w:rPr>
+      </w:pPr>
+      <w:r>
+        <w:drawing>
+          <wp:anchor distT="0" distB="0" distL="114300" distR="114300" simplePos="0" relativeHeight="251826176" behindDoc="1" locked="0" layoutInCell="1" allowOverlap="1" wp14:anchorId="4BE82442">
+            <wp:simplePos x="0" y="0"/>
+            <wp:positionH relativeFrom="column">
+              <wp:posOffset>-48467</wp:posOffset>
+            </wp:positionH>
+            <wp:positionV relativeFrom="paragraph">
+              <wp:posOffset>887257</wp:posOffset>
+            </wp:positionV>
+            <wp:extent cx="2524125" cy="1857375"/>
+            <wp:effectExtent l="0" t="0" r="9525" b="9525"/>
+            <wp:wrapTight wrapText="bothSides">
+              <wp:wrapPolygon edited="0">
+                <wp:start x="0" y="0"/>
+                <wp:lineTo x="0" y="21489"/>
+                <wp:lineTo x="21518" y="21489"/>
+                <wp:lineTo x="21518" y="0"/>
+                <wp:lineTo x="0" y="0"/>
+              </wp:wrapPolygon>
+            </wp:wrapTight>
+            <wp:docPr id="165" name="Imagem 165"/>
+            <wp:cNvGraphicFramePr>
+              <a:graphicFrameLocks xmlns:a="http://schemas.openxmlformats.org/drawingml/2006/main" noChangeAspect="1"/>
+            </wp:cNvGraphicFramePr>
+            <a:graphic xmlns:a="http://schemas.openxmlformats.org/drawingml/2006/main">
+              <a:graphicData uri="http://schemas.openxmlformats.org/drawingml/2006/picture">
+                <pic:pic xmlns:pic="http://schemas.openxmlformats.org/drawingml/2006/picture">
+                  <pic:nvPicPr>
+                    <pic:cNvPr id="1" name=""/>
+                    <pic:cNvPicPr/>
+                  </pic:nvPicPr>
+                  <pic:blipFill>
+                    <a:blip r:embed="rId177">
+                      <a:extLst>
+                        <a:ext uri="{28A0092B-C50C-407E-A947-70E740481C1C}">
+                          <a14:useLocalDpi xmlns:a14="http://schemas.microsoft.com/office/drawing/2010/main" val="0"/>
+                        </a:ext>
+                      </a:extLst>
+                    </a:blip>
+                    <a:stretch>
+                      <a:fillRect/>
+                    </a:stretch>
+                  </pic:blipFill>
+                  <pic:spPr>
+                    <a:xfrm>
+                      <a:off x="0" y="0"/>
+                      <a:ext cx="2524125" cy="1857375"/>
+                    </a:xfrm>
+                    <a:prstGeom prst="rect">
+                      <a:avLst/>
+                    </a:prstGeom>
+                  </pic:spPr>
+                </pic:pic>
+              </a:graphicData>
+            </a:graphic>
+          </wp:anchor>
+        </w:drawing>
+      </w:r>
+      <w:r>
+        <w:t>106- A</w:t>
+      </w:r>
+      <w:r>
+        <w:t>linhamos a lista no topo da imagem</w:t>
+      </w:r>
+      <w:r>
+        <w:t xml:space="preserve"> utilizando vertical- </w:t>
+      </w:r>
+      <w:proofErr w:type="spellStart"/>
+      <w:r>
+        <w:t>align</w:t>
+      </w:r>
+      <w:proofErr w:type="spellEnd"/>
+      <w:r>
+        <w:t xml:space="preserve">: top, incluímos mais dois itens a lista no </w:t>
+      </w:r>
+      <w:proofErr w:type="spellStart"/>
+      <w:r>
+        <w:t>html</w:t>
+      </w:r>
+      <w:proofErr w:type="spellEnd"/>
+      <w:r>
+        <w:t xml:space="preserve"> e colocamos um espaço entre os itens da lista.</w:t>
+      </w:r>
+      <w:r>
+        <w:rPr>
+          <w:noProof/>
+        </w:rPr>
+        <w:t xml:space="preserve"> </w:t>
+      </w:r>
+    </w:p>
+    <w:p>
+      <w:pPr>
+        <w:tabs>
+          <w:tab w:val="left" w:pos="4839"/>
+        </w:tabs>
+      </w:pPr>
+    </w:p>
+    <w:p>
+      <w:pPr>
+        <w:tabs>
+          <w:tab w:val="left" w:pos="4839"/>
+        </w:tabs>
+      </w:pPr>
+    </w:p>
+    <w:p>
+      <w:pPr>
+        <w:tabs>
+          <w:tab w:val="left" w:pos="4839"/>
+        </w:tabs>
+      </w:pPr>
+    </w:p>
+    <w:p>
+      <w:pPr>
+        <w:tabs>
+          <w:tab w:val="left" w:pos="4839"/>
+        </w:tabs>
+      </w:pPr>
+    </w:p>
+    <w:p>
+      <w:pPr>
+        <w:tabs>
+          <w:tab w:val="left" w:pos="4839"/>
+        </w:tabs>
+      </w:pPr>
+    </w:p>
+    <w:p>
+      <w:pPr>
+        <w:tabs>
+          <w:tab w:val="left" w:pos="4839"/>
+        </w:tabs>
+      </w:pPr>
+    </w:p>
+    <w:p>
+      <w:pPr>
+        <w:tabs>
+          <w:tab w:val="left" w:pos="4839"/>
+        </w:tabs>
+      </w:pPr>
+    </w:p>
+    <w:p>
+      <w:pPr>
+        <w:tabs>
+          <w:tab w:val="left" w:pos="4839"/>
+        </w:tabs>
+      </w:pPr>
+    </w:p>
+    <w:p>
+      <w:pPr>
+        <w:tabs>
+          <w:tab w:val="left" w:pos="4839"/>
+        </w:tabs>
+      </w:pPr>
+    </w:p>
+    <w:p>
+      <w:pPr>
+        <w:tabs>
+          <w:tab w:val="left" w:pos="4839"/>
+        </w:tabs>
+      </w:pPr>
+    </w:p>
+    <w:p>
+      <w:pPr>
+        <w:tabs>
+          <w:tab w:val="left" w:pos="4839"/>
+        </w:tabs>
+      </w:pPr>
+    </w:p>
+    <w:p>
+      <w:pPr>
+        <w:tabs>
+          <w:tab w:val="left" w:pos="4839"/>
+        </w:tabs>
+        <w:rPr>
+          <w:noProof/>
+        </w:rPr>
+      </w:pPr>
+      <w:r>
+        <w:lastRenderedPageBreak/>
+        <w:drawing>
+          <wp:anchor distT="0" distB="0" distL="114300" distR="114300" simplePos="0" relativeHeight="251830272" behindDoc="1" locked="0" layoutInCell="1" allowOverlap="1" wp14:anchorId="14E8919C">
+            <wp:simplePos x="0" y="0"/>
+            <wp:positionH relativeFrom="column">
+              <wp:posOffset>2321870</wp:posOffset>
+            </wp:positionH>
+            <wp:positionV relativeFrom="paragraph">
+              <wp:posOffset>3267311</wp:posOffset>
+            </wp:positionV>
+            <wp:extent cx="2734057" cy="1152686"/>
+            <wp:effectExtent l="0" t="0" r="9525" b="9525"/>
+            <wp:wrapTight wrapText="bothSides">
+              <wp:wrapPolygon edited="0">
+                <wp:start x="0" y="0"/>
+                <wp:lineTo x="0" y="21421"/>
+                <wp:lineTo x="21525" y="21421"/>
+                <wp:lineTo x="21525" y="0"/>
+                <wp:lineTo x="0" y="0"/>
+              </wp:wrapPolygon>
+            </wp:wrapTight>
+            <wp:docPr id="168" name="Imagem 168"/>
+            <wp:cNvGraphicFramePr>
+              <a:graphicFrameLocks xmlns:a="http://schemas.openxmlformats.org/drawingml/2006/main" noChangeAspect="1"/>
+            </wp:cNvGraphicFramePr>
+            <a:graphic xmlns:a="http://schemas.openxmlformats.org/drawingml/2006/main">
+              <a:graphicData uri="http://schemas.openxmlformats.org/drawingml/2006/picture">
+                <pic:pic xmlns:pic="http://schemas.openxmlformats.org/drawingml/2006/picture">
+                  <pic:nvPicPr>
+                    <pic:cNvPr id="1" name=""/>
+                    <pic:cNvPicPr/>
+                  </pic:nvPicPr>
+                  <pic:blipFill>
+                    <a:blip r:embed="rId178">
+                      <a:extLst>
+                        <a:ext uri="{28A0092B-C50C-407E-A947-70E740481C1C}">
+                          <a14:useLocalDpi xmlns:a14="http://schemas.microsoft.com/office/drawing/2010/main" val="0"/>
+                        </a:ext>
+                      </a:extLst>
+                    </a:blip>
+                    <a:stretch>
+                      <a:fillRect/>
+                    </a:stretch>
+                  </pic:blipFill>
+                  <pic:spPr>
+                    <a:xfrm>
+                      <a:off x="0" y="0"/>
+                      <a:ext cx="2734057" cy="1152686"/>
+                    </a:xfrm>
+                    <a:prstGeom prst="rect">
+                      <a:avLst/>
+                    </a:prstGeom>
+                  </pic:spPr>
+                </pic:pic>
+              </a:graphicData>
+            </a:graphic>
+          </wp:anchor>
+        </w:drawing>
+      </w:r>
+      <w:r>
+        <w:drawing>
+          <wp:anchor distT="0" distB="0" distL="114300" distR="114300" simplePos="0" relativeHeight="251829248" behindDoc="1" locked="0" layoutInCell="1" allowOverlap="1" wp14:anchorId="22C3D197">
+            <wp:simplePos x="0" y="0"/>
+            <wp:positionH relativeFrom="margin">
+              <wp:align>left</wp:align>
+            </wp:positionH>
+            <wp:positionV relativeFrom="paragraph">
+              <wp:posOffset>3298913</wp:posOffset>
+            </wp:positionV>
+            <wp:extent cx="2209800" cy="723900"/>
+            <wp:effectExtent l="0" t="0" r="0" b="0"/>
+            <wp:wrapTight wrapText="bothSides">
+              <wp:wrapPolygon edited="0">
+                <wp:start x="0" y="0"/>
+                <wp:lineTo x="0" y="21032"/>
+                <wp:lineTo x="21414" y="21032"/>
+                <wp:lineTo x="21414" y="0"/>
+                <wp:lineTo x="0" y="0"/>
+              </wp:wrapPolygon>
+            </wp:wrapTight>
+            <wp:docPr id="167" name="Imagem 167"/>
+            <wp:cNvGraphicFramePr>
+              <a:graphicFrameLocks xmlns:a="http://schemas.openxmlformats.org/drawingml/2006/main" noChangeAspect="1"/>
+            </wp:cNvGraphicFramePr>
+            <a:graphic xmlns:a="http://schemas.openxmlformats.org/drawingml/2006/main">
+              <a:graphicData uri="http://schemas.openxmlformats.org/drawingml/2006/picture">
+                <pic:pic xmlns:pic="http://schemas.openxmlformats.org/drawingml/2006/picture">
+                  <pic:nvPicPr>
+                    <pic:cNvPr id="1" name=""/>
+                    <pic:cNvPicPr/>
+                  </pic:nvPicPr>
+                  <pic:blipFill>
+                    <a:blip r:embed="rId179">
+                      <a:extLst>
+                        <a:ext uri="{28A0092B-C50C-407E-A947-70E740481C1C}">
+                          <a14:useLocalDpi xmlns:a14="http://schemas.microsoft.com/office/drawing/2010/main" val="0"/>
+                        </a:ext>
+                      </a:extLst>
+                    </a:blip>
+                    <a:stretch>
+                      <a:fillRect/>
+                    </a:stretch>
+                  </pic:blipFill>
+                  <pic:spPr>
+                    <a:xfrm>
+                      <a:off x="0" y="0"/>
+                      <a:ext cx="2209800" cy="723900"/>
+                    </a:xfrm>
+                    <a:prstGeom prst="rect">
+                      <a:avLst/>
+                    </a:prstGeom>
+                  </pic:spPr>
+                </pic:pic>
+              </a:graphicData>
+            </a:graphic>
+          </wp:anchor>
+        </w:drawing>
+      </w:r>
+      <w:r>
+        <w:drawing>
+          <wp:anchor distT="0" distB="0" distL="114300" distR="114300" simplePos="0" relativeHeight="251828224" behindDoc="1" locked="0" layoutInCell="1" allowOverlap="1" wp14:anchorId="7D8AE735" wp14:editId="54D4E12D">
+            <wp:simplePos x="0" y="0"/>
+            <wp:positionH relativeFrom="page">
+              <wp:posOffset>967031</wp:posOffset>
+            </wp:positionH>
+            <wp:positionV relativeFrom="paragraph">
+              <wp:posOffset>162</wp:posOffset>
+            </wp:positionV>
+            <wp:extent cx="5400040" cy="2605405"/>
+            <wp:effectExtent l="0" t="0" r="0" b="4445"/>
+            <wp:wrapTight wrapText="bothSides">
+              <wp:wrapPolygon edited="0">
+                <wp:start x="0" y="0"/>
+                <wp:lineTo x="0" y="21479"/>
+                <wp:lineTo x="21488" y="21479"/>
+                <wp:lineTo x="21488" y="0"/>
+                <wp:lineTo x="0" y="0"/>
+              </wp:wrapPolygon>
+            </wp:wrapTight>
+            <wp:docPr id="166" name="Imagem 166"/>
+            <wp:cNvGraphicFramePr>
+              <a:graphicFrameLocks xmlns:a="http://schemas.openxmlformats.org/drawingml/2006/main" noChangeAspect="1"/>
+            </wp:cNvGraphicFramePr>
+            <a:graphic xmlns:a="http://schemas.openxmlformats.org/drawingml/2006/main">
+              <a:graphicData uri="http://schemas.openxmlformats.org/drawingml/2006/picture">
+                <pic:pic xmlns:pic="http://schemas.openxmlformats.org/drawingml/2006/picture">
+                  <pic:nvPicPr>
+                    <pic:cNvPr id="1" name=""/>
+                    <pic:cNvPicPr/>
+                  </pic:nvPicPr>
+                  <pic:blipFill>
+                    <a:blip r:embed="rId180">
+                      <a:extLst>
+                        <a:ext uri="{28A0092B-C50C-407E-A947-70E740481C1C}">
+                          <a14:useLocalDpi xmlns:a14="http://schemas.microsoft.com/office/drawing/2010/main" val="0"/>
+                        </a:ext>
+                      </a:extLst>
+                    </a:blip>
+                    <a:stretch>
+                      <a:fillRect/>
+                    </a:stretch>
+                  </pic:blipFill>
+                  <pic:spPr>
+                    <a:xfrm>
+                      <a:off x="0" y="0"/>
+                      <a:ext cx="5400040" cy="2605405"/>
+                    </a:xfrm>
+                    <a:prstGeom prst="rect">
+                      <a:avLst/>
+                    </a:prstGeom>
+                  </pic:spPr>
+                </pic:pic>
+              </a:graphicData>
+            </a:graphic>
+          </wp:anchor>
+        </w:drawing>
+      </w:r>
+      <w:r>
+        <w:t xml:space="preserve">107- Na lista queremos que o primeiro item ficasse em encorpado e negrito para isso utilizamos o </w:t>
+      </w:r>
+      <w:proofErr w:type="spellStart"/>
+      <w:r>
+        <w:t>first-child</w:t>
+      </w:r>
+      <w:proofErr w:type="spellEnd"/>
+      <w:r>
+        <w:t xml:space="preserve"> que significa o primeiro filho conforme código a baixo.</w:t>
+      </w:r>
+    </w:p>
+    <w:p>
+      <w:pPr>
+        <w:tabs>
+          <w:tab w:val="left" w:pos="4839"/>
+        </w:tabs>
+      </w:pPr>
+    </w:p>
+    <w:p>
+      <w:pPr>
+        <w:tabs>
+          <w:tab w:val="left" w:pos="4839"/>
+        </w:tabs>
+      </w:pPr>
+    </w:p>
+    <w:p>
+      <w:pPr>
+        <w:tabs>
+          <w:tab w:val="left" w:pos="4839"/>
+        </w:tabs>
+      </w:pPr>
+    </w:p>
+    <w:p>
+      <w:pPr>
+        <w:tabs>
+          <w:tab w:val="left" w:pos="4839"/>
+        </w:tabs>
+      </w:pPr>
+    </w:p>
+    <w:p>
+      <w:pPr>
+        <w:tabs>
+          <w:tab w:val="left" w:pos="4839"/>
+        </w:tabs>
+      </w:pPr>
+    </w:p>
+    <w:p>
+      <w:pPr>
+        <w:tabs>
+          <w:tab w:val="left" w:pos="4839"/>
+        </w:tabs>
+      </w:pPr>
+      <w:r>
+        <w:t>108-</w:t>
+      </w:r>
+      <w:r>
+        <w:t xml:space="preserve"> </w:t>
+      </w:r>
+      <w:r>
+        <w:t>A</w:t>
+      </w:r>
+      <w:r>
+        <w:t>dicionando ícones de estrela na nossa lista benefícios:</w:t>
+      </w:r>
+    </w:p>
+    <w:p>
+      <w:pPr>
+        <w:tabs>
+          <w:tab w:val="left" w:pos="4839"/>
+        </w:tabs>
+      </w:pPr>
+      <w:r>
+        <w:t>Acessemos site que contenha o ícone de est</w:t>
+      </w:r>
+      <w:r>
+        <w:t>rela negra</w:t>
+      </w:r>
+      <w:r>
+        <w:t xml:space="preserve"> </w:t>
+      </w:r>
+      <w:hyperlink r:id="rId181" w:history="1">
+        <w:r>
+          <w:rPr>
+            <w:rStyle w:val="Hyperlink"/>
+          </w:rPr>
+          <w:t>https://www.compart.com/en/unicode/U+2605</w:t>
+        </w:r>
+      </w:hyperlink>
+      <w:r>
+        <w:t xml:space="preserve"> </w:t>
+      </w:r>
+    </w:p>
+    <w:p>
+      <w:pPr>
+        <w:tabs>
+          <w:tab w:val="left" w:pos="4839"/>
+        </w:tabs>
+        <w:rPr>
+          <w:noProof/>
+        </w:rPr>
+      </w:pPr>
+      <w:r>
+        <w:drawing>
+          <wp:anchor distT="0" distB="0" distL="114300" distR="114300" simplePos="0" relativeHeight="251832320" behindDoc="1" locked="0" layoutInCell="1" allowOverlap="1" wp14:anchorId="1FAB9793">
+            <wp:simplePos x="0" y="0"/>
+            <wp:positionH relativeFrom="column">
+              <wp:posOffset>1898163</wp:posOffset>
+            </wp:positionH>
+            <wp:positionV relativeFrom="paragraph">
+              <wp:posOffset>288142</wp:posOffset>
+            </wp:positionV>
+            <wp:extent cx="2572109" cy="1333686"/>
+            <wp:effectExtent l="0" t="0" r="0" b="0"/>
+            <wp:wrapTight wrapText="bothSides">
+              <wp:wrapPolygon edited="0">
+                <wp:start x="0" y="0"/>
+                <wp:lineTo x="0" y="21291"/>
+                <wp:lineTo x="21440" y="21291"/>
+                <wp:lineTo x="21440" y="0"/>
+                <wp:lineTo x="0" y="0"/>
+              </wp:wrapPolygon>
+            </wp:wrapTight>
+            <wp:docPr id="170" name="Imagem 170"/>
+            <wp:cNvGraphicFramePr>
+              <a:graphicFrameLocks xmlns:a="http://schemas.openxmlformats.org/drawingml/2006/main" noChangeAspect="1"/>
+            </wp:cNvGraphicFramePr>
+            <a:graphic xmlns:a="http://schemas.openxmlformats.org/drawingml/2006/main">
+              <a:graphicData uri="http://schemas.openxmlformats.org/drawingml/2006/picture">
+                <pic:pic xmlns:pic="http://schemas.openxmlformats.org/drawingml/2006/picture">
+                  <pic:nvPicPr>
+                    <pic:cNvPr id="1" name=""/>
+                    <pic:cNvPicPr/>
+                  </pic:nvPicPr>
+                  <pic:blipFill>
+                    <a:blip r:embed="rId182">
+                      <a:extLst>
+                        <a:ext uri="{28A0092B-C50C-407E-A947-70E740481C1C}">
+                          <a14:useLocalDpi xmlns:a14="http://schemas.microsoft.com/office/drawing/2010/main" val="0"/>
+                        </a:ext>
+                      </a:extLst>
+                    </a:blip>
+                    <a:stretch>
+                      <a:fillRect/>
+                    </a:stretch>
+                  </pic:blipFill>
+                  <pic:spPr>
+                    <a:xfrm>
+                      <a:off x="0" y="0"/>
+                      <a:ext cx="2572109" cy="1333686"/>
+                    </a:xfrm>
+                    <a:prstGeom prst="rect">
+                      <a:avLst/>
+                    </a:prstGeom>
+                  </pic:spPr>
+                </pic:pic>
+              </a:graphicData>
+            </a:graphic>
+          </wp:anchor>
+        </w:drawing>
+      </w:r>
+      <w:r>
+        <w:drawing>
+          <wp:anchor distT="0" distB="0" distL="114300" distR="114300" simplePos="0" relativeHeight="251833344" behindDoc="1" locked="0" layoutInCell="1" allowOverlap="1" wp14:anchorId="2CFCE985">
+            <wp:simplePos x="0" y="0"/>
+            <wp:positionH relativeFrom="column">
+              <wp:posOffset>333419</wp:posOffset>
+            </wp:positionH>
+            <wp:positionV relativeFrom="paragraph">
+              <wp:posOffset>607325</wp:posOffset>
+            </wp:positionV>
+            <wp:extent cx="1533739" cy="704948"/>
+            <wp:effectExtent l="0" t="0" r="9525" b="0"/>
+            <wp:wrapTight wrapText="bothSides">
+              <wp:wrapPolygon edited="0">
+                <wp:start x="0" y="0"/>
+                <wp:lineTo x="0" y="21016"/>
+                <wp:lineTo x="21466" y="21016"/>
+                <wp:lineTo x="21466" y="0"/>
+                <wp:lineTo x="0" y="0"/>
+              </wp:wrapPolygon>
+            </wp:wrapTight>
+            <wp:docPr id="171" name="Imagem 171"/>
+            <wp:cNvGraphicFramePr>
+              <a:graphicFrameLocks xmlns:a="http://schemas.openxmlformats.org/drawingml/2006/main" noChangeAspect="1"/>
+            </wp:cNvGraphicFramePr>
+            <a:graphic xmlns:a="http://schemas.openxmlformats.org/drawingml/2006/main">
+              <a:graphicData uri="http://schemas.openxmlformats.org/drawingml/2006/picture">
+                <pic:pic xmlns:pic="http://schemas.openxmlformats.org/drawingml/2006/picture">
+                  <pic:nvPicPr>
+                    <pic:cNvPr id="1" name=""/>
+                    <pic:cNvPicPr/>
+                  </pic:nvPicPr>
+                  <pic:blipFill>
+                    <a:blip r:embed="rId183">
+                      <a:extLst>
+                        <a:ext uri="{28A0092B-C50C-407E-A947-70E740481C1C}">
+                          <a14:useLocalDpi xmlns:a14="http://schemas.microsoft.com/office/drawing/2010/main" val="0"/>
+                        </a:ext>
+                      </a:extLst>
+                    </a:blip>
+                    <a:stretch>
+                      <a:fillRect/>
+                    </a:stretch>
+                  </pic:blipFill>
+                  <pic:spPr>
+                    <a:xfrm>
+                      <a:off x="0" y="0"/>
+                      <a:ext cx="1533739" cy="704948"/>
+                    </a:xfrm>
+                    <a:prstGeom prst="rect">
+                      <a:avLst/>
+                    </a:prstGeom>
+                  </pic:spPr>
+                </pic:pic>
+              </a:graphicData>
+            </a:graphic>
+          </wp:anchor>
+        </w:drawing>
+      </w:r>
+      <w:r>
+        <w:t>Copiamos o símbolo e colocamos em nosso código conforme imagem a baixo.</w:t>
+      </w:r>
+    </w:p>
+    <w:p>
+      <w:pPr>
+        <w:tabs>
+          <w:tab w:val="left" w:pos="4839"/>
+        </w:tabs>
+      </w:pPr>
+    </w:p>
+    <w:p>
+      <w:pPr>
+        <w:tabs>
+          <w:tab w:val="left" w:pos="4839"/>
+        </w:tabs>
+      </w:pPr>
+    </w:p>
+    <w:p>
+      <w:pPr>
+        <w:tabs>
+          <w:tab w:val="left" w:pos="4839"/>
+        </w:tabs>
+      </w:pPr>
+    </w:p>
+    <w:p>
+      <w:pPr>
+        <w:tabs>
+          <w:tab w:val="left" w:pos="4839"/>
+        </w:tabs>
+      </w:pPr>
+    </w:p>
+    <w:p>
+      <w:pPr>
+        <w:tabs>
+          <w:tab w:val="left" w:pos="4839"/>
+        </w:tabs>
+      </w:pPr>
+    </w:p>
+    <w:p>
+      <w:pPr>
+        <w:tabs>
+          <w:tab w:val="left" w:pos="4839"/>
+        </w:tabs>
+        <w:rPr>
+          <w:noProof/>
+        </w:rPr>
+      </w:pPr>
+      <w:r>
+        <w:drawing>
+          <wp:anchor distT="0" distB="0" distL="114300" distR="114300" simplePos="0" relativeHeight="251834368" behindDoc="1" locked="0" layoutInCell="1" allowOverlap="1" wp14:anchorId="3816BF5B">
+            <wp:simplePos x="0" y="0"/>
+            <wp:positionH relativeFrom="margin">
+              <wp:align>left</wp:align>
+            </wp:positionH>
+            <wp:positionV relativeFrom="paragraph">
+              <wp:posOffset>382358</wp:posOffset>
+            </wp:positionV>
+            <wp:extent cx="1800225" cy="676275"/>
+            <wp:effectExtent l="0" t="0" r="9525" b="9525"/>
+            <wp:wrapTight wrapText="bothSides">
+              <wp:wrapPolygon edited="0">
+                <wp:start x="0" y="0"/>
+                <wp:lineTo x="0" y="21296"/>
+                <wp:lineTo x="21486" y="21296"/>
+                <wp:lineTo x="21486" y="0"/>
+                <wp:lineTo x="0" y="0"/>
+              </wp:wrapPolygon>
+            </wp:wrapTight>
+            <wp:docPr id="172" name="Imagem 172"/>
+            <wp:cNvGraphicFramePr>
+              <a:graphicFrameLocks xmlns:a="http://schemas.openxmlformats.org/drawingml/2006/main" noChangeAspect="1"/>
+            </wp:cNvGraphicFramePr>
+            <a:graphic xmlns:a="http://schemas.openxmlformats.org/drawingml/2006/main">
+              <a:graphicData uri="http://schemas.openxmlformats.org/drawingml/2006/picture">
+                <pic:pic xmlns:pic="http://schemas.openxmlformats.org/drawingml/2006/picture">
+                  <pic:nvPicPr>
+                    <pic:cNvPr id="1" name=""/>
+                    <pic:cNvPicPr/>
+                  </pic:nvPicPr>
+                  <pic:blipFill>
+                    <a:blip r:embed="rId184">
+                      <a:extLst>
+                        <a:ext uri="{28A0092B-C50C-407E-A947-70E740481C1C}">
+                          <a14:useLocalDpi xmlns:a14="http://schemas.microsoft.com/office/drawing/2010/main" val="0"/>
+                        </a:ext>
+                      </a:extLst>
+                    </a:blip>
+                    <a:stretch>
+                      <a:fillRect/>
+                    </a:stretch>
+                  </pic:blipFill>
+                  <pic:spPr>
+                    <a:xfrm>
+                      <a:off x="0" y="0"/>
+                      <a:ext cx="1800225" cy="676275"/>
+                    </a:xfrm>
+                    <a:prstGeom prst="rect">
+                      <a:avLst/>
+                    </a:prstGeom>
+                  </pic:spPr>
+                </pic:pic>
+              </a:graphicData>
+            </a:graphic>
+          </wp:anchor>
+        </w:drawing>
+      </w:r>
+      <w:r>
+        <w:t>109-</w:t>
+      </w:r>
+      <w:r>
+        <w:t xml:space="preserve"> Aumentamos o espaço inte</w:t>
+      </w:r>
+      <w:r>
+        <w:t>rno da seção benefícios para cima e para baixo.</w:t>
+      </w:r>
+      <w:r>
+        <w:rPr>
+          <w:noProof/>
+        </w:rPr>
+        <w:t xml:space="preserve"> </w:t>
+      </w:r>
+    </w:p>
+    <w:p>
+      <w:pPr>
+        <w:tabs>
+          <w:tab w:val="left" w:pos="4839"/>
+        </w:tabs>
+      </w:pPr>
+    </w:p>
+    <w:p>
+      <w:pPr>
+        <w:tabs>
+          <w:tab w:val="left" w:pos="4839"/>
+        </w:tabs>
+      </w:pPr>
+    </w:p>
+    <w:p>
+      <w:pPr>
+        <w:tabs>
+          <w:tab w:val="left" w:pos="4839"/>
+        </w:tabs>
+      </w:pPr>
+    </w:p>
+    <w:p>
+      <w:pPr>
+        <w:tabs>
+          <w:tab w:val="left" w:pos="4839"/>
+        </w:tabs>
+      </w:pPr>
+    </w:p>
+    <w:p>
+      <w:pPr>
+        <w:tabs>
+          <w:tab w:val="left" w:pos="4839"/>
+        </w:tabs>
+      </w:pPr>
       <w:bookmarkStart w:id="0" w:name="_GoBack"/>
+      <w:r>
+        <w:lastRenderedPageBreak/>
+        <w:drawing>
+          <wp:anchor distT="0" distB="0" distL="114300" distR="114300" simplePos="0" relativeHeight="251835392" behindDoc="1" locked="0" layoutInCell="1" allowOverlap="1" wp14:anchorId="6DE412F3">
+            <wp:simplePos x="0" y="0"/>
+            <wp:positionH relativeFrom="column">
+              <wp:posOffset>-167684</wp:posOffset>
+            </wp:positionH>
+            <wp:positionV relativeFrom="paragraph">
+              <wp:posOffset>531628</wp:posOffset>
+            </wp:positionV>
+            <wp:extent cx="2190750" cy="895350"/>
+            <wp:effectExtent l="0" t="0" r="0" b="0"/>
+            <wp:wrapTight wrapText="bothSides">
+              <wp:wrapPolygon edited="0">
+                <wp:start x="0" y="0"/>
+                <wp:lineTo x="0" y="21140"/>
+                <wp:lineTo x="21412" y="21140"/>
+                <wp:lineTo x="21412" y="0"/>
+                <wp:lineTo x="0" y="0"/>
+              </wp:wrapPolygon>
+            </wp:wrapTight>
+            <wp:docPr id="173" name="Imagem 173"/>
+            <wp:cNvGraphicFramePr>
+              <a:graphicFrameLocks xmlns:a="http://schemas.openxmlformats.org/drawingml/2006/main" noChangeAspect="1"/>
+            </wp:cNvGraphicFramePr>
+            <a:graphic xmlns:a="http://schemas.openxmlformats.org/drawingml/2006/main">
+              <a:graphicData uri="http://schemas.openxmlformats.org/drawingml/2006/picture">
+                <pic:pic xmlns:pic="http://schemas.openxmlformats.org/drawingml/2006/picture">
+                  <pic:nvPicPr>
+                    <pic:cNvPr id="1" name=""/>
+                    <pic:cNvPicPr/>
+                  </pic:nvPicPr>
+                  <pic:blipFill>
+                    <a:blip r:embed="rId185">
+                      <a:extLst>
+                        <a:ext uri="{28A0092B-C50C-407E-A947-70E740481C1C}">
+                          <a14:useLocalDpi xmlns:a14="http://schemas.microsoft.com/office/drawing/2010/main" val="0"/>
+                        </a:ext>
+                      </a:extLst>
+                    </a:blip>
+                    <a:stretch>
+                      <a:fillRect/>
+                    </a:stretch>
+                  </pic:blipFill>
+                  <pic:spPr>
+                    <a:xfrm>
+                      <a:off x="0" y="0"/>
+                      <a:ext cx="2190750" cy="895350"/>
+                    </a:xfrm>
+                    <a:prstGeom prst="rect">
+                      <a:avLst/>
+                    </a:prstGeom>
+                  </pic:spPr>
+                </pic:pic>
+              </a:graphicData>
+            </a:graphic>
+          </wp:anchor>
+        </w:drawing>
+      </w:r>
       <w:bookmarkEnd w:id="0"/>
+      <w:r>
+        <w:t xml:space="preserve">110- Na </w:t>
+      </w:r>
+      <w:proofErr w:type="spellStart"/>
+      <w:r>
+        <w:t>div</w:t>
+      </w:r>
+      <w:proofErr w:type="spellEnd"/>
+      <w:r>
+        <w:t xml:space="preserve"> que contem a lista e a imagem benefícios demos uma largura e centralizamos o item (a lista e a imagem) conforme código.</w:t>
+      </w:r>
+      <w:r>
+        <w:rPr>
+          <w:noProof/>
+        </w:rPr>
+        <w:t xml:space="preserve"> </w:t>
+      </w:r>
+      <w:r>
+        <w:t xml:space="preserve"> </w:t>
+      </w:r>
     </w:p>
     <w:sectPr>
-      <w:footerReference w:type="default" r:id="rId174"/>
+      <w:footerReference w:type="default" r:id="rId186"/>
       <w:pgSz w:w="11906" w:h="16838"/>
       <w:pgMar w:top="1418" w:right="1701" w:bottom="1418" w:left="1701" w:header="709" w:footer="709" w:gutter="0"/>
       <w:cols w:space="708"/>
@@ -18934,9 +20280,9 @@
     </w:lvl>
   </w:abstractNum>
   <w:abstractNum w:abstractNumId="3" w15:restartNumberingAfterBreak="0">
-    <w:nsid w:val="31FB2E6C"/>
+    <w:nsid w:val="2F7145AF"/>
     <w:multiLevelType w:val="hybridMultilevel"/>
-    <w:tmpl w:val="1D0E047C"/>
+    <w:tmpl w:val="119866EE"/>
     <w:lvl w:ilvl="0" w:tplc="04160001">
       <w:start w:val="1"/>
       <w:numFmt w:val="bullet"/>
@@ -19047,9 +20393,9 @@
     </w:lvl>
   </w:abstractNum>
   <w:abstractNum w:abstractNumId="4" w15:restartNumberingAfterBreak="0">
-    <w:nsid w:val="463821FD"/>
+    <w:nsid w:val="31FB2E6C"/>
     <w:multiLevelType w:val="hybridMultilevel"/>
-    <w:tmpl w:val="1D662410"/>
+    <w:tmpl w:val="1D0E047C"/>
     <w:lvl w:ilvl="0" w:tplc="04160001">
       <w:start w:val="1"/>
       <w:numFmt w:val="bullet"/>
@@ -19160,9 +20506,9 @@
     </w:lvl>
   </w:abstractNum>
   <w:abstractNum w:abstractNumId="5" w15:restartNumberingAfterBreak="0">
-    <w:nsid w:val="471817DB"/>
+    <w:nsid w:val="463821FD"/>
     <w:multiLevelType w:val="hybridMultilevel"/>
-    <w:tmpl w:val="E0CCA988"/>
+    <w:tmpl w:val="1D662410"/>
     <w:lvl w:ilvl="0" w:tplc="04160001">
       <w:start w:val="1"/>
       <w:numFmt w:val="bullet"/>
@@ -19273,9 +20619,9 @@
     </w:lvl>
   </w:abstractNum>
   <w:abstractNum w:abstractNumId="6" w15:restartNumberingAfterBreak="0">
-    <w:nsid w:val="5B807CDB"/>
+    <w:nsid w:val="471817DB"/>
     <w:multiLevelType w:val="hybridMultilevel"/>
-    <w:tmpl w:val="5BD0D580"/>
+    <w:tmpl w:val="E0CCA988"/>
     <w:lvl w:ilvl="0" w:tplc="04160001">
       <w:start w:val="1"/>
       <w:numFmt w:val="bullet"/>
@@ -19386,9 +20732,9 @@
     </w:lvl>
   </w:abstractNum>
   <w:abstractNum w:abstractNumId="7" w15:restartNumberingAfterBreak="0">
-    <w:nsid w:val="61BC3A9D"/>
+    <w:nsid w:val="5B807CDB"/>
     <w:multiLevelType w:val="hybridMultilevel"/>
-    <w:tmpl w:val="C6E60B46"/>
+    <w:tmpl w:val="5BD0D580"/>
     <w:lvl w:ilvl="0" w:tplc="04160001">
       <w:start w:val="1"/>
       <w:numFmt w:val="bullet"/>
@@ -19499,9 +20845,9 @@
     </w:lvl>
   </w:abstractNum>
   <w:abstractNum w:abstractNumId="8" w15:restartNumberingAfterBreak="0">
-    <w:nsid w:val="6B0F7CA7"/>
+    <w:nsid w:val="61BC3A9D"/>
     <w:multiLevelType w:val="hybridMultilevel"/>
-    <w:tmpl w:val="3FF40976"/>
+    <w:tmpl w:val="C6E60B46"/>
     <w:lvl w:ilvl="0" w:tplc="04160001">
       <w:start w:val="1"/>
       <w:numFmt w:val="bullet"/>
@@ -19612,9 +20958,9 @@
     </w:lvl>
   </w:abstractNum>
   <w:abstractNum w:abstractNumId="9" w15:restartNumberingAfterBreak="0">
-    <w:nsid w:val="761A2345"/>
+    <w:nsid w:val="65B64E8C"/>
     <w:multiLevelType w:val="hybridMultilevel"/>
-    <w:tmpl w:val="B030912C"/>
+    <w:tmpl w:val="3CE0BA36"/>
     <w:lvl w:ilvl="0" w:tplc="04160001">
       <w:start w:val="1"/>
       <w:numFmt w:val="bullet"/>
@@ -19725,9 +21071,9 @@
     </w:lvl>
   </w:abstractNum>
   <w:abstractNum w:abstractNumId="10" w15:restartNumberingAfterBreak="0">
-    <w:nsid w:val="7E3921C8"/>
+    <w:nsid w:val="6B0F7CA7"/>
     <w:multiLevelType w:val="hybridMultilevel"/>
-    <w:tmpl w:val="68D678A0"/>
+    <w:tmpl w:val="3FF40976"/>
     <w:lvl w:ilvl="0" w:tplc="04160001">
       <w:start w:val="1"/>
       <w:numFmt w:val="bullet"/>
@@ -19838,9 +21184,9 @@
     </w:lvl>
   </w:abstractNum>
   <w:abstractNum w:abstractNumId="11" w15:restartNumberingAfterBreak="0">
-    <w:nsid w:val="7EDD3EB0"/>
+    <w:nsid w:val="6E574C15"/>
     <w:multiLevelType w:val="hybridMultilevel"/>
-    <w:tmpl w:val="2ACE7D7E"/>
+    <w:tmpl w:val="16843580"/>
     <w:lvl w:ilvl="0" w:tplc="04160001">
       <w:start w:val="1"/>
       <w:numFmt w:val="bullet"/>
@@ -19951,9 +21297,9 @@
     </w:lvl>
   </w:abstractNum>
   <w:abstractNum w:abstractNumId="12" w15:restartNumberingAfterBreak="0">
-    <w:nsid w:val="7EFE27EB"/>
+    <w:nsid w:val="761A2345"/>
     <w:multiLevelType w:val="hybridMultilevel"/>
-    <w:tmpl w:val="48A8C2E4"/>
+    <w:tmpl w:val="B030912C"/>
     <w:lvl w:ilvl="0" w:tplc="04160001">
       <w:start w:val="1"/>
       <w:numFmt w:val="bullet"/>
@@ -20063,44 +21409,392 @@
       </w:rPr>
     </w:lvl>
   </w:abstractNum>
+  <w:abstractNum w:abstractNumId="13" w15:restartNumberingAfterBreak="0">
+    <w:nsid w:val="7E3921C8"/>
+    <w:multiLevelType w:val="hybridMultilevel"/>
+    <w:tmpl w:val="68D678A0"/>
+    <w:lvl w:ilvl="0" w:tplc="04160001">
+      <w:start w:val="1"/>
+      <w:numFmt w:val="bullet"/>
+      <w:lvlText w:val=""/>
+      <w:lvlJc w:val="left"/>
+      <w:pPr>
+        <w:ind w:left="720" w:hanging="360"/>
+      </w:pPr>
+      <w:rPr>
+        <w:rFonts w:ascii="Symbol" w:hAnsi="Symbol" w:hint="default"/>
+      </w:rPr>
+    </w:lvl>
+    <w:lvl w:ilvl="1" w:tplc="04160003" w:tentative="1">
+      <w:start w:val="1"/>
+      <w:numFmt w:val="bullet"/>
+      <w:lvlText w:val="o"/>
+      <w:lvlJc w:val="left"/>
+      <w:pPr>
+        <w:ind w:left="1440" w:hanging="360"/>
+      </w:pPr>
+      <w:rPr>
+        <w:rFonts w:ascii="Courier New" w:hAnsi="Courier New" w:cs="Courier New" w:hint="default"/>
+      </w:rPr>
+    </w:lvl>
+    <w:lvl w:ilvl="2" w:tplc="04160005" w:tentative="1">
+      <w:start w:val="1"/>
+      <w:numFmt w:val="bullet"/>
+      <w:lvlText w:val=""/>
+      <w:lvlJc w:val="left"/>
+      <w:pPr>
+        <w:ind w:left="2160" w:hanging="360"/>
+      </w:pPr>
+      <w:rPr>
+        <w:rFonts w:ascii="Wingdings" w:hAnsi="Wingdings" w:hint="default"/>
+      </w:rPr>
+    </w:lvl>
+    <w:lvl w:ilvl="3" w:tplc="04160001" w:tentative="1">
+      <w:start w:val="1"/>
+      <w:numFmt w:val="bullet"/>
+      <w:lvlText w:val=""/>
+      <w:lvlJc w:val="left"/>
+      <w:pPr>
+        <w:ind w:left="2880" w:hanging="360"/>
+      </w:pPr>
+      <w:rPr>
+        <w:rFonts w:ascii="Symbol" w:hAnsi="Symbol" w:hint="default"/>
+      </w:rPr>
+    </w:lvl>
+    <w:lvl w:ilvl="4" w:tplc="04160003" w:tentative="1">
+      <w:start w:val="1"/>
+      <w:numFmt w:val="bullet"/>
+      <w:lvlText w:val="o"/>
+      <w:lvlJc w:val="left"/>
+      <w:pPr>
+        <w:ind w:left="3600" w:hanging="360"/>
+      </w:pPr>
+      <w:rPr>
+        <w:rFonts w:ascii="Courier New" w:hAnsi="Courier New" w:cs="Courier New" w:hint="default"/>
+      </w:rPr>
+    </w:lvl>
+    <w:lvl w:ilvl="5" w:tplc="04160005" w:tentative="1">
+      <w:start w:val="1"/>
+      <w:numFmt w:val="bullet"/>
+      <w:lvlText w:val=""/>
+      <w:lvlJc w:val="left"/>
+      <w:pPr>
+        <w:ind w:left="4320" w:hanging="360"/>
+      </w:pPr>
+      <w:rPr>
+        <w:rFonts w:ascii="Wingdings" w:hAnsi="Wingdings" w:hint="default"/>
+      </w:rPr>
+    </w:lvl>
+    <w:lvl w:ilvl="6" w:tplc="04160001" w:tentative="1">
+      <w:start w:val="1"/>
+      <w:numFmt w:val="bullet"/>
+      <w:lvlText w:val=""/>
+      <w:lvlJc w:val="left"/>
+      <w:pPr>
+        <w:ind w:left="5040" w:hanging="360"/>
+      </w:pPr>
+      <w:rPr>
+        <w:rFonts w:ascii="Symbol" w:hAnsi="Symbol" w:hint="default"/>
+      </w:rPr>
+    </w:lvl>
+    <w:lvl w:ilvl="7" w:tplc="04160003" w:tentative="1">
+      <w:start w:val="1"/>
+      <w:numFmt w:val="bullet"/>
+      <w:lvlText w:val="o"/>
+      <w:lvlJc w:val="left"/>
+      <w:pPr>
+        <w:ind w:left="5760" w:hanging="360"/>
+      </w:pPr>
+      <w:rPr>
+        <w:rFonts w:ascii="Courier New" w:hAnsi="Courier New" w:cs="Courier New" w:hint="default"/>
+      </w:rPr>
+    </w:lvl>
+    <w:lvl w:ilvl="8" w:tplc="04160005" w:tentative="1">
+      <w:start w:val="1"/>
+      <w:numFmt w:val="bullet"/>
+      <w:lvlText w:val=""/>
+      <w:lvlJc w:val="left"/>
+      <w:pPr>
+        <w:ind w:left="6480" w:hanging="360"/>
+      </w:pPr>
+      <w:rPr>
+        <w:rFonts w:ascii="Wingdings" w:hAnsi="Wingdings" w:hint="default"/>
+      </w:rPr>
+    </w:lvl>
+  </w:abstractNum>
+  <w:abstractNum w:abstractNumId="14" w15:restartNumberingAfterBreak="0">
+    <w:nsid w:val="7EDD3EB0"/>
+    <w:multiLevelType w:val="hybridMultilevel"/>
+    <w:tmpl w:val="2ACE7D7E"/>
+    <w:lvl w:ilvl="0" w:tplc="04160001">
+      <w:start w:val="1"/>
+      <w:numFmt w:val="bullet"/>
+      <w:lvlText w:val=""/>
+      <w:lvlJc w:val="left"/>
+      <w:pPr>
+        <w:ind w:left="720" w:hanging="360"/>
+      </w:pPr>
+      <w:rPr>
+        <w:rFonts w:ascii="Symbol" w:hAnsi="Symbol" w:hint="default"/>
+      </w:rPr>
+    </w:lvl>
+    <w:lvl w:ilvl="1" w:tplc="04160003" w:tentative="1">
+      <w:start w:val="1"/>
+      <w:numFmt w:val="bullet"/>
+      <w:lvlText w:val="o"/>
+      <w:lvlJc w:val="left"/>
+      <w:pPr>
+        <w:ind w:left="1440" w:hanging="360"/>
+      </w:pPr>
+      <w:rPr>
+        <w:rFonts w:ascii="Courier New" w:hAnsi="Courier New" w:cs="Courier New" w:hint="default"/>
+      </w:rPr>
+    </w:lvl>
+    <w:lvl w:ilvl="2" w:tplc="04160005" w:tentative="1">
+      <w:start w:val="1"/>
+      <w:numFmt w:val="bullet"/>
+      <w:lvlText w:val=""/>
+      <w:lvlJc w:val="left"/>
+      <w:pPr>
+        <w:ind w:left="2160" w:hanging="360"/>
+      </w:pPr>
+      <w:rPr>
+        <w:rFonts w:ascii="Wingdings" w:hAnsi="Wingdings" w:hint="default"/>
+      </w:rPr>
+    </w:lvl>
+    <w:lvl w:ilvl="3" w:tplc="04160001" w:tentative="1">
+      <w:start w:val="1"/>
+      <w:numFmt w:val="bullet"/>
+      <w:lvlText w:val=""/>
+      <w:lvlJc w:val="left"/>
+      <w:pPr>
+        <w:ind w:left="2880" w:hanging="360"/>
+      </w:pPr>
+      <w:rPr>
+        <w:rFonts w:ascii="Symbol" w:hAnsi="Symbol" w:hint="default"/>
+      </w:rPr>
+    </w:lvl>
+    <w:lvl w:ilvl="4" w:tplc="04160003" w:tentative="1">
+      <w:start w:val="1"/>
+      <w:numFmt w:val="bullet"/>
+      <w:lvlText w:val="o"/>
+      <w:lvlJc w:val="left"/>
+      <w:pPr>
+        <w:ind w:left="3600" w:hanging="360"/>
+      </w:pPr>
+      <w:rPr>
+        <w:rFonts w:ascii="Courier New" w:hAnsi="Courier New" w:cs="Courier New" w:hint="default"/>
+      </w:rPr>
+    </w:lvl>
+    <w:lvl w:ilvl="5" w:tplc="04160005" w:tentative="1">
+      <w:start w:val="1"/>
+      <w:numFmt w:val="bullet"/>
+      <w:lvlText w:val=""/>
+      <w:lvlJc w:val="left"/>
+      <w:pPr>
+        <w:ind w:left="4320" w:hanging="360"/>
+      </w:pPr>
+      <w:rPr>
+        <w:rFonts w:ascii="Wingdings" w:hAnsi="Wingdings" w:hint="default"/>
+      </w:rPr>
+    </w:lvl>
+    <w:lvl w:ilvl="6" w:tplc="04160001" w:tentative="1">
+      <w:start w:val="1"/>
+      <w:numFmt w:val="bullet"/>
+      <w:lvlText w:val=""/>
+      <w:lvlJc w:val="left"/>
+      <w:pPr>
+        <w:ind w:left="5040" w:hanging="360"/>
+      </w:pPr>
+      <w:rPr>
+        <w:rFonts w:ascii="Symbol" w:hAnsi="Symbol" w:hint="default"/>
+      </w:rPr>
+    </w:lvl>
+    <w:lvl w:ilvl="7" w:tplc="04160003" w:tentative="1">
+      <w:start w:val="1"/>
+      <w:numFmt w:val="bullet"/>
+      <w:lvlText w:val="o"/>
+      <w:lvlJc w:val="left"/>
+      <w:pPr>
+        <w:ind w:left="5760" w:hanging="360"/>
+      </w:pPr>
+      <w:rPr>
+        <w:rFonts w:ascii="Courier New" w:hAnsi="Courier New" w:cs="Courier New" w:hint="default"/>
+      </w:rPr>
+    </w:lvl>
+    <w:lvl w:ilvl="8" w:tplc="04160005" w:tentative="1">
+      <w:start w:val="1"/>
+      <w:numFmt w:val="bullet"/>
+      <w:lvlText w:val=""/>
+      <w:lvlJc w:val="left"/>
+      <w:pPr>
+        <w:ind w:left="6480" w:hanging="360"/>
+      </w:pPr>
+      <w:rPr>
+        <w:rFonts w:ascii="Wingdings" w:hAnsi="Wingdings" w:hint="default"/>
+      </w:rPr>
+    </w:lvl>
+  </w:abstractNum>
+  <w:abstractNum w:abstractNumId="15" w15:restartNumberingAfterBreak="0">
+    <w:nsid w:val="7EFE27EB"/>
+    <w:multiLevelType w:val="hybridMultilevel"/>
+    <w:tmpl w:val="48A8C2E4"/>
+    <w:lvl w:ilvl="0" w:tplc="04160001">
+      <w:start w:val="1"/>
+      <w:numFmt w:val="bullet"/>
+      <w:lvlText w:val=""/>
+      <w:lvlJc w:val="left"/>
+      <w:pPr>
+        <w:ind w:left="720" w:hanging="360"/>
+      </w:pPr>
+      <w:rPr>
+        <w:rFonts w:ascii="Symbol" w:hAnsi="Symbol" w:hint="default"/>
+      </w:rPr>
+    </w:lvl>
+    <w:lvl w:ilvl="1" w:tplc="04160003" w:tentative="1">
+      <w:start w:val="1"/>
+      <w:numFmt w:val="bullet"/>
+      <w:lvlText w:val="o"/>
+      <w:lvlJc w:val="left"/>
+      <w:pPr>
+        <w:ind w:left="1440" w:hanging="360"/>
+      </w:pPr>
+      <w:rPr>
+        <w:rFonts w:ascii="Courier New" w:hAnsi="Courier New" w:cs="Courier New" w:hint="default"/>
+      </w:rPr>
+    </w:lvl>
+    <w:lvl w:ilvl="2" w:tplc="04160005" w:tentative="1">
+      <w:start w:val="1"/>
+      <w:numFmt w:val="bullet"/>
+      <w:lvlText w:val=""/>
+      <w:lvlJc w:val="left"/>
+      <w:pPr>
+        <w:ind w:left="2160" w:hanging="360"/>
+      </w:pPr>
+      <w:rPr>
+        <w:rFonts w:ascii="Wingdings" w:hAnsi="Wingdings" w:hint="default"/>
+      </w:rPr>
+    </w:lvl>
+    <w:lvl w:ilvl="3" w:tplc="04160001" w:tentative="1">
+      <w:start w:val="1"/>
+      <w:numFmt w:val="bullet"/>
+      <w:lvlText w:val=""/>
+      <w:lvlJc w:val="left"/>
+      <w:pPr>
+        <w:ind w:left="2880" w:hanging="360"/>
+      </w:pPr>
+      <w:rPr>
+        <w:rFonts w:ascii="Symbol" w:hAnsi="Symbol" w:hint="default"/>
+      </w:rPr>
+    </w:lvl>
+    <w:lvl w:ilvl="4" w:tplc="04160003" w:tentative="1">
+      <w:start w:val="1"/>
+      <w:numFmt w:val="bullet"/>
+      <w:lvlText w:val="o"/>
+      <w:lvlJc w:val="left"/>
+      <w:pPr>
+        <w:ind w:left="3600" w:hanging="360"/>
+      </w:pPr>
+      <w:rPr>
+        <w:rFonts w:ascii="Courier New" w:hAnsi="Courier New" w:cs="Courier New" w:hint="default"/>
+      </w:rPr>
+    </w:lvl>
+    <w:lvl w:ilvl="5" w:tplc="04160005" w:tentative="1">
+      <w:start w:val="1"/>
+      <w:numFmt w:val="bullet"/>
+      <w:lvlText w:val=""/>
+      <w:lvlJc w:val="left"/>
+      <w:pPr>
+        <w:ind w:left="4320" w:hanging="360"/>
+      </w:pPr>
+      <w:rPr>
+        <w:rFonts w:ascii="Wingdings" w:hAnsi="Wingdings" w:hint="default"/>
+      </w:rPr>
+    </w:lvl>
+    <w:lvl w:ilvl="6" w:tplc="04160001" w:tentative="1">
+      <w:start w:val="1"/>
+      <w:numFmt w:val="bullet"/>
+      <w:lvlText w:val=""/>
+      <w:lvlJc w:val="left"/>
+      <w:pPr>
+        <w:ind w:left="5040" w:hanging="360"/>
+      </w:pPr>
+      <w:rPr>
+        <w:rFonts w:ascii="Symbol" w:hAnsi="Symbol" w:hint="default"/>
+      </w:rPr>
+    </w:lvl>
+    <w:lvl w:ilvl="7" w:tplc="04160003" w:tentative="1">
+      <w:start w:val="1"/>
+      <w:numFmt w:val="bullet"/>
+      <w:lvlText w:val="o"/>
+      <w:lvlJc w:val="left"/>
+      <w:pPr>
+        <w:ind w:left="5760" w:hanging="360"/>
+      </w:pPr>
+      <w:rPr>
+        <w:rFonts w:ascii="Courier New" w:hAnsi="Courier New" w:cs="Courier New" w:hint="default"/>
+      </w:rPr>
+    </w:lvl>
+    <w:lvl w:ilvl="8" w:tplc="04160005" w:tentative="1">
+      <w:start w:val="1"/>
+      <w:numFmt w:val="bullet"/>
+      <w:lvlText w:val=""/>
+      <w:lvlJc w:val="left"/>
+      <w:pPr>
+        <w:ind w:left="6480" w:hanging="360"/>
+      </w:pPr>
+      <w:rPr>
+        <w:rFonts w:ascii="Wingdings" w:hAnsi="Wingdings" w:hint="default"/>
+      </w:rPr>
+    </w:lvl>
+  </w:abstractNum>
   <w:num w:numId="1">
-    <w:abstractNumId w:val="5"/>
+    <w:abstractNumId w:val="6"/>
   </w:num>
   <w:num w:numId="2">
-    <w:abstractNumId w:val="10"/>
+    <w:abstractNumId w:val="13"/>
   </w:num>
   <w:num w:numId="3">
-    <w:abstractNumId w:val="3"/>
+    <w:abstractNumId w:val="4"/>
   </w:num>
   <w:num w:numId="4">
     <w:abstractNumId w:val="0"/>
   </w:num>
   <w:num w:numId="5">
-    <w:abstractNumId w:val="6"/>
+    <w:abstractNumId w:val="7"/>
   </w:num>
   <w:num w:numId="6">
-    <w:abstractNumId w:val="8"/>
+    <w:abstractNumId w:val="10"/>
   </w:num>
   <w:num w:numId="7">
-    <w:abstractNumId w:val="4"/>
+    <w:abstractNumId w:val="5"/>
   </w:num>
   <w:num w:numId="8">
     <w:abstractNumId w:val="1"/>
   </w:num>
   <w:num w:numId="9">
-    <w:abstractNumId w:val="11"/>
+    <w:abstractNumId w:val="14"/>
   </w:num>
   <w:num w:numId="10">
     <w:abstractNumId w:val="2"/>
   </w:num>
   <w:num w:numId="11">
+    <w:abstractNumId w:val="12"/>
+  </w:num>
+  <w:num w:numId="12">
+    <w:abstractNumId w:val="15"/>
+  </w:num>
+  <w:num w:numId="13">
+    <w:abstractNumId w:val="8"/>
+  </w:num>
+  <w:num w:numId="14">
     <w:abstractNumId w:val="9"/>
   </w:num>
-  <w:num w:numId="12">
-    <w:abstractNumId w:val="12"/>
+  <w:num w:numId="15">
+    <w:abstractNumId w:val="11"/>
   </w:num>
-  <w:num w:numId="13">
-    <w:abstractNumId w:val="7"/>
+  <w:num w:numId="16">
+    <w:abstractNumId w:val="3"/>
   </w:num>
 </w:numbering>
 </file>
@@ -20506,6 +22200,7 @@
   <w:style w:type="character" w:default="1" w:styleId="Fontepargpadro">
     <w:name w:val="Default Paragraph Font"/>
     <w:uiPriority w:val="1"/>
+    <w:semiHidden/>
     <w:unhideWhenUsed/>
   </w:style>
   <w:style w:type="table" w:default="1" w:styleId="Tabelanormal">
@@ -20910,7 +22605,7 @@
 </file>
 
 <file path=customXml/itemProps1.xml><?xml version="1.0" encoding="utf-8"?>
-<ds:datastoreItem xmlns:ds="http://schemas.openxmlformats.org/officeDocument/2006/customXml" ds:itemID="{2B437E4C-0508-4602-A86F-4A262A539409}">
+<ds:datastoreItem xmlns:ds="http://schemas.openxmlformats.org/officeDocument/2006/customXml" ds:itemID="{331FEC4D-868F-4AA4-B0C3-E4DD7A69D22D}">
   <ds:schemaRefs>
     <ds:schemaRef ds:uri="http://schemas.openxmlformats.org/officeDocument/2006/bibliography"/>
   </ds:schemaRefs>

</xml_diff>

<commit_message>
atulização da aula dia 06/10/2026
</commit_message>
<xml_diff>
--- a/apostila/Projeto Space For Men.docx
+++ b/apostila/Projeto Space For Men.docx
@@ -19935,6 +19935,9 @@
         </w:rPr>
       </w:pPr>
       <w:r>
+        <w:rPr>
+          <w:noProof/>
+        </w:rPr>
         <w:drawing>
           <wp:anchor distT="0" distB="0" distL="114300" distR="114300" simplePos="0" relativeHeight="251836416" behindDoc="1" locked="0" layoutInCell="1" allowOverlap="1" wp14:anchorId="6FB23FB0">
             <wp:simplePos x="0" y="0"/>
@@ -20064,6 +20067,9 @@
         </w:tabs>
       </w:pPr>
       <w:r>
+        <w:rPr>
+          <w:noProof/>
+        </w:rPr>
         <w:drawing>
           <wp:anchor distT="0" distB="0" distL="114300" distR="114300" simplePos="0" relativeHeight="251837440" behindDoc="1" locked="0" layoutInCell="1" allowOverlap="1" wp14:anchorId="0A5EC00B">
             <wp:simplePos x="0" y="0"/>
@@ -20328,6 +20334,9 @@
         </w:tabs>
       </w:pPr>
       <w:r>
+        <w:rPr>
+          <w:noProof/>
+        </w:rPr>
         <w:lastRenderedPageBreak/>
         <w:drawing>
           <wp:anchor distT="0" distB="0" distL="114300" distR="114300" simplePos="0" relativeHeight="251839488" behindDoc="1" locked="0" layoutInCell="1" allowOverlap="1" wp14:anchorId="3B122CDA">
@@ -20388,6 +20397,9 @@
         </w:drawing>
       </w:r>
       <w:r>
+        <w:rPr>
+          <w:noProof/>
+        </w:rPr>
         <w:drawing>
           <wp:anchor distT="0" distB="0" distL="114300" distR="114300" simplePos="0" relativeHeight="251838464" behindDoc="1" locked="0" layoutInCell="1" allowOverlap="1" wp14:anchorId="1C9F26B4">
             <wp:simplePos x="0" y="0"/>
@@ -20477,6 +20489,9 @@
         </w:rPr>
       </w:pPr>
       <w:r>
+        <w:rPr>
+          <w:noProof/>
+        </w:rPr>
         <w:drawing>
           <wp:anchor distT="0" distB="0" distL="114300" distR="114300" simplePos="0" relativeHeight="251840512" behindDoc="1" locked="0" layoutInCell="1" allowOverlap="1" wp14:anchorId="083C737B">
             <wp:simplePos x="0" y="0"/>
@@ -20570,6 +20585,9 @@
         </w:tabs>
       </w:pPr>
       <w:r>
+        <w:rPr>
+          <w:noProof/>
+        </w:rPr>
         <w:drawing>
           <wp:anchor distT="0" distB="0" distL="114300" distR="114300" simplePos="0" relativeHeight="251841536" behindDoc="1" locked="0" layoutInCell="1" allowOverlap="1" wp14:anchorId="7CA97115">
             <wp:simplePos x="0" y="0"/>
@@ -20727,6 +20745,9 @@
         </w:tabs>
       </w:pPr>
       <w:r>
+        <w:rPr>
+          <w:noProof/>
+        </w:rPr>
         <w:drawing>
           <wp:anchor distT="0" distB="0" distL="114300" distR="114300" simplePos="0" relativeHeight="251842560" behindDoc="1" locked="0" layoutInCell="1" allowOverlap="1" wp14:anchorId="42BBC2DB">
             <wp:simplePos x="0" y="0"/>
@@ -20831,11 +20852,1008 @@
       <w:r>
         <w:t xml:space="preserve"> cria uma transição visual entre esses diferentes fundos.</w:t>
       </w:r>
+    </w:p>
+    <w:p>
+      <w:pPr>
+        <w:tabs>
+          <w:tab w:val="left" w:pos="4839"/>
+        </w:tabs>
+      </w:pPr>
+    </w:p>
+    <w:p>
+      <w:pPr>
+        <w:tabs>
+          <w:tab w:val="left" w:pos="4839"/>
+        </w:tabs>
+      </w:pPr>
+    </w:p>
+    <w:p>
+      <w:pPr>
+        <w:tabs>
+          <w:tab w:val="left" w:pos="4839"/>
+        </w:tabs>
+      </w:pPr>
+    </w:p>
+    <w:p>
+      <w:pPr>
+        <w:tabs>
+          <w:tab w:val="left" w:pos="4839"/>
+        </w:tabs>
+      </w:pPr>
+      <w:r>
+        <w:lastRenderedPageBreak/>
+        <w:t>116- Testamos o degrade de diversos tipos, com mais de 3cores usando:</w:t>
+      </w:r>
+    </w:p>
+    <w:p>
+      <w:pPr>
+        <w:pStyle w:val="PargrafodaLista"/>
+        <w:numPr>
+          <w:ilvl w:val="0"/>
+          <w:numId w:val="17"/>
+        </w:numPr>
+        <w:tabs>
+          <w:tab w:val="left" w:pos="4839"/>
+        </w:tabs>
+        <w:rPr>
+          <w:b/>
+        </w:rPr>
+      </w:pPr>
+      <w:proofErr w:type="spellStart"/>
+      <w:r>
+        <w:t>Background:</w:t>
+      </w:r>
+      <w:r>
+        <w:rPr>
+          <w:b/>
+        </w:rPr>
+        <w:t>linear-</w:t>
+      </w:r>
+      <w:proofErr w:type="gramStart"/>
+      <w:r>
+        <w:rPr>
+          <w:b/>
+        </w:rPr>
+        <w:t>grandient</w:t>
+      </w:r>
+      <w:proofErr w:type="spellEnd"/>
+      <w:r>
+        <w:rPr>
+          <w:b/>
+        </w:rPr>
+        <w:t>(</w:t>
+      </w:r>
+      <w:proofErr w:type="gramEnd"/>
+      <w:r>
+        <w:rPr>
+          <w:b/>
+        </w:rPr>
+        <w:t xml:space="preserve">Orange, </w:t>
+      </w:r>
+      <w:proofErr w:type="spellStart"/>
+      <w:r>
+        <w:rPr>
+          <w:b/>
+        </w:rPr>
+        <w:t>blue,red,black</w:t>
+      </w:r>
+      <w:proofErr w:type="spellEnd"/>
+      <w:r>
+        <w:rPr>
+          <w:b/>
+        </w:rPr>
+        <w:t>).</w:t>
+      </w:r>
+    </w:p>
+    <w:p>
+      <w:pPr>
+        <w:pStyle w:val="PargrafodaLista"/>
+        <w:numPr>
+          <w:ilvl w:val="0"/>
+          <w:numId w:val="17"/>
+        </w:numPr>
+        <w:tabs>
+          <w:tab w:val="left" w:pos="4839"/>
+        </w:tabs>
+      </w:pPr>
+      <w:r>
+        <w:t>Colocamos e graus (</w:t>
+      </w:r>
+      <w:r>
+        <w:rPr>
+          <w:b/>
+        </w:rPr>
+        <w:t xml:space="preserve">45deg, </w:t>
+      </w:r>
+      <w:proofErr w:type="spellStart"/>
+      <w:proofErr w:type="gramStart"/>
+      <w:r>
+        <w:rPr>
+          <w:b/>
+        </w:rPr>
+        <w:t>Orange,blue</w:t>
+      </w:r>
+      <w:proofErr w:type="spellEnd"/>
+      <w:proofErr w:type="gramEnd"/>
+      <w:r>
+        <w:rPr>
+          <w:b/>
+        </w:rPr>
+        <w:t xml:space="preserve">, </w:t>
+      </w:r>
+      <w:proofErr w:type="spellStart"/>
+      <w:r>
+        <w:rPr>
+          <w:b/>
+        </w:rPr>
+        <w:t>black</w:t>
+      </w:r>
+      <w:proofErr w:type="spellEnd"/>
+      <w:r>
+        <w:rPr>
+          <w:b/>
+        </w:rPr>
+        <w:t xml:space="preserve"> </w:t>
+      </w:r>
+      <w:r>
+        <w:rPr>
+          <w:b/>
+        </w:rPr>
+        <w:t>.</w:t>
+      </w:r>
+    </w:p>
+    <w:p>
+      <w:pPr>
+        <w:pStyle w:val="PargrafodaLista"/>
+        <w:numPr>
+          <w:ilvl w:val="0"/>
+          <w:numId w:val="17"/>
+        </w:numPr>
+        <w:tabs>
+          <w:tab w:val="left" w:pos="4839"/>
+        </w:tabs>
+      </w:pPr>
+      <w:r>
+        <w:t xml:space="preserve">Utilizamos porcentagem para cada cor exemplo </w:t>
+      </w:r>
+      <w:r>
+        <w:rPr>
+          <w:b/>
+        </w:rPr>
+        <w:t xml:space="preserve">(Orange 50%, blue, </w:t>
+      </w:r>
+      <w:proofErr w:type="spellStart"/>
+      <w:r>
+        <w:rPr>
+          <w:b/>
+        </w:rPr>
+        <w:t>red</w:t>
+      </w:r>
+      <w:proofErr w:type="spellEnd"/>
+      <w:r>
+        <w:rPr>
+          <w:b/>
+        </w:rPr>
+        <w:t xml:space="preserve">, </w:t>
+      </w:r>
+      <w:proofErr w:type="spellStart"/>
+      <w:r>
+        <w:rPr>
+          <w:b/>
+        </w:rPr>
+        <w:t>black</w:t>
+      </w:r>
+      <w:proofErr w:type="spellEnd"/>
+      <w:r>
+        <w:rPr>
+          <w:b/>
+        </w:rPr>
+        <w:t>.</w:t>
+      </w:r>
+      <w:r>
+        <w:t xml:space="preserve"> </w:t>
+      </w:r>
+    </w:p>
+    <w:p>
+      <w:pPr>
+        <w:pStyle w:val="PargrafodaLista"/>
+        <w:numPr>
+          <w:ilvl w:val="0"/>
+          <w:numId w:val="17"/>
+        </w:numPr>
+        <w:tabs>
+          <w:tab w:val="left" w:pos="4839"/>
+        </w:tabs>
+        <w:rPr>
+          <w:b/>
+        </w:rPr>
+      </w:pPr>
+      <w:r>
+        <w:t>E também podemos utilizar o degrade em círculos</w:t>
+      </w:r>
+      <w:r>
+        <w:rPr>
+          <w:b/>
+        </w:rPr>
+        <w:t>: Background: radial-</w:t>
+      </w:r>
+      <w:proofErr w:type="spellStart"/>
+      <w:proofErr w:type="gramStart"/>
+      <w:r>
+        <w:rPr>
+          <w:b/>
+        </w:rPr>
+        <w:t>gradient</w:t>
+      </w:r>
+      <w:proofErr w:type="spellEnd"/>
+      <w:r>
+        <w:rPr>
+          <w:b/>
+        </w:rPr>
+        <w:t xml:space="preserve">( </w:t>
+      </w:r>
+      <w:proofErr w:type="spellStart"/>
+      <w:r>
+        <w:rPr>
+          <w:b/>
+        </w:rPr>
+        <w:t>Orange</w:t>
+      </w:r>
+      <w:proofErr w:type="gramEnd"/>
+      <w:r>
+        <w:rPr>
+          <w:b/>
+        </w:rPr>
+        <w:t>,blue,black</w:t>
+      </w:r>
+      <w:proofErr w:type="spellEnd"/>
+      <w:r>
+        <w:rPr>
+          <w:b/>
+        </w:rPr>
+        <w:t>)</w:t>
+      </w:r>
+      <w:r>
+        <w:rPr>
+          <w:b/>
+        </w:rPr>
+        <w:t>.</w:t>
+      </w:r>
+    </w:p>
+    <w:p>
+      <w:pPr>
+        <w:tabs>
+          <w:tab w:val="left" w:pos="4839"/>
+        </w:tabs>
+        <w:rPr>
+          <w:b/>
+        </w:rPr>
+      </w:pPr>
+    </w:p>
+    <w:p>
+      <w:pPr>
+        <w:tabs>
+          <w:tab w:val="left" w:pos="4839"/>
+        </w:tabs>
+        <w:rPr>
+          <w:b/>
+        </w:rPr>
+      </w:pPr>
+      <w:r>
+        <w:rPr>
+          <w:b/>
+        </w:rPr>
+        <w:t>117- Opacidade e S</w:t>
+      </w:r>
+      <w:r>
+        <w:rPr>
+          <w:b/>
+        </w:rPr>
+        <w:t>o</w:t>
+      </w:r>
+      <w:r>
+        <w:rPr>
+          <w:b/>
+        </w:rPr>
+        <w:t>mbra</w:t>
+      </w:r>
+    </w:p>
+    <w:p>
+      <w:pPr>
+        <w:tabs>
+          <w:tab w:val="left" w:pos="4839"/>
+        </w:tabs>
+        <w:rPr>
+          <w:b/>
+        </w:rPr>
+      </w:pPr>
+      <w:r>
+        <w:rPr>
+          <w:b/>
+        </w:rPr>
+        <w:t>O que é opacidade?</w:t>
+      </w:r>
+    </w:p>
+    <w:p>
+      <w:pPr>
+        <w:tabs>
+          <w:tab w:val="left" w:pos="4839"/>
+        </w:tabs>
+        <w:rPr>
+          <w:b/>
+        </w:rPr>
+      </w:pPr>
+      <w:r>
+        <w:rPr>
+          <w:b/>
+        </w:rPr>
+        <w:t>E uma camada a mais que coloca em cima do elemento.</w:t>
+      </w:r>
+    </w:p>
+    <w:p>
+      <w:pPr>
+        <w:tabs>
+          <w:tab w:val="left" w:pos="4839"/>
+        </w:tabs>
+        <w:rPr>
+          <w:b/>
+        </w:rPr>
+      </w:pPr>
+      <w:r>
+        <w:rPr>
+          <w:b/>
+        </w:rPr>
+        <w:t>Essa camada ajuda a luz a passar ou não como por exemplo um tipo de insulfilme de um carro que ao se aplicada ajuda a luz do lado de fora a não passa completamente.</w:t>
+      </w:r>
+    </w:p>
+    <w:p>
+      <w:pPr>
+        <w:tabs>
+          <w:tab w:val="left" w:pos="4839"/>
+        </w:tabs>
+        <w:rPr>
+          <w:b/>
+        </w:rPr>
+      </w:pPr>
+      <w:r>
+        <w:rPr>
+          <w:b/>
+        </w:rPr>
+        <w:t xml:space="preserve">Na </w:t>
+      </w:r>
+      <w:proofErr w:type="spellStart"/>
+      <w:r>
+        <w:rPr>
+          <w:b/>
+        </w:rPr>
+        <w:t>class</w:t>
+      </w:r>
+      <w:proofErr w:type="spellEnd"/>
+      <w:r>
+        <w:rPr>
+          <w:b/>
+        </w:rPr>
+        <w:t xml:space="preserve"> </w:t>
+      </w:r>
+      <w:proofErr w:type="spellStart"/>
+      <w:r>
+        <w:rPr>
+          <w:b/>
+        </w:rPr>
+        <w:t>imagembeneficios</w:t>
+      </w:r>
+      <w:proofErr w:type="spellEnd"/>
+      <w:r>
+        <w:rPr>
+          <w:b/>
+        </w:rPr>
+        <w:t xml:space="preserve"> colocamos opacity:1</w:t>
+      </w:r>
+    </w:p>
+    <w:p>
+      <w:pPr>
+        <w:tabs>
+          <w:tab w:val="left" w:pos="4839"/>
+        </w:tabs>
+        <w:rPr>
+          <w:b/>
+        </w:rPr>
+      </w:pPr>
+      <w:proofErr w:type="spellStart"/>
+      <w:r>
+        <w:rPr>
+          <w:b/>
+        </w:rPr>
+        <w:t>Obs</w:t>
+      </w:r>
+      <w:proofErr w:type="spellEnd"/>
+      <w:r>
+        <w:rPr>
+          <w:b/>
+        </w:rPr>
+        <w:t xml:space="preserve">: </w:t>
+      </w:r>
+      <w:proofErr w:type="spellStart"/>
+      <w:r>
+        <w:rPr>
+          <w:b/>
+        </w:rPr>
+        <w:t>opacity</w:t>
+      </w:r>
+      <w:proofErr w:type="spellEnd"/>
+      <w:r>
+        <w:rPr>
+          <w:b/>
+        </w:rPr>
+        <w:t xml:space="preserve"> vai de 1 a 0 </w:t>
+      </w:r>
+    </w:p>
+    <w:p>
+      <w:pPr>
+        <w:tabs>
+          <w:tab w:val="left" w:pos="4839"/>
+        </w:tabs>
+        <w:rPr>
+          <w:b/>
+        </w:rPr>
+      </w:pPr>
+      <w:r>
+        <w:rPr>
+          <w:b/>
+        </w:rPr>
+        <w:t>0-Exibe nada</w:t>
+      </w:r>
+    </w:p>
+    <w:p>
+      <w:pPr>
+        <w:tabs>
+          <w:tab w:val="left" w:pos="4839"/>
+        </w:tabs>
+        <w:rPr>
+          <w:b/>
+        </w:rPr>
+      </w:pPr>
+      <w:r>
+        <w:rPr>
+          <w:b/>
+        </w:rPr>
+        <w:t>1-Exibe o elemento inteiro</w:t>
+      </w:r>
+    </w:p>
+    <w:p>
+      <w:pPr>
+        <w:tabs>
+          <w:tab w:val="left" w:pos="4839"/>
+        </w:tabs>
+        <w:rPr>
+          <w:b/>
+        </w:rPr>
+      </w:pPr>
+      <w:r>
+        <w:rPr>
+          <w:b/>
+        </w:rPr>
+        <w:t xml:space="preserve">Então colocamos de 0.3 que exibe 30% ou </w:t>
+      </w:r>
+      <w:r>
+        <w:rPr>
+          <w:b/>
+        </w:rPr>
+        <w:t>0.7 exibe 70%</w:t>
+      </w:r>
+      <w:r>
+        <w:rPr>
+          <w:b/>
+        </w:rPr>
+        <w:t>.</w:t>
+      </w:r>
+    </w:p>
+    <w:p>
+      <w:pPr>
+        <w:tabs>
+          <w:tab w:val="left" w:pos="4839"/>
+        </w:tabs>
+        <w:rPr>
+          <w:b/>
+        </w:rPr>
+      </w:pPr>
+    </w:p>
+    <w:p>
+      <w:pPr>
+        <w:tabs>
+          <w:tab w:val="left" w:pos="4839"/>
+        </w:tabs>
+        <w:rPr>
+          <w:b/>
+        </w:rPr>
+      </w:pPr>
+      <w:r>
+        <w:rPr>
+          <w:b/>
+        </w:rPr>
+        <w:t xml:space="preserve">118- Aplicamos </w:t>
+      </w:r>
+      <w:r>
+        <w:rPr>
+          <w:b/>
+        </w:rPr>
+        <w:t xml:space="preserve">opacidade no nosso site utilizando o </w:t>
+      </w:r>
+      <w:proofErr w:type="spellStart"/>
+      <w:r>
+        <w:rPr>
+          <w:b/>
+        </w:rPr>
+        <w:t>eveito</w:t>
+      </w:r>
+      <w:proofErr w:type="spellEnd"/>
+      <w:r>
+        <w:rPr>
+          <w:b/>
+        </w:rPr>
+        <w:t xml:space="preserve"> do </w:t>
+      </w:r>
+      <w:proofErr w:type="spellStart"/>
+      <w:r>
+        <w:rPr>
+          <w:b/>
+        </w:rPr>
+        <w:t>hover</w:t>
+      </w:r>
+      <w:proofErr w:type="spellEnd"/>
+      <w:r>
+        <w:rPr>
+          <w:b/>
+        </w:rPr>
+        <w:t xml:space="preserve"> que ao passar o mouse na imagem benefícios ele fica com apenas 30% de visibilidade e também adicionamos um </w:t>
+      </w:r>
+      <w:proofErr w:type="spellStart"/>
+      <w:r>
+        <w:rPr>
+          <w:b/>
+        </w:rPr>
+        <w:t>trasition</w:t>
+      </w:r>
+      <w:proofErr w:type="spellEnd"/>
+      <w:r>
+        <w:rPr>
+          <w:b/>
+        </w:rPr>
+        <w:t xml:space="preserve"> para que ocorra um tempo para essa passagem ao utilizar o </w:t>
+      </w:r>
+      <w:proofErr w:type="spellStart"/>
+      <w:r>
+        <w:rPr>
+          <w:b/>
+        </w:rPr>
+        <w:t>hover</w:t>
+      </w:r>
+      <w:proofErr w:type="spellEnd"/>
+      <w:r>
+        <w:rPr>
+          <w:b/>
+        </w:rPr>
+        <w:t xml:space="preserve">. </w:t>
+      </w:r>
+    </w:p>
+    <w:p>
+      <w:pPr>
+        <w:pStyle w:val="PargrafodaLista"/>
+        <w:tabs>
+          <w:tab w:val="left" w:pos="4839"/>
+        </w:tabs>
+        <w:jc w:val="both"/>
+        <w:rPr>
+          <w:b/>
+        </w:rPr>
+      </w:pPr>
+      <w:r>
+        <w:rPr>
+          <w:b/>
+        </w:rPr>
+        <w:drawing>
+          <wp:anchor distT="0" distB="0" distL="114300" distR="114300" simplePos="0" relativeHeight="251843584" behindDoc="1" locked="0" layoutInCell="1" allowOverlap="1" wp14:anchorId="4AF0FC48">
+            <wp:simplePos x="0" y="0"/>
+            <wp:positionH relativeFrom="column">
+              <wp:posOffset>-59099</wp:posOffset>
+            </wp:positionH>
+            <wp:positionV relativeFrom="paragraph">
+              <wp:posOffset>118022</wp:posOffset>
+            </wp:positionV>
+            <wp:extent cx="2933700" cy="1762125"/>
+            <wp:effectExtent l="0" t="0" r="0" b="9525"/>
+            <wp:wrapTight wrapText="bothSides">
+              <wp:wrapPolygon edited="0">
+                <wp:start x="0" y="0"/>
+                <wp:lineTo x="0" y="21483"/>
+                <wp:lineTo x="21460" y="21483"/>
+                <wp:lineTo x="21460" y="0"/>
+                <wp:lineTo x="0" y="0"/>
+              </wp:wrapPolygon>
+            </wp:wrapTight>
+            <wp:docPr id="175" name="Imagem 175"/>
+            <wp:cNvGraphicFramePr>
+              <a:graphicFrameLocks xmlns:a="http://schemas.openxmlformats.org/drawingml/2006/main" noChangeAspect="1"/>
+            </wp:cNvGraphicFramePr>
+            <a:graphic xmlns:a="http://schemas.openxmlformats.org/drawingml/2006/main">
+              <a:graphicData uri="http://schemas.openxmlformats.org/drawingml/2006/picture">
+                <pic:pic xmlns:pic="http://schemas.openxmlformats.org/drawingml/2006/picture">
+                  <pic:nvPicPr>
+                    <pic:cNvPr id="1" name=""/>
+                    <pic:cNvPicPr/>
+                  </pic:nvPicPr>
+                  <pic:blipFill>
+                    <a:blip r:embed="rId193">
+                      <a:extLst>
+                        <a:ext uri="{28A0092B-C50C-407E-A947-70E740481C1C}">
+                          <a14:useLocalDpi xmlns:a14="http://schemas.microsoft.com/office/drawing/2010/main" val="0"/>
+                        </a:ext>
+                      </a:extLst>
+                    </a:blip>
+                    <a:stretch>
+                      <a:fillRect/>
+                    </a:stretch>
+                  </pic:blipFill>
+                  <pic:spPr>
+                    <a:xfrm>
+                      <a:off x="0" y="0"/>
+                      <a:ext cx="2933700" cy="1762125"/>
+                    </a:xfrm>
+                    <a:prstGeom prst="rect">
+                      <a:avLst/>
+                    </a:prstGeom>
+                  </pic:spPr>
+                </pic:pic>
+              </a:graphicData>
+            </a:graphic>
+          </wp:anchor>
+        </w:drawing>
+      </w:r>
+    </w:p>
+    <w:p>
+      <w:pPr>
+        <w:tabs>
+          <w:tab w:val="left" w:pos="4839"/>
+        </w:tabs>
+      </w:pPr>
+    </w:p>
+    <w:p>
+      <w:pPr>
+        <w:tabs>
+          <w:tab w:val="left" w:pos="4839"/>
+        </w:tabs>
+      </w:pPr>
+    </w:p>
+    <w:p>
+      <w:pPr>
+        <w:tabs>
+          <w:tab w:val="left" w:pos="4839"/>
+        </w:tabs>
+      </w:pPr>
+    </w:p>
+    <w:p>
+      <w:pPr>
+        <w:tabs>
+          <w:tab w:val="left" w:pos="4839"/>
+        </w:tabs>
+      </w:pPr>
+    </w:p>
+    <w:p>
+      <w:pPr>
+        <w:tabs>
+          <w:tab w:val="left" w:pos="4839"/>
+        </w:tabs>
+      </w:pPr>
+    </w:p>
+    <w:p>
+      <w:pPr>
+        <w:tabs>
+          <w:tab w:val="left" w:pos="4839"/>
+        </w:tabs>
+      </w:pPr>
+    </w:p>
+    <w:p>
+      <w:pPr>
+        <w:tabs>
+          <w:tab w:val="left" w:pos="4839"/>
+        </w:tabs>
+      </w:pPr>
+      <w:r>
+        <w:t>119- Sombra nos elementos.</w:t>
+      </w:r>
+    </w:p>
+    <w:p>
+      <w:pPr>
+        <w:tabs>
+          <w:tab w:val="left" w:pos="4839"/>
+        </w:tabs>
+      </w:pPr>
+      <w:r>
+        <w:t>Como funciona a sombra? E como se coloca uma luz em cima do elemento que vai refletir a sombra em baixo.</w:t>
+      </w:r>
+    </w:p>
+    <w:p>
+      <w:pPr>
+        <w:tabs>
+          <w:tab w:val="left" w:pos="4839"/>
+        </w:tabs>
+      </w:pPr>
+      <w:r>
+        <w:t xml:space="preserve">Na </w:t>
+      </w:r>
+      <w:proofErr w:type="spellStart"/>
+      <w:r>
+        <w:t>class</w:t>
+      </w:r>
+      <w:proofErr w:type="spellEnd"/>
+      <w:r>
+        <w:t xml:space="preserve"> </w:t>
+      </w:r>
+      <w:proofErr w:type="spellStart"/>
+      <w:r>
+        <w:t>imagembeneficios</w:t>
+      </w:r>
+      <w:proofErr w:type="spellEnd"/>
+      <w:r>
+        <w:t xml:space="preserve"> vamos colocar box-</w:t>
+      </w:r>
+      <w:proofErr w:type="spellStart"/>
+      <w:r>
+        <w:t>shadow</w:t>
+      </w:r>
+      <w:proofErr w:type="spellEnd"/>
+      <w:r>
+        <w:t xml:space="preserve"> que significa sombra em caixa que possui a propriedade do eixo x e y parecido com exemplo a baixo.</w:t>
+      </w:r>
+    </w:p>
+    <w:p>
+      <w:pPr>
+        <w:tabs>
+          <w:tab w:val="left" w:pos="4839"/>
+        </w:tabs>
+      </w:pPr>
+      <w:r>
+        <w:rPr>
+          <w:b/>
+        </w:rPr>
+        <w:lastRenderedPageBreak/>
+        <w:drawing>
+          <wp:anchor distT="0" distB="0" distL="114300" distR="114300" simplePos="0" relativeHeight="251844608" behindDoc="1" locked="0" layoutInCell="1" allowOverlap="1" wp14:anchorId="364478F3">
+            <wp:simplePos x="0" y="0"/>
+            <wp:positionH relativeFrom="margin">
+              <wp:posOffset>-180207</wp:posOffset>
+            </wp:positionH>
+            <wp:positionV relativeFrom="paragraph">
+              <wp:posOffset>74</wp:posOffset>
+            </wp:positionV>
+            <wp:extent cx="3057525" cy="1209675"/>
+            <wp:effectExtent l="0" t="0" r="9525" b="9525"/>
+            <wp:wrapTight wrapText="bothSides">
+              <wp:wrapPolygon edited="0">
+                <wp:start x="0" y="0"/>
+                <wp:lineTo x="0" y="21430"/>
+                <wp:lineTo x="21533" y="21430"/>
+                <wp:lineTo x="21533" y="0"/>
+                <wp:lineTo x="0" y="0"/>
+              </wp:wrapPolygon>
+            </wp:wrapTight>
+            <wp:docPr id="176" name="Imagem 176"/>
+            <wp:cNvGraphicFramePr>
+              <a:graphicFrameLocks xmlns:a="http://schemas.openxmlformats.org/drawingml/2006/main" noChangeAspect="1"/>
+            </wp:cNvGraphicFramePr>
+            <a:graphic xmlns:a="http://schemas.openxmlformats.org/drawingml/2006/main">
+              <a:graphicData uri="http://schemas.openxmlformats.org/drawingml/2006/picture">
+                <pic:pic xmlns:pic="http://schemas.openxmlformats.org/drawingml/2006/picture">
+                  <pic:nvPicPr>
+                    <pic:cNvPr id="1" name=""/>
+                    <pic:cNvPicPr/>
+                  </pic:nvPicPr>
+                  <pic:blipFill>
+                    <a:blip r:embed="rId194">
+                      <a:extLst>
+                        <a:ext uri="{28A0092B-C50C-407E-A947-70E740481C1C}">
+                          <a14:useLocalDpi xmlns:a14="http://schemas.microsoft.com/office/drawing/2010/main" val="0"/>
+                        </a:ext>
+                      </a:extLst>
+                    </a:blip>
+                    <a:stretch>
+                      <a:fillRect/>
+                    </a:stretch>
+                  </pic:blipFill>
+                  <pic:spPr>
+                    <a:xfrm>
+                      <a:off x="0" y="0"/>
+                      <a:ext cx="3057525" cy="1209675"/>
+                    </a:xfrm>
+                    <a:prstGeom prst="rect">
+                      <a:avLst/>
+                    </a:prstGeom>
+                  </pic:spPr>
+                </pic:pic>
+              </a:graphicData>
+            </a:graphic>
+          </wp:anchor>
+        </w:drawing>
+      </w:r>
+    </w:p>
+    <w:p/>
+    <w:p/>
+    <w:p/>
+    <w:p/>
+    <w:p>
+      <w:r>
+        <w:t>120- Para</w:t>
+      </w:r>
+      <w:r>
+        <w:t xml:space="preserve"> espalhar a sombra utilizamos mais um valor chamado </w:t>
+      </w:r>
+      <w:proofErr w:type="spellStart"/>
+      <w:r>
+        <w:t>bluer</w:t>
+      </w:r>
+      <w:proofErr w:type="spellEnd"/>
+    </w:p>
+    <w:p>
+      <w:r>
+        <w:drawing>
+          <wp:anchor distT="0" distB="0" distL="114300" distR="114300" simplePos="0" relativeHeight="251846656" behindDoc="1" locked="0" layoutInCell="1" allowOverlap="1" wp14:anchorId="229C49B5">
+            <wp:simplePos x="0" y="0"/>
+            <wp:positionH relativeFrom="page">
+              <wp:align>left</wp:align>
+            </wp:positionH>
+            <wp:positionV relativeFrom="paragraph">
+              <wp:posOffset>1275907</wp:posOffset>
+            </wp:positionV>
+            <wp:extent cx="5400040" cy="2614295"/>
+            <wp:effectExtent l="0" t="0" r="0" b="0"/>
+            <wp:wrapTight wrapText="bothSides">
+              <wp:wrapPolygon edited="0">
+                <wp:start x="0" y="0"/>
+                <wp:lineTo x="0" y="21406"/>
+                <wp:lineTo x="21488" y="21406"/>
+                <wp:lineTo x="21488" y="0"/>
+                <wp:lineTo x="0" y="0"/>
+              </wp:wrapPolygon>
+            </wp:wrapTight>
+            <wp:docPr id="178" name="Imagem 178"/>
+            <wp:cNvGraphicFramePr>
+              <a:graphicFrameLocks xmlns:a="http://schemas.openxmlformats.org/drawingml/2006/main" noChangeAspect="1"/>
+            </wp:cNvGraphicFramePr>
+            <a:graphic xmlns:a="http://schemas.openxmlformats.org/drawingml/2006/main">
+              <a:graphicData uri="http://schemas.openxmlformats.org/drawingml/2006/picture">
+                <pic:pic xmlns:pic="http://schemas.openxmlformats.org/drawingml/2006/picture">
+                  <pic:nvPicPr>
+                    <pic:cNvPr id="1" name=""/>
+                    <pic:cNvPicPr/>
+                  </pic:nvPicPr>
+                  <pic:blipFill>
+                    <a:blip r:embed="rId195">
+                      <a:extLst>
+                        <a:ext uri="{28A0092B-C50C-407E-A947-70E740481C1C}">
+                          <a14:useLocalDpi xmlns:a14="http://schemas.microsoft.com/office/drawing/2010/main" val="0"/>
+                        </a:ext>
+                      </a:extLst>
+                    </a:blip>
+                    <a:stretch>
+                      <a:fillRect/>
+                    </a:stretch>
+                  </pic:blipFill>
+                  <pic:spPr>
+                    <a:xfrm>
+                      <a:off x="0" y="0"/>
+                      <a:ext cx="5400040" cy="2614295"/>
+                    </a:xfrm>
+                    <a:prstGeom prst="rect">
+                      <a:avLst/>
+                    </a:prstGeom>
+                  </pic:spPr>
+                </pic:pic>
+              </a:graphicData>
+            </a:graphic>
+          </wp:anchor>
+        </w:drawing>
+      </w:r>
+      <w:r>
+        <w:drawing>
+          <wp:anchor distT="0" distB="0" distL="114300" distR="114300" simplePos="0" relativeHeight="251845632" behindDoc="1" locked="0" layoutInCell="1" allowOverlap="1" wp14:anchorId="1E2E6E7C">
+            <wp:simplePos x="0" y="0"/>
+            <wp:positionH relativeFrom="page">
+              <wp:align>left</wp:align>
+            </wp:positionH>
+            <wp:positionV relativeFrom="paragraph">
+              <wp:posOffset>11430</wp:posOffset>
+            </wp:positionV>
+            <wp:extent cx="3362325" cy="1381125"/>
+            <wp:effectExtent l="0" t="0" r="9525" b="9525"/>
+            <wp:wrapTight wrapText="bothSides">
+              <wp:wrapPolygon edited="0">
+                <wp:start x="0" y="0"/>
+                <wp:lineTo x="0" y="21451"/>
+                <wp:lineTo x="21539" y="21451"/>
+                <wp:lineTo x="21539" y="0"/>
+                <wp:lineTo x="0" y="0"/>
+              </wp:wrapPolygon>
+            </wp:wrapTight>
+            <wp:docPr id="177" name="Imagem 177"/>
+            <wp:cNvGraphicFramePr>
+              <a:graphicFrameLocks xmlns:a="http://schemas.openxmlformats.org/drawingml/2006/main" noChangeAspect="1"/>
+            </wp:cNvGraphicFramePr>
+            <a:graphic xmlns:a="http://schemas.openxmlformats.org/drawingml/2006/main">
+              <a:graphicData uri="http://schemas.openxmlformats.org/drawingml/2006/picture">
+                <pic:pic xmlns:pic="http://schemas.openxmlformats.org/drawingml/2006/picture">
+                  <pic:nvPicPr>
+                    <pic:cNvPr id="1" name=""/>
+                    <pic:cNvPicPr/>
+                  </pic:nvPicPr>
+                  <pic:blipFill>
+                    <a:blip r:embed="rId196">
+                      <a:extLst>
+                        <a:ext uri="{28A0092B-C50C-407E-A947-70E740481C1C}">
+                          <a14:useLocalDpi xmlns:a14="http://schemas.microsoft.com/office/drawing/2010/main" val="0"/>
+                        </a:ext>
+                      </a:extLst>
+                    </a:blip>
+                    <a:stretch>
+                      <a:fillRect/>
+                    </a:stretch>
+                  </pic:blipFill>
+                  <pic:spPr>
+                    <a:xfrm>
+                      <a:off x="0" y="0"/>
+                      <a:ext cx="3362325" cy="1381125"/>
+                    </a:xfrm>
+                    <a:prstGeom prst="rect">
+                      <a:avLst/>
+                    </a:prstGeom>
+                  </pic:spPr>
+                </pic:pic>
+              </a:graphicData>
+            </a:graphic>
+          </wp:anchor>
+        </w:drawing>
+      </w:r>
+    </w:p>
+    <w:p/>
+    <w:p/>
+    <w:p/>
+    <w:p/>
+    <w:p>
+      <w:pPr>
+        <w:jc w:val="center"/>
+      </w:pPr>
+    </w:p>
+    <w:p/>
+    <w:p/>
+    <w:p/>
+    <w:p/>
+    <w:p/>
+    <w:p/>
+    <w:p/>
+    <w:p/>
+    <w:p/>
+    <w:p>
+      <w:r>
+        <w:t>121-</w:t>
+      </w:r>
+      <w:r>
+        <w:t xml:space="preserve"> No box-</w:t>
+      </w:r>
+      <w:proofErr w:type="spellStart"/>
+      <w:r>
+        <w:t>sh</w:t>
+      </w:r>
+      <w:r>
+        <w:t>adow</w:t>
+      </w:r>
+      <w:proofErr w:type="spellEnd"/>
+      <w:r>
+        <w:t xml:space="preserve"> existe o 4 valor que seria a propriedade que configura a intensidade da borda a partir do tamanho do elemento, isto é, o tamanho da sombra projetada nesta caso inserimos 20px.</w:t>
+      </w:r>
       <w:bookmarkStart w:id="0" w:name="_GoBack"/>
       <w:bookmarkEnd w:id="0"/>
     </w:p>
     <w:sectPr>
-      <w:footerReference w:type="default" r:id="rId193"/>
+      <w:footerReference w:type="default" r:id="rId197"/>
       <w:pgSz w:w="11906" w:h="16838"/>
       <w:pgMar w:top="1418" w:right="1701" w:bottom="1418" w:left="1701" w:header="709" w:footer="709" w:gutter="0"/>
       <w:cols w:space="708"/>
@@ -21139,6 +22157,95 @@
     </w:lvl>
   </w:abstractNum>
   <w:abstractNum w:abstractNumId="2" w15:restartNumberingAfterBreak="0">
+    <w:nsid w:val="17D27596"/>
+    <w:multiLevelType w:val="hybridMultilevel"/>
+    <w:tmpl w:val="F1201F1A"/>
+    <w:lvl w:ilvl="0" w:tplc="F86C0848">
+      <w:start w:val="1"/>
+      <w:numFmt w:val="decimal"/>
+      <w:lvlText w:val="%1-"/>
+      <w:lvlJc w:val="left"/>
+      <w:pPr>
+        <w:ind w:left="720" w:hanging="360"/>
+      </w:pPr>
+      <w:rPr>
+        <w:rFonts w:hint="default"/>
+      </w:rPr>
+    </w:lvl>
+    <w:lvl w:ilvl="1" w:tplc="04160019" w:tentative="1">
+      <w:start w:val="1"/>
+      <w:numFmt w:val="lowerLetter"/>
+      <w:lvlText w:val="%2."/>
+      <w:lvlJc w:val="left"/>
+      <w:pPr>
+        <w:ind w:left="1440" w:hanging="360"/>
+      </w:pPr>
+    </w:lvl>
+    <w:lvl w:ilvl="2" w:tplc="0416001B" w:tentative="1">
+      <w:start w:val="1"/>
+      <w:numFmt w:val="lowerRoman"/>
+      <w:lvlText w:val="%3."/>
+      <w:lvlJc w:val="right"/>
+      <w:pPr>
+        <w:ind w:left="2160" w:hanging="180"/>
+      </w:pPr>
+    </w:lvl>
+    <w:lvl w:ilvl="3" w:tplc="0416000F" w:tentative="1">
+      <w:start w:val="1"/>
+      <w:numFmt w:val="decimal"/>
+      <w:lvlText w:val="%4."/>
+      <w:lvlJc w:val="left"/>
+      <w:pPr>
+        <w:ind w:left="2880" w:hanging="360"/>
+      </w:pPr>
+    </w:lvl>
+    <w:lvl w:ilvl="4" w:tplc="04160019" w:tentative="1">
+      <w:start w:val="1"/>
+      <w:numFmt w:val="lowerLetter"/>
+      <w:lvlText w:val="%5."/>
+      <w:lvlJc w:val="left"/>
+      <w:pPr>
+        <w:ind w:left="3600" w:hanging="360"/>
+      </w:pPr>
+    </w:lvl>
+    <w:lvl w:ilvl="5" w:tplc="0416001B" w:tentative="1">
+      <w:start w:val="1"/>
+      <w:numFmt w:val="lowerRoman"/>
+      <w:lvlText w:val="%6."/>
+      <w:lvlJc w:val="right"/>
+      <w:pPr>
+        <w:ind w:left="4320" w:hanging="180"/>
+      </w:pPr>
+    </w:lvl>
+    <w:lvl w:ilvl="6" w:tplc="0416000F" w:tentative="1">
+      <w:start w:val="1"/>
+      <w:numFmt w:val="decimal"/>
+      <w:lvlText w:val="%7."/>
+      <w:lvlJc w:val="left"/>
+      <w:pPr>
+        <w:ind w:left="5040" w:hanging="360"/>
+      </w:pPr>
+    </w:lvl>
+    <w:lvl w:ilvl="7" w:tplc="04160019" w:tentative="1">
+      <w:start w:val="1"/>
+      <w:numFmt w:val="lowerLetter"/>
+      <w:lvlText w:val="%8."/>
+      <w:lvlJc w:val="left"/>
+      <w:pPr>
+        <w:ind w:left="5760" w:hanging="360"/>
+      </w:pPr>
+    </w:lvl>
+    <w:lvl w:ilvl="8" w:tplc="0416001B" w:tentative="1">
+      <w:start w:val="1"/>
+      <w:numFmt w:val="lowerRoman"/>
+      <w:lvlText w:val="%9."/>
+      <w:lvlJc w:val="right"/>
+      <w:pPr>
+        <w:ind w:left="6480" w:hanging="180"/>
+      </w:pPr>
+    </w:lvl>
+  </w:abstractNum>
+  <w:abstractNum w:abstractNumId="3" w15:restartNumberingAfterBreak="0">
     <w:nsid w:val="271B712E"/>
     <w:multiLevelType w:val="hybridMultilevel"/>
     <w:tmpl w:val="76A0506E"/>
@@ -21251,7 +22358,7 @@
       </w:rPr>
     </w:lvl>
   </w:abstractNum>
-  <w:abstractNum w:abstractNumId="3" w15:restartNumberingAfterBreak="0">
+  <w:abstractNum w:abstractNumId="4" w15:restartNumberingAfterBreak="0">
     <w:nsid w:val="2F7145AF"/>
     <w:multiLevelType w:val="hybridMultilevel"/>
     <w:tmpl w:val="119866EE"/>
@@ -21364,7 +22471,7 @@
       </w:rPr>
     </w:lvl>
   </w:abstractNum>
-  <w:abstractNum w:abstractNumId="4" w15:restartNumberingAfterBreak="0">
+  <w:abstractNum w:abstractNumId="5" w15:restartNumberingAfterBreak="0">
     <w:nsid w:val="31FB2E6C"/>
     <w:multiLevelType w:val="hybridMultilevel"/>
     <w:tmpl w:val="1D0E047C"/>
@@ -21477,7 +22584,7 @@
       </w:rPr>
     </w:lvl>
   </w:abstractNum>
-  <w:abstractNum w:abstractNumId="5" w15:restartNumberingAfterBreak="0">
+  <w:abstractNum w:abstractNumId="6" w15:restartNumberingAfterBreak="0">
     <w:nsid w:val="463821FD"/>
     <w:multiLevelType w:val="hybridMultilevel"/>
     <w:tmpl w:val="1D662410"/>
@@ -21590,7 +22697,7 @@
       </w:rPr>
     </w:lvl>
   </w:abstractNum>
-  <w:abstractNum w:abstractNumId="6" w15:restartNumberingAfterBreak="0">
+  <w:abstractNum w:abstractNumId="7" w15:restartNumberingAfterBreak="0">
     <w:nsid w:val="471817DB"/>
     <w:multiLevelType w:val="hybridMultilevel"/>
     <w:tmpl w:val="E0CCA988"/>
@@ -21703,7 +22810,7 @@
       </w:rPr>
     </w:lvl>
   </w:abstractNum>
-  <w:abstractNum w:abstractNumId="7" w15:restartNumberingAfterBreak="0">
+  <w:abstractNum w:abstractNumId="8" w15:restartNumberingAfterBreak="0">
     <w:nsid w:val="5B807CDB"/>
     <w:multiLevelType w:val="hybridMultilevel"/>
     <w:tmpl w:val="5BD0D580"/>
@@ -21816,10 +22923,99 @@
       </w:rPr>
     </w:lvl>
   </w:abstractNum>
-  <w:abstractNum w:abstractNumId="8" w15:restartNumberingAfterBreak="0">
-    <w:nsid w:val="61BC3A9D"/>
+  <w:abstractNum w:abstractNumId="9" w15:restartNumberingAfterBreak="0">
+    <w:nsid w:val="5CEE6337"/>
     <w:multiLevelType w:val="hybridMultilevel"/>
-    <w:tmpl w:val="C6E60B46"/>
+    <w:tmpl w:val="6FBC1190"/>
+    <w:lvl w:ilvl="0" w:tplc="00D2DBCA">
+      <w:start w:val="1"/>
+      <w:numFmt w:val="decimal"/>
+      <w:lvlText w:val="%1-"/>
+      <w:lvlJc w:val="left"/>
+      <w:pPr>
+        <w:ind w:left="720" w:hanging="360"/>
+      </w:pPr>
+      <w:rPr>
+        <w:rFonts w:hint="default"/>
+      </w:rPr>
+    </w:lvl>
+    <w:lvl w:ilvl="1" w:tplc="04160019" w:tentative="1">
+      <w:start w:val="1"/>
+      <w:numFmt w:val="lowerLetter"/>
+      <w:lvlText w:val="%2."/>
+      <w:lvlJc w:val="left"/>
+      <w:pPr>
+        <w:ind w:left="1440" w:hanging="360"/>
+      </w:pPr>
+    </w:lvl>
+    <w:lvl w:ilvl="2" w:tplc="0416001B" w:tentative="1">
+      <w:start w:val="1"/>
+      <w:numFmt w:val="lowerRoman"/>
+      <w:lvlText w:val="%3."/>
+      <w:lvlJc w:val="right"/>
+      <w:pPr>
+        <w:ind w:left="2160" w:hanging="180"/>
+      </w:pPr>
+    </w:lvl>
+    <w:lvl w:ilvl="3" w:tplc="0416000F" w:tentative="1">
+      <w:start w:val="1"/>
+      <w:numFmt w:val="decimal"/>
+      <w:lvlText w:val="%4."/>
+      <w:lvlJc w:val="left"/>
+      <w:pPr>
+        <w:ind w:left="2880" w:hanging="360"/>
+      </w:pPr>
+    </w:lvl>
+    <w:lvl w:ilvl="4" w:tplc="04160019" w:tentative="1">
+      <w:start w:val="1"/>
+      <w:numFmt w:val="lowerLetter"/>
+      <w:lvlText w:val="%5."/>
+      <w:lvlJc w:val="left"/>
+      <w:pPr>
+        <w:ind w:left="3600" w:hanging="360"/>
+      </w:pPr>
+    </w:lvl>
+    <w:lvl w:ilvl="5" w:tplc="0416001B" w:tentative="1">
+      <w:start w:val="1"/>
+      <w:numFmt w:val="lowerRoman"/>
+      <w:lvlText w:val="%6."/>
+      <w:lvlJc w:val="right"/>
+      <w:pPr>
+        <w:ind w:left="4320" w:hanging="180"/>
+      </w:pPr>
+    </w:lvl>
+    <w:lvl w:ilvl="6" w:tplc="0416000F" w:tentative="1">
+      <w:start w:val="1"/>
+      <w:numFmt w:val="decimal"/>
+      <w:lvlText w:val="%7."/>
+      <w:lvlJc w:val="left"/>
+      <w:pPr>
+        <w:ind w:left="5040" w:hanging="360"/>
+      </w:pPr>
+    </w:lvl>
+    <w:lvl w:ilvl="7" w:tplc="04160019" w:tentative="1">
+      <w:start w:val="1"/>
+      <w:numFmt w:val="lowerLetter"/>
+      <w:lvlText w:val="%8."/>
+      <w:lvlJc w:val="left"/>
+      <w:pPr>
+        <w:ind w:left="5760" w:hanging="360"/>
+      </w:pPr>
+    </w:lvl>
+    <w:lvl w:ilvl="8" w:tplc="0416001B" w:tentative="1">
+      <w:start w:val="1"/>
+      <w:numFmt w:val="lowerRoman"/>
+      <w:lvlText w:val="%9."/>
+      <w:lvlJc w:val="right"/>
+      <w:pPr>
+        <w:ind w:left="6480" w:hanging="180"/>
+      </w:pPr>
+    </w:lvl>
+  </w:abstractNum>
+  <w:abstractNum w:abstractNumId="10" w15:restartNumberingAfterBreak="0">
+    <w:nsid w:val="61246D7D"/>
+    <w:multiLevelType w:val="hybridMultilevel"/>
+    <w:tmpl w:val="6A780C0A"/>
     <w:lvl w:ilvl="0" w:tplc="04160001">
       <w:start w:val="1"/>
       <w:numFmt w:val="bullet"/>
@@ -21929,10 +23125,10 @@
       </w:rPr>
     </w:lvl>
   </w:abstractNum>
-  <w:abstractNum w:abstractNumId="9" w15:restartNumberingAfterBreak="0">
-    <w:nsid w:val="65B64E8C"/>
+  <w:abstractNum w:abstractNumId="11" w15:restartNumberingAfterBreak="0">
+    <w:nsid w:val="61BC3A9D"/>
     <w:multiLevelType w:val="hybridMultilevel"/>
-    <w:tmpl w:val="3CE0BA36"/>
+    <w:tmpl w:val="C6E60B46"/>
     <w:lvl w:ilvl="0" w:tplc="04160001">
       <w:start w:val="1"/>
       <w:numFmt w:val="bullet"/>
@@ -22042,10 +23238,10 @@
       </w:rPr>
     </w:lvl>
   </w:abstractNum>
-  <w:abstractNum w:abstractNumId="10" w15:restartNumberingAfterBreak="0">
-    <w:nsid w:val="6B0F7CA7"/>
+  <w:abstractNum w:abstractNumId="12" w15:restartNumberingAfterBreak="0">
+    <w:nsid w:val="65B64E8C"/>
     <w:multiLevelType w:val="hybridMultilevel"/>
-    <w:tmpl w:val="3FF40976"/>
+    <w:tmpl w:val="3CE0BA36"/>
     <w:lvl w:ilvl="0" w:tplc="04160001">
       <w:start w:val="1"/>
       <w:numFmt w:val="bullet"/>
@@ -22155,10 +23351,10 @@
       </w:rPr>
     </w:lvl>
   </w:abstractNum>
-  <w:abstractNum w:abstractNumId="11" w15:restartNumberingAfterBreak="0">
-    <w:nsid w:val="6E574C15"/>
+  <w:abstractNum w:abstractNumId="13" w15:restartNumberingAfterBreak="0">
+    <w:nsid w:val="6B0F7CA7"/>
     <w:multiLevelType w:val="hybridMultilevel"/>
-    <w:tmpl w:val="16843580"/>
+    <w:tmpl w:val="3FF40976"/>
     <w:lvl w:ilvl="0" w:tplc="04160001">
       <w:start w:val="1"/>
       <w:numFmt w:val="bullet"/>
@@ -22268,10 +23464,10 @@
       </w:rPr>
     </w:lvl>
   </w:abstractNum>
-  <w:abstractNum w:abstractNumId="12" w15:restartNumberingAfterBreak="0">
-    <w:nsid w:val="761A2345"/>
+  <w:abstractNum w:abstractNumId="14" w15:restartNumberingAfterBreak="0">
+    <w:nsid w:val="6E574C15"/>
     <w:multiLevelType w:val="hybridMultilevel"/>
-    <w:tmpl w:val="B030912C"/>
+    <w:tmpl w:val="16843580"/>
     <w:lvl w:ilvl="0" w:tplc="04160001">
       <w:start w:val="1"/>
       <w:numFmt w:val="bullet"/>
@@ -22381,10 +23577,10 @@
       </w:rPr>
     </w:lvl>
   </w:abstractNum>
-  <w:abstractNum w:abstractNumId="13" w15:restartNumberingAfterBreak="0">
-    <w:nsid w:val="7E3921C8"/>
+  <w:abstractNum w:abstractNumId="15" w15:restartNumberingAfterBreak="0">
+    <w:nsid w:val="761A2345"/>
     <w:multiLevelType w:val="hybridMultilevel"/>
-    <w:tmpl w:val="68D678A0"/>
+    <w:tmpl w:val="B030912C"/>
     <w:lvl w:ilvl="0" w:tplc="04160001">
       <w:start w:val="1"/>
       <w:numFmt w:val="bullet"/>
@@ -22494,10 +23690,10 @@
       </w:rPr>
     </w:lvl>
   </w:abstractNum>
-  <w:abstractNum w:abstractNumId="14" w15:restartNumberingAfterBreak="0">
-    <w:nsid w:val="7EDD3EB0"/>
+  <w:abstractNum w:abstractNumId="16" w15:restartNumberingAfterBreak="0">
+    <w:nsid w:val="7E3921C8"/>
     <w:multiLevelType w:val="hybridMultilevel"/>
-    <w:tmpl w:val="2ACE7D7E"/>
+    <w:tmpl w:val="68D678A0"/>
     <w:lvl w:ilvl="0" w:tplc="04160001">
       <w:start w:val="1"/>
       <w:numFmt w:val="bullet"/>
@@ -22607,10 +23803,10 @@
       </w:rPr>
     </w:lvl>
   </w:abstractNum>
-  <w:abstractNum w:abstractNumId="15" w15:restartNumberingAfterBreak="0">
-    <w:nsid w:val="7EFE27EB"/>
+  <w:abstractNum w:abstractNumId="17" w15:restartNumberingAfterBreak="0">
+    <w:nsid w:val="7EDD3EB0"/>
     <w:multiLevelType w:val="hybridMultilevel"/>
-    <w:tmpl w:val="48A8C2E4"/>
+    <w:tmpl w:val="2ACE7D7E"/>
     <w:lvl w:ilvl="0" w:tplc="04160001">
       <w:start w:val="1"/>
       <w:numFmt w:val="bullet"/>
@@ -22720,53 +23916,175 @@
       </w:rPr>
     </w:lvl>
   </w:abstractNum>
+  <w:abstractNum w:abstractNumId="18" w15:restartNumberingAfterBreak="0">
+    <w:nsid w:val="7EFE27EB"/>
+    <w:multiLevelType w:val="hybridMultilevel"/>
+    <w:tmpl w:val="48A8C2E4"/>
+    <w:lvl w:ilvl="0" w:tplc="04160001">
+      <w:start w:val="1"/>
+      <w:numFmt w:val="bullet"/>
+      <w:lvlText w:val=""/>
+      <w:lvlJc w:val="left"/>
+      <w:pPr>
+        <w:ind w:left="720" w:hanging="360"/>
+      </w:pPr>
+      <w:rPr>
+        <w:rFonts w:ascii="Symbol" w:hAnsi="Symbol" w:hint="default"/>
+      </w:rPr>
+    </w:lvl>
+    <w:lvl w:ilvl="1" w:tplc="04160003" w:tentative="1">
+      <w:start w:val="1"/>
+      <w:numFmt w:val="bullet"/>
+      <w:lvlText w:val="o"/>
+      <w:lvlJc w:val="left"/>
+      <w:pPr>
+        <w:ind w:left="1440" w:hanging="360"/>
+      </w:pPr>
+      <w:rPr>
+        <w:rFonts w:ascii="Courier New" w:hAnsi="Courier New" w:cs="Courier New" w:hint="default"/>
+      </w:rPr>
+    </w:lvl>
+    <w:lvl w:ilvl="2" w:tplc="04160005" w:tentative="1">
+      <w:start w:val="1"/>
+      <w:numFmt w:val="bullet"/>
+      <w:lvlText w:val=""/>
+      <w:lvlJc w:val="left"/>
+      <w:pPr>
+        <w:ind w:left="2160" w:hanging="360"/>
+      </w:pPr>
+      <w:rPr>
+        <w:rFonts w:ascii="Wingdings" w:hAnsi="Wingdings" w:hint="default"/>
+      </w:rPr>
+    </w:lvl>
+    <w:lvl w:ilvl="3" w:tplc="04160001" w:tentative="1">
+      <w:start w:val="1"/>
+      <w:numFmt w:val="bullet"/>
+      <w:lvlText w:val=""/>
+      <w:lvlJc w:val="left"/>
+      <w:pPr>
+        <w:ind w:left="2880" w:hanging="360"/>
+      </w:pPr>
+      <w:rPr>
+        <w:rFonts w:ascii="Symbol" w:hAnsi="Symbol" w:hint="default"/>
+      </w:rPr>
+    </w:lvl>
+    <w:lvl w:ilvl="4" w:tplc="04160003" w:tentative="1">
+      <w:start w:val="1"/>
+      <w:numFmt w:val="bullet"/>
+      <w:lvlText w:val="o"/>
+      <w:lvlJc w:val="left"/>
+      <w:pPr>
+        <w:ind w:left="3600" w:hanging="360"/>
+      </w:pPr>
+      <w:rPr>
+        <w:rFonts w:ascii="Courier New" w:hAnsi="Courier New" w:cs="Courier New" w:hint="default"/>
+      </w:rPr>
+    </w:lvl>
+    <w:lvl w:ilvl="5" w:tplc="04160005" w:tentative="1">
+      <w:start w:val="1"/>
+      <w:numFmt w:val="bullet"/>
+      <w:lvlText w:val=""/>
+      <w:lvlJc w:val="left"/>
+      <w:pPr>
+        <w:ind w:left="4320" w:hanging="360"/>
+      </w:pPr>
+      <w:rPr>
+        <w:rFonts w:ascii="Wingdings" w:hAnsi="Wingdings" w:hint="default"/>
+      </w:rPr>
+    </w:lvl>
+    <w:lvl w:ilvl="6" w:tplc="04160001" w:tentative="1">
+      <w:start w:val="1"/>
+      <w:numFmt w:val="bullet"/>
+      <w:lvlText w:val=""/>
+      <w:lvlJc w:val="left"/>
+      <w:pPr>
+        <w:ind w:left="5040" w:hanging="360"/>
+      </w:pPr>
+      <w:rPr>
+        <w:rFonts w:ascii="Symbol" w:hAnsi="Symbol" w:hint="default"/>
+      </w:rPr>
+    </w:lvl>
+    <w:lvl w:ilvl="7" w:tplc="04160003" w:tentative="1">
+      <w:start w:val="1"/>
+      <w:numFmt w:val="bullet"/>
+      <w:lvlText w:val="o"/>
+      <w:lvlJc w:val="left"/>
+      <w:pPr>
+        <w:ind w:left="5760" w:hanging="360"/>
+      </w:pPr>
+      <w:rPr>
+        <w:rFonts w:ascii="Courier New" w:hAnsi="Courier New" w:cs="Courier New" w:hint="default"/>
+      </w:rPr>
+    </w:lvl>
+    <w:lvl w:ilvl="8" w:tplc="04160005" w:tentative="1">
+      <w:start w:val="1"/>
+      <w:numFmt w:val="bullet"/>
+      <w:lvlText w:val=""/>
+      <w:lvlJc w:val="left"/>
+      <w:pPr>
+        <w:ind w:left="6480" w:hanging="360"/>
+      </w:pPr>
+      <w:rPr>
+        <w:rFonts w:ascii="Wingdings" w:hAnsi="Wingdings" w:hint="default"/>
+      </w:rPr>
+    </w:lvl>
+  </w:abstractNum>
   <w:num w:numId="1">
-    <w:abstractNumId w:val="6"/>
+    <w:abstractNumId w:val="7"/>
   </w:num>
   <w:num w:numId="2">
-    <w:abstractNumId w:val="13"/>
+    <w:abstractNumId w:val="16"/>
   </w:num>
   <w:num w:numId="3">
-    <w:abstractNumId w:val="4"/>
+    <w:abstractNumId w:val="5"/>
   </w:num>
   <w:num w:numId="4">
     <w:abstractNumId w:val="0"/>
   </w:num>
   <w:num w:numId="5">
-    <w:abstractNumId w:val="7"/>
+    <w:abstractNumId w:val="8"/>
   </w:num>
   <w:num w:numId="6">
-    <w:abstractNumId w:val="10"/>
+    <w:abstractNumId w:val="13"/>
   </w:num>
   <w:num w:numId="7">
-    <w:abstractNumId w:val="5"/>
+    <w:abstractNumId w:val="6"/>
   </w:num>
   <w:num w:numId="8">
     <w:abstractNumId w:val="1"/>
   </w:num>
   <w:num w:numId="9">
+    <w:abstractNumId w:val="17"/>
+  </w:num>
+  <w:num w:numId="10">
+    <w:abstractNumId w:val="3"/>
+  </w:num>
+  <w:num w:numId="11">
+    <w:abstractNumId w:val="15"/>
+  </w:num>
+  <w:num w:numId="12">
+    <w:abstractNumId w:val="18"/>
+  </w:num>
+  <w:num w:numId="13">
+    <w:abstractNumId w:val="11"/>
+  </w:num>
+  <w:num w:numId="14">
+    <w:abstractNumId w:val="12"/>
+  </w:num>
+  <w:num w:numId="15">
     <w:abstractNumId w:val="14"/>
   </w:num>
-  <w:num w:numId="10">
+  <w:num w:numId="16">
+    <w:abstractNumId w:val="4"/>
+  </w:num>
+  <w:num w:numId="17">
+    <w:abstractNumId w:val="10"/>
+  </w:num>
+  <w:num w:numId="18">
     <w:abstractNumId w:val="2"/>
   </w:num>
-  <w:num w:numId="11">
-    <w:abstractNumId w:val="12"/>
-  </w:num>
-  <w:num w:numId="12">
-    <w:abstractNumId w:val="15"/>
-  </w:num>
-  <w:num w:numId="13">
-    <w:abstractNumId w:val="8"/>
-  </w:num>
-  <w:num w:numId="14">
+  <w:num w:numId="19">
     <w:abstractNumId w:val="9"/>
-  </w:num>
-  <w:num w:numId="15">
-    <w:abstractNumId w:val="11"/>
-  </w:num>
-  <w:num w:numId="16">
-    <w:abstractNumId w:val="3"/>
   </w:num>
 </w:numbering>
 </file>
@@ -23577,7 +24895,7 @@
 </file>
 
 <file path=customXml/itemProps1.xml><?xml version="1.0" encoding="utf-8"?>
-<ds:datastoreItem xmlns:ds="http://schemas.openxmlformats.org/officeDocument/2006/customXml" ds:itemID="{7209A1A3-EEEB-4701-84D9-8E38D8D8AF22}">
+<ds:datastoreItem xmlns:ds="http://schemas.openxmlformats.org/officeDocument/2006/customXml" ds:itemID="{C9F7780D-DE23-4A1C-AA11-D8618B7C3303}">
   <ds:schemaRefs>
     <ds:schemaRef ds:uri="http://schemas.openxmlformats.org/officeDocument/2006/bibliography"/>
   </ds:schemaRefs>

</xml_diff>

<commit_message>
atulização da aula dia 13/10/2026
</commit_message>
<xml_diff>
--- a/apostila/Projeto Space For Men.docx
+++ b/apostila/Projeto Space For Men.docx
@@ -3,9 +3,9 @@
 <w:document xmlns:wpc="http://schemas.microsoft.com/office/word/2010/wordprocessingCanvas" xmlns:cx="http://schemas.microsoft.com/office/drawing/2014/chartex" xmlns:cx1="http://schemas.microsoft.com/office/drawing/2015/9/8/chartex" xmlns:cx2="http://schemas.microsoft.com/office/drawing/2015/10/21/chartex" xmlns:cx3="http://schemas.microsoft.com/office/drawing/2016/5/9/chartex" xmlns:cx4="http://schemas.microsoft.com/office/drawing/2016/5/10/chartex" xmlns:cx5="http://schemas.microsoft.com/office/drawing/2016/5/11/chartex" xmlns:cx6="http://schemas.microsoft.com/office/drawing/2016/5/12/chartex" xmlns:cx7="http://schemas.microsoft.com/office/drawing/2016/5/13/chartex" xmlns:cx8="http://schemas.microsoft.com/office/drawing/2016/5/14/chartex" xmlns:mc="http://schemas.openxmlformats.org/markup-compatibility/2006" xmlns:aink="http://schemas.microsoft.com/office/drawing/2016/ink" xmlns:am3d="http://schemas.microsoft.com/office/drawing/2017/model3d" xmlns:o="urn:schemas-microsoft-com:office:office" xmlns:r="http://schemas.openxmlformats.org/officeDocument/2006/relationships" xmlns:m="http://schemas.openxmlformats.org/officeDocument/2006/math" xmlns:v="urn:schemas-microsoft-com:vml" xmlns:wp14="http://schemas.microsoft.com/office/word/2010/wordprocessingDrawing" xmlns:wp="http://schemas.openxmlformats.org/drawingml/2006/wordprocessingDrawing" xmlns:w10="urn:schemas-microsoft-com:office:word" xmlns:w="http://schemas.openxmlformats.org/wordprocessingml/2006/main" xmlns:w14="http://schemas.microsoft.com/office/word/2010/wordml" xmlns:w15="http://schemas.microsoft.com/office/word/2012/wordml" xmlns:w16cid="http://schemas.microsoft.com/office/word/2016/wordml/cid" xmlns:w16se="http://schemas.microsoft.com/office/word/2015/wordml/symex" xmlns:wpg="http://schemas.microsoft.com/office/word/2010/wordprocessingGroup" xmlns:wpi="http://schemas.microsoft.com/office/word/2010/wordprocessingInk" xmlns:wne="http://schemas.microsoft.com/office/word/2006/wordml" xmlns:wps="http://schemas.microsoft.com/office/word/2010/wordprocessingShape" mc:Ignorable="w14 w15 w16se w16cid wp14">
   <w:body>
     <w:p>
-      <w:pPr>
-        <w:jc w:val="center"/>
-      </w:pPr>
+      <w:r>
+        <w:t xml:space="preserve">                                                     </w:t>
+      </w:r>
       <w:r>
         <w:t xml:space="preserve">Projeto Space For </w:t>
       </w:r>
@@ -21450,6 +21450,7 @@
       <w:r>
         <w:rPr>
           <w:b/>
+          <w:noProof/>
         </w:rPr>
         <w:drawing>
           <wp:anchor distT="0" distB="0" distL="114300" distR="114300" simplePos="0" relativeHeight="251843584" behindDoc="1" locked="0" layoutInCell="1" allowOverlap="1" wp14:anchorId="4AF0FC48">
@@ -21615,6 +21616,7 @@
       <w:r>
         <w:rPr>
           <w:b/>
+          <w:noProof/>
         </w:rPr>
         <w:lastRenderedPageBreak/>
         <w:drawing>
@@ -21695,6 +21697,9 @@
     </w:p>
     <w:p>
       <w:r>
+        <w:rPr>
+          <w:noProof/>
+        </w:rPr>
         <w:drawing>
           <wp:anchor distT="0" distB="0" distL="114300" distR="114300" simplePos="0" relativeHeight="251846656" behindDoc="1" locked="0" layoutInCell="1" allowOverlap="1" wp14:anchorId="229C49B5">
             <wp:simplePos x="0" y="0"/>
@@ -21754,6 +21759,9 @@
         </w:drawing>
       </w:r>
       <w:r>
+        <w:rPr>
+          <w:noProof/>
+        </w:rPr>
         <w:drawing>
           <wp:anchor distT="0" distB="0" distL="114300" distR="114300" simplePos="0" relativeHeight="251845632" behindDoc="1" locked="0" layoutInCell="1" allowOverlap="1" wp14:anchorId="1E2E6E7C">
             <wp:simplePos x="0" y="0"/>
@@ -21832,6 +21840,136 @@
     <w:p/>
     <w:p/>
     <w:p>
+      <w:pPr>
+        <w:rPr>
+          <w:noProof/>
+        </w:rPr>
+      </w:pPr>
+      <w:r>
+        <w:rPr>
+          <w:noProof/>
+        </w:rPr>
+        <w:lastRenderedPageBreak/>
+        <w:drawing>
+          <wp:anchor distT="0" distB="0" distL="114300" distR="114300" simplePos="0" relativeHeight="251848704" behindDoc="1" locked="0" layoutInCell="1" allowOverlap="1" wp14:anchorId="7A8F1434">
+            <wp:simplePos x="0" y="0"/>
+            <wp:positionH relativeFrom="column">
+              <wp:posOffset>-389595</wp:posOffset>
+            </wp:positionH>
+            <wp:positionV relativeFrom="paragraph">
+              <wp:posOffset>1853402</wp:posOffset>
+            </wp:positionV>
+            <wp:extent cx="5400040" cy="2571750"/>
+            <wp:effectExtent l="0" t="0" r="0" b="0"/>
+            <wp:wrapTight wrapText="bothSides">
+              <wp:wrapPolygon edited="0">
+                <wp:start x="0" y="0"/>
+                <wp:lineTo x="0" y="21440"/>
+                <wp:lineTo x="21488" y="21440"/>
+                <wp:lineTo x="21488" y="0"/>
+                <wp:lineTo x="0" y="0"/>
+              </wp:wrapPolygon>
+            </wp:wrapTight>
+            <wp:docPr id="185" name="Imagem 185"/>
+            <wp:cNvGraphicFramePr>
+              <a:graphicFrameLocks xmlns:a="http://schemas.openxmlformats.org/drawingml/2006/main" noChangeAspect="1"/>
+            </wp:cNvGraphicFramePr>
+            <a:graphic xmlns:a="http://schemas.openxmlformats.org/drawingml/2006/main">
+              <a:graphicData uri="http://schemas.openxmlformats.org/drawingml/2006/picture">
+                <pic:pic xmlns:pic="http://schemas.openxmlformats.org/drawingml/2006/picture">
+                  <pic:nvPicPr>
+                    <pic:cNvPr id="1" name=""/>
+                    <pic:cNvPicPr/>
+                  </pic:nvPicPr>
+                  <pic:blipFill>
+                    <a:blip r:embed="rId197">
+                      <a:extLst>
+                        <a:ext uri="{28A0092B-C50C-407E-A947-70E740481C1C}">
+                          <a14:useLocalDpi xmlns:a14="http://schemas.microsoft.com/office/drawing/2010/main" val="0"/>
+                        </a:ext>
+                      </a:extLst>
+                    </a:blip>
+                    <a:stretch>
+                      <a:fillRect/>
+                    </a:stretch>
+                  </pic:blipFill>
+                  <pic:spPr>
+                    <a:xfrm>
+                      <a:off x="0" y="0"/>
+                      <a:ext cx="5400040" cy="2571750"/>
+                    </a:xfrm>
+                    <a:prstGeom prst="rect">
+                      <a:avLst/>
+                    </a:prstGeom>
+                  </pic:spPr>
+                </pic:pic>
+              </a:graphicData>
+            </a:graphic>
+          </wp:anchor>
+        </w:drawing>
+      </w:r>
+      <w:r>
+        <w:rPr>
+          <w:noProof/>
+        </w:rPr>
+        <w:drawing>
+          <wp:anchor distT="0" distB="0" distL="114300" distR="114300" simplePos="0" relativeHeight="251847680" behindDoc="1" locked="0" layoutInCell="1" allowOverlap="1" wp14:anchorId="145858AC">
+            <wp:simplePos x="0" y="0"/>
+            <wp:positionH relativeFrom="column">
+              <wp:posOffset>-346902</wp:posOffset>
+            </wp:positionH>
+            <wp:positionV relativeFrom="paragraph">
+              <wp:posOffset>618401</wp:posOffset>
+            </wp:positionV>
+            <wp:extent cx="3676650" cy="1266825"/>
+            <wp:effectExtent l="0" t="0" r="0" b="9525"/>
+            <wp:wrapTight wrapText="bothSides">
+              <wp:wrapPolygon edited="0">
+                <wp:start x="0" y="0"/>
+                <wp:lineTo x="0" y="21438"/>
+                <wp:lineTo x="21488" y="21438"/>
+                <wp:lineTo x="21488" y="0"/>
+                <wp:lineTo x="0" y="0"/>
+              </wp:wrapPolygon>
+            </wp:wrapTight>
+            <wp:docPr id="184" name="Imagem 184"/>
+            <wp:cNvGraphicFramePr>
+              <a:graphicFrameLocks xmlns:a="http://schemas.openxmlformats.org/drawingml/2006/main" noChangeAspect="1"/>
+            </wp:cNvGraphicFramePr>
+            <a:graphic xmlns:a="http://schemas.openxmlformats.org/drawingml/2006/main">
+              <a:graphicData uri="http://schemas.openxmlformats.org/drawingml/2006/picture">
+                <pic:pic xmlns:pic="http://schemas.openxmlformats.org/drawingml/2006/picture">
+                  <pic:nvPicPr>
+                    <pic:cNvPr id="1" name=""/>
+                    <pic:cNvPicPr/>
+                  </pic:nvPicPr>
+                  <pic:blipFill>
+                    <a:blip r:embed="rId198">
+                      <a:extLst>
+                        <a:ext uri="{28A0092B-C50C-407E-A947-70E740481C1C}">
+                          <a14:useLocalDpi xmlns:a14="http://schemas.microsoft.com/office/drawing/2010/main" val="0"/>
+                        </a:ext>
+                      </a:extLst>
+                    </a:blip>
+                    <a:stretch>
+                      <a:fillRect/>
+                    </a:stretch>
+                  </pic:blipFill>
+                  <pic:spPr>
+                    <a:xfrm>
+                      <a:off x="0" y="0"/>
+                      <a:ext cx="3676650" cy="1266825"/>
+                    </a:xfrm>
+                    <a:prstGeom prst="rect">
+                      <a:avLst/>
+                    </a:prstGeom>
+                  </pic:spPr>
+                </pic:pic>
+              </a:graphicData>
+            </a:graphic>
+          </wp:anchor>
+        </w:drawing>
+      </w:r>
       <w:r>
         <w:t>121-</w:t>
       </w:r>
@@ -21847,13 +21985,1561 @@
       </w:r>
       <w:proofErr w:type="spellEnd"/>
       <w:r>
-        <w:t xml:space="preserve"> existe o 4 valor que seria a propriedade que configura a intensidade da borda a partir do tamanho do elemento, isto é, o tamanho da sombra projetada nesta caso inserimos 20px.</w:t>
-      </w:r>
+        <w:t xml:space="preserve"> existe o </w:t>
+      </w:r>
+      <w:proofErr w:type="gramStart"/>
+      <w:r>
+        <w:t xml:space="preserve">4 </w:t>
+      </w:r>
+      <w:r>
+        <w:t>valor</w:t>
+      </w:r>
+      <w:proofErr w:type="gramEnd"/>
+      <w:r>
+        <w:t xml:space="preserve"> que seria a propriedade que configura a intensidade da borda a partir do tamanho do elemento, isto é, o tamanho da sombra projetada </w:t>
+      </w:r>
+      <w:proofErr w:type="spellStart"/>
+      <w:r>
+        <w:t>nesta</w:t>
+      </w:r>
+      <w:proofErr w:type="spellEnd"/>
+      <w:r>
+        <w:t xml:space="preserve"> caso inserimos 20px.</w:t>
+      </w:r>
+      <w:r>
+        <w:rPr>
+          <w:noProof/>
+        </w:rPr>
+        <w:t xml:space="preserve"> </w:t>
+      </w:r>
+    </w:p>
+    <w:p/>
+    <w:p/>
+    <w:p/>
+    <w:p/>
+    <w:p/>
+    <w:p/>
+    <w:p/>
+    <w:p/>
+    <w:p/>
+    <w:p/>
+    <w:p/>
+    <w:p/>
+    <w:p/>
+    <w:p/>
+    <w:p/>
+    <w:p>
+      <w:r>
+        <w:t>122-</w:t>
+      </w:r>
+      <w:r>
+        <w:t xml:space="preserve"> Design responsivo.</w:t>
+      </w:r>
+    </w:p>
+    <w:p>
+      <w:r>
+        <w:t>O que podemos fazer para saber se a nosso pagina está adaptado para uso do celular?</w:t>
+      </w:r>
+    </w:p>
+    <w:p>
+      <w:r>
+        <w:t xml:space="preserve">Tem duas formas de abrir e para verificar a </w:t>
+      </w:r>
+      <w:proofErr w:type="spellStart"/>
+      <w:r>
+        <w:t>ferramento</w:t>
+      </w:r>
+      <w:proofErr w:type="spellEnd"/>
+      <w:r>
+        <w:t xml:space="preserve"> do desenvolvimento onde podemos verificar.</w:t>
+      </w:r>
+    </w:p>
+    <w:p>
+      <w:r>
+        <w:t>1-</w:t>
+      </w:r>
+      <w:proofErr w:type="gramStart"/>
+      <w:r>
+        <w:t>contr</w:t>
+      </w:r>
+      <w:proofErr w:type="gramEnd"/>
+      <w:r>
+        <w:t>+shift+</w:t>
+      </w:r>
+      <w:r>
+        <w:t>i</w:t>
+      </w:r>
+    </w:p>
+    <w:p>
+      <w:r>
+        <w:rPr>
+          <w:noProof/>
+        </w:rPr>
+        <w:drawing>
+          <wp:anchor distT="0" distB="0" distL="114300" distR="114300" simplePos="0" relativeHeight="251849728" behindDoc="1" locked="0" layoutInCell="1" allowOverlap="1" wp14:anchorId="7BB6641E">
+            <wp:simplePos x="0" y="0"/>
+            <wp:positionH relativeFrom="column">
+              <wp:posOffset>-155309</wp:posOffset>
+            </wp:positionH>
+            <wp:positionV relativeFrom="paragraph">
+              <wp:posOffset>353635</wp:posOffset>
+            </wp:positionV>
+            <wp:extent cx="5400040" cy="1982470"/>
+            <wp:effectExtent l="0" t="0" r="0" b="0"/>
+            <wp:wrapTight wrapText="bothSides">
+              <wp:wrapPolygon edited="0">
+                <wp:start x="0" y="0"/>
+                <wp:lineTo x="0" y="21379"/>
+                <wp:lineTo x="21488" y="21379"/>
+                <wp:lineTo x="21488" y="0"/>
+                <wp:lineTo x="0" y="0"/>
+              </wp:wrapPolygon>
+            </wp:wrapTight>
+            <wp:docPr id="188" name="Imagem 188"/>
+            <wp:cNvGraphicFramePr>
+              <a:graphicFrameLocks xmlns:a="http://schemas.openxmlformats.org/drawingml/2006/main" noChangeAspect="1"/>
+            </wp:cNvGraphicFramePr>
+            <a:graphic xmlns:a="http://schemas.openxmlformats.org/drawingml/2006/main">
+              <a:graphicData uri="http://schemas.openxmlformats.org/drawingml/2006/picture">
+                <pic:pic xmlns:pic="http://schemas.openxmlformats.org/drawingml/2006/picture">
+                  <pic:nvPicPr>
+                    <pic:cNvPr id="1" name=""/>
+                    <pic:cNvPicPr/>
+                  </pic:nvPicPr>
+                  <pic:blipFill>
+                    <a:blip r:embed="rId199">
+                      <a:extLst>
+                        <a:ext uri="{28A0092B-C50C-407E-A947-70E740481C1C}">
+                          <a14:useLocalDpi xmlns:a14="http://schemas.microsoft.com/office/drawing/2010/main" val="0"/>
+                        </a:ext>
+                      </a:extLst>
+                    </a:blip>
+                    <a:stretch>
+                      <a:fillRect/>
+                    </a:stretch>
+                  </pic:blipFill>
+                  <pic:spPr>
+                    <a:xfrm>
+                      <a:off x="0" y="0"/>
+                      <a:ext cx="5400040" cy="1982470"/>
+                    </a:xfrm>
+                    <a:prstGeom prst="rect">
+                      <a:avLst/>
+                    </a:prstGeom>
+                  </pic:spPr>
+                </pic:pic>
+              </a:graphicData>
+            </a:graphic>
+          </wp:anchor>
+        </w:drawing>
+      </w:r>
+      <w:r>
+        <w:t>2-F12</w:t>
+      </w:r>
+    </w:p>
+    <w:p>
+      <w:r>
+        <w:lastRenderedPageBreak/>
+        <w:t xml:space="preserve">Ao clicar no botão conforme desenho acima </w:t>
+      </w:r>
+      <w:r>
+        <w:t>podemos vê o nosso site como ele se comporta no formato de celular.</w:t>
+      </w:r>
+    </w:p>
+    <w:p/>
+    <w:p>
+      <w:r>
+        <w:t>123- Precisamos compreender quantos pixels existem na tela para trabalhamos em uma melhor exibi</w:t>
+      </w:r>
+      <w:r>
+        <w:t>ção. Atualmente, nossa tela se adaptada ao tamanho disponibilizados pelo navegador de 940px mínimo.</w:t>
+      </w:r>
+    </w:p>
+    <w:p>
+      <w:r>
+        <w:t>No caso de celulares o panorama é diferente mesmo que a resolução do dispositivo de celulares seja 2000px, a quantidade de pixels na tela sempre será diferente. Esses valores são chamados de DPI que é densidade de pixels por polegada.</w:t>
+      </w:r>
+    </w:p>
+    <w:p>
+      <w:r>
+        <w:t>Geralmente, os celulares possuem 320px de largura de tela, alguns maiores 350px a 480px.</w:t>
+      </w:r>
+    </w:p>
+    <w:p/>
+    <w:p>
+      <w:pPr>
+        <w:rPr>
+          <w:noProof/>
+        </w:rPr>
+      </w:pPr>
+      <w:r>
+        <w:rPr>
+          <w:b/>
+          <w:i/>
+          <w:noProof/>
+        </w:rPr>
+        <w:drawing>
+          <wp:anchor distT="0" distB="0" distL="114300" distR="114300" simplePos="0" relativeHeight="251850752" behindDoc="1" locked="0" layoutInCell="1" allowOverlap="1" wp14:anchorId="7B628E26">
+            <wp:simplePos x="0" y="0"/>
+            <wp:positionH relativeFrom="column">
+              <wp:posOffset>-123781</wp:posOffset>
+            </wp:positionH>
+            <wp:positionV relativeFrom="paragraph">
+              <wp:posOffset>537786</wp:posOffset>
+            </wp:positionV>
+            <wp:extent cx="5210810" cy="257175"/>
+            <wp:effectExtent l="0" t="0" r="8890" b="9525"/>
+            <wp:wrapTight wrapText="bothSides">
+              <wp:wrapPolygon edited="0">
+                <wp:start x="0" y="0"/>
+                <wp:lineTo x="0" y="20800"/>
+                <wp:lineTo x="21558" y="20800"/>
+                <wp:lineTo x="21558" y="0"/>
+                <wp:lineTo x="0" y="0"/>
+              </wp:wrapPolygon>
+            </wp:wrapTight>
+            <wp:docPr id="189" name="Imagem 189"/>
+            <wp:cNvGraphicFramePr>
+              <a:graphicFrameLocks xmlns:a="http://schemas.openxmlformats.org/drawingml/2006/main" noChangeAspect="1"/>
+            </wp:cNvGraphicFramePr>
+            <a:graphic xmlns:a="http://schemas.openxmlformats.org/drawingml/2006/main">
+              <a:graphicData uri="http://schemas.openxmlformats.org/drawingml/2006/picture">
+                <pic:pic xmlns:pic="http://schemas.openxmlformats.org/drawingml/2006/picture">
+                  <pic:nvPicPr>
+                    <pic:cNvPr id="1" name=""/>
+                    <pic:cNvPicPr/>
+                  </pic:nvPicPr>
+                  <pic:blipFill>
+                    <a:blip r:embed="rId200">
+                      <a:extLst>
+                        <a:ext uri="{28A0092B-C50C-407E-A947-70E740481C1C}">
+                          <a14:useLocalDpi xmlns:a14="http://schemas.microsoft.com/office/drawing/2010/main" val="0"/>
+                        </a:ext>
+                      </a:extLst>
+                    </a:blip>
+                    <a:stretch>
+                      <a:fillRect/>
+                    </a:stretch>
+                  </pic:blipFill>
+                  <pic:spPr>
+                    <a:xfrm>
+                      <a:off x="0" y="0"/>
+                      <a:ext cx="5210810" cy="257175"/>
+                    </a:xfrm>
+                    <a:prstGeom prst="rect">
+                      <a:avLst/>
+                    </a:prstGeom>
+                  </pic:spPr>
+                </pic:pic>
+              </a:graphicData>
+            </a:graphic>
+          </wp:anchor>
+        </w:drawing>
+      </w:r>
+      <w:r>
+        <w:rPr>
+          <w:b/>
+          <w:i/>
+        </w:rPr>
+        <w:t xml:space="preserve">Para saber a quantidade de pixels o navegador utiliza uma </w:t>
+      </w:r>
+      <w:proofErr w:type="spellStart"/>
+      <w:r>
+        <w:rPr>
+          <w:b/>
+          <w:i/>
+        </w:rPr>
+        <w:t>tag</w:t>
+      </w:r>
+      <w:proofErr w:type="spellEnd"/>
+      <w:r>
+        <w:rPr>
+          <w:b/>
+          <w:i/>
+        </w:rPr>
+        <w:t xml:space="preserve"> do </w:t>
+      </w:r>
+      <w:proofErr w:type="spellStart"/>
+      <w:r>
+        <w:rPr>
+          <w:b/>
+          <w:i/>
+        </w:rPr>
+        <w:t>html</w:t>
+      </w:r>
+      <w:proofErr w:type="spellEnd"/>
+      <w:r>
+        <w:rPr>
+          <w:b/>
+          <w:i/>
+        </w:rPr>
+        <w:t xml:space="preserve"> (</w:t>
+      </w:r>
+      <w:proofErr w:type="gramStart"/>
+      <w:r>
+        <w:rPr>
+          <w:b/>
+          <w:i/>
+        </w:rPr>
+        <w:t>ou seja</w:t>
+      </w:r>
+      <w:proofErr w:type="gramEnd"/>
+      <w:r>
+        <w:rPr>
+          <w:b/>
+          <w:i/>
+        </w:rPr>
+        <w:t xml:space="preserve"> para saber o tamanho da tela que está sendo </w:t>
+      </w:r>
+      <w:proofErr w:type="spellStart"/>
+      <w:r>
+        <w:rPr>
+          <w:b/>
+          <w:i/>
+        </w:rPr>
+        <w:t>renderizado</w:t>
+      </w:r>
+      <w:proofErr w:type="spellEnd"/>
+      <w:r>
+        <w:rPr>
+          <w:b/>
+          <w:i/>
+        </w:rPr>
+        <w:t xml:space="preserve"> o site.</w:t>
+      </w:r>
+    </w:p>
+    <w:p>
+      <w:pPr>
+        <w:rPr>
+          <w:noProof/>
+        </w:rPr>
+      </w:pPr>
+    </w:p>
+    <w:p>
+      <w:pPr>
+        <w:rPr>
+          <w:noProof/>
+        </w:rPr>
+      </w:pPr>
+      <w:r>
+        <w:rPr>
+          <w:noProof/>
+        </w:rPr>
+        <w:t>124- Estamos informando ao navegador ao fazer uma pesguisa a onde possui um tela que a largura máxima seja 480px precisar entregar a seguintes configurações.</w:t>
+      </w:r>
+      <w:r>
+        <w:rPr>
+          <w:noProof/>
+        </w:rPr>
+        <w:t xml:space="preserve"> </w:t>
+      </w:r>
+    </w:p>
+    <w:p>
+      <w:pPr>
+        <w:rPr>
+          <w:u w:val="single"/>
+        </w:rPr>
+      </w:pPr>
+      <w:r>
+        <w:rPr>
+          <w:noProof/>
+        </w:rPr>
+        <w:drawing>
+          <wp:anchor distT="0" distB="0" distL="114300" distR="114300" simplePos="0" relativeHeight="251851776" behindDoc="1" locked="0" layoutInCell="1" allowOverlap="1" wp14:anchorId="6619F344">
+            <wp:simplePos x="0" y="0"/>
+            <wp:positionH relativeFrom="margin">
+              <wp:align>left</wp:align>
+            </wp:positionH>
+            <wp:positionV relativeFrom="paragraph">
+              <wp:posOffset>141043</wp:posOffset>
+            </wp:positionV>
+            <wp:extent cx="3362325" cy="809625"/>
+            <wp:effectExtent l="0" t="0" r="9525" b="9525"/>
+            <wp:wrapTight wrapText="bothSides">
+              <wp:wrapPolygon edited="0">
+                <wp:start x="0" y="0"/>
+                <wp:lineTo x="0" y="21346"/>
+                <wp:lineTo x="21539" y="21346"/>
+                <wp:lineTo x="21539" y="0"/>
+                <wp:lineTo x="0" y="0"/>
+              </wp:wrapPolygon>
+            </wp:wrapTight>
+            <wp:docPr id="186" name="Imagem 186"/>
+            <wp:cNvGraphicFramePr>
+              <a:graphicFrameLocks xmlns:a="http://schemas.openxmlformats.org/drawingml/2006/main" noChangeAspect="1"/>
+            </wp:cNvGraphicFramePr>
+            <a:graphic xmlns:a="http://schemas.openxmlformats.org/drawingml/2006/main">
+              <a:graphicData uri="http://schemas.openxmlformats.org/drawingml/2006/picture">
+                <pic:pic xmlns:pic="http://schemas.openxmlformats.org/drawingml/2006/picture">
+                  <pic:nvPicPr>
+                    <pic:cNvPr id="1" name=""/>
+                    <pic:cNvPicPr/>
+                  </pic:nvPicPr>
+                  <pic:blipFill>
+                    <a:blip r:embed="rId201">
+                      <a:extLst>
+                        <a:ext uri="{28A0092B-C50C-407E-A947-70E740481C1C}">
+                          <a14:useLocalDpi xmlns:a14="http://schemas.microsoft.com/office/drawing/2010/main" val="0"/>
+                        </a:ext>
+                      </a:extLst>
+                    </a:blip>
+                    <a:stretch>
+                      <a:fillRect/>
+                    </a:stretch>
+                  </pic:blipFill>
+                  <pic:spPr>
+                    <a:xfrm>
+                      <a:off x="0" y="0"/>
+                      <a:ext cx="3362325" cy="809625"/>
+                    </a:xfrm>
+                    <a:prstGeom prst="rect">
+                      <a:avLst/>
+                    </a:prstGeom>
+                  </pic:spPr>
+                </pic:pic>
+              </a:graphicData>
+            </a:graphic>
+          </wp:anchor>
+        </w:drawing>
+      </w:r>
+    </w:p>
+    <w:p>
+      <w:r>
+        <w:t xml:space="preserve">  </w:t>
+      </w:r>
+    </w:p>
+    <w:p/>
+    <w:p/>
+    <w:p/>
+    <w:p>
+      <w:pPr>
+        <w:rPr>
+          <w:noProof/>
+        </w:rPr>
+      </w:pPr>
+      <w:r>
+        <w:t xml:space="preserve">125- </w:t>
+      </w:r>
+      <w:r>
+        <w:t>A principal tática pra não perder muito tempo ciando u layout responsivo e usar medidas proporcional para TUDO ao criar um site com layout que se adapte sempre.</w:t>
+      </w:r>
+    </w:p>
+    <w:p>
+      <w:proofErr w:type="gramStart"/>
+      <w:r>
+        <w:t>Ou seja</w:t>
+      </w:r>
+      <w:proofErr w:type="gramEnd"/>
+      <w:r>
+        <w:t xml:space="preserve"> ao observamos o código a abaixo podemos deduzir que a nossa pagina index.html esta bem estruturada com varias divisões com medidas como por exemplo.</w:t>
+      </w:r>
+    </w:p>
+    <w:p>
+      <w:proofErr w:type="gramStart"/>
+      <w:r>
+        <w:t>.caixa</w:t>
+      </w:r>
+      <w:proofErr w:type="gramEnd"/>
+      <w:r>
+        <w:t>(</w:t>
+      </w:r>
+      <w:proofErr w:type="spellStart"/>
+      <w:r>
+        <w:t>div</w:t>
+      </w:r>
+      <w:proofErr w:type="spellEnd"/>
+      <w:r>
+        <w:t xml:space="preserve"> menu com tamanho 940px)</w:t>
+      </w:r>
+    </w:p>
+    <w:p>
+      <w:proofErr w:type="gramStart"/>
+      <w:r>
+        <w:t>.principal</w:t>
+      </w:r>
+      <w:proofErr w:type="gramEnd"/>
+      <w:r>
+        <w:t>(</w:t>
+      </w:r>
+      <w:proofErr w:type="spellStart"/>
+      <w:r>
+        <w:t>section</w:t>
+      </w:r>
+      <w:proofErr w:type="spellEnd"/>
+      <w:r>
+        <w:t xml:space="preserve"> da seção principal da página com medida 940px)</w:t>
+      </w:r>
+    </w:p>
+    <w:p>
+      <w:proofErr w:type="gramStart"/>
+      <w:r>
+        <w:t>.mapa</w:t>
+      </w:r>
+      <w:proofErr w:type="gramEnd"/>
+      <w:r>
+        <w:t>(</w:t>
+      </w:r>
+      <w:proofErr w:type="spellStart"/>
+      <w:r>
+        <w:t>section</w:t>
+      </w:r>
+      <w:proofErr w:type="spellEnd"/>
+      <w:r>
+        <w:t xml:space="preserve"> do mapa com medida 940px)</w:t>
+      </w:r>
+    </w:p>
+    <w:p/>
+    <w:p>
+      <w:r>
+        <w:t xml:space="preserve">Colocamos uma medida para toda divisão da nossa página </w:t>
+      </w:r>
+      <w:r>
+        <w:t>tornando fácil para a página ficar responsiva).</w:t>
+      </w:r>
+    </w:p>
+    <w:p/>
+    <w:p>
+      <w:r>
+        <w:rPr>
+          <w:noProof/>
+        </w:rPr>
+        <w:lastRenderedPageBreak/>
+        <w:drawing>
+          <wp:anchor distT="0" distB="0" distL="114300" distR="114300" simplePos="0" relativeHeight="251852800" behindDoc="1" locked="0" layoutInCell="1" allowOverlap="1" wp14:anchorId="702D4D49">
+            <wp:simplePos x="0" y="0"/>
+            <wp:positionH relativeFrom="margin">
+              <wp:posOffset>-350978</wp:posOffset>
+            </wp:positionH>
+            <wp:positionV relativeFrom="paragraph">
+              <wp:posOffset>620</wp:posOffset>
+            </wp:positionV>
+            <wp:extent cx="5400040" cy="1163320"/>
+            <wp:effectExtent l="0" t="0" r="0" b="0"/>
+            <wp:wrapTight wrapText="bothSides">
+              <wp:wrapPolygon edited="0">
+                <wp:start x="0" y="0"/>
+                <wp:lineTo x="0" y="21223"/>
+                <wp:lineTo x="21488" y="21223"/>
+                <wp:lineTo x="21488" y="0"/>
+                <wp:lineTo x="0" y="0"/>
+              </wp:wrapPolygon>
+            </wp:wrapTight>
+            <wp:docPr id="187" name="Imagem 187"/>
+            <wp:cNvGraphicFramePr>
+              <a:graphicFrameLocks xmlns:a="http://schemas.openxmlformats.org/drawingml/2006/main" noChangeAspect="1"/>
+            </wp:cNvGraphicFramePr>
+            <a:graphic xmlns:a="http://schemas.openxmlformats.org/drawingml/2006/main">
+              <a:graphicData uri="http://schemas.openxmlformats.org/drawingml/2006/picture">
+                <pic:pic xmlns:pic="http://schemas.openxmlformats.org/drawingml/2006/picture">
+                  <pic:nvPicPr>
+                    <pic:cNvPr id="1" name=""/>
+                    <pic:cNvPicPr/>
+                  </pic:nvPicPr>
+                  <pic:blipFill>
+                    <a:blip r:embed="rId202">
+                      <a:extLst>
+                        <a:ext uri="{28A0092B-C50C-407E-A947-70E740481C1C}">
+                          <a14:useLocalDpi xmlns:a14="http://schemas.microsoft.com/office/drawing/2010/main" val="0"/>
+                        </a:ext>
+                      </a:extLst>
+                    </a:blip>
+                    <a:stretch>
+                      <a:fillRect/>
+                    </a:stretch>
+                  </pic:blipFill>
+                  <pic:spPr>
+                    <a:xfrm>
+                      <a:off x="0" y="0"/>
+                      <a:ext cx="5400040" cy="1163320"/>
+                    </a:xfrm>
+                    <a:prstGeom prst="rect">
+                      <a:avLst/>
+                    </a:prstGeom>
+                  </pic:spPr>
+                </pic:pic>
+              </a:graphicData>
+            </a:graphic>
+          </wp:anchor>
+        </w:drawing>
+      </w:r>
+    </w:p>
+    <w:p/>
+    <w:p/>
+    <w:p/>
+    <w:p/>
+    <w:p>
+      <w:r>
+        <w:rPr>
+          <w:noProof/>
+        </w:rPr>
+        <w:drawing>
+          <wp:anchor distT="0" distB="0" distL="114300" distR="114300" simplePos="0" relativeHeight="251853824" behindDoc="1" locked="0" layoutInCell="1" allowOverlap="1" wp14:anchorId="1B28A151">
+            <wp:simplePos x="0" y="0"/>
+            <wp:positionH relativeFrom="column">
+              <wp:posOffset>-303826</wp:posOffset>
+            </wp:positionH>
+            <wp:positionV relativeFrom="paragraph">
+              <wp:posOffset>466577</wp:posOffset>
+            </wp:positionV>
+            <wp:extent cx="5400040" cy="737235"/>
+            <wp:effectExtent l="0" t="0" r="0" b="5715"/>
+            <wp:wrapTight wrapText="bothSides">
+              <wp:wrapPolygon edited="0">
+                <wp:start x="0" y="0"/>
+                <wp:lineTo x="0" y="21209"/>
+                <wp:lineTo x="21488" y="21209"/>
+                <wp:lineTo x="21488" y="0"/>
+                <wp:lineTo x="0" y="0"/>
+              </wp:wrapPolygon>
+            </wp:wrapTight>
+            <wp:docPr id="190" name="Imagem 190"/>
+            <wp:cNvGraphicFramePr>
+              <a:graphicFrameLocks xmlns:a="http://schemas.openxmlformats.org/drawingml/2006/main" noChangeAspect="1"/>
+            </wp:cNvGraphicFramePr>
+            <a:graphic xmlns:a="http://schemas.openxmlformats.org/drawingml/2006/main">
+              <a:graphicData uri="http://schemas.openxmlformats.org/drawingml/2006/picture">
+                <pic:pic xmlns:pic="http://schemas.openxmlformats.org/drawingml/2006/picture">
+                  <pic:nvPicPr>
+                    <pic:cNvPr id="1" name=""/>
+                    <pic:cNvPicPr/>
+                  </pic:nvPicPr>
+                  <pic:blipFill>
+                    <a:blip r:embed="rId203">
+                      <a:extLst>
+                        <a:ext uri="{28A0092B-C50C-407E-A947-70E740481C1C}">
+                          <a14:useLocalDpi xmlns:a14="http://schemas.microsoft.com/office/drawing/2010/main" val="0"/>
+                        </a:ext>
+                      </a:extLst>
+                    </a:blip>
+                    <a:stretch>
+                      <a:fillRect/>
+                    </a:stretch>
+                  </pic:blipFill>
+                  <pic:spPr>
+                    <a:xfrm>
+                      <a:off x="0" y="0"/>
+                      <a:ext cx="5400040" cy="737235"/>
+                    </a:xfrm>
+                    <a:prstGeom prst="rect">
+                      <a:avLst/>
+                    </a:prstGeom>
+                  </pic:spPr>
+                </pic:pic>
+              </a:graphicData>
+            </a:graphic>
+          </wp:anchor>
+        </w:drawing>
+      </w:r>
+      <w:r>
+        <w:t xml:space="preserve">126- O vídeo estava com uma largura fixa no </w:t>
+      </w:r>
+      <w:proofErr w:type="spellStart"/>
+      <w:r>
+        <w:t>html</w:t>
+      </w:r>
+      <w:proofErr w:type="spellEnd"/>
+      <w:r>
+        <w:t xml:space="preserve"> trocamos o valor para </w:t>
+      </w:r>
+      <w:proofErr w:type="spellStart"/>
+      <w:r>
+        <w:t>width</w:t>
+      </w:r>
+      <w:proofErr w:type="spellEnd"/>
+      <w:r>
+        <w:t xml:space="preserve"> 100% e o vídeo ficou ajustado para o tamanho de tela do celular.</w:t>
+      </w:r>
+    </w:p>
+    <w:p/>
+    <w:p>
+      <w:pPr>
+        <w:rPr>
+          <w:noProof/>
+        </w:rPr>
+      </w:pPr>
+      <w:r>
+        <w:rPr>
+          <w:noProof/>
+        </w:rPr>
+        <w:drawing>
+          <wp:anchor distT="0" distB="0" distL="114300" distR="114300" simplePos="0" relativeHeight="251855872" behindDoc="1" locked="0" layoutInCell="1" allowOverlap="1" wp14:anchorId="71499116">
+            <wp:simplePos x="0" y="0"/>
+            <wp:positionH relativeFrom="page">
+              <wp:posOffset>148561</wp:posOffset>
+            </wp:positionH>
+            <wp:positionV relativeFrom="paragraph">
+              <wp:posOffset>2191901</wp:posOffset>
+            </wp:positionV>
+            <wp:extent cx="3273425" cy="3540642"/>
+            <wp:effectExtent l="0" t="0" r="3175" b="3175"/>
+            <wp:wrapTight wrapText="bothSides">
+              <wp:wrapPolygon edited="0">
+                <wp:start x="0" y="0"/>
+                <wp:lineTo x="0" y="21503"/>
+                <wp:lineTo x="21495" y="21503"/>
+                <wp:lineTo x="21495" y="0"/>
+                <wp:lineTo x="0" y="0"/>
+              </wp:wrapPolygon>
+            </wp:wrapTight>
+            <wp:docPr id="192" name="Imagem 192"/>
+            <wp:cNvGraphicFramePr>
+              <a:graphicFrameLocks xmlns:a="http://schemas.openxmlformats.org/drawingml/2006/main" noChangeAspect="1"/>
+            </wp:cNvGraphicFramePr>
+            <a:graphic xmlns:a="http://schemas.openxmlformats.org/drawingml/2006/main">
+              <a:graphicData uri="http://schemas.openxmlformats.org/drawingml/2006/picture">
+                <pic:pic xmlns:pic="http://schemas.openxmlformats.org/drawingml/2006/picture">
+                  <pic:nvPicPr>
+                    <pic:cNvPr id="1" name=""/>
+                    <pic:cNvPicPr/>
+                  </pic:nvPicPr>
+                  <pic:blipFill>
+                    <a:blip r:embed="rId204">
+                      <a:extLst>
+                        <a:ext uri="{28A0092B-C50C-407E-A947-70E740481C1C}">
+                          <a14:useLocalDpi xmlns:a14="http://schemas.microsoft.com/office/drawing/2010/main" val="0"/>
+                        </a:ext>
+                      </a:extLst>
+                    </a:blip>
+                    <a:stretch>
+                      <a:fillRect/>
+                    </a:stretch>
+                  </pic:blipFill>
+                  <pic:spPr>
+                    <a:xfrm>
+                      <a:off x="0" y="0"/>
+                      <a:ext cx="3273425" cy="3540642"/>
+                    </a:xfrm>
+                    <a:prstGeom prst="rect">
+                      <a:avLst/>
+                    </a:prstGeom>
+                  </pic:spPr>
+                </pic:pic>
+              </a:graphicData>
+            </a:graphic>
+            <wp14:sizeRelH relativeFrom="margin">
+              <wp14:pctWidth>0</wp14:pctWidth>
+            </wp14:sizeRelH>
+            <wp14:sizeRelV relativeFrom="margin">
+              <wp14:pctHeight>0</wp14:pctHeight>
+            </wp14:sizeRelV>
+          </wp:anchor>
+        </w:drawing>
+      </w:r>
+      <w:r>
+        <w:rPr>
+          <w:noProof/>
+        </w:rPr>
+        <w:drawing>
+          <wp:anchor distT="0" distB="0" distL="114300" distR="114300" simplePos="0" relativeHeight="251854848" behindDoc="1" locked="0" layoutInCell="1" allowOverlap="1" wp14:anchorId="0A137F1F">
+            <wp:simplePos x="0" y="0"/>
+            <wp:positionH relativeFrom="page">
+              <wp:posOffset>595306</wp:posOffset>
+            </wp:positionH>
+            <wp:positionV relativeFrom="paragraph">
+              <wp:posOffset>380099</wp:posOffset>
+            </wp:positionV>
+            <wp:extent cx="5400040" cy="1743710"/>
+            <wp:effectExtent l="0" t="0" r="0" b="8890"/>
+            <wp:wrapTight wrapText="bothSides">
+              <wp:wrapPolygon edited="0">
+                <wp:start x="0" y="0"/>
+                <wp:lineTo x="0" y="21474"/>
+                <wp:lineTo x="21488" y="21474"/>
+                <wp:lineTo x="21488" y="0"/>
+                <wp:lineTo x="0" y="0"/>
+              </wp:wrapPolygon>
+            </wp:wrapTight>
+            <wp:docPr id="191" name="Imagem 191"/>
+            <wp:cNvGraphicFramePr>
+              <a:graphicFrameLocks xmlns:a="http://schemas.openxmlformats.org/drawingml/2006/main" noChangeAspect="1"/>
+            </wp:cNvGraphicFramePr>
+            <a:graphic xmlns:a="http://schemas.openxmlformats.org/drawingml/2006/main">
+              <a:graphicData uri="http://schemas.openxmlformats.org/drawingml/2006/picture">
+                <pic:pic xmlns:pic="http://schemas.openxmlformats.org/drawingml/2006/picture">
+                  <pic:nvPicPr>
+                    <pic:cNvPr id="1" name=""/>
+                    <pic:cNvPicPr/>
+                  </pic:nvPicPr>
+                  <pic:blipFill>
+                    <a:blip r:embed="rId205">
+                      <a:extLst>
+                        <a:ext uri="{28A0092B-C50C-407E-A947-70E740481C1C}">
+                          <a14:useLocalDpi xmlns:a14="http://schemas.microsoft.com/office/drawing/2010/main" val="0"/>
+                        </a:ext>
+                      </a:extLst>
+                    </a:blip>
+                    <a:stretch>
+                      <a:fillRect/>
+                    </a:stretch>
+                  </pic:blipFill>
+                  <pic:spPr>
+                    <a:xfrm>
+                      <a:off x="0" y="0"/>
+                      <a:ext cx="5400040" cy="1743710"/>
+                    </a:xfrm>
+                    <a:prstGeom prst="rect">
+                      <a:avLst/>
+                    </a:prstGeom>
+                  </pic:spPr>
+                </pic:pic>
+              </a:graphicData>
+            </a:graphic>
+            <wp14:sizeRelV relativeFrom="margin">
+              <wp14:pctHeight>0</wp14:pctHeight>
+            </wp14:sizeRelV>
+          </wp:anchor>
+        </w:drawing>
+      </w:r>
+      <w:r>
+        <w:t xml:space="preserve">127- Para centraliza o logo que </w:t>
+      </w:r>
+      <w:proofErr w:type="gramStart"/>
+      <w:r>
+        <w:t>esta</w:t>
+      </w:r>
+      <w:proofErr w:type="gramEnd"/>
+      <w:r>
+        <w:t xml:space="preserve"> dentro do h1 utilizamos o seguinte comando:</w:t>
+      </w:r>
+      <w:r>
+        <w:rPr>
+          <w:noProof/>
+        </w:rPr>
+        <w:t xml:space="preserve"> </w:t>
+      </w:r>
+    </w:p>
+    <w:p/>
+    <w:p/>
+    <w:p/>
+    <w:p/>
+    <w:p/>
+    <w:p/>
+    <w:p/>
+    <w:p/>
+    <w:p/>
+    <w:p/>
+    <w:p/>
+    <w:p/>
+    <w:p/>
+    <w:p/>
+    <w:p/>
+    <w:p/>
+    <w:p/>
+    <w:p/>
+    <w:p/>
+    <w:p>
+      <w:r>
+        <w:rPr>
+          <w:noProof/>
+        </w:rPr>
+        <w:lastRenderedPageBreak/>
+        <w:drawing>
+          <wp:anchor distT="0" distB="0" distL="114300" distR="114300" simplePos="0" relativeHeight="251856896" behindDoc="1" locked="0" layoutInCell="1" allowOverlap="1" wp14:anchorId="5B3A4205">
+            <wp:simplePos x="0" y="0"/>
+            <wp:positionH relativeFrom="margin">
+              <wp:posOffset>-287079</wp:posOffset>
+            </wp:positionH>
+            <wp:positionV relativeFrom="paragraph">
+              <wp:posOffset>704201</wp:posOffset>
+            </wp:positionV>
+            <wp:extent cx="5400040" cy="2413635"/>
+            <wp:effectExtent l="0" t="0" r="0" b="5715"/>
+            <wp:wrapTight wrapText="bothSides">
+              <wp:wrapPolygon edited="0">
+                <wp:start x="0" y="0"/>
+                <wp:lineTo x="0" y="21481"/>
+                <wp:lineTo x="21488" y="21481"/>
+                <wp:lineTo x="21488" y="0"/>
+                <wp:lineTo x="0" y="0"/>
+              </wp:wrapPolygon>
+            </wp:wrapTight>
+            <wp:docPr id="193" name="Imagem 193"/>
+            <wp:cNvGraphicFramePr>
+              <a:graphicFrameLocks xmlns:a="http://schemas.openxmlformats.org/drawingml/2006/main" noChangeAspect="1"/>
+            </wp:cNvGraphicFramePr>
+            <a:graphic xmlns:a="http://schemas.openxmlformats.org/drawingml/2006/main">
+              <a:graphicData uri="http://schemas.openxmlformats.org/drawingml/2006/picture">
+                <pic:pic xmlns:pic="http://schemas.openxmlformats.org/drawingml/2006/picture">
+                  <pic:nvPicPr>
+                    <pic:cNvPr id="1" name=""/>
+                    <pic:cNvPicPr/>
+                  </pic:nvPicPr>
+                  <pic:blipFill>
+                    <a:blip r:embed="rId206">
+                      <a:extLst>
+                        <a:ext uri="{28A0092B-C50C-407E-A947-70E740481C1C}">
+                          <a14:useLocalDpi xmlns:a14="http://schemas.microsoft.com/office/drawing/2010/main" val="0"/>
+                        </a:ext>
+                      </a:extLst>
+                    </a:blip>
+                    <a:stretch>
+                      <a:fillRect/>
+                    </a:stretch>
+                  </pic:blipFill>
+                  <pic:spPr>
+                    <a:xfrm>
+                      <a:off x="0" y="0"/>
+                      <a:ext cx="5400040" cy="2413635"/>
+                    </a:xfrm>
+                    <a:prstGeom prst="rect">
+                      <a:avLst/>
+                    </a:prstGeom>
+                  </pic:spPr>
+                </pic:pic>
+              </a:graphicData>
+            </a:graphic>
+          </wp:anchor>
+        </w:drawing>
+      </w:r>
+      <w:r>
+        <w:t xml:space="preserve">128- Para ajustar o menu utilizamos o </w:t>
+      </w:r>
+      <w:proofErr w:type="spellStart"/>
+      <w:r>
+        <w:t>position:static</w:t>
+      </w:r>
+      <w:proofErr w:type="spellEnd"/>
+      <w:r>
+        <w:t xml:space="preserve"> onde queríamos que ele ficasse em baixo do logo conforme está no </w:t>
+      </w:r>
+      <w:proofErr w:type="spellStart"/>
+      <w:r>
+        <w:t>html</w:t>
+      </w:r>
+      <w:proofErr w:type="spellEnd"/>
+      <w:r>
+        <w:t xml:space="preserve"> com isso substituímos o </w:t>
+      </w:r>
+      <w:proofErr w:type="spellStart"/>
+      <w:r>
+        <w:t>position:absolute</w:t>
+      </w:r>
+      <w:proofErr w:type="spellEnd"/>
+      <w:r>
+        <w:t xml:space="preserve"> conforme código abaixo.</w:t>
+      </w:r>
+      <w:r>
+        <w:rPr>
+          <w:noProof/>
+        </w:rPr>
+        <w:t xml:space="preserve"> </w:t>
+      </w:r>
+    </w:p>
+    <w:p/>
+    <w:p>
+      <w:r>
+        <w:t>129-</w:t>
+      </w:r>
+      <w:r>
+        <w:t xml:space="preserve"> </w:t>
+      </w:r>
+      <w:r>
+        <w:t>Para melhorar a visualização no celular da lista benefícios e da imagem colocamos uma em baixo da outra utilizando o seguinte código.</w:t>
+      </w:r>
+      <w:r>
+        <w:rPr>
+          <w:noProof/>
+        </w:rPr>
+        <w:t xml:space="preserve"> </w:t>
+      </w:r>
+    </w:p>
+    <w:p/>
+    <w:p>
+      <w:r>
+        <w:drawing>
+          <wp:anchor distT="0" distB="0" distL="114300" distR="114300" simplePos="0" relativeHeight="251857920" behindDoc="1" locked="0" layoutInCell="1" allowOverlap="1" wp14:anchorId="04135376">
+            <wp:simplePos x="0" y="0"/>
+            <wp:positionH relativeFrom="column">
+              <wp:posOffset>-420798</wp:posOffset>
+            </wp:positionH>
+            <wp:positionV relativeFrom="paragraph">
+              <wp:posOffset>172957</wp:posOffset>
+            </wp:positionV>
+            <wp:extent cx="4267200" cy="876300"/>
+            <wp:effectExtent l="0" t="0" r="0" b="0"/>
+            <wp:wrapTight wrapText="bothSides">
+              <wp:wrapPolygon edited="0">
+                <wp:start x="0" y="0"/>
+                <wp:lineTo x="0" y="21130"/>
+                <wp:lineTo x="21504" y="21130"/>
+                <wp:lineTo x="21504" y="0"/>
+                <wp:lineTo x="0" y="0"/>
+              </wp:wrapPolygon>
+            </wp:wrapTight>
+            <wp:docPr id="194" name="Imagem 194"/>
+            <wp:cNvGraphicFramePr>
+              <a:graphicFrameLocks xmlns:a="http://schemas.openxmlformats.org/drawingml/2006/main" noChangeAspect="1"/>
+            </wp:cNvGraphicFramePr>
+            <a:graphic xmlns:a="http://schemas.openxmlformats.org/drawingml/2006/main">
+              <a:graphicData uri="http://schemas.openxmlformats.org/drawingml/2006/picture">
+                <pic:pic xmlns:pic="http://schemas.openxmlformats.org/drawingml/2006/picture">
+                  <pic:nvPicPr>
+                    <pic:cNvPr id="1" name=""/>
+                    <pic:cNvPicPr/>
+                  </pic:nvPicPr>
+                  <pic:blipFill>
+                    <a:blip r:embed="rId207">
+                      <a:extLst>
+                        <a:ext uri="{28A0092B-C50C-407E-A947-70E740481C1C}">
+                          <a14:useLocalDpi xmlns:a14="http://schemas.microsoft.com/office/drawing/2010/main" val="0"/>
+                        </a:ext>
+                      </a:extLst>
+                    </a:blip>
+                    <a:stretch>
+                      <a:fillRect/>
+                    </a:stretch>
+                  </pic:blipFill>
+                  <pic:spPr>
+                    <a:xfrm>
+                      <a:off x="0" y="0"/>
+                      <a:ext cx="4267200" cy="876300"/>
+                    </a:xfrm>
+                    <a:prstGeom prst="rect">
+                      <a:avLst/>
+                    </a:prstGeom>
+                  </pic:spPr>
+                </pic:pic>
+              </a:graphicData>
+            </a:graphic>
+          </wp:anchor>
+        </w:drawing>
+      </w:r>
+    </w:p>
+    <w:p/>
+    <w:p/>
+    <w:p>
+      <w:r>
+        <w:drawing>
+          <wp:anchor distT="0" distB="0" distL="114300" distR="114300" simplePos="0" relativeHeight="251858944" behindDoc="1" locked="0" layoutInCell="1" allowOverlap="1" wp14:anchorId="482522C7">
+            <wp:simplePos x="0" y="0"/>
+            <wp:positionH relativeFrom="column">
+              <wp:posOffset>-346548</wp:posOffset>
+            </wp:positionH>
+            <wp:positionV relativeFrom="paragraph">
+              <wp:posOffset>252597</wp:posOffset>
+            </wp:positionV>
+            <wp:extent cx="2314898" cy="3505689"/>
+            <wp:effectExtent l="0" t="0" r="9525" b="0"/>
+            <wp:wrapTight wrapText="bothSides">
+              <wp:wrapPolygon edited="0">
+                <wp:start x="0" y="0"/>
+                <wp:lineTo x="0" y="21483"/>
+                <wp:lineTo x="21511" y="21483"/>
+                <wp:lineTo x="21511" y="0"/>
+                <wp:lineTo x="0" y="0"/>
+              </wp:wrapPolygon>
+            </wp:wrapTight>
+            <wp:docPr id="195" name="Imagem 195"/>
+            <wp:cNvGraphicFramePr>
+              <a:graphicFrameLocks xmlns:a="http://schemas.openxmlformats.org/drawingml/2006/main" noChangeAspect="1"/>
+            </wp:cNvGraphicFramePr>
+            <a:graphic xmlns:a="http://schemas.openxmlformats.org/drawingml/2006/main">
+              <a:graphicData uri="http://schemas.openxmlformats.org/drawingml/2006/picture">
+                <pic:pic xmlns:pic="http://schemas.openxmlformats.org/drawingml/2006/picture">
+                  <pic:nvPicPr>
+                    <pic:cNvPr id="1" name=""/>
+                    <pic:cNvPicPr/>
+                  </pic:nvPicPr>
+                  <pic:blipFill>
+                    <a:blip r:embed="rId208">
+                      <a:extLst>
+                        <a:ext uri="{28A0092B-C50C-407E-A947-70E740481C1C}">
+                          <a14:useLocalDpi xmlns:a14="http://schemas.microsoft.com/office/drawing/2010/main" val="0"/>
+                        </a:ext>
+                      </a:extLst>
+                    </a:blip>
+                    <a:stretch>
+                      <a:fillRect/>
+                    </a:stretch>
+                  </pic:blipFill>
+                  <pic:spPr>
+                    <a:xfrm>
+                      <a:off x="0" y="0"/>
+                      <a:ext cx="2314898" cy="3505689"/>
+                    </a:xfrm>
+                    <a:prstGeom prst="rect">
+                      <a:avLst/>
+                    </a:prstGeom>
+                  </pic:spPr>
+                </pic:pic>
+              </a:graphicData>
+            </a:graphic>
+          </wp:anchor>
+        </w:drawing>
+      </w:r>
+    </w:p>
+    <w:p/>
+    <w:p/>
+    <w:p/>
+    <w:p/>
+    <w:p/>
+    <w:p/>
+    <w:p/>
+    <w:p/>
+    <w:p/>
+    <w:p/>
+    <w:p/>
+    <w:p/>
+    <w:p>
+      <w:r>
+        <w:lastRenderedPageBreak/>
+        <w:t>130-</w:t>
+      </w:r>
+      <w:r>
+        <w:t xml:space="preserve"> </w:t>
+      </w:r>
+      <w:r>
+        <w:t>Deixando a nossa página do produto responsiva para celular no arquivo produto.css no final colocamos o seguinte código para começar a deixar a nosso pagina pronta para ser visualizada pelo celular.</w:t>
+      </w:r>
+      <w:r>
+        <w:tab/>
+      </w:r>
+    </w:p>
+    <w:p>
+      <w:r>
+        <w:drawing>
+          <wp:anchor distT="0" distB="0" distL="114300" distR="114300" simplePos="0" relativeHeight="251859968" behindDoc="1" locked="0" layoutInCell="1" allowOverlap="1" wp14:anchorId="50C475A8">
+            <wp:simplePos x="0" y="0"/>
+            <wp:positionH relativeFrom="column">
+              <wp:posOffset>-219326</wp:posOffset>
+            </wp:positionH>
+            <wp:positionV relativeFrom="paragraph">
+              <wp:posOffset>30052</wp:posOffset>
+            </wp:positionV>
+            <wp:extent cx="2990850" cy="1247775"/>
+            <wp:effectExtent l="0" t="0" r="0" b="9525"/>
+            <wp:wrapTight wrapText="bothSides">
+              <wp:wrapPolygon edited="0">
+                <wp:start x="0" y="0"/>
+                <wp:lineTo x="0" y="21435"/>
+                <wp:lineTo x="21462" y="21435"/>
+                <wp:lineTo x="21462" y="0"/>
+                <wp:lineTo x="0" y="0"/>
+              </wp:wrapPolygon>
+            </wp:wrapTight>
+            <wp:docPr id="196" name="Imagem 196"/>
+            <wp:cNvGraphicFramePr>
+              <a:graphicFrameLocks xmlns:a="http://schemas.openxmlformats.org/drawingml/2006/main" noChangeAspect="1"/>
+            </wp:cNvGraphicFramePr>
+            <a:graphic xmlns:a="http://schemas.openxmlformats.org/drawingml/2006/main">
+              <a:graphicData uri="http://schemas.openxmlformats.org/drawingml/2006/picture">
+                <pic:pic xmlns:pic="http://schemas.openxmlformats.org/drawingml/2006/picture">
+                  <pic:nvPicPr>
+                    <pic:cNvPr id="1" name=""/>
+                    <pic:cNvPicPr/>
+                  </pic:nvPicPr>
+                  <pic:blipFill>
+                    <a:blip r:embed="rId209">
+                      <a:extLst>
+                        <a:ext uri="{28A0092B-C50C-407E-A947-70E740481C1C}">
+                          <a14:useLocalDpi xmlns:a14="http://schemas.microsoft.com/office/drawing/2010/main" val="0"/>
+                        </a:ext>
+                      </a:extLst>
+                    </a:blip>
+                    <a:stretch>
+                      <a:fillRect/>
+                    </a:stretch>
+                  </pic:blipFill>
+                  <pic:spPr>
+                    <a:xfrm>
+                      <a:off x="0" y="0"/>
+                      <a:ext cx="2990850" cy="1247775"/>
+                    </a:xfrm>
+                    <a:prstGeom prst="rect">
+                      <a:avLst/>
+                    </a:prstGeom>
+                  </pic:spPr>
+                </pic:pic>
+              </a:graphicData>
+            </a:graphic>
+          </wp:anchor>
+        </w:drawing>
+      </w:r>
+    </w:p>
+    <w:p/>
+    <w:p/>
+    <w:p/>
+    <w:p/>
+    <w:p>
+      <w:pPr>
+        <w:rPr>
+          <w:noProof/>
+        </w:rPr>
+      </w:pPr>
+      <w:r>
+        <w:t>131- Centralizamos o logo utilizando o código abaixo:</w:t>
+      </w:r>
+      <w:r>
+        <w:rPr>
+          <w:noProof/>
+        </w:rPr>
+        <w:t xml:space="preserve"> </w:t>
+      </w:r>
+    </w:p>
+    <w:p>
+      <w:r>
+        <w:drawing>
+          <wp:anchor distT="0" distB="0" distL="114300" distR="114300" simplePos="0" relativeHeight="251860992" behindDoc="1" locked="0" layoutInCell="1" allowOverlap="1" wp14:anchorId="3B5B01C6">
+            <wp:simplePos x="0" y="0"/>
+            <wp:positionH relativeFrom="column">
+              <wp:posOffset>-410358</wp:posOffset>
+            </wp:positionH>
+            <wp:positionV relativeFrom="paragraph">
+              <wp:posOffset>176146</wp:posOffset>
+            </wp:positionV>
+            <wp:extent cx="3590925" cy="2600325"/>
+            <wp:effectExtent l="0" t="0" r="9525" b="9525"/>
+            <wp:wrapTight wrapText="bothSides">
+              <wp:wrapPolygon edited="0">
+                <wp:start x="0" y="0"/>
+                <wp:lineTo x="0" y="21521"/>
+                <wp:lineTo x="21543" y="21521"/>
+                <wp:lineTo x="21543" y="0"/>
+                <wp:lineTo x="0" y="0"/>
+              </wp:wrapPolygon>
+            </wp:wrapTight>
+            <wp:docPr id="197" name="Imagem 197"/>
+            <wp:cNvGraphicFramePr>
+              <a:graphicFrameLocks xmlns:a="http://schemas.openxmlformats.org/drawingml/2006/main" noChangeAspect="1"/>
+            </wp:cNvGraphicFramePr>
+            <a:graphic xmlns:a="http://schemas.openxmlformats.org/drawingml/2006/main">
+              <a:graphicData uri="http://schemas.openxmlformats.org/drawingml/2006/picture">
+                <pic:pic xmlns:pic="http://schemas.openxmlformats.org/drawingml/2006/picture">
+                  <pic:nvPicPr>
+                    <pic:cNvPr id="1" name=""/>
+                    <pic:cNvPicPr/>
+                  </pic:nvPicPr>
+                  <pic:blipFill>
+                    <a:blip r:embed="rId210">
+                      <a:extLst>
+                        <a:ext uri="{28A0092B-C50C-407E-A947-70E740481C1C}">
+                          <a14:useLocalDpi xmlns:a14="http://schemas.microsoft.com/office/drawing/2010/main" val="0"/>
+                        </a:ext>
+                      </a:extLst>
+                    </a:blip>
+                    <a:stretch>
+                      <a:fillRect/>
+                    </a:stretch>
+                  </pic:blipFill>
+                  <pic:spPr>
+                    <a:xfrm>
+                      <a:off x="0" y="0"/>
+                      <a:ext cx="3590925" cy="2600325"/>
+                    </a:xfrm>
+                    <a:prstGeom prst="rect">
+                      <a:avLst/>
+                    </a:prstGeom>
+                  </pic:spPr>
+                </pic:pic>
+              </a:graphicData>
+            </a:graphic>
+          </wp:anchor>
+        </w:drawing>
+      </w:r>
+    </w:p>
+    <w:p/>
+    <w:p/>
+    <w:p/>
+    <w:p/>
+    <w:p/>
+    <w:p/>
+    <w:p/>
+    <w:p/>
+    <w:p/>
+    <w:p/>
+    <w:p>
+      <w:r>
+        <w:t>132-</w:t>
+      </w:r>
+      <w:r>
+        <w:t xml:space="preserve"> Para colocar o menu a baixo do logo utilizamos o seguinte código:</w:t>
+      </w:r>
+    </w:p>
+    <w:p/>
+    <w:p>
+      <w:pPr>
+        <w:tabs>
+          <w:tab w:val="left" w:pos="2729"/>
+        </w:tabs>
+      </w:pPr>
+      <w:r>
+        <w:drawing>
+          <wp:anchor distT="0" distB="0" distL="114300" distR="114300" simplePos="0" relativeHeight="251863040" behindDoc="1" locked="0" layoutInCell="1" allowOverlap="1" wp14:anchorId="65117283">
+            <wp:simplePos x="0" y="0"/>
+            <wp:positionH relativeFrom="margin">
+              <wp:posOffset>-137603</wp:posOffset>
+            </wp:positionH>
+            <wp:positionV relativeFrom="paragraph">
+              <wp:posOffset>936521</wp:posOffset>
+            </wp:positionV>
+            <wp:extent cx="2438740" cy="1714739"/>
+            <wp:effectExtent l="0" t="0" r="0" b="0"/>
+            <wp:wrapTight wrapText="bothSides">
+              <wp:wrapPolygon edited="0">
+                <wp:start x="0" y="0"/>
+                <wp:lineTo x="0" y="21360"/>
+                <wp:lineTo x="21431" y="21360"/>
+                <wp:lineTo x="21431" y="0"/>
+                <wp:lineTo x="0" y="0"/>
+              </wp:wrapPolygon>
+            </wp:wrapTight>
+            <wp:docPr id="199" name="Imagem 199"/>
+            <wp:cNvGraphicFramePr>
+              <a:graphicFrameLocks xmlns:a="http://schemas.openxmlformats.org/drawingml/2006/main" noChangeAspect="1"/>
+            </wp:cNvGraphicFramePr>
+            <a:graphic xmlns:a="http://schemas.openxmlformats.org/drawingml/2006/main">
+              <a:graphicData uri="http://schemas.openxmlformats.org/drawingml/2006/picture">
+                <pic:pic xmlns:pic="http://schemas.openxmlformats.org/drawingml/2006/picture">
+                  <pic:nvPicPr>
+                    <pic:cNvPr id="1" name=""/>
+                    <pic:cNvPicPr/>
+                  </pic:nvPicPr>
+                  <pic:blipFill>
+                    <a:blip r:embed="rId211">
+                      <a:extLst>
+                        <a:ext uri="{28A0092B-C50C-407E-A947-70E740481C1C}">
+                          <a14:useLocalDpi xmlns:a14="http://schemas.microsoft.com/office/drawing/2010/main" val="0"/>
+                        </a:ext>
+                      </a:extLst>
+                    </a:blip>
+                    <a:stretch>
+                      <a:fillRect/>
+                    </a:stretch>
+                  </pic:blipFill>
+                  <pic:spPr>
+                    <a:xfrm>
+                      <a:off x="0" y="0"/>
+                      <a:ext cx="2438740" cy="1714739"/>
+                    </a:xfrm>
+                    <a:prstGeom prst="rect">
+                      <a:avLst/>
+                    </a:prstGeom>
+                  </pic:spPr>
+                </pic:pic>
+              </a:graphicData>
+            </a:graphic>
+          </wp:anchor>
+        </w:drawing>
+      </w:r>
+      <w:r>
+        <w:drawing>
+          <wp:anchor distT="0" distB="0" distL="114300" distR="114300" simplePos="0" relativeHeight="251862016" behindDoc="1" locked="0" layoutInCell="1" allowOverlap="1" wp14:anchorId="3F55AE62">
+            <wp:simplePos x="0" y="0"/>
+            <wp:positionH relativeFrom="column">
+              <wp:posOffset>-133054</wp:posOffset>
+            </wp:positionH>
+            <wp:positionV relativeFrom="paragraph">
+              <wp:posOffset>12169</wp:posOffset>
+            </wp:positionV>
+            <wp:extent cx="2533650" cy="876300"/>
+            <wp:effectExtent l="0" t="0" r="0" b="0"/>
+            <wp:wrapTight wrapText="bothSides">
+              <wp:wrapPolygon edited="0">
+                <wp:start x="0" y="0"/>
+                <wp:lineTo x="0" y="21130"/>
+                <wp:lineTo x="21438" y="21130"/>
+                <wp:lineTo x="21438" y="0"/>
+                <wp:lineTo x="0" y="0"/>
+              </wp:wrapPolygon>
+            </wp:wrapTight>
+            <wp:docPr id="198" name="Imagem 198"/>
+            <wp:cNvGraphicFramePr>
+              <a:graphicFrameLocks xmlns:a="http://schemas.openxmlformats.org/drawingml/2006/main" noChangeAspect="1"/>
+            </wp:cNvGraphicFramePr>
+            <a:graphic xmlns:a="http://schemas.openxmlformats.org/drawingml/2006/main">
+              <a:graphicData uri="http://schemas.openxmlformats.org/drawingml/2006/picture">
+                <pic:pic xmlns:pic="http://schemas.openxmlformats.org/drawingml/2006/picture">
+                  <pic:nvPicPr>
+                    <pic:cNvPr id="1" name=""/>
+                    <pic:cNvPicPr/>
+                  </pic:nvPicPr>
+                  <pic:blipFill>
+                    <a:blip r:embed="rId212">
+                      <a:extLst>
+                        <a:ext uri="{28A0092B-C50C-407E-A947-70E740481C1C}">
+                          <a14:useLocalDpi xmlns:a14="http://schemas.microsoft.com/office/drawing/2010/main" val="0"/>
+                        </a:ext>
+                      </a:extLst>
+                    </a:blip>
+                    <a:stretch>
+                      <a:fillRect/>
+                    </a:stretch>
+                  </pic:blipFill>
+                  <pic:spPr>
+                    <a:xfrm>
+                      <a:off x="0" y="0"/>
+                      <a:ext cx="2533650" cy="876300"/>
+                    </a:xfrm>
+                    <a:prstGeom prst="rect">
+                      <a:avLst/>
+                    </a:prstGeom>
+                  </pic:spPr>
+                </pic:pic>
+              </a:graphicData>
+            </a:graphic>
+          </wp:anchor>
+        </w:drawing>
+      </w:r>
+      <w:r>
+        <w:tab/>
+      </w:r>
+    </w:p>
+    <w:p>
+      <w:pPr>
+        <w:jc w:val="center"/>
+      </w:pPr>
+    </w:p>
+    <w:p>
+      <w:pPr>
+        <w:jc w:val="center"/>
+      </w:pPr>
+    </w:p>
+    <w:p>
+      <w:pPr>
+        <w:jc w:val="center"/>
+      </w:pPr>
+    </w:p>
+    <w:p>
+      <w:pPr>
+        <w:jc w:val="center"/>
+      </w:pPr>
+    </w:p>
+    <w:p>
+      <w:pPr>
+        <w:tabs>
+          <w:tab w:val="left" w:pos="184"/>
+        </w:tabs>
+      </w:pPr>
+    </w:p>
+    <w:p>
+      <w:pPr>
+        <w:tabs>
+          <w:tab w:val="left" w:pos="184"/>
+        </w:tabs>
+      </w:pPr>
+    </w:p>
+    <w:p>
+      <w:pPr>
+        <w:tabs>
+          <w:tab w:val="left" w:pos="184"/>
+        </w:tabs>
+      </w:pPr>
+    </w:p>
+    <w:p>
+      <w:pPr>
+        <w:tabs>
+          <w:tab w:val="left" w:pos="184"/>
+        </w:tabs>
+      </w:pPr>
+    </w:p>
+    <w:p>
+      <w:pPr>
+        <w:tabs>
+          <w:tab w:val="left" w:pos="184"/>
+        </w:tabs>
+      </w:pPr>
+    </w:p>
+    <w:p>
+      <w:pPr>
+        <w:tabs>
+          <w:tab w:val="left" w:pos="184"/>
+        </w:tabs>
+      </w:pPr>
+      <w:r>
+        <w:lastRenderedPageBreak/>
+        <w:t>133-</w:t>
+      </w:r>
+      <w:r>
+        <w:t xml:space="preserve"> Para deixar</w:t>
+      </w:r>
+      <w:r>
+        <w:t xml:space="preserve"> os itens do produto responsivos utilizamos o seguinte código:</w:t>
+      </w:r>
+      <w:r>
+        <w:rPr>
+          <w:noProof/>
+        </w:rPr>
+        <w:t xml:space="preserve"> </w:t>
+      </w:r>
+    </w:p>
+    <w:p>
+      <w:pPr>
+        <w:jc w:val="center"/>
+      </w:pPr>
       <w:bookmarkStart w:id="0" w:name="_GoBack"/>
+      <w:r>
+        <w:drawing>
+          <wp:anchor distT="0" distB="0" distL="114300" distR="114300" simplePos="0" relativeHeight="251864064" behindDoc="1" locked="0" layoutInCell="1" allowOverlap="1" wp14:anchorId="18BF8929">
+            <wp:simplePos x="0" y="0"/>
+            <wp:positionH relativeFrom="column">
+              <wp:posOffset>-304180</wp:posOffset>
+            </wp:positionH>
+            <wp:positionV relativeFrom="paragraph">
+              <wp:posOffset>110298</wp:posOffset>
+            </wp:positionV>
+            <wp:extent cx="2971800" cy="2428875"/>
+            <wp:effectExtent l="0" t="0" r="0" b="9525"/>
+            <wp:wrapTight wrapText="bothSides">
+              <wp:wrapPolygon edited="0">
+                <wp:start x="0" y="0"/>
+                <wp:lineTo x="0" y="21515"/>
+                <wp:lineTo x="21462" y="21515"/>
+                <wp:lineTo x="21462" y="0"/>
+                <wp:lineTo x="0" y="0"/>
+              </wp:wrapPolygon>
+            </wp:wrapTight>
+            <wp:docPr id="200" name="Imagem 200"/>
+            <wp:cNvGraphicFramePr>
+              <a:graphicFrameLocks xmlns:a="http://schemas.openxmlformats.org/drawingml/2006/main" noChangeAspect="1"/>
+            </wp:cNvGraphicFramePr>
+            <a:graphic xmlns:a="http://schemas.openxmlformats.org/drawingml/2006/main">
+              <a:graphicData uri="http://schemas.openxmlformats.org/drawingml/2006/picture">
+                <pic:pic xmlns:pic="http://schemas.openxmlformats.org/drawingml/2006/picture">
+                  <pic:nvPicPr>
+                    <pic:cNvPr id="1" name=""/>
+                    <pic:cNvPicPr/>
+                  </pic:nvPicPr>
+                  <pic:blipFill>
+                    <a:blip r:embed="rId213">
+                      <a:extLst>
+                        <a:ext uri="{28A0092B-C50C-407E-A947-70E740481C1C}">
+                          <a14:useLocalDpi xmlns:a14="http://schemas.microsoft.com/office/drawing/2010/main" val="0"/>
+                        </a:ext>
+                      </a:extLst>
+                    </a:blip>
+                    <a:stretch>
+                      <a:fillRect/>
+                    </a:stretch>
+                  </pic:blipFill>
+                  <pic:spPr>
+                    <a:xfrm>
+                      <a:off x="0" y="0"/>
+                      <a:ext cx="2971800" cy="2428875"/>
+                    </a:xfrm>
+                    <a:prstGeom prst="rect">
+                      <a:avLst/>
+                    </a:prstGeom>
+                  </pic:spPr>
+                </pic:pic>
+              </a:graphicData>
+            </a:graphic>
+          </wp:anchor>
+        </w:drawing>
+      </w:r>
       <w:bookmarkEnd w:id="0"/>
     </w:p>
+    <w:p>
+      <w:pPr>
+        <w:jc w:val="center"/>
+      </w:pPr>
+    </w:p>
+    <w:p>
+      <w:pPr>
+        <w:jc w:val="center"/>
+      </w:pPr>
+    </w:p>
     <w:sectPr>
-      <w:footerReference w:type="default" r:id="rId197"/>
+      <w:footerReference w:type="default" r:id="rId214"/>
       <w:pgSz w:w="11906" w:h="16838"/>
       <w:pgMar w:top="1418" w:right="1701" w:bottom="1418" w:left="1701" w:header="709" w:footer="709" w:gutter="0"/>
       <w:cols w:space="708"/>
@@ -23691,6 +25377,95 @@
     </w:lvl>
   </w:abstractNum>
   <w:abstractNum w:abstractNumId="16" w15:restartNumberingAfterBreak="0">
+    <w:nsid w:val="7BD44012"/>
+    <w:multiLevelType w:val="hybridMultilevel"/>
+    <w:tmpl w:val="4DEA9584"/>
+    <w:lvl w:ilvl="0" w:tplc="D70A465A">
+      <w:start w:val="1"/>
+      <w:numFmt w:val="decimal"/>
+      <w:lvlText w:val="%1-"/>
+      <w:lvlJc w:val="left"/>
+      <w:pPr>
+        <w:ind w:left="720" w:hanging="360"/>
+      </w:pPr>
+      <w:rPr>
+        <w:rFonts w:hint="default"/>
+      </w:rPr>
+    </w:lvl>
+    <w:lvl w:ilvl="1" w:tplc="04160019" w:tentative="1">
+      <w:start w:val="1"/>
+      <w:numFmt w:val="lowerLetter"/>
+      <w:lvlText w:val="%2."/>
+      <w:lvlJc w:val="left"/>
+      <w:pPr>
+        <w:ind w:left="1440" w:hanging="360"/>
+      </w:pPr>
+    </w:lvl>
+    <w:lvl w:ilvl="2" w:tplc="0416001B" w:tentative="1">
+      <w:start w:val="1"/>
+      <w:numFmt w:val="lowerRoman"/>
+      <w:lvlText w:val="%3."/>
+      <w:lvlJc w:val="right"/>
+      <w:pPr>
+        <w:ind w:left="2160" w:hanging="180"/>
+      </w:pPr>
+    </w:lvl>
+    <w:lvl w:ilvl="3" w:tplc="0416000F" w:tentative="1">
+      <w:start w:val="1"/>
+      <w:numFmt w:val="decimal"/>
+      <w:lvlText w:val="%4."/>
+      <w:lvlJc w:val="left"/>
+      <w:pPr>
+        <w:ind w:left="2880" w:hanging="360"/>
+      </w:pPr>
+    </w:lvl>
+    <w:lvl w:ilvl="4" w:tplc="04160019" w:tentative="1">
+      <w:start w:val="1"/>
+      <w:numFmt w:val="lowerLetter"/>
+      <w:lvlText w:val="%5."/>
+      <w:lvlJc w:val="left"/>
+      <w:pPr>
+        <w:ind w:left="3600" w:hanging="360"/>
+      </w:pPr>
+    </w:lvl>
+    <w:lvl w:ilvl="5" w:tplc="0416001B" w:tentative="1">
+      <w:start w:val="1"/>
+      <w:numFmt w:val="lowerRoman"/>
+      <w:lvlText w:val="%6."/>
+      <w:lvlJc w:val="right"/>
+      <w:pPr>
+        <w:ind w:left="4320" w:hanging="180"/>
+      </w:pPr>
+    </w:lvl>
+    <w:lvl w:ilvl="6" w:tplc="0416000F" w:tentative="1">
+      <w:start w:val="1"/>
+      <w:numFmt w:val="decimal"/>
+      <w:lvlText w:val="%7."/>
+      <w:lvlJc w:val="left"/>
+      <w:pPr>
+        <w:ind w:left="5040" w:hanging="360"/>
+      </w:pPr>
+    </w:lvl>
+    <w:lvl w:ilvl="7" w:tplc="04160019" w:tentative="1">
+      <w:start w:val="1"/>
+      <w:numFmt w:val="lowerLetter"/>
+      <w:lvlText w:val="%8."/>
+      <w:lvlJc w:val="left"/>
+      <w:pPr>
+        <w:ind w:left="5760" w:hanging="360"/>
+      </w:pPr>
+    </w:lvl>
+    <w:lvl w:ilvl="8" w:tplc="0416001B" w:tentative="1">
+      <w:start w:val="1"/>
+      <w:numFmt w:val="lowerRoman"/>
+      <w:lvlText w:val="%9."/>
+      <w:lvlJc w:val="right"/>
+      <w:pPr>
+        <w:ind w:left="6480" w:hanging="180"/>
+      </w:pPr>
+    </w:lvl>
+  </w:abstractNum>
+  <w:abstractNum w:abstractNumId="17" w15:restartNumberingAfterBreak="0">
     <w:nsid w:val="7E3921C8"/>
     <w:multiLevelType w:val="hybridMultilevel"/>
     <w:tmpl w:val="68D678A0"/>
@@ -23803,7 +25578,7 @@
       </w:rPr>
     </w:lvl>
   </w:abstractNum>
-  <w:abstractNum w:abstractNumId="17" w15:restartNumberingAfterBreak="0">
+  <w:abstractNum w:abstractNumId="18" w15:restartNumberingAfterBreak="0">
     <w:nsid w:val="7EDD3EB0"/>
     <w:multiLevelType w:val="hybridMultilevel"/>
     <w:tmpl w:val="2ACE7D7E"/>
@@ -23916,7 +25691,7 @@
       </w:rPr>
     </w:lvl>
   </w:abstractNum>
-  <w:abstractNum w:abstractNumId="18" w15:restartNumberingAfterBreak="0">
+  <w:abstractNum w:abstractNumId="19" w15:restartNumberingAfterBreak="0">
     <w:nsid w:val="7EFE27EB"/>
     <w:multiLevelType w:val="hybridMultilevel"/>
     <w:tmpl w:val="48A8C2E4"/>
@@ -24033,7 +25808,7 @@
     <w:abstractNumId w:val="7"/>
   </w:num>
   <w:num w:numId="2">
-    <w:abstractNumId w:val="16"/>
+    <w:abstractNumId w:val="17"/>
   </w:num>
   <w:num w:numId="3">
     <w:abstractNumId w:val="5"/>
@@ -24054,7 +25829,7 @@
     <w:abstractNumId w:val="1"/>
   </w:num>
   <w:num w:numId="9">
-    <w:abstractNumId w:val="17"/>
+    <w:abstractNumId w:val="18"/>
   </w:num>
   <w:num w:numId="10">
     <w:abstractNumId w:val="3"/>
@@ -24063,7 +25838,7 @@
     <w:abstractNumId w:val="15"/>
   </w:num>
   <w:num w:numId="12">
-    <w:abstractNumId w:val="18"/>
+    <w:abstractNumId w:val="19"/>
   </w:num>
   <w:num w:numId="13">
     <w:abstractNumId w:val="11"/>
@@ -24085,6 +25860,9 @@
   </w:num>
   <w:num w:numId="19">
     <w:abstractNumId w:val="9"/>
+  </w:num>
+  <w:num w:numId="20">
+    <w:abstractNumId w:val="16"/>
   </w:num>
 </w:numbering>
 </file>
@@ -24895,7 +26673,7 @@
 </file>
 
 <file path=customXml/itemProps1.xml><?xml version="1.0" encoding="utf-8"?>
-<ds:datastoreItem xmlns:ds="http://schemas.openxmlformats.org/officeDocument/2006/customXml" ds:itemID="{C9F7780D-DE23-4A1C-AA11-D8618B7C3303}">
+<ds:datastoreItem xmlns:ds="http://schemas.openxmlformats.org/officeDocument/2006/customXml" ds:itemID="{3F8BE591-04BD-46BF-A282-63187D07B558}">
   <ds:schemaRefs>
     <ds:schemaRef ds:uri="http://schemas.openxmlformats.org/officeDocument/2006/bibliography"/>
   </ds:schemaRefs>

</xml_diff>

<commit_message>
atulização da aula dia 15/10/2026
</commit_message>
<xml_diff>
--- a/apostila/Projeto Space For Men.docx
+++ b/apostila/Projeto Space For Men.docx
@@ -22946,6 +22946,9 @@
     <w:p/>
     <w:p>
       <w:r>
+        <w:rPr>
+          <w:noProof/>
+        </w:rPr>
         <w:drawing>
           <wp:anchor distT="0" distB="0" distL="114300" distR="114300" simplePos="0" relativeHeight="251857920" behindDoc="1" locked="0" layoutInCell="1" allowOverlap="1" wp14:anchorId="04135376">
             <wp:simplePos x="0" y="0"/>
@@ -23009,6 +23012,9 @@
     <w:p/>
     <w:p>
       <w:r>
+        <w:rPr>
+          <w:noProof/>
+        </w:rPr>
         <w:drawing>
           <wp:anchor distT="0" distB="0" distL="114300" distR="114300" simplePos="0" relativeHeight="251858944" behindDoc="1" locked="0" layoutInCell="1" allowOverlap="1" wp14:anchorId="482522C7">
             <wp:simplePos x="0" y="0"/>
@@ -23097,6 +23103,9 @@
     </w:p>
     <w:p>
       <w:r>
+        <w:rPr>
+          <w:noProof/>
+        </w:rPr>
         <w:drawing>
           <wp:anchor distT="0" distB="0" distL="114300" distR="114300" simplePos="0" relativeHeight="251859968" behindDoc="1" locked="0" layoutInCell="1" allowOverlap="1" wp14:anchorId="50C475A8">
             <wp:simplePos x="0" y="0"/>
@@ -23178,6 +23187,9 @@
     </w:p>
     <w:p>
       <w:r>
+        <w:rPr>
+          <w:noProof/>
+        </w:rPr>
         <w:drawing>
           <wp:anchor distT="0" distB="0" distL="114300" distR="114300" simplePos="0" relativeHeight="251860992" behindDoc="1" locked="0" layoutInCell="1" allowOverlap="1" wp14:anchorId="3B5B01C6">
             <wp:simplePos x="0" y="0"/>
@@ -23263,6 +23275,9 @@
         </w:tabs>
       </w:pPr>
       <w:r>
+        <w:rPr>
+          <w:noProof/>
+        </w:rPr>
         <w:drawing>
           <wp:anchor distT="0" distB="0" distL="114300" distR="114300" simplePos="0" relativeHeight="251863040" behindDoc="1" locked="0" layoutInCell="1" allowOverlap="1" wp14:anchorId="65117283">
             <wp:simplePos x="0" y="0"/>
@@ -23322,6 +23337,9 @@
         </w:drawing>
       </w:r>
       <w:r>
+        <w:rPr>
+          <w:noProof/>
+        </w:rPr>
         <w:drawing>
           <wp:anchor distT="0" distB="0" distL="114300" distR="114300" simplePos="0" relativeHeight="251862016" behindDoc="1" locked="0" layoutInCell="1" allowOverlap="1" wp14:anchorId="3F55AE62">
             <wp:simplePos x="0" y="0"/>
@@ -23444,6 +23462,9 @@
         <w:tabs>
           <w:tab w:val="left" w:pos="184"/>
         </w:tabs>
+        <w:rPr>
+          <w:noProof/>
+        </w:rPr>
       </w:pPr>
       <w:r>
         <w:lastRenderedPageBreak/>
@@ -23455,19 +23476,15 @@
       <w:r>
         <w:t xml:space="preserve"> os itens do produto responsivos utilizamos o seguinte código:</w:t>
       </w:r>
-      <w:r>
-        <w:rPr>
-          <w:noProof/>
-        </w:rPr>
-        <w:t xml:space="preserve"> </w:t>
-      </w:r>
     </w:p>
     <w:p>
       <w:pPr>
         <w:jc w:val="center"/>
       </w:pPr>
-      <w:bookmarkStart w:id="0" w:name="_GoBack"/>
-      <w:r>
+      <w:r>
+        <w:rPr>
+          <w:noProof/>
+        </w:rPr>
         <w:drawing>
           <wp:anchor distT="0" distB="0" distL="114300" distR="114300" simplePos="0" relativeHeight="251864064" behindDoc="1" locked="0" layoutInCell="1" allowOverlap="1" wp14:anchorId="18BF8929">
             <wp:simplePos x="0" y="0"/>
@@ -23526,20 +23543,748 @@
           </wp:anchor>
         </w:drawing>
       </w:r>
+    </w:p>
+    <w:p>
+      <w:pPr>
+        <w:jc w:val="center"/>
+      </w:pPr>
+    </w:p>
+    <w:p>
+      <w:pPr>
+        <w:tabs>
+          <w:tab w:val="left" w:pos="218"/>
+        </w:tabs>
+      </w:pPr>
+    </w:p>
+    <w:p>
+      <w:pPr>
+        <w:tabs>
+          <w:tab w:val="left" w:pos="218"/>
+        </w:tabs>
+      </w:pPr>
+    </w:p>
+    <w:p>
+      <w:pPr>
+        <w:tabs>
+          <w:tab w:val="left" w:pos="218"/>
+        </w:tabs>
+      </w:pPr>
+    </w:p>
+    <w:p>
+      <w:pPr>
+        <w:tabs>
+          <w:tab w:val="left" w:pos="218"/>
+        </w:tabs>
+      </w:pPr>
+    </w:p>
+    <w:p>
+      <w:pPr>
+        <w:tabs>
+          <w:tab w:val="left" w:pos="218"/>
+        </w:tabs>
+      </w:pPr>
+    </w:p>
+    <w:p>
+      <w:pPr>
+        <w:tabs>
+          <w:tab w:val="left" w:pos="218"/>
+        </w:tabs>
+      </w:pPr>
+    </w:p>
+    <w:p>
+      <w:pPr>
+        <w:tabs>
+          <w:tab w:val="left" w:pos="218"/>
+        </w:tabs>
+      </w:pPr>
+    </w:p>
+    <w:p>
+      <w:pPr>
+        <w:tabs>
+          <w:tab w:val="left" w:pos="218"/>
+        </w:tabs>
+      </w:pPr>
+    </w:p>
+    <w:p>
+      <w:pPr>
+        <w:tabs>
+          <w:tab w:val="left" w:pos="218"/>
+        </w:tabs>
+      </w:pPr>
+    </w:p>
+    <w:p>
+      <w:pPr>
+        <w:tabs>
+          <w:tab w:val="left" w:pos="218"/>
+        </w:tabs>
+      </w:pPr>
+      <w:r>
+        <w:t>134-</w:t>
+      </w:r>
+      <w:r>
+        <w:t xml:space="preserve"> Deixamos a página do contato responsiva para celular utilizando os </w:t>
+      </w:r>
+      <w:proofErr w:type="gramStart"/>
+      <w:r>
+        <w:t>seguintes códig</w:t>
+      </w:r>
+      <w:r>
+        <w:t>o</w:t>
+      </w:r>
+      <w:proofErr w:type="gramEnd"/>
+      <w:r>
+        <w:t>:</w:t>
+      </w:r>
+    </w:p>
+    <w:p>
+      <w:pPr>
+        <w:pStyle w:val="PargrafodaLista"/>
+        <w:numPr>
+          <w:ilvl w:val="0"/>
+          <w:numId w:val="22"/>
+        </w:numPr>
+        <w:tabs>
+          <w:tab w:val="left" w:pos="218"/>
+        </w:tabs>
+      </w:pPr>
+      <w:r>
+        <w:drawing>
+          <wp:anchor distT="0" distB="0" distL="114300" distR="114300" simplePos="0" relativeHeight="251865088" behindDoc="1" locked="0" layoutInCell="1" allowOverlap="1" wp14:anchorId="48263D8E">
+            <wp:simplePos x="0" y="0"/>
+            <wp:positionH relativeFrom="column">
+              <wp:posOffset>-357357</wp:posOffset>
+            </wp:positionH>
+            <wp:positionV relativeFrom="paragraph">
+              <wp:posOffset>317707</wp:posOffset>
+            </wp:positionV>
+            <wp:extent cx="3324225" cy="2419350"/>
+            <wp:effectExtent l="0" t="0" r="9525" b="0"/>
+            <wp:wrapTight wrapText="bothSides">
+              <wp:wrapPolygon edited="0">
+                <wp:start x="0" y="0"/>
+                <wp:lineTo x="0" y="21430"/>
+                <wp:lineTo x="21538" y="21430"/>
+                <wp:lineTo x="21538" y="0"/>
+                <wp:lineTo x="0" y="0"/>
+              </wp:wrapPolygon>
+            </wp:wrapTight>
+            <wp:docPr id="201" name="Imagem 201"/>
+            <wp:cNvGraphicFramePr>
+              <a:graphicFrameLocks xmlns:a="http://schemas.openxmlformats.org/drawingml/2006/main" noChangeAspect="1"/>
+            </wp:cNvGraphicFramePr>
+            <a:graphic xmlns:a="http://schemas.openxmlformats.org/drawingml/2006/main">
+              <a:graphicData uri="http://schemas.openxmlformats.org/drawingml/2006/picture">
+                <pic:pic xmlns:pic="http://schemas.openxmlformats.org/drawingml/2006/picture">
+                  <pic:nvPicPr>
+                    <pic:cNvPr id="1" name=""/>
+                    <pic:cNvPicPr/>
+                  </pic:nvPicPr>
+                  <pic:blipFill>
+                    <a:blip r:embed="rId214">
+                      <a:extLst>
+                        <a:ext uri="{28A0092B-C50C-407E-A947-70E740481C1C}">
+                          <a14:useLocalDpi xmlns:a14="http://schemas.microsoft.com/office/drawing/2010/main" val="0"/>
+                        </a:ext>
+                      </a:extLst>
+                    </a:blip>
+                    <a:stretch>
+                      <a:fillRect/>
+                    </a:stretch>
+                  </pic:blipFill>
+                  <pic:spPr>
+                    <a:xfrm>
+                      <a:off x="0" y="0"/>
+                      <a:ext cx="3324225" cy="2419350"/>
+                    </a:xfrm>
+                    <a:prstGeom prst="rect">
+                      <a:avLst/>
+                    </a:prstGeom>
+                  </pic:spPr>
+                </pic:pic>
+              </a:graphicData>
+            </a:graphic>
+          </wp:anchor>
+        </w:drawing>
+      </w:r>
+      <w:r>
+        <w:t>Menu do contato</w:t>
+      </w:r>
+    </w:p>
+    <w:p>
+      <w:pPr>
+        <w:tabs>
+          <w:tab w:val="left" w:pos="218"/>
+        </w:tabs>
+      </w:pPr>
+    </w:p>
+    <w:p>
+      <w:pPr>
+        <w:tabs>
+          <w:tab w:val="left" w:pos="218"/>
+        </w:tabs>
+      </w:pPr>
+    </w:p>
+    <w:p>
+      <w:pPr>
+        <w:tabs>
+          <w:tab w:val="left" w:pos="218"/>
+        </w:tabs>
+      </w:pPr>
+    </w:p>
+    <w:p>
+      <w:pPr>
+        <w:tabs>
+          <w:tab w:val="left" w:pos="218"/>
+        </w:tabs>
+        <w:jc w:val="both"/>
+      </w:pPr>
+    </w:p>
+    <w:p>
+      <w:pPr>
+        <w:tabs>
+          <w:tab w:val="left" w:pos="218"/>
+        </w:tabs>
+        <w:jc w:val="both"/>
+      </w:pPr>
+    </w:p>
+    <w:p>
+      <w:pPr>
+        <w:tabs>
+          <w:tab w:val="left" w:pos="218"/>
+        </w:tabs>
+        <w:jc w:val="both"/>
+      </w:pPr>
+    </w:p>
+    <w:p>
+      <w:pPr>
+        <w:tabs>
+          <w:tab w:val="left" w:pos="218"/>
+        </w:tabs>
+        <w:jc w:val="both"/>
+      </w:pPr>
+    </w:p>
+    <w:p>
+      <w:pPr>
+        <w:tabs>
+          <w:tab w:val="left" w:pos="218"/>
+        </w:tabs>
+        <w:jc w:val="both"/>
+      </w:pPr>
+    </w:p>
+    <w:p>
+      <w:pPr>
+        <w:tabs>
+          <w:tab w:val="left" w:pos="218"/>
+        </w:tabs>
+        <w:jc w:val="both"/>
+      </w:pPr>
+    </w:p>
+    <w:p>
+      <w:pPr>
+        <w:tabs>
+          <w:tab w:val="left" w:pos="218"/>
+        </w:tabs>
+        <w:jc w:val="both"/>
+      </w:pPr>
+      <w:r>
+        <w:t xml:space="preserve">No </w:t>
+      </w:r>
+      <w:proofErr w:type="spellStart"/>
+      <w:r>
+        <w:t>main</w:t>
+      </w:r>
+      <w:proofErr w:type="spellEnd"/>
+      <w:r>
+        <w:t xml:space="preserve"> colocamos a largura seja automática para cada tamanho do celular </w:t>
+      </w:r>
+    </w:p>
+    <w:p>
+      <w:pPr>
+        <w:tabs>
+          <w:tab w:val="left" w:pos="218"/>
+        </w:tabs>
+        <w:jc w:val="both"/>
+        <w:rPr>
+          <w:noProof/>
+        </w:rPr>
+      </w:pPr>
+      <w:r>
+        <w:drawing>
+          <wp:anchor distT="0" distB="0" distL="114300" distR="114300" simplePos="0" relativeHeight="251866112" behindDoc="1" locked="0" layoutInCell="1" allowOverlap="1" wp14:anchorId="7F61F778">
+            <wp:simplePos x="0" y="0"/>
+            <wp:positionH relativeFrom="column">
+              <wp:posOffset>-70544</wp:posOffset>
+            </wp:positionH>
+            <wp:positionV relativeFrom="paragraph">
+              <wp:posOffset>358967</wp:posOffset>
+            </wp:positionV>
+            <wp:extent cx="2181225" cy="971550"/>
+            <wp:effectExtent l="0" t="0" r="9525" b="0"/>
+            <wp:wrapTight wrapText="bothSides">
+              <wp:wrapPolygon edited="0">
+                <wp:start x="0" y="0"/>
+                <wp:lineTo x="0" y="21176"/>
+                <wp:lineTo x="21506" y="21176"/>
+                <wp:lineTo x="21506" y="0"/>
+                <wp:lineTo x="0" y="0"/>
+              </wp:wrapPolygon>
+            </wp:wrapTight>
+            <wp:docPr id="202" name="Imagem 202"/>
+            <wp:cNvGraphicFramePr>
+              <a:graphicFrameLocks xmlns:a="http://schemas.openxmlformats.org/drawingml/2006/main" noChangeAspect="1"/>
+            </wp:cNvGraphicFramePr>
+            <a:graphic xmlns:a="http://schemas.openxmlformats.org/drawingml/2006/main">
+              <a:graphicData uri="http://schemas.openxmlformats.org/drawingml/2006/picture">
+                <pic:pic xmlns:pic="http://schemas.openxmlformats.org/drawingml/2006/picture">
+                  <pic:nvPicPr>
+                    <pic:cNvPr id="1" name=""/>
+                    <pic:cNvPicPr/>
+                  </pic:nvPicPr>
+                  <pic:blipFill>
+                    <a:blip r:embed="rId215">
+                      <a:extLst>
+                        <a:ext uri="{28A0092B-C50C-407E-A947-70E740481C1C}">
+                          <a14:useLocalDpi xmlns:a14="http://schemas.microsoft.com/office/drawing/2010/main" val="0"/>
+                        </a:ext>
+                      </a:extLst>
+                    </a:blip>
+                    <a:stretch>
+                      <a:fillRect/>
+                    </a:stretch>
+                  </pic:blipFill>
+                  <pic:spPr>
+                    <a:xfrm>
+                      <a:off x="0" y="0"/>
+                      <a:ext cx="2181225" cy="971550"/>
+                    </a:xfrm>
+                    <a:prstGeom prst="rect">
+                      <a:avLst/>
+                    </a:prstGeom>
+                  </pic:spPr>
+                </pic:pic>
+              </a:graphicData>
+            </a:graphic>
+          </wp:anchor>
+        </w:drawing>
+      </w:r>
+      <w:r>
+        <w:t>E demos um espaço para esquerda.</w:t>
+      </w:r>
+      <w:r>
+        <w:rPr>
+          <w:noProof/>
+        </w:rPr>
+        <w:t xml:space="preserve"> </w:t>
+      </w:r>
+    </w:p>
+    <w:p>
+      <w:pPr>
+        <w:tabs>
+          <w:tab w:val="left" w:pos="218"/>
+        </w:tabs>
+        <w:jc w:val="both"/>
+      </w:pPr>
+    </w:p>
+    <w:p>
+      <w:pPr>
+        <w:tabs>
+          <w:tab w:val="left" w:pos="218"/>
+        </w:tabs>
+        <w:jc w:val="both"/>
+      </w:pPr>
+    </w:p>
+    <w:p>
+      <w:pPr>
+        <w:tabs>
+          <w:tab w:val="left" w:pos="218"/>
+        </w:tabs>
+        <w:jc w:val="both"/>
+      </w:pPr>
+    </w:p>
+    <w:p>
+      <w:pPr>
+        <w:tabs>
+          <w:tab w:val="left" w:pos="218"/>
+        </w:tabs>
+        <w:jc w:val="both"/>
+      </w:pPr>
+    </w:p>
+    <w:p>
+      <w:pPr>
+        <w:tabs>
+          <w:tab w:val="left" w:pos="218"/>
+        </w:tabs>
+        <w:jc w:val="both"/>
+      </w:pPr>
+    </w:p>
+    <w:p>
+      <w:pPr>
+        <w:tabs>
+          <w:tab w:val="left" w:pos="218"/>
+        </w:tabs>
+        <w:jc w:val="both"/>
+      </w:pPr>
+    </w:p>
+    <w:p>
+      <w:pPr>
+        <w:tabs>
+          <w:tab w:val="left" w:pos="218"/>
+        </w:tabs>
+        <w:jc w:val="both"/>
+      </w:pPr>
+      <w:r>
+        <w:lastRenderedPageBreak/>
+        <w:t>Nos inputs demos uma largura de 90% e um espaço interno de 10px para todos os lado</w:t>
+      </w:r>
+      <w:r>
+        <w:t>s</w:t>
+      </w:r>
+      <w:r>
+        <w:t>.</w:t>
+      </w:r>
+    </w:p>
+    <w:p>
+      <w:pPr>
+        <w:tabs>
+          <w:tab w:val="left" w:pos="218"/>
+        </w:tabs>
+        <w:jc w:val="both"/>
+      </w:pPr>
+      <w:r>
+        <w:drawing>
+          <wp:anchor distT="0" distB="0" distL="114300" distR="114300" simplePos="0" relativeHeight="251867136" behindDoc="1" locked="0" layoutInCell="1" allowOverlap="1" wp14:anchorId="39EBE94F">
+            <wp:simplePos x="0" y="0"/>
+            <wp:positionH relativeFrom="margin">
+              <wp:align>left</wp:align>
+            </wp:positionH>
+            <wp:positionV relativeFrom="paragraph">
+              <wp:posOffset>206877</wp:posOffset>
+            </wp:positionV>
+            <wp:extent cx="2095792" cy="905001"/>
+            <wp:effectExtent l="0" t="0" r="0" b="9525"/>
+            <wp:wrapTight wrapText="bothSides">
+              <wp:wrapPolygon edited="0">
+                <wp:start x="0" y="0"/>
+                <wp:lineTo x="0" y="21373"/>
+                <wp:lineTo x="21404" y="21373"/>
+                <wp:lineTo x="21404" y="0"/>
+                <wp:lineTo x="0" y="0"/>
+              </wp:wrapPolygon>
+            </wp:wrapTight>
+            <wp:docPr id="203" name="Imagem 203"/>
+            <wp:cNvGraphicFramePr>
+              <a:graphicFrameLocks xmlns:a="http://schemas.openxmlformats.org/drawingml/2006/main" noChangeAspect="1"/>
+            </wp:cNvGraphicFramePr>
+            <a:graphic xmlns:a="http://schemas.openxmlformats.org/drawingml/2006/main">
+              <a:graphicData uri="http://schemas.openxmlformats.org/drawingml/2006/picture">
+                <pic:pic xmlns:pic="http://schemas.openxmlformats.org/drawingml/2006/picture">
+                  <pic:nvPicPr>
+                    <pic:cNvPr id="1" name=""/>
+                    <pic:cNvPicPr/>
+                  </pic:nvPicPr>
+                  <pic:blipFill>
+                    <a:blip r:embed="rId216">
+                      <a:extLst>
+                        <a:ext uri="{28A0092B-C50C-407E-A947-70E740481C1C}">
+                          <a14:useLocalDpi xmlns:a14="http://schemas.microsoft.com/office/drawing/2010/main" val="0"/>
+                        </a:ext>
+                      </a:extLst>
+                    </a:blip>
+                    <a:stretch>
+                      <a:fillRect/>
+                    </a:stretch>
+                  </pic:blipFill>
+                  <pic:spPr>
+                    <a:xfrm>
+                      <a:off x="0" y="0"/>
+                      <a:ext cx="2095792" cy="905001"/>
+                    </a:xfrm>
+                    <a:prstGeom prst="rect">
+                      <a:avLst/>
+                    </a:prstGeom>
+                  </pic:spPr>
+                </pic:pic>
+              </a:graphicData>
+            </a:graphic>
+          </wp:anchor>
+        </w:drawing>
+      </w:r>
+    </w:p>
+    <w:p>
+      <w:pPr>
+        <w:tabs>
+          <w:tab w:val="left" w:pos="218"/>
+        </w:tabs>
+        <w:jc w:val="both"/>
+      </w:pPr>
+    </w:p>
+    <w:p>
+      <w:pPr>
+        <w:tabs>
+          <w:tab w:val="left" w:pos="218"/>
+        </w:tabs>
+        <w:jc w:val="both"/>
+      </w:pPr>
+    </w:p>
+    <w:p>
+      <w:pPr>
+        <w:tabs>
+          <w:tab w:val="left" w:pos="218"/>
+        </w:tabs>
+        <w:jc w:val="both"/>
+      </w:pPr>
+    </w:p>
+    <w:p>
+      <w:pPr>
+        <w:tabs>
+          <w:tab w:val="left" w:pos="218"/>
+        </w:tabs>
+        <w:jc w:val="both"/>
+      </w:pPr>
+    </w:p>
+    <w:p>
+      <w:pPr>
+        <w:tabs>
+          <w:tab w:val="left" w:pos="218"/>
+        </w:tabs>
+        <w:jc w:val="both"/>
+      </w:pPr>
+      <w:r>
+        <w:drawing>
+          <wp:anchor distT="0" distB="0" distL="114300" distR="114300" simplePos="0" relativeHeight="251868160" behindDoc="1" locked="0" layoutInCell="1" allowOverlap="1" wp14:anchorId="0A0E024F">
+            <wp:simplePos x="0" y="0"/>
+            <wp:positionH relativeFrom="column">
+              <wp:posOffset>13704</wp:posOffset>
+            </wp:positionH>
+            <wp:positionV relativeFrom="paragraph">
+              <wp:posOffset>384042</wp:posOffset>
+            </wp:positionV>
+            <wp:extent cx="2085975" cy="1076325"/>
+            <wp:effectExtent l="0" t="0" r="9525" b="9525"/>
+            <wp:wrapTight wrapText="bothSides">
+              <wp:wrapPolygon edited="0">
+                <wp:start x="0" y="0"/>
+                <wp:lineTo x="0" y="21409"/>
+                <wp:lineTo x="21501" y="21409"/>
+                <wp:lineTo x="21501" y="0"/>
+                <wp:lineTo x="0" y="0"/>
+              </wp:wrapPolygon>
+            </wp:wrapTight>
+            <wp:docPr id="204" name="Imagem 204"/>
+            <wp:cNvGraphicFramePr>
+              <a:graphicFrameLocks xmlns:a="http://schemas.openxmlformats.org/drawingml/2006/main" noChangeAspect="1"/>
+            </wp:cNvGraphicFramePr>
+            <a:graphic xmlns:a="http://schemas.openxmlformats.org/drawingml/2006/main">
+              <a:graphicData uri="http://schemas.openxmlformats.org/drawingml/2006/picture">
+                <pic:pic xmlns:pic="http://schemas.openxmlformats.org/drawingml/2006/picture">
+                  <pic:nvPicPr>
+                    <pic:cNvPr id="1" name=""/>
+                    <pic:cNvPicPr/>
+                  </pic:nvPicPr>
+                  <pic:blipFill>
+                    <a:blip r:embed="rId217">
+                      <a:extLst>
+                        <a:ext uri="{28A0092B-C50C-407E-A947-70E740481C1C}">
+                          <a14:useLocalDpi xmlns:a14="http://schemas.microsoft.com/office/drawing/2010/main" val="0"/>
+                        </a:ext>
+                      </a:extLst>
+                    </a:blip>
+                    <a:stretch>
+                      <a:fillRect/>
+                    </a:stretch>
+                  </pic:blipFill>
+                  <pic:spPr>
+                    <a:xfrm>
+                      <a:off x="0" y="0"/>
+                      <a:ext cx="2085975" cy="1076325"/>
+                    </a:xfrm>
+                    <a:prstGeom prst="rect">
+                      <a:avLst/>
+                    </a:prstGeom>
+                  </pic:spPr>
+                </pic:pic>
+              </a:graphicData>
+            </a:graphic>
+          </wp:anchor>
+        </w:drawing>
+      </w:r>
+      <w:r>
+        <w:t>E no botão enviar</w:t>
+      </w:r>
+      <w:r>
+        <w:t xml:space="preserve"> ficou da seguinte forma:</w:t>
+      </w:r>
+    </w:p>
+    <w:p>
+      <w:pPr>
+        <w:tabs>
+          <w:tab w:val="left" w:pos="218"/>
+        </w:tabs>
+        <w:jc w:val="both"/>
+        <w:rPr>
+          <w:noProof/>
+        </w:rPr>
+      </w:pPr>
+    </w:p>
+    <w:p>
+      <w:pPr>
+        <w:tabs>
+          <w:tab w:val="left" w:pos="218"/>
+        </w:tabs>
+        <w:jc w:val="both"/>
+        <w:rPr>
+          <w:noProof/>
+        </w:rPr>
+      </w:pPr>
+    </w:p>
+    <w:p>
+      <w:pPr>
+        <w:tabs>
+          <w:tab w:val="left" w:pos="218"/>
+        </w:tabs>
+        <w:jc w:val="both"/>
+        <w:rPr>
+          <w:noProof/>
+        </w:rPr>
+      </w:pPr>
+    </w:p>
+    <w:p>
+      <w:pPr>
+        <w:tabs>
+          <w:tab w:val="left" w:pos="218"/>
+        </w:tabs>
+        <w:jc w:val="both"/>
+        <w:rPr>
+          <w:noProof/>
+        </w:rPr>
+      </w:pPr>
+    </w:p>
+    <w:p>
+      <w:pPr>
+        <w:tabs>
+          <w:tab w:val="left" w:pos="218"/>
+        </w:tabs>
+        <w:jc w:val="both"/>
+        <w:rPr>
+          <w:noProof/>
+        </w:rPr>
+      </w:pPr>
+    </w:p>
+    <w:p>
+      <w:pPr>
+        <w:tabs>
+          <w:tab w:val="left" w:pos="218"/>
+        </w:tabs>
+        <w:jc w:val="both"/>
+      </w:pPr>
+      <w:r>
+        <w:rPr>
+          <w:noProof/>
+        </w:rPr>
+        <w:drawing>
+          <wp:anchor distT="0" distB="0" distL="114300" distR="114300" simplePos="0" relativeHeight="251869184" behindDoc="1" locked="0" layoutInCell="1" allowOverlap="1" wp14:anchorId="04A68F17">
+            <wp:simplePos x="0" y="0"/>
+            <wp:positionH relativeFrom="column">
+              <wp:posOffset>-198223</wp:posOffset>
+            </wp:positionH>
+            <wp:positionV relativeFrom="paragraph">
+              <wp:posOffset>455930</wp:posOffset>
+            </wp:positionV>
+            <wp:extent cx="2867025" cy="4744085"/>
+            <wp:effectExtent l="0" t="0" r="9525" b="0"/>
+            <wp:wrapTight wrapText="bothSides">
+              <wp:wrapPolygon edited="0">
+                <wp:start x="0" y="0"/>
+                <wp:lineTo x="0" y="21510"/>
+                <wp:lineTo x="21528" y="21510"/>
+                <wp:lineTo x="21528" y="0"/>
+                <wp:lineTo x="0" y="0"/>
+              </wp:wrapPolygon>
+            </wp:wrapTight>
+            <wp:docPr id="205" name="Imagem 205"/>
+            <wp:cNvGraphicFramePr>
+              <a:graphicFrameLocks xmlns:a="http://schemas.openxmlformats.org/drawingml/2006/main" noChangeAspect="1"/>
+            </wp:cNvGraphicFramePr>
+            <a:graphic xmlns:a="http://schemas.openxmlformats.org/drawingml/2006/main">
+              <a:graphicData uri="http://schemas.openxmlformats.org/drawingml/2006/picture">
+                <pic:pic xmlns:pic="http://schemas.openxmlformats.org/drawingml/2006/picture">
+                  <pic:nvPicPr>
+                    <pic:cNvPr id="1" name=""/>
+                    <pic:cNvPicPr/>
+                  </pic:nvPicPr>
+                  <pic:blipFill>
+                    <a:blip r:embed="rId218">
+                      <a:extLst>
+                        <a:ext uri="{28A0092B-C50C-407E-A947-70E740481C1C}">
+                          <a14:useLocalDpi xmlns:a14="http://schemas.microsoft.com/office/drawing/2010/main" val="0"/>
+                        </a:ext>
+                      </a:extLst>
+                    </a:blip>
+                    <a:stretch>
+                      <a:fillRect/>
+                    </a:stretch>
+                  </pic:blipFill>
+                  <pic:spPr>
+                    <a:xfrm>
+                      <a:off x="0" y="0"/>
+                      <a:ext cx="2867025" cy="4744085"/>
+                    </a:xfrm>
+                    <a:prstGeom prst="rect">
+                      <a:avLst/>
+                    </a:prstGeom>
+                  </pic:spPr>
+                </pic:pic>
+              </a:graphicData>
+            </a:graphic>
+          </wp:anchor>
+        </w:drawing>
+      </w:r>
+      <w:r>
+        <w:rPr>
+          <w:noProof/>
+        </w:rPr>
+        <w:t>Código interio ficou da seguinte forma:</w:t>
+      </w:r>
+    </w:p>
+    <w:p/>
+    <w:p/>
+    <w:p/>
+    <w:p/>
+    <w:p/>
+    <w:p/>
+    <w:p/>
+    <w:p/>
+    <w:p/>
+    <w:p/>
+    <w:p/>
+    <w:p/>
+    <w:p/>
+    <w:p/>
+    <w:p/>
+    <w:p/>
+    <w:p/>
+    <w:p/>
+    <w:p>
+      <w:r>
+        <w:lastRenderedPageBreak/>
+        <w:t xml:space="preserve">135- Como </w:t>
+      </w:r>
+      <w:r>
+        <w:t xml:space="preserve">hospedar o site e criar uma </w:t>
+      </w:r>
+      <w:proofErr w:type="spellStart"/>
+      <w:r>
+        <w:t>url</w:t>
+      </w:r>
+      <w:proofErr w:type="spellEnd"/>
+      <w:r>
+        <w:t xml:space="preserve"> utilizando o github.</w:t>
+      </w:r>
+      <w:bookmarkStart w:id="0" w:name="_GoBack"/>
       <w:bookmarkEnd w:id="0"/>
     </w:p>
-    <w:p>
-      <w:pPr>
-        <w:jc w:val="center"/>
-      </w:pPr>
-    </w:p>
-    <w:p>
-      <w:pPr>
-        <w:jc w:val="center"/>
-      </w:pPr>
-    </w:p>
     <w:sectPr>
-      <w:footerReference w:type="default" r:id="rId214"/>
+      <w:footerReference w:type="default" r:id="rId219"/>
       <w:pgSz w:w="11906" w:h="16838"/>
       <w:pgMar w:top="1418" w:right="1701" w:bottom="1418" w:left="1701" w:header="709" w:footer="709" w:gutter="0"/>
       <w:cols w:space="708"/>
@@ -23617,16 +24362,16 @@
 <file path=word/numbering.xml><?xml version="1.0" encoding="utf-8"?>
 <w:numbering xmlns:wpc="http://schemas.microsoft.com/office/word/2010/wordprocessingCanvas" xmlns:cx="http://schemas.microsoft.com/office/drawing/2014/chartex" xmlns:cx1="http://schemas.microsoft.com/office/drawing/2015/9/8/chartex" xmlns:cx2="http://schemas.microsoft.com/office/drawing/2015/10/21/chartex" xmlns:cx3="http://schemas.microsoft.com/office/drawing/2016/5/9/chartex" xmlns:cx4="http://schemas.microsoft.com/office/drawing/2016/5/10/chartex" xmlns:cx5="http://schemas.microsoft.com/office/drawing/2016/5/11/chartex" xmlns:cx6="http://schemas.microsoft.com/office/drawing/2016/5/12/chartex" xmlns:cx7="http://schemas.microsoft.com/office/drawing/2016/5/13/chartex" xmlns:cx8="http://schemas.microsoft.com/office/drawing/2016/5/14/chartex" xmlns:mc="http://schemas.openxmlformats.org/markup-compatibility/2006" xmlns:aink="http://schemas.microsoft.com/office/drawing/2016/ink" xmlns:am3d="http://schemas.microsoft.com/office/drawing/2017/model3d" xmlns:o="urn:schemas-microsoft-com:office:office" xmlns:r="http://schemas.openxmlformats.org/officeDocument/2006/relationships" xmlns:m="http://schemas.openxmlformats.org/officeDocument/2006/math" xmlns:v="urn:schemas-microsoft-com:vml" xmlns:wp14="http://schemas.microsoft.com/office/word/2010/wordprocessingDrawing" xmlns:wp="http://schemas.openxmlformats.org/drawingml/2006/wordprocessingDrawing" xmlns:w10="urn:schemas-microsoft-com:office:word" xmlns:w="http://schemas.openxmlformats.org/wordprocessingml/2006/main" xmlns:w14="http://schemas.microsoft.com/office/word/2010/wordml" xmlns:w15="http://schemas.microsoft.com/office/word/2012/wordml" xmlns:w16cid="http://schemas.microsoft.com/office/word/2016/wordml/cid" xmlns:w16se="http://schemas.microsoft.com/office/word/2015/wordml/symex" xmlns:wpg="http://schemas.microsoft.com/office/word/2010/wordprocessingGroup" xmlns:wpi="http://schemas.microsoft.com/office/word/2010/wordprocessingInk" xmlns:wne="http://schemas.microsoft.com/office/word/2006/wordml" xmlns:wps="http://schemas.microsoft.com/office/word/2010/wordprocessingShape" mc:Ignorable="w14 w15 w16se w16cid wp14">
   <w:abstractNum w:abstractNumId="0" w15:restartNumberingAfterBreak="0">
-    <w:nsid w:val="0D1063FF"/>
+    <w:nsid w:val="03C42D59"/>
     <w:multiLevelType w:val="hybridMultilevel"/>
-    <w:tmpl w:val="EF6C9B0A"/>
+    <w:tmpl w:val="F30220DC"/>
     <w:lvl w:ilvl="0" w:tplc="04160001">
       <w:start w:val="1"/>
       <w:numFmt w:val="bullet"/>
       <w:lvlText w:val=""/>
       <w:lvlJc w:val="left"/>
       <w:pPr>
-        <w:ind w:left="1440" w:hanging="360"/>
+        <w:ind w:left="720" w:hanging="360"/>
       </w:pPr>
       <w:rPr>
         <w:rFonts w:ascii="Symbol" w:hAnsi="Symbol" w:hint="default"/>
@@ -23638,7 +24383,7 @@
       <w:lvlText w:val="o"/>
       <w:lvlJc w:val="left"/>
       <w:pPr>
-        <w:ind w:left="2160" w:hanging="360"/>
+        <w:ind w:left="1440" w:hanging="360"/>
       </w:pPr>
       <w:rPr>
         <w:rFonts w:ascii="Courier New" w:hAnsi="Courier New" w:cs="Courier New" w:hint="default"/>
@@ -23650,7 +24395,7 @@
       <w:lvlText w:val=""/>
       <w:lvlJc w:val="left"/>
       <w:pPr>
-        <w:ind w:left="2880" w:hanging="360"/>
+        <w:ind w:left="2160" w:hanging="360"/>
       </w:pPr>
       <w:rPr>
         <w:rFonts w:ascii="Wingdings" w:hAnsi="Wingdings" w:hint="default"/>
@@ -23662,7 +24407,7 @@
       <w:lvlText w:val=""/>
       <w:lvlJc w:val="left"/>
       <w:pPr>
-        <w:ind w:left="3600" w:hanging="360"/>
+        <w:ind w:left="2880" w:hanging="360"/>
       </w:pPr>
       <w:rPr>
         <w:rFonts w:ascii="Symbol" w:hAnsi="Symbol" w:hint="default"/>
@@ -23674,7 +24419,7 @@
       <w:lvlText w:val="o"/>
       <w:lvlJc w:val="left"/>
       <w:pPr>
-        <w:ind w:left="4320" w:hanging="360"/>
+        <w:ind w:left="3600" w:hanging="360"/>
       </w:pPr>
       <w:rPr>
         <w:rFonts w:ascii="Courier New" w:hAnsi="Courier New" w:cs="Courier New" w:hint="default"/>
@@ -23686,7 +24431,7 @@
       <w:lvlText w:val=""/>
       <w:lvlJc w:val="left"/>
       <w:pPr>
-        <w:ind w:left="5040" w:hanging="360"/>
+        <w:ind w:left="4320" w:hanging="360"/>
       </w:pPr>
       <w:rPr>
         <w:rFonts w:ascii="Wingdings" w:hAnsi="Wingdings" w:hint="default"/>
@@ -23698,7 +24443,7 @@
       <w:lvlText w:val=""/>
       <w:lvlJc w:val="left"/>
       <w:pPr>
-        <w:ind w:left="5760" w:hanging="360"/>
+        <w:ind w:left="5040" w:hanging="360"/>
       </w:pPr>
       <w:rPr>
         <w:rFonts w:ascii="Symbol" w:hAnsi="Symbol" w:hint="default"/>
@@ -23710,7 +24455,7 @@
       <w:lvlText w:val="o"/>
       <w:lvlJc w:val="left"/>
       <w:pPr>
-        <w:ind w:left="6480" w:hanging="360"/>
+        <w:ind w:left="5760" w:hanging="360"/>
       </w:pPr>
       <w:rPr>
         <w:rFonts w:ascii="Courier New" w:hAnsi="Courier New" w:cs="Courier New" w:hint="default"/>
@@ -23722,7 +24467,7 @@
       <w:lvlText w:val=""/>
       <w:lvlJc w:val="left"/>
       <w:pPr>
-        <w:ind w:left="7200" w:hanging="360"/>
+        <w:ind w:left="6480" w:hanging="360"/>
       </w:pPr>
       <w:rPr>
         <w:rFonts w:ascii="Wingdings" w:hAnsi="Wingdings" w:hint="default"/>
@@ -23730,16 +24475,16 @@
     </w:lvl>
   </w:abstractNum>
   <w:abstractNum w:abstractNumId="1" w15:restartNumberingAfterBreak="0">
-    <w:nsid w:val="17066399"/>
+    <w:nsid w:val="0D1063FF"/>
     <w:multiLevelType w:val="hybridMultilevel"/>
-    <w:tmpl w:val="5D46B7AA"/>
+    <w:tmpl w:val="EF6C9B0A"/>
     <w:lvl w:ilvl="0" w:tplc="04160001">
       <w:start w:val="1"/>
       <w:numFmt w:val="bullet"/>
       <w:lvlText w:val=""/>
       <w:lvlJc w:val="left"/>
       <w:pPr>
-        <w:ind w:left="720" w:hanging="360"/>
+        <w:ind w:left="1440" w:hanging="360"/>
       </w:pPr>
       <w:rPr>
         <w:rFonts w:ascii="Symbol" w:hAnsi="Symbol" w:hint="default"/>
@@ -23751,7 +24496,7 @@
       <w:lvlText w:val="o"/>
       <w:lvlJc w:val="left"/>
       <w:pPr>
-        <w:ind w:left="1440" w:hanging="360"/>
+        <w:ind w:left="2160" w:hanging="360"/>
       </w:pPr>
       <w:rPr>
         <w:rFonts w:ascii="Courier New" w:hAnsi="Courier New" w:cs="Courier New" w:hint="default"/>
@@ -23763,7 +24508,7 @@
       <w:lvlText w:val=""/>
       <w:lvlJc w:val="left"/>
       <w:pPr>
-        <w:ind w:left="2160" w:hanging="360"/>
+        <w:ind w:left="2880" w:hanging="360"/>
       </w:pPr>
       <w:rPr>
         <w:rFonts w:ascii="Wingdings" w:hAnsi="Wingdings" w:hint="default"/>
@@ -23775,7 +24520,7 @@
       <w:lvlText w:val=""/>
       <w:lvlJc w:val="left"/>
       <w:pPr>
-        <w:ind w:left="2880" w:hanging="360"/>
+        <w:ind w:left="3600" w:hanging="360"/>
       </w:pPr>
       <w:rPr>
         <w:rFonts w:ascii="Symbol" w:hAnsi="Symbol" w:hint="default"/>
@@ -23787,7 +24532,7 @@
       <w:lvlText w:val="o"/>
       <w:lvlJc w:val="left"/>
       <w:pPr>
-        <w:ind w:left="3600" w:hanging="360"/>
+        <w:ind w:left="4320" w:hanging="360"/>
       </w:pPr>
       <w:rPr>
         <w:rFonts w:ascii="Courier New" w:hAnsi="Courier New" w:cs="Courier New" w:hint="default"/>
@@ -23799,7 +24544,7 @@
       <w:lvlText w:val=""/>
       <w:lvlJc w:val="left"/>
       <w:pPr>
-        <w:ind w:left="4320" w:hanging="360"/>
+        <w:ind w:left="5040" w:hanging="360"/>
       </w:pPr>
       <w:rPr>
         <w:rFonts w:ascii="Wingdings" w:hAnsi="Wingdings" w:hint="default"/>
@@ -23811,7 +24556,7 @@
       <w:lvlText w:val=""/>
       <w:lvlJc w:val="left"/>
       <w:pPr>
-        <w:ind w:left="5040" w:hanging="360"/>
+        <w:ind w:left="5760" w:hanging="360"/>
       </w:pPr>
       <w:rPr>
         <w:rFonts w:ascii="Symbol" w:hAnsi="Symbol" w:hint="default"/>
@@ -23823,7 +24568,7 @@
       <w:lvlText w:val="o"/>
       <w:lvlJc w:val="left"/>
       <w:pPr>
-        <w:ind w:left="5760" w:hanging="360"/>
+        <w:ind w:left="6480" w:hanging="360"/>
       </w:pPr>
       <w:rPr>
         <w:rFonts w:ascii="Courier New" w:hAnsi="Courier New" w:cs="Courier New" w:hint="default"/>
@@ -23835,7 +24580,7 @@
       <w:lvlText w:val=""/>
       <w:lvlJc w:val="left"/>
       <w:pPr>
-        <w:ind w:left="6480" w:hanging="360"/>
+        <w:ind w:left="7200" w:hanging="360"/>
       </w:pPr>
       <w:rPr>
         <w:rFonts w:ascii="Wingdings" w:hAnsi="Wingdings" w:hint="default"/>
@@ -23843,6 +24588,119 @@
     </w:lvl>
   </w:abstractNum>
   <w:abstractNum w:abstractNumId="2" w15:restartNumberingAfterBreak="0">
+    <w:nsid w:val="17066399"/>
+    <w:multiLevelType w:val="hybridMultilevel"/>
+    <w:tmpl w:val="5D46B7AA"/>
+    <w:lvl w:ilvl="0" w:tplc="04160001">
+      <w:start w:val="1"/>
+      <w:numFmt w:val="bullet"/>
+      <w:lvlText w:val=""/>
+      <w:lvlJc w:val="left"/>
+      <w:pPr>
+        <w:ind w:left="720" w:hanging="360"/>
+      </w:pPr>
+      <w:rPr>
+        <w:rFonts w:ascii="Symbol" w:hAnsi="Symbol" w:hint="default"/>
+      </w:rPr>
+    </w:lvl>
+    <w:lvl w:ilvl="1" w:tplc="04160003" w:tentative="1">
+      <w:start w:val="1"/>
+      <w:numFmt w:val="bullet"/>
+      <w:lvlText w:val="o"/>
+      <w:lvlJc w:val="left"/>
+      <w:pPr>
+        <w:ind w:left="1440" w:hanging="360"/>
+      </w:pPr>
+      <w:rPr>
+        <w:rFonts w:ascii="Courier New" w:hAnsi="Courier New" w:cs="Courier New" w:hint="default"/>
+      </w:rPr>
+    </w:lvl>
+    <w:lvl w:ilvl="2" w:tplc="04160005" w:tentative="1">
+      <w:start w:val="1"/>
+      <w:numFmt w:val="bullet"/>
+      <w:lvlText w:val=""/>
+      <w:lvlJc w:val="left"/>
+      <w:pPr>
+        <w:ind w:left="2160" w:hanging="360"/>
+      </w:pPr>
+      <w:rPr>
+        <w:rFonts w:ascii="Wingdings" w:hAnsi="Wingdings" w:hint="default"/>
+      </w:rPr>
+    </w:lvl>
+    <w:lvl w:ilvl="3" w:tplc="04160001" w:tentative="1">
+      <w:start w:val="1"/>
+      <w:numFmt w:val="bullet"/>
+      <w:lvlText w:val=""/>
+      <w:lvlJc w:val="left"/>
+      <w:pPr>
+        <w:ind w:left="2880" w:hanging="360"/>
+      </w:pPr>
+      <w:rPr>
+        <w:rFonts w:ascii="Symbol" w:hAnsi="Symbol" w:hint="default"/>
+      </w:rPr>
+    </w:lvl>
+    <w:lvl w:ilvl="4" w:tplc="04160003" w:tentative="1">
+      <w:start w:val="1"/>
+      <w:numFmt w:val="bullet"/>
+      <w:lvlText w:val="o"/>
+      <w:lvlJc w:val="left"/>
+      <w:pPr>
+        <w:ind w:left="3600" w:hanging="360"/>
+      </w:pPr>
+      <w:rPr>
+        <w:rFonts w:ascii="Courier New" w:hAnsi="Courier New" w:cs="Courier New" w:hint="default"/>
+      </w:rPr>
+    </w:lvl>
+    <w:lvl w:ilvl="5" w:tplc="04160005" w:tentative="1">
+      <w:start w:val="1"/>
+      <w:numFmt w:val="bullet"/>
+      <w:lvlText w:val=""/>
+      <w:lvlJc w:val="left"/>
+      <w:pPr>
+        <w:ind w:left="4320" w:hanging="360"/>
+      </w:pPr>
+      <w:rPr>
+        <w:rFonts w:ascii="Wingdings" w:hAnsi="Wingdings" w:hint="default"/>
+      </w:rPr>
+    </w:lvl>
+    <w:lvl w:ilvl="6" w:tplc="04160001" w:tentative="1">
+      <w:start w:val="1"/>
+      <w:numFmt w:val="bullet"/>
+      <w:lvlText w:val=""/>
+      <w:lvlJc w:val="left"/>
+      <w:pPr>
+        <w:ind w:left="5040" w:hanging="360"/>
+      </w:pPr>
+      <w:rPr>
+        <w:rFonts w:ascii="Symbol" w:hAnsi="Symbol" w:hint="default"/>
+      </w:rPr>
+    </w:lvl>
+    <w:lvl w:ilvl="7" w:tplc="04160003" w:tentative="1">
+      <w:start w:val="1"/>
+      <w:numFmt w:val="bullet"/>
+      <w:lvlText w:val="o"/>
+      <w:lvlJc w:val="left"/>
+      <w:pPr>
+        <w:ind w:left="5760" w:hanging="360"/>
+      </w:pPr>
+      <w:rPr>
+        <w:rFonts w:ascii="Courier New" w:hAnsi="Courier New" w:cs="Courier New" w:hint="default"/>
+      </w:rPr>
+    </w:lvl>
+    <w:lvl w:ilvl="8" w:tplc="04160005" w:tentative="1">
+      <w:start w:val="1"/>
+      <w:numFmt w:val="bullet"/>
+      <w:lvlText w:val=""/>
+      <w:lvlJc w:val="left"/>
+      <w:pPr>
+        <w:ind w:left="6480" w:hanging="360"/>
+      </w:pPr>
+      <w:rPr>
+        <w:rFonts w:ascii="Wingdings" w:hAnsi="Wingdings" w:hint="default"/>
+      </w:rPr>
+    </w:lvl>
+  </w:abstractNum>
+  <w:abstractNum w:abstractNumId="3" w15:restartNumberingAfterBreak="0">
     <w:nsid w:val="17D27596"/>
     <w:multiLevelType w:val="hybridMultilevel"/>
     <w:tmpl w:val="F1201F1A"/>
@@ -23931,7 +24789,7 @@
       </w:pPr>
     </w:lvl>
   </w:abstractNum>
-  <w:abstractNum w:abstractNumId="3" w15:restartNumberingAfterBreak="0">
+  <w:abstractNum w:abstractNumId="4" w15:restartNumberingAfterBreak="0">
     <w:nsid w:val="271B712E"/>
     <w:multiLevelType w:val="hybridMultilevel"/>
     <w:tmpl w:val="76A0506E"/>
@@ -24044,7 +24902,7 @@
       </w:rPr>
     </w:lvl>
   </w:abstractNum>
-  <w:abstractNum w:abstractNumId="4" w15:restartNumberingAfterBreak="0">
+  <w:abstractNum w:abstractNumId="5" w15:restartNumberingAfterBreak="0">
     <w:nsid w:val="2F7145AF"/>
     <w:multiLevelType w:val="hybridMultilevel"/>
     <w:tmpl w:val="119866EE"/>
@@ -24157,7 +25015,7 @@
       </w:rPr>
     </w:lvl>
   </w:abstractNum>
-  <w:abstractNum w:abstractNumId="5" w15:restartNumberingAfterBreak="0">
+  <w:abstractNum w:abstractNumId="6" w15:restartNumberingAfterBreak="0">
     <w:nsid w:val="31FB2E6C"/>
     <w:multiLevelType w:val="hybridMultilevel"/>
     <w:tmpl w:val="1D0E047C"/>
@@ -24270,10 +25128,10 @@
       </w:rPr>
     </w:lvl>
   </w:abstractNum>
-  <w:abstractNum w:abstractNumId="6" w15:restartNumberingAfterBreak="0">
-    <w:nsid w:val="463821FD"/>
+  <w:abstractNum w:abstractNumId="7" w15:restartNumberingAfterBreak="0">
+    <w:nsid w:val="3C8B4E31"/>
     <w:multiLevelType w:val="hybridMultilevel"/>
-    <w:tmpl w:val="1D662410"/>
+    <w:tmpl w:val="D38427FC"/>
     <w:lvl w:ilvl="0" w:tplc="04160001">
       <w:start w:val="1"/>
       <w:numFmt w:val="bullet"/>
@@ -24383,10 +25241,10 @@
       </w:rPr>
     </w:lvl>
   </w:abstractNum>
-  <w:abstractNum w:abstractNumId="7" w15:restartNumberingAfterBreak="0">
-    <w:nsid w:val="471817DB"/>
+  <w:abstractNum w:abstractNumId="8" w15:restartNumberingAfterBreak="0">
+    <w:nsid w:val="463821FD"/>
     <w:multiLevelType w:val="hybridMultilevel"/>
-    <w:tmpl w:val="E0CCA988"/>
+    <w:tmpl w:val="1D662410"/>
     <w:lvl w:ilvl="0" w:tplc="04160001">
       <w:start w:val="1"/>
       <w:numFmt w:val="bullet"/>
@@ -24496,10 +25354,10 @@
       </w:rPr>
     </w:lvl>
   </w:abstractNum>
-  <w:abstractNum w:abstractNumId="8" w15:restartNumberingAfterBreak="0">
-    <w:nsid w:val="5B807CDB"/>
+  <w:abstractNum w:abstractNumId="9" w15:restartNumberingAfterBreak="0">
+    <w:nsid w:val="471817DB"/>
     <w:multiLevelType w:val="hybridMultilevel"/>
-    <w:tmpl w:val="5BD0D580"/>
+    <w:tmpl w:val="E0CCA988"/>
     <w:lvl w:ilvl="0" w:tplc="04160001">
       <w:start w:val="1"/>
       <w:numFmt w:val="bullet"/>
@@ -24609,7 +25467,120 @@
       </w:rPr>
     </w:lvl>
   </w:abstractNum>
-  <w:abstractNum w:abstractNumId="9" w15:restartNumberingAfterBreak="0">
+  <w:abstractNum w:abstractNumId="10" w15:restartNumberingAfterBreak="0">
+    <w:nsid w:val="5B807CDB"/>
+    <w:multiLevelType w:val="hybridMultilevel"/>
+    <w:tmpl w:val="5BD0D580"/>
+    <w:lvl w:ilvl="0" w:tplc="04160001">
+      <w:start w:val="1"/>
+      <w:numFmt w:val="bullet"/>
+      <w:lvlText w:val=""/>
+      <w:lvlJc w:val="left"/>
+      <w:pPr>
+        <w:ind w:left="720" w:hanging="360"/>
+      </w:pPr>
+      <w:rPr>
+        <w:rFonts w:ascii="Symbol" w:hAnsi="Symbol" w:hint="default"/>
+      </w:rPr>
+    </w:lvl>
+    <w:lvl w:ilvl="1" w:tplc="04160003" w:tentative="1">
+      <w:start w:val="1"/>
+      <w:numFmt w:val="bullet"/>
+      <w:lvlText w:val="o"/>
+      <w:lvlJc w:val="left"/>
+      <w:pPr>
+        <w:ind w:left="1440" w:hanging="360"/>
+      </w:pPr>
+      <w:rPr>
+        <w:rFonts w:ascii="Courier New" w:hAnsi="Courier New" w:cs="Courier New" w:hint="default"/>
+      </w:rPr>
+    </w:lvl>
+    <w:lvl w:ilvl="2" w:tplc="04160005" w:tentative="1">
+      <w:start w:val="1"/>
+      <w:numFmt w:val="bullet"/>
+      <w:lvlText w:val=""/>
+      <w:lvlJc w:val="left"/>
+      <w:pPr>
+        <w:ind w:left="2160" w:hanging="360"/>
+      </w:pPr>
+      <w:rPr>
+        <w:rFonts w:ascii="Wingdings" w:hAnsi="Wingdings" w:hint="default"/>
+      </w:rPr>
+    </w:lvl>
+    <w:lvl w:ilvl="3" w:tplc="04160001" w:tentative="1">
+      <w:start w:val="1"/>
+      <w:numFmt w:val="bullet"/>
+      <w:lvlText w:val=""/>
+      <w:lvlJc w:val="left"/>
+      <w:pPr>
+        <w:ind w:left="2880" w:hanging="360"/>
+      </w:pPr>
+      <w:rPr>
+        <w:rFonts w:ascii="Symbol" w:hAnsi="Symbol" w:hint="default"/>
+      </w:rPr>
+    </w:lvl>
+    <w:lvl w:ilvl="4" w:tplc="04160003" w:tentative="1">
+      <w:start w:val="1"/>
+      <w:numFmt w:val="bullet"/>
+      <w:lvlText w:val="o"/>
+      <w:lvlJc w:val="left"/>
+      <w:pPr>
+        <w:ind w:left="3600" w:hanging="360"/>
+      </w:pPr>
+      <w:rPr>
+        <w:rFonts w:ascii="Courier New" w:hAnsi="Courier New" w:cs="Courier New" w:hint="default"/>
+      </w:rPr>
+    </w:lvl>
+    <w:lvl w:ilvl="5" w:tplc="04160005" w:tentative="1">
+      <w:start w:val="1"/>
+      <w:numFmt w:val="bullet"/>
+      <w:lvlText w:val=""/>
+      <w:lvlJc w:val="left"/>
+      <w:pPr>
+        <w:ind w:left="4320" w:hanging="360"/>
+      </w:pPr>
+      <w:rPr>
+        <w:rFonts w:ascii="Wingdings" w:hAnsi="Wingdings" w:hint="default"/>
+      </w:rPr>
+    </w:lvl>
+    <w:lvl w:ilvl="6" w:tplc="04160001" w:tentative="1">
+      <w:start w:val="1"/>
+      <w:numFmt w:val="bullet"/>
+      <w:lvlText w:val=""/>
+      <w:lvlJc w:val="left"/>
+      <w:pPr>
+        <w:ind w:left="5040" w:hanging="360"/>
+      </w:pPr>
+      <w:rPr>
+        <w:rFonts w:ascii="Symbol" w:hAnsi="Symbol" w:hint="default"/>
+      </w:rPr>
+    </w:lvl>
+    <w:lvl w:ilvl="7" w:tplc="04160003" w:tentative="1">
+      <w:start w:val="1"/>
+      <w:numFmt w:val="bullet"/>
+      <w:lvlText w:val="o"/>
+      <w:lvlJc w:val="left"/>
+      <w:pPr>
+        <w:ind w:left="5760" w:hanging="360"/>
+      </w:pPr>
+      <w:rPr>
+        <w:rFonts w:ascii="Courier New" w:hAnsi="Courier New" w:cs="Courier New" w:hint="default"/>
+      </w:rPr>
+    </w:lvl>
+    <w:lvl w:ilvl="8" w:tplc="04160005" w:tentative="1">
+      <w:start w:val="1"/>
+      <w:numFmt w:val="bullet"/>
+      <w:lvlText w:val=""/>
+      <w:lvlJc w:val="left"/>
+      <w:pPr>
+        <w:ind w:left="6480" w:hanging="360"/>
+      </w:pPr>
+      <w:rPr>
+        <w:rFonts w:ascii="Wingdings" w:hAnsi="Wingdings" w:hint="default"/>
+      </w:rPr>
+    </w:lvl>
+  </w:abstractNum>
+  <w:abstractNum w:abstractNumId="11" w15:restartNumberingAfterBreak="0">
     <w:nsid w:val="5CEE6337"/>
     <w:multiLevelType w:val="hybridMultilevel"/>
     <w:tmpl w:val="6FBC1190"/>
@@ -24698,7 +25669,7 @@
       </w:pPr>
     </w:lvl>
   </w:abstractNum>
-  <w:abstractNum w:abstractNumId="10" w15:restartNumberingAfterBreak="0">
+  <w:abstractNum w:abstractNumId="12" w15:restartNumberingAfterBreak="0">
     <w:nsid w:val="61246D7D"/>
     <w:multiLevelType w:val="hybridMultilevel"/>
     <w:tmpl w:val="6A780C0A"/>
@@ -24811,7 +25782,7 @@
       </w:rPr>
     </w:lvl>
   </w:abstractNum>
-  <w:abstractNum w:abstractNumId="11" w15:restartNumberingAfterBreak="0">
+  <w:abstractNum w:abstractNumId="13" w15:restartNumberingAfterBreak="0">
     <w:nsid w:val="61BC3A9D"/>
     <w:multiLevelType w:val="hybridMultilevel"/>
     <w:tmpl w:val="C6E60B46"/>
@@ -24924,7 +25895,7 @@
       </w:rPr>
     </w:lvl>
   </w:abstractNum>
-  <w:abstractNum w:abstractNumId="12" w15:restartNumberingAfterBreak="0">
+  <w:abstractNum w:abstractNumId="14" w15:restartNumberingAfterBreak="0">
     <w:nsid w:val="65B64E8C"/>
     <w:multiLevelType w:val="hybridMultilevel"/>
     <w:tmpl w:val="3CE0BA36"/>
@@ -25037,7 +26008,7 @@
       </w:rPr>
     </w:lvl>
   </w:abstractNum>
-  <w:abstractNum w:abstractNumId="13" w15:restartNumberingAfterBreak="0">
+  <w:abstractNum w:abstractNumId="15" w15:restartNumberingAfterBreak="0">
     <w:nsid w:val="6B0F7CA7"/>
     <w:multiLevelType w:val="hybridMultilevel"/>
     <w:tmpl w:val="3FF40976"/>
@@ -25150,7 +26121,7 @@
       </w:rPr>
     </w:lvl>
   </w:abstractNum>
-  <w:abstractNum w:abstractNumId="14" w15:restartNumberingAfterBreak="0">
+  <w:abstractNum w:abstractNumId="16" w15:restartNumberingAfterBreak="0">
     <w:nsid w:val="6E574C15"/>
     <w:multiLevelType w:val="hybridMultilevel"/>
     <w:tmpl w:val="16843580"/>
@@ -25263,7 +26234,7 @@
       </w:rPr>
     </w:lvl>
   </w:abstractNum>
-  <w:abstractNum w:abstractNumId="15" w15:restartNumberingAfterBreak="0">
+  <w:abstractNum w:abstractNumId="17" w15:restartNumberingAfterBreak="0">
     <w:nsid w:val="761A2345"/>
     <w:multiLevelType w:val="hybridMultilevel"/>
     <w:tmpl w:val="B030912C"/>
@@ -25376,7 +26347,7 @@
       </w:rPr>
     </w:lvl>
   </w:abstractNum>
-  <w:abstractNum w:abstractNumId="16" w15:restartNumberingAfterBreak="0">
+  <w:abstractNum w:abstractNumId="18" w15:restartNumberingAfterBreak="0">
     <w:nsid w:val="7BD44012"/>
     <w:multiLevelType w:val="hybridMultilevel"/>
     <w:tmpl w:val="4DEA9584"/>
@@ -25465,7 +26436,7 @@
       </w:pPr>
     </w:lvl>
   </w:abstractNum>
-  <w:abstractNum w:abstractNumId="17" w15:restartNumberingAfterBreak="0">
+  <w:abstractNum w:abstractNumId="19" w15:restartNumberingAfterBreak="0">
     <w:nsid w:val="7E3921C8"/>
     <w:multiLevelType w:val="hybridMultilevel"/>
     <w:tmpl w:val="68D678A0"/>
@@ -25578,7 +26549,7 @@
       </w:rPr>
     </w:lvl>
   </w:abstractNum>
-  <w:abstractNum w:abstractNumId="18" w15:restartNumberingAfterBreak="0">
+  <w:abstractNum w:abstractNumId="20" w15:restartNumberingAfterBreak="0">
     <w:nsid w:val="7EDD3EB0"/>
     <w:multiLevelType w:val="hybridMultilevel"/>
     <w:tmpl w:val="2ACE7D7E"/>
@@ -25691,7 +26662,7 @@
       </w:rPr>
     </w:lvl>
   </w:abstractNum>
-  <w:abstractNum w:abstractNumId="19" w15:restartNumberingAfterBreak="0">
+  <w:abstractNum w:abstractNumId="21" w15:restartNumberingAfterBreak="0">
     <w:nsid w:val="7EFE27EB"/>
     <w:multiLevelType w:val="hybridMultilevel"/>
     <w:tmpl w:val="48A8C2E4"/>
@@ -25805,64 +26776,70 @@
     </w:lvl>
   </w:abstractNum>
   <w:num w:numId="1">
+    <w:abstractNumId w:val="9"/>
+  </w:num>
+  <w:num w:numId="2">
+    <w:abstractNumId w:val="19"/>
+  </w:num>
+  <w:num w:numId="3">
+    <w:abstractNumId w:val="6"/>
+  </w:num>
+  <w:num w:numId="4">
+    <w:abstractNumId w:val="1"/>
+  </w:num>
+  <w:num w:numId="5">
+    <w:abstractNumId w:val="10"/>
+  </w:num>
+  <w:num w:numId="6">
+    <w:abstractNumId w:val="15"/>
+  </w:num>
+  <w:num w:numId="7">
+    <w:abstractNumId w:val="8"/>
+  </w:num>
+  <w:num w:numId="8">
+    <w:abstractNumId w:val="2"/>
+  </w:num>
+  <w:num w:numId="9">
+    <w:abstractNumId w:val="20"/>
+  </w:num>
+  <w:num w:numId="10">
+    <w:abstractNumId w:val="4"/>
+  </w:num>
+  <w:num w:numId="11">
+    <w:abstractNumId w:val="17"/>
+  </w:num>
+  <w:num w:numId="12">
+    <w:abstractNumId w:val="21"/>
+  </w:num>
+  <w:num w:numId="13">
+    <w:abstractNumId w:val="13"/>
+  </w:num>
+  <w:num w:numId="14">
+    <w:abstractNumId w:val="14"/>
+  </w:num>
+  <w:num w:numId="15">
+    <w:abstractNumId w:val="16"/>
+  </w:num>
+  <w:num w:numId="16">
+    <w:abstractNumId w:val="5"/>
+  </w:num>
+  <w:num w:numId="17">
+    <w:abstractNumId w:val="12"/>
+  </w:num>
+  <w:num w:numId="18">
+    <w:abstractNumId w:val="3"/>
+  </w:num>
+  <w:num w:numId="19">
+    <w:abstractNumId w:val="11"/>
+  </w:num>
+  <w:num w:numId="20">
+    <w:abstractNumId w:val="18"/>
+  </w:num>
+  <w:num w:numId="21">
     <w:abstractNumId w:val="7"/>
   </w:num>
-  <w:num w:numId="2">
-    <w:abstractNumId w:val="17"/>
-  </w:num>
-  <w:num w:numId="3">
-    <w:abstractNumId w:val="5"/>
-  </w:num>
-  <w:num w:numId="4">
+  <w:num w:numId="22">
     <w:abstractNumId w:val="0"/>
-  </w:num>
-  <w:num w:numId="5">
-    <w:abstractNumId w:val="8"/>
-  </w:num>
-  <w:num w:numId="6">
-    <w:abstractNumId w:val="13"/>
-  </w:num>
-  <w:num w:numId="7">
-    <w:abstractNumId w:val="6"/>
-  </w:num>
-  <w:num w:numId="8">
-    <w:abstractNumId w:val="1"/>
-  </w:num>
-  <w:num w:numId="9">
-    <w:abstractNumId w:val="18"/>
-  </w:num>
-  <w:num w:numId="10">
-    <w:abstractNumId w:val="3"/>
-  </w:num>
-  <w:num w:numId="11">
-    <w:abstractNumId w:val="15"/>
-  </w:num>
-  <w:num w:numId="12">
-    <w:abstractNumId w:val="19"/>
-  </w:num>
-  <w:num w:numId="13">
-    <w:abstractNumId w:val="11"/>
-  </w:num>
-  <w:num w:numId="14">
-    <w:abstractNumId w:val="12"/>
-  </w:num>
-  <w:num w:numId="15">
-    <w:abstractNumId w:val="14"/>
-  </w:num>
-  <w:num w:numId="16">
-    <w:abstractNumId w:val="4"/>
-  </w:num>
-  <w:num w:numId="17">
-    <w:abstractNumId w:val="10"/>
-  </w:num>
-  <w:num w:numId="18">
-    <w:abstractNumId w:val="2"/>
-  </w:num>
-  <w:num w:numId="19">
-    <w:abstractNumId w:val="9"/>
-  </w:num>
-  <w:num w:numId="20">
-    <w:abstractNumId w:val="16"/>
   </w:num>
 </w:numbering>
 </file>
@@ -26673,7 +27650,7 @@
 </file>
 
 <file path=customXml/itemProps1.xml><?xml version="1.0" encoding="utf-8"?>
-<ds:datastoreItem xmlns:ds="http://schemas.openxmlformats.org/officeDocument/2006/customXml" ds:itemID="{3F8BE591-04BD-46BF-A282-63187D07B558}">
+<ds:datastoreItem xmlns:ds="http://schemas.openxmlformats.org/officeDocument/2006/customXml" ds:itemID="{D61C1F14-3A8E-499F-BC5D-CD8ED72055DB}">
   <ds:schemaRefs>
     <ds:schemaRef ds:uri="http://schemas.openxmlformats.org/officeDocument/2006/bibliography"/>
   </ds:schemaRefs>

</xml_diff>